<commit_message>
edit: add diagram pics, almost final version of project doc.
</commit_message>
<xml_diff>
--- a/Nati_Goral_IDS_Documentation.docx
+++ b/Nati_Goral_IDS_Documentation.docx
@@ -13607,7 +13607,7 @@
       </w:pPr>
       <w:r>
         <w:drawing>
-          <wp:inline wp14:editId="3F35E60F" wp14:anchorId="7AE7B739">
+          <wp:inline wp14:editId="2DF33C90" wp14:anchorId="7AE7B739">
             <wp:extent cx="5724525" cy="4533900"/>
             <wp:effectExtent l="0" t="0" r="0" b="0"/>
             <wp:docPr id="563566285" name="drawing"/>
@@ -13832,7 +13832,7 @@
       </w:pPr>
       <w:r>
         <w:drawing>
-          <wp:inline wp14:editId="4EDE9F0B" wp14:anchorId="25EAECA0">
+          <wp:inline wp14:editId="5A91D5DF" wp14:anchorId="25EAECA0">
             <wp:extent cx="6035040" cy="8992715"/>
             <wp:effectExtent l="0" t="0" r="0" b="0"/>
             <wp:docPr id="598936811" name="drawing"/>
@@ -13910,7 +13910,7 @@
       </w:pPr>
       <w:r>
         <w:drawing>
-          <wp:inline wp14:editId="4FB493C8" wp14:anchorId="1CC55D2C">
+          <wp:inline wp14:editId="1A77DCDC" wp14:anchorId="1CC55D2C">
             <wp:extent cx="5452928" cy="6400800"/>
             <wp:effectExtent l="0" t="0" r="0" b="0"/>
             <wp:docPr id="164819633" name="drawing"/>
@@ -13979,7 +13979,7 @@
       </w:pPr>
       <w:r>
         <w:drawing>
-          <wp:inline wp14:editId="34CFE559" wp14:anchorId="0AE2A371">
+          <wp:inline wp14:editId="2255D658" wp14:anchorId="0AE2A371">
             <wp:extent cx="4579608" cy="6400800"/>
             <wp:effectExtent l="0" t="0" r="0" b="0"/>
             <wp:docPr id="1517320799" name="drawing"/>
@@ -14049,7 +14049,7 @@
       </w:pPr>
       <w:r>
         <w:drawing>
-          <wp:inline wp14:editId="1AA1323C" wp14:anchorId="6541E10C">
+          <wp:inline wp14:editId="241F5CAA" wp14:anchorId="6541E10C">
             <wp:extent cx="5207975" cy="6400800"/>
             <wp:effectExtent l="0" t="0" r="0" b="0"/>
             <wp:docPr id="1958724488" name="drawing"/>
@@ -14092,7 +14092,7 @@
       </w:r>
       <w:r>
         <w:drawing>
-          <wp:inline wp14:editId="4B1C1CC3" wp14:anchorId="5F884BAF">
+          <wp:inline wp14:editId="7600980C" wp14:anchorId="5F884BAF">
             <wp:extent cx="5760720" cy="2722204"/>
             <wp:effectExtent l="0" t="0" r="0" b="0"/>
             <wp:docPr id="1260126147" name="drawing"/>
@@ -22865,7 +22865,7 @@
       </w:pPr>
       <w:r>
         <w:drawing>
-          <wp:inline wp14:editId="0DD219ED" wp14:anchorId="5A6629E8">
+          <wp:inline wp14:editId="7009B223" wp14:anchorId="5A6629E8">
             <wp:extent cx="5724525" cy="5314084"/>
             <wp:effectExtent l="0" t="0" r="0" b="0"/>
             <wp:docPr id="1196433712" name="drawing"/>
@@ -22940,7 +22940,7 @@
       </w:pPr>
       <w:r>
         <w:drawing>
-          <wp:inline wp14:editId="47BBCC60" wp14:anchorId="3E159756">
+          <wp:inline wp14:editId="29B19FD2" wp14:anchorId="3E159756">
             <wp:extent cx="5724525" cy="5257800"/>
             <wp:effectExtent l="0" t="0" r="0" b="0"/>
             <wp:docPr id="85614664" name="drawing"/>
@@ -31792,7 +31792,7 @@
           <w:szCs w:val="32"/>
           <w:rtl w:val="1"/>
         </w:rPr>
-        <w:t>תרשימי פע</w:t>
+        <w:t xml:space="preserve">תרשימי </w:t>
       </w:r>
       <w:r>
         <w:rPr>
@@ -31802,7 +31802,7 @@
           <w:szCs w:val="32"/>
           <w:rtl w:val="1"/>
         </w:rPr>
-        <w:t>ילות</w:t>
+        <w:t>נסיבות שימוש פעילות</w:t>
       </w:r>
     </w:p>
     <w:p>
@@ -31832,7 +31832,7 @@
       </w:pPr>
       <w:r>
         <w:drawing>
-          <wp:inline wp14:editId="784107A4" wp14:anchorId="26CAE44D">
+          <wp:inline wp14:editId="384C3E26" wp14:anchorId="26CAE44D">
             <wp:extent cx="4381500" cy="5724525"/>
             <wp:effectExtent l="0" t="0" r="0" b="0"/>
             <wp:docPr id="523224763" name="drawing"/>
@@ -31934,7 +31934,7 @@
       </w:pPr>
       <w:r>
         <w:drawing>
-          <wp:inline wp14:editId="29454FDF" wp14:anchorId="7B37ED6D">
+          <wp:inline wp14:editId="13D780AE" wp14:anchorId="7B37ED6D">
             <wp:extent cx="3810000" cy="5724525"/>
             <wp:effectExtent l="0" t="0" r="0" b="0"/>
             <wp:docPr id="1138705242" name="drawing"/>
@@ -32097,7 +32097,7 @@
       </w:pPr>
       <w:r>
         <w:drawing>
-          <wp:inline wp14:editId="46CB6727" wp14:anchorId="70ABDE8A">
+          <wp:inline wp14:editId="3C7C7798" wp14:anchorId="70ABDE8A">
             <wp:extent cx="1809750" cy="5724525"/>
             <wp:effectExtent l="0" t="0" r="0" b="0"/>
             <wp:docPr id="790314797" name="drawing"/>
@@ -32260,7 +32260,7 @@
       </w:pPr>
       <w:r>
         <w:drawing>
-          <wp:inline wp14:editId="081CFCCC" wp14:anchorId="6FC7A770">
+          <wp:inline wp14:editId="3B641935" wp14:anchorId="6FC7A770">
             <wp:extent cx="5391150" cy="5724525"/>
             <wp:effectExtent l="0" t="0" r="0" b="0"/>
             <wp:docPr id="1401079" name="drawing"/>
@@ -32423,7 +32423,7 @@
       </w:pPr>
       <w:r>
         <w:drawing>
-          <wp:inline wp14:editId="3BD0941E" wp14:anchorId="14A3ED04">
+          <wp:inline wp14:editId="7AACB1A9" wp14:anchorId="14A3ED04">
             <wp:extent cx="1685925" cy="5724525"/>
             <wp:effectExtent l="0" t="0" r="0" b="0"/>
             <wp:docPr id="1677924645" name="drawing"/>
@@ -32586,7 +32586,7 @@
       </w:pPr>
       <w:r>
         <w:drawing>
-          <wp:inline wp14:editId="46E05B0A" wp14:anchorId="2BDC24CD">
+          <wp:inline wp14:editId="36FC778D" wp14:anchorId="2BDC24CD">
             <wp:extent cx="4229100" cy="5724525"/>
             <wp:effectExtent l="0" t="0" r="0" b="0"/>
             <wp:docPr id="1957067183" name="drawing"/>
@@ -32749,7 +32749,7 @@
       </w:pPr>
       <w:r>
         <w:drawing>
-          <wp:inline wp14:editId="4343E8F0" wp14:anchorId="7D394D69">
+          <wp:inline wp14:editId="0AA5A385" wp14:anchorId="7D394D69">
             <wp:extent cx="3219450" cy="5724525"/>
             <wp:effectExtent l="0" t="0" r="0" b="0"/>
             <wp:docPr id="1852013637" name="drawing"/>
@@ -32912,7 +32912,7 @@
       </w:pPr>
       <w:r>
         <w:drawing>
-          <wp:inline wp14:editId="4F969CD7" wp14:anchorId="27429E65">
+          <wp:inline wp14:editId="1C10CB04" wp14:anchorId="27429E65">
             <wp:extent cx="3171825" cy="5724525"/>
             <wp:effectExtent l="0" t="0" r="0" b="0"/>
             <wp:docPr id="2019192343" name="drawing"/>
@@ -33132,7 +33132,7 @@
       </w:pPr>
       <w:r>
         <w:drawing>
-          <wp:inline wp14:editId="1534BD93" wp14:anchorId="06CDB435">
+          <wp:inline wp14:editId="5E9BD7C0" wp14:anchorId="06CDB435">
             <wp:extent cx="6309360" cy="4566676"/>
             <wp:effectExtent l="0" t="0" r="0" b="0"/>
             <wp:docPr id="302539347" name="drawing"/>
@@ -33386,7 +33386,7 @@
           <w:rtl w:val="1"/>
           <w:lang w:val="en-US"/>
         </w:rPr>
-        <w:t>תרשים</w:t>
+        <w:t xml:space="preserve"> </w:t>
       </w:r>
       <w:r>
         <w:rPr>
@@ -33397,7 +33397,64 @@
           <w:rtl w:val="1"/>
           <w:lang w:val="en-US"/>
         </w:rPr>
-        <w:t xml:space="preserve"> פריסה</w:t>
+        <w:t>תרשימי</w:t>
+      </w:r>
+      <w:r>
+        <w:rPr>
+          <w:b w:val="1"/>
+          <w:bCs w:val="1"/>
+          <w:sz w:val="28"/>
+          <w:szCs w:val="28"/>
+          <w:rtl w:val="1"/>
+          <w:lang w:val="en-US"/>
+        </w:rPr>
+        <w:t xml:space="preserve"> רצף</w:t>
+      </w:r>
+      <w:r>
+        <w:br/>
+      </w:r>
+      <w:r>
+        <w:drawing>
+          <wp:inline wp14:editId="7BE97707" wp14:anchorId="6CD25025">
+            <wp:extent cx="5724525" cy="4343400"/>
+            <wp:effectExtent l="0" t="0" r="0" b="0"/>
+            <wp:docPr id="797717993" name="drawing"/>
+            <wp:cNvGraphicFramePr>
+              <a:graphicFrameLocks noChangeAspect="1"/>
+            </wp:cNvGraphicFramePr>
+            <a:graphic>
+              <a:graphicData xmlns:a="http://schemas.openxmlformats.org/drawingml/2006/main" uri="http://schemas.openxmlformats.org/drawingml/2006/picture">
+                <pic:pic xmlns:pic="http://schemas.openxmlformats.org/drawingml/2006/picture">
+                  <pic:nvPicPr>
+                    <pic:cNvPr id="797717993" name="Picture 797717993"/>
+                    <pic:cNvPicPr/>
+                  </pic:nvPicPr>
+                  <pic:blipFill>
+                    <a:blip xmlns:r="http://schemas.openxmlformats.org/officeDocument/2006/relationships" r:embed="rId1197763482">
+                      <a:extLst>
+                        <a:ext uri="{28A0092B-C50C-407E-A947-70E740481C1C}">
+                          <a14:useLocalDpi xmlns:a14="http://schemas.microsoft.com/office/drawing/2010/main"/>
+                        </a:ext>
+                      </a:extLst>
+                    </a:blip>
+                    <a:stretch>
+                      <a:fillRect/>
+                    </a:stretch>
+                  </pic:blipFill>
+                  <pic:spPr>
+                    <a:xfrm>
+                      <a:off x="0" y="0"/>
+                      <a:ext cx="5724525" cy="4343400"/>
+                    </a:xfrm>
+                    <a:prstGeom prst="rect">
+                      <a:avLst/>
+                    </a:prstGeom>
+                  </pic:spPr>
+                </pic:pic>
+              </a:graphicData>
+            </a:graphic>
+          </wp:inline>
+        </w:drawing>
       </w:r>
     </w:p>
     <w:p>
@@ -33418,7 +33475,546 @@
       </w:pPr>
       <w:r>
         <w:drawing>
-          <wp:inline wp14:editId="72A1E201" wp14:anchorId="0B824320">
+          <wp:inline wp14:editId="0ADDF816" wp14:anchorId="0F1B83B6">
+            <wp:extent cx="5724525" cy="4810125"/>
+            <wp:effectExtent l="0" t="0" r="0" b="0"/>
+            <wp:docPr id="1620513378" name="drawing"/>
+            <wp:cNvGraphicFramePr>
+              <a:graphicFrameLocks noChangeAspect="1"/>
+            </wp:cNvGraphicFramePr>
+            <a:graphic>
+              <a:graphicData xmlns:a="http://schemas.openxmlformats.org/drawingml/2006/main" uri="http://schemas.openxmlformats.org/drawingml/2006/picture">
+                <pic:pic xmlns:pic="http://schemas.openxmlformats.org/drawingml/2006/picture">
+                  <pic:nvPicPr>
+                    <pic:cNvPr id="1620513378" name="Picture 1620513378"/>
+                    <pic:cNvPicPr/>
+                  </pic:nvPicPr>
+                  <pic:blipFill>
+                    <a:blip xmlns:r="http://schemas.openxmlformats.org/officeDocument/2006/relationships" r:embed="rId384325985">
+                      <a:extLst>
+                        <a:ext uri="{28A0092B-C50C-407E-A947-70E740481C1C}">
+                          <a14:useLocalDpi xmlns:a14="http://schemas.microsoft.com/office/drawing/2010/main"/>
+                        </a:ext>
+                      </a:extLst>
+                    </a:blip>
+                    <a:stretch>
+                      <a:fillRect/>
+                    </a:stretch>
+                  </pic:blipFill>
+                  <pic:spPr>
+                    <a:xfrm>
+                      <a:off x="0" y="0"/>
+                      <a:ext cx="5724525" cy="4810125"/>
+                    </a:xfrm>
+                    <a:prstGeom prst="rect">
+                      <a:avLst/>
+                    </a:prstGeom>
+                  </pic:spPr>
+                </pic:pic>
+              </a:graphicData>
+            </a:graphic>
+          </wp:inline>
+        </w:drawing>
+      </w:r>
+      <w:r>
+        <w:drawing>
+          <wp:inline wp14:editId="1005BABE" wp14:anchorId="3929069D">
+            <wp:extent cx="5724525" cy="5495925"/>
+            <wp:effectExtent l="0" t="0" r="0" b="0"/>
+            <wp:docPr id="367107683" name="drawing"/>
+            <wp:cNvGraphicFramePr>
+              <a:graphicFrameLocks noChangeAspect="1"/>
+            </wp:cNvGraphicFramePr>
+            <a:graphic>
+              <a:graphicData xmlns:a="http://schemas.openxmlformats.org/drawingml/2006/main" uri="http://schemas.openxmlformats.org/drawingml/2006/picture">
+                <pic:pic xmlns:pic="http://schemas.openxmlformats.org/drawingml/2006/picture">
+                  <pic:nvPicPr>
+                    <pic:cNvPr id="367107683" name="Picture 367107683"/>
+                    <pic:cNvPicPr/>
+                  </pic:nvPicPr>
+                  <pic:blipFill>
+                    <a:blip xmlns:r="http://schemas.openxmlformats.org/officeDocument/2006/relationships" r:embed="rId610249835">
+                      <a:extLst>
+                        <a:ext uri="{28A0092B-C50C-407E-A947-70E740481C1C}">
+                          <a14:useLocalDpi xmlns:a14="http://schemas.microsoft.com/office/drawing/2010/main"/>
+                        </a:ext>
+                      </a:extLst>
+                    </a:blip>
+                    <a:stretch>
+                      <a:fillRect/>
+                    </a:stretch>
+                  </pic:blipFill>
+                  <pic:spPr>
+                    <a:xfrm>
+                      <a:off x="0" y="0"/>
+                      <a:ext cx="5724525" cy="5495925"/>
+                    </a:xfrm>
+                    <a:prstGeom prst="rect">
+                      <a:avLst/>
+                    </a:prstGeom>
+                  </pic:spPr>
+                </pic:pic>
+              </a:graphicData>
+            </a:graphic>
+          </wp:inline>
+        </w:drawing>
+      </w:r>
+      <w:r>
+        <w:drawing>
+          <wp:inline wp14:editId="508F231A" wp14:anchorId="786C6D55">
+            <wp:extent cx="4381500" cy="5057775"/>
+            <wp:effectExtent l="0" t="0" r="0" b="0"/>
+            <wp:docPr id="1993956855" name="drawing"/>
+            <wp:cNvGraphicFramePr>
+              <a:graphicFrameLocks noChangeAspect="1"/>
+            </wp:cNvGraphicFramePr>
+            <a:graphic>
+              <a:graphicData xmlns:a="http://schemas.openxmlformats.org/drawingml/2006/main" uri="http://schemas.openxmlformats.org/drawingml/2006/picture">
+                <pic:pic xmlns:pic="http://schemas.openxmlformats.org/drawingml/2006/picture">
+                  <pic:nvPicPr>
+                    <pic:cNvPr id="1993956855" name="Picture 1993956855"/>
+                    <pic:cNvPicPr/>
+                  </pic:nvPicPr>
+                  <pic:blipFill>
+                    <a:blip xmlns:r="http://schemas.openxmlformats.org/officeDocument/2006/relationships" r:embed="rId877448221">
+                      <a:extLst>
+                        <a:ext uri="{28A0092B-C50C-407E-A947-70E740481C1C}">
+                          <a14:useLocalDpi xmlns:a14="http://schemas.microsoft.com/office/drawing/2010/main"/>
+                        </a:ext>
+                      </a:extLst>
+                    </a:blip>
+                    <a:stretch>
+                      <a:fillRect/>
+                    </a:stretch>
+                  </pic:blipFill>
+                  <pic:spPr>
+                    <a:xfrm>
+                      <a:off x="0" y="0"/>
+                      <a:ext cx="4381500" cy="5057775"/>
+                    </a:xfrm>
+                    <a:prstGeom prst="rect">
+                      <a:avLst/>
+                    </a:prstGeom>
+                  </pic:spPr>
+                </pic:pic>
+              </a:graphicData>
+            </a:graphic>
+          </wp:inline>
+        </w:drawing>
+      </w:r>
+      <w:r>
+        <w:drawing>
+          <wp:inline wp14:editId="5EBB2804" wp14:anchorId="1B323F48">
+            <wp:extent cx="5724525" cy="5295900"/>
+            <wp:effectExtent l="0" t="0" r="0" b="0"/>
+            <wp:docPr id="1042447647" name="drawing"/>
+            <wp:cNvGraphicFramePr>
+              <a:graphicFrameLocks noChangeAspect="1"/>
+            </wp:cNvGraphicFramePr>
+            <a:graphic>
+              <a:graphicData xmlns:a="http://schemas.openxmlformats.org/drawingml/2006/main" uri="http://schemas.openxmlformats.org/drawingml/2006/picture">
+                <pic:pic xmlns:pic="http://schemas.openxmlformats.org/drawingml/2006/picture">
+                  <pic:nvPicPr>
+                    <pic:cNvPr id="1042447647" name="Picture 1042447647"/>
+                    <pic:cNvPicPr/>
+                  </pic:nvPicPr>
+                  <pic:blipFill>
+                    <a:blip xmlns:r="http://schemas.openxmlformats.org/officeDocument/2006/relationships" r:embed="rId1395407235">
+                      <a:extLst>
+                        <a:ext uri="{28A0092B-C50C-407E-A947-70E740481C1C}">
+                          <a14:useLocalDpi xmlns:a14="http://schemas.microsoft.com/office/drawing/2010/main"/>
+                        </a:ext>
+                      </a:extLst>
+                    </a:blip>
+                    <a:stretch>
+                      <a:fillRect/>
+                    </a:stretch>
+                  </pic:blipFill>
+                  <pic:spPr>
+                    <a:xfrm>
+                      <a:off x="0" y="0"/>
+                      <a:ext cx="5724525" cy="5295900"/>
+                    </a:xfrm>
+                    <a:prstGeom prst="rect">
+                      <a:avLst/>
+                    </a:prstGeom>
+                  </pic:spPr>
+                </pic:pic>
+              </a:graphicData>
+            </a:graphic>
+          </wp:inline>
+        </w:drawing>
+      </w:r>
+      <w:r>
+        <w:drawing>
+          <wp:inline wp14:editId="39CE6019" wp14:anchorId="666768D2">
+            <wp:extent cx="4267200" cy="5724525"/>
+            <wp:effectExtent l="0" t="0" r="0" b="0"/>
+            <wp:docPr id="154675720" name="drawing"/>
+            <wp:cNvGraphicFramePr>
+              <a:graphicFrameLocks noChangeAspect="1"/>
+            </wp:cNvGraphicFramePr>
+            <a:graphic>
+              <a:graphicData xmlns:a="http://schemas.openxmlformats.org/drawingml/2006/main" uri="http://schemas.openxmlformats.org/drawingml/2006/picture">
+                <pic:pic xmlns:pic="http://schemas.openxmlformats.org/drawingml/2006/picture">
+                  <pic:nvPicPr>
+                    <pic:cNvPr id="154675720" name="Picture 154675720"/>
+                    <pic:cNvPicPr/>
+                  </pic:nvPicPr>
+                  <pic:blipFill>
+                    <a:blip xmlns:r="http://schemas.openxmlformats.org/officeDocument/2006/relationships" r:embed="rId389247671">
+                      <a:extLst>
+                        <a:ext uri="{28A0092B-C50C-407E-A947-70E740481C1C}">
+                          <a14:useLocalDpi xmlns:a14="http://schemas.microsoft.com/office/drawing/2010/main"/>
+                        </a:ext>
+                      </a:extLst>
+                    </a:blip>
+                    <a:stretch>
+                      <a:fillRect/>
+                    </a:stretch>
+                  </pic:blipFill>
+                  <pic:spPr>
+                    <a:xfrm>
+                      <a:off x="0" y="0"/>
+                      <a:ext cx="4267200" cy="5724525"/>
+                    </a:xfrm>
+                    <a:prstGeom prst="rect">
+                      <a:avLst/>
+                    </a:prstGeom>
+                  </pic:spPr>
+                </pic:pic>
+              </a:graphicData>
+            </a:graphic>
+          </wp:inline>
+        </w:drawing>
+      </w:r>
+      <w:r>
+        <w:rPr>
+          <w:b w:val="1"/>
+          <w:bCs w:val="1"/>
+          <w:sz w:val="28"/>
+          <w:szCs w:val="28"/>
+          <w:rtl w:val="1"/>
+          <w:lang w:val="en-US"/>
+        </w:rPr>
+        <w:t xml:space="preserve"> </w:t>
+      </w:r>
+    </w:p>
+    <w:p>
+      <w:pPr>
+        <w:pStyle w:val="Normal"/>
+        <w:suppressLineNumbers w:val="0"/>
+        <w:bidi w:val="1"/>
+        <w:spacing w:before="0" w:beforeAutospacing="off" w:after="160" w:afterAutospacing="off" w:line="259" w:lineRule="auto"/>
+        <w:ind w:left="0" w:right="0"/>
+        <w:jc w:val="center"/>
+        <w:rPr>
+          <w:b w:val="1"/>
+          <w:bCs w:val="1"/>
+          <w:sz w:val="28"/>
+          <w:szCs w:val="28"/>
+          <w:lang w:val="en-US"/>
+        </w:rPr>
+      </w:pPr>
+      <w:r>
+        <w:drawing>
+          <wp:inline wp14:editId="5A83F37A" wp14:anchorId="2827C006">
+            <wp:extent cx="4495800" cy="5724525"/>
+            <wp:effectExtent l="0" t="0" r="0" b="0"/>
+            <wp:docPr id="1558740901" name="drawing"/>
+            <wp:cNvGraphicFramePr>
+              <a:graphicFrameLocks noChangeAspect="1"/>
+            </wp:cNvGraphicFramePr>
+            <a:graphic>
+              <a:graphicData xmlns:a="http://schemas.openxmlformats.org/drawingml/2006/main" uri="http://schemas.openxmlformats.org/drawingml/2006/picture">
+                <pic:pic xmlns:pic="http://schemas.openxmlformats.org/drawingml/2006/picture">
+                  <pic:nvPicPr>
+                    <pic:cNvPr id="1558740901" name="Picture 1558740901"/>
+                    <pic:cNvPicPr/>
+                  </pic:nvPicPr>
+                  <pic:blipFill>
+                    <a:blip xmlns:r="http://schemas.openxmlformats.org/officeDocument/2006/relationships" r:embed="rId1816278683">
+                      <a:extLst>
+                        <a:ext uri="{28A0092B-C50C-407E-A947-70E740481C1C}">
+                          <a14:useLocalDpi xmlns:a14="http://schemas.microsoft.com/office/drawing/2010/main"/>
+                        </a:ext>
+                      </a:extLst>
+                    </a:blip>
+                    <a:stretch>
+                      <a:fillRect/>
+                    </a:stretch>
+                  </pic:blipFill>
+                  <pic:spPr>
+                    <a:xfrm>
+                      <a:off x="0" y="0"/>
+                      <a:ext cx="4495800" cy="5724525"/>
+                    </a:xfrm>
+                    <a:prstGeom prst="rect">
+                      <a:avLst/>
+                    </a:prstGeom>
+                  </pic:spPr>
+                </pic:pic>
+              </a:graphicData>
+            </a:graphic>
+          </wp:inline>
+        </w:drawing>
+      </w:r>
+    </w:p>
+    <w:p>
+      <w:pPr>
+        <w:pStyle w:val="Normal"/>
+        <w:suppressLineNumbers w:val="0"/>
+        <w:bidi w:val="1"/>
+        <w:spacing w:before="0" w:beforeAutospacing="off" w:after="160" w:afterAutospacing="off" w:line="259" w:lineRule="auto"/>
+        <w:ind w:left="0" w:right="0"/>
+        <w:jc w:val="center"/>
+        <w:rPr>
+          <w:b w:val="1"/>
+          <w:bCs w:val="1"/>
+          <w:sz w:val="28"/>
+          <w:szCs w:val="28"/>
+          <w:lang w:val="en-US"/>
+        </w:rPr>
+      </w:pPr>
+      <w:r>
+        <w:drawing>
+          <wp:inline wp14:editId="4BB98A76" wp14:anchorId="0ADFBB00">
+            <wp:extent cx="5657850" cy="5438775"/>
+            <wp:effectExtent l="0" t="0" r="0" b="0"/>
+            <wp:docPr id="637726740" name="drawing"/>
+            <wp:cNvGraphicFramePr>
+              <a:graphicFrameLocks noChangeAspect="1"/>
+            </wp:cNvGraphicFramePr>
+            <a:graphic>
+              <a:graphicData xmlns:a="http://schemas.openxmlformats.org/drawingml/2006/main" uri="http://schemas.openxmlformats.org/drawingml/2006/picture">
+                <pic:pic xmlns:pic="http://schemas.openxmlformats.org/drawingml/2006/picture">
+                  <pic:nvPicPr>
+                    <pic:cNvPr id="637726740" name="Picture 637726740"/>
+                    <pic:cNvPicPr/>
+                  </pic:nvPicPr>
+                  <pic:blipFill>
+                    <a:blip xmlns:r="http://schemas.openxmlformats.org/officeDocument/2006/relationships" r:embed="rId540263310">
+                      <a:extLst>
+                        <a:ext uri="{28A0092B-C50C-407E-A947-70E740481C1C}">
+                          <a14:useLocalDpi xmlns:a14="http://schemas.microsoft.com/office/drawing/2010/main"/>
+                        </a:ext>
+                      </a:extLst>
+                    </a:blip>
+                    <a:stretch>
+                      <a:fillRect/>
+                    </a:stretch>
+                  </pic:blipFill>
+                  <pic:spPr>
+                    <a:xfrm>
+                      <a:off x="0" y="0"/>
+                      <a:ext cx="5657850" cy="5438775"/>
+                    </a:xfrm>
+                    <a:prstGeom prst="rect">
+                      <a:avLst/>
+                    </a:prstGeom>
+                  </pic:spPr>
+                </pic:pic>
+              </a:graphicData>
+            </a:graphic>
+          </wp:inline>
+        </w:drawing>
+      </w:r>
+    </w:p>
+    <w:p>
+      <w:pPr>
+        <w:pStyle w:val="Normal"/>
+        <w:suppressLineNumbers w:val="0"/>
+        <w:bidi w:val="1"/>
+        <w:spacing w:before="0" w:beforeAutospacing="off" w:after="160" w:afterAutospacing="off" w:line="259" w:lineRule="auto"/>
+        <w:ind w:left="0" w:right="0"/>
+        <w:jc w:val="center"/>
+        <w:rPr>
+          <w:b w:val="1"/>
+          <w:bCs w:val="1"/>
+          <w:sz w:val="28"/>
+          <w:szCs w:val="28"/>
+          <w:lang w:val="en-US"/>
+        </w:rPr>
+      </w:pPr>
+      <w:r>
+        <w:drawing>
+          <wp:inline wp14:editId="084A4F06" wp14:anchorId="77A60B94">
+            <wp:extent cx="5305425" cy="3619500"/>
+            <wp:effectExtent l="0" t="0" r="0" b="0"/>
+            <wp:docPr id="1308735261" name="drawing"/>
+            <wp:cNvGraphicFramePr>
+              <a:graphicFrameLocks noChangeAspect="1"/>
+            </wp:cNvGraphicFramePr>
+            <a:graphic>
+              <a:graphicData xmlns:a="http://schemas.openxmlformats.org/drawingml/2006/main" uri="http://schemas.openxmlformats.org/drawingml/2006/picture">
+                <pic:pic xmlns:pic="http://schemas.openxmlformats.org/drawingml/2006/picture">
+                  <pic:nvPicPr>
+                    <pic:cNvPr id="1308735261" name="Picture 1308735261"/>
+                    <pic:cNvPicPr/>
+                  </pic:nvPicPr>
+                  <pic:blipFill>
+                    <a:blip xmlns:r="http://schemas.openxmlformats.org/officeDocument/2006/relationships" r:embed="rId1860771858">
+                      <a:extLst>
+                        <a:ext uri="{28A0092B-C50C-407E-A947-70E740481C1C}">
+                          <a14:useLocalDpi xmlns:a14="http://schemas.microsoft.com/office/drawing/2010/main"/>
+                        </a:ext>
+                      </a:extLst>
+                    </a:blip>
+                    <a:stretch>
+                      <a:fillRect/>
+                    </a:stretch>
+                  </pic:blipFill>
+                  <pic:spPr>
+                    <a:xfrm>
+                      <a:off x="0" y="0"/>
+                      <a:ext cx="5305425" cy="3619500"/>
+                    </a:xfrm>
+                    <a:prstGeom prst="rect">
+                      <a:avLst/>
+                    </a:prstGeom>
+                  </pic:spPr>
+                </pic:pic>
+              </a:graphicData>
+            </a:graphic>
+          </wp:inline>
+        </w:drawing>
+      </w:r>
+    </w:p>
+    <w:p>
+      <w:pPr>
+        <w:pStyle w:val="Normal"/>
+        <w:suppressLineNumbers w:val="0"/>
+        <w:bidi w:val="1"/>
+        <w:spacing w:before="0" w:beforeAutospacing="off" w:after="160" w:afterAutospacing="off" w:line="259" w:lineRule="auto"/>
+        <w:ind w:left="0" w:right="0"/>
+        <w:jc w:val="center"/>
+        <w:rPr>
+          <w:b w:val="1"/>
+          <w:bCs w:val="1"/>
+          <w:sz w:val="28"/>
+          <w:szCs w:val="28"/>
+          <w:lang w:val="en-US"/>
+        </w:rPr>
+      </w:pPr>
+      <w:r>
+        <w:drawing>
+          <wp:inline wp14:editId="502E4B27" wp14:anchorId="77DC3BE5">
+            <wp:extent cx="5514975" cy="4467225"/>
+            <wp:effectExtent l="0" t="0" r="0" b="0"/>
+            <wp:docPr id="1281609463" name="drawing"/>
+            <wp:cNvGraphicFramePr>
+              <a:graphicFrameLocks noChangeAspect="1"/>
+            </wp:cNvGraphicFramePr>
+            <a:graphic>
+              <a:graphicData xmlns:a="http://schemas.openxmlformats.org/drawingml/2006/main" uri="http://schemas.openxmlformats.org/drawingml/2006/picture">
+                <pic:pic xmlns:pic="http://schemas.openxmlformats.org/drawingml/2006/picture">
+                  <pic:nvPicPr>
+                    <pic:cNvPr id="1281609463" name="Picture 1281609463"/>
+                    <pic:cNvPicPr/>
+                  </pic:nvPicPr>
+                  <pic:blipFill>
+                    <a:blip xmlns:r="http://schemas.openxmlformats.org/officeDocument/2006/relationships" r:embed="rId932671847">
+                      <a:extLst>
+                        <a:ext uri="{28A0092B-C50C-407E-A947-70E740481C1C}">
+                          <a14:useLocalDpi xmlns:a14="http://schemas.microsoft.com/office/drawing/2010/main"/>
+                        </a:ext>
+                      </a:extLst>
+                    </a:blip>
+                    <a:stretch>
+                      <a:fillRect/>
+                    </a:stretch>
+                  </pic:blipFill>
+                  <pic:spPr>
+                    <a:xfrm>
+                      <a:off x="0" y="0"/>
+                      <a:ext cx="5514975" cy="4467225"/>
+                    </a:xfrm>
+                    <a:prstGeom prst="rect">
+                      <a:avLst/>
+                    </a:prstGeom>
+                  </pic:spPr>
+                </pic:pic>
+              </a:graphicData>
+            </a:graphic>
+          </wp:inline>
+        </w:drawing>
+      </w:r>
+    </w:p>
+    <w:p>
+      <w:pPr>
+        <w:pStyle w:val="Normal"/>
+        <w:suppressLineNumbers w:val="0"/>
+        <w:bidi w:val="1"/>
+        <w:spacing w:before="0" w:beforeAutospacing="off" w:after="160" w:afterAutospacing="off" w:line="259" w:lineRule="auto"/>
+        <w:ind w:left="0" w:right="0"/>
+        <w:jc w:val="center"/>
+        <w:rPr>
+          <w:b w:val="1"/>
+          <w:bCs w:val="1"/>
+          <w:sz w:val="28"/>
+          <w:szCs w:val="28"/>
+          <w:lang w:val="en-US"/>
+        </w:rPr>
+      </w:pPr>
+    </w:p>
+    <w:p>
+      <w:pPr>
+        <w:pStyle w:val="Normal"/>
+        <w:suppressLineNumbers w:val="0"/>
+        <w:bidi w:val="1"/>
+        <w:spacing w:before="0" w:beforeAutospacing="off" w:after="160" w:afterAutospacing="off" w:line="259" w:lineRule="auto"/>
+        <w:ind w:left="0" w:right="0"/>
+        <w:jc w:val="center"/>
+        <w:rPr>
+          <w:b w:val="1"/>
+          <w:bCs w:val="1"/>
+          <w:sz w:val="28"/>
+          <w:szCs w:val="28"/>
+          <w:lang w:val="en-US"/>
+        </w:rPr>
+      </w:pPr>
+      <w:r>
+        <w:rPr>
+          <w:b w:val="1"/>
+          <w:bCs w:val="1"/>
+          <w:sz w:val="28"/>
+          <w:szCs w:val="28"/>
+          <w:rtl w:val="1"/>
+          <w:lang w:val="en-US"/>
+        </w:rPr>
+        <w:t>תרשים</w:t>
+      </w:r>
+      <w:r>
+        <w:rPr>
+          <w:b w:val="1"/>
+          <w:bCs w:val="1"/>
+          <w:sz w:val="28"/>
+          <w:szCs w:val="28"/>
+          <w:rtl w:val="1"/>
+          <w:lang w:val="en-US"/>
+        </w:rPr>
+        <w:t xml:space="preserve"> פריסה</w:t>
+      </w:r>
+    </w:p>
+    <w:p>
+      <w:pPr>
+        <w:pStyle w:val="Normal"/>
+        <w:suppressLineNumbers w:val="0"/>
+        <w:bidi w:val="1"/>
+        <w:spacing w:before="0" w:beforeAutospacing="off" w:after="160" w:afterAutospacing="off" w:line="259" w:lineRule="auto"/>
+        <w:ind w:left="0" w:right="0"/>
+        <w:jc w:val="center"/>
+        <w:rPr>
+          <w:b w:val="1"/>
+          <w:bCs w:val="1"/>
+          <w:sz w:val="28"/>
+          <w:szCs w:val="28"/>
+          <w:lang w:val="en-US"/>
+        </w:rPr>
+      </w:pPr>
+      <w:r>
+        <w:drawing>
+          <wp:inline wp14:editId="65D8F92A" wp14:anchorId="0B824320">
             <wp:extent cx="5724525" cy="5400675"/>
             <wp:effectExtent l="0" t="0" r="0" b="0"/>
             <wp:docPr id="710942909" name="drawing"/>
@@ -33460,16 +34056,3946 @@
         </w:drawing>
       </w:r>
     </w:p>
+    <w:p>
+      <w:pPr>
+        <w:pStyle w:val="Normal"/>
+        <w:suppressLineNumbers w:val="0"/>
+        <w:bidi w:val="1"/>
+        <w:spacing w:before="0" w:beforeAutospacing="off" w:after="160" w:afterAutospacing="off" w:line="259" w:lineRule="auto"/>
+        <w:ind w:left="0" w:right="0"/>
+        <w:jc w:val="center"/>
+        <w:rPr>
+          <w:b w:val="1"/>
+          <w:bCs w:val="1"/>
+          <w:sz w:val="28"/>
+          <w:szCs w:val="28"/>
+          <w:lang w:val="en-US"/>
+        </w:rPr>
+      </w:pPr>
+    </w:p>
+    <w:p>
+      <w:pPr>
+        <w:pStyle w:val="Normal"/>
+        <w:suppressLineNumbers w:val="0"/>
+        <w:bidi w:val="1"/>
+        <w:spacing w:before="0" w:beforeAutospacing="off" w:after="160" w:afterAutospacing="off" w:line="259" w:lineRule="auto"/>
+        <w:ind w:left="0" w:right="0"/>
+        <w:jc w:val="center"/>
+        <w:rPr>
+          <w:b w:val="1"/>
+          <w:bCs w:val="1"/>
+          <w:sz w:val="28"/>
+          <w:szCs w:val="28"/>
+          <w:lang w:val="en-US"/>
+        </w:rPr>
+      </w:pPr>
+    </w:p>
+    <w:p>
+      <w:pPr>
+        <w:pStyle w:val="Normal"/>
+        <w:suppressLineNumbers w:val="0"/>
+        <w:bidi w:val="1"/>
+        <w:spacing w:before="0" w:beforeAutospacing="off" w:after="160" w:afterAutospacing="off" w:line="259" w:lineRule="auto"/>
+        <w:ind w:left="0" w:right="0"/>
+        <w:jc w:val="center"/>
+        <w:rPr>
+          <w:b w:val="1"/>
+          <w:bCs w:val="1"/>
+          <w:sz w:val="28"/>
+          <w:szCs w:val="28"/>
+          <w:lang w:val="en-US"/>
+        </w:rPr>
+      </w:pPr>
+    </w:p>
+    <w:p>
+      <w:pPr>
+        <w:pStyle w:val="Normal"/>
+        <w:suppressLineNumbers w:val="0"/>
+        <w:bidi w:val="1"/>
+        <w:spacing w:before="0" w:beforeAutospacing="off" w:after="160" w:afterAutospacing="off" w:line="259" w:lineRule="auto"/>
+        <w:ind w:left="0" w:right="0"/>
+        <w:jc w:val="center"/>
+        <w:rPr>
+          <w:b w:val="1"/>
+          <w:bCs w:val="1"/>
+          <w:sz w:val="28"/>
+          <w:szCs w:val="28"/>
+          <w:lang w:val="en-US"/>
+        </w:rPr>
+      </w:pPr>
+    </w:p>
+    <w:p>
+      <w:pPr>
+        <w:pStyle w:val="Normal"/>
+        <w:suppressLineNumbers w:val="0"/>
+        <w:bidi w:val="1"/>
+        <w:spacing w:before="0" w:beforeAutospacing="off" w:after="160" w:afterAutospacing="off" w:line="259" w:lineRule="auto"/>
+        <w:ind w:left="0" w:right="0"/>
+        <w:jc w:val="center"/>
+        <w:rPr>
+          <w:b w:val="1"/>
+          <w:bCs w:val="1"/>
+          <w:sz w:val="28"/>
+          <w:szCs w:val="28"/>
+          <w:lang w:val="en-US"/>
+        </w:rPr>
+      </w:pPr>
+    </w:p>
+    <w:p>
+      <w:pPr>
+        <w:pStyle w:val="Normal"/>
+        <w:suppressLineNumbers w:val="0"/>
+        <w:bidi w:val="1"/>
+        <w:spacing w:before="0" w:beforeAutospacing="off" w:after="160" w:afterAutospacing="off" w:line="259" w:lineRule="auto"/>
+        <w:ind w:left="0" w:right="0"/>
+        <w:jc w:val="center"/>
+        <w:rPr>
+          <w:b w:val="1"/>
+          <w:bCs w:val="1"/>
+          <w:sz w:val="28"/>
+          <w:szCs w:val="28"/>
+          <w:lang w:val="en-US"/>
+        </w:rPr>
+      </w:pPr>
+    </w:p>
+    <w:p>
+      <w:pPr>
+        <w:pStyle w:val="Normal"/>
+        <w:suppressLineNumbers w:val="0"/>
+        <w:bidi w:val="1"/>
+        <w:spacing w:before="0" w:beforeAutospacing="off" w:after="160" w:afterAutospacing="off" w:line="259" w:lineRule="auto"/>
+        <w:ind w:left="0" w:right="0"/>
+        <w:jc w:val="center"/>
+        <w:rPr>
+          <w:b w:val="1"/>
+          <w:bCs w:val="1"/>
+          <w:sz w:val="28"/>
+          <w:szCs w:val="28"/>
+          <w:lang w:val="en-US"/>
+        </w:rPr>
+      </w:pPr>
+    </w:p>
+    <w:p>
+      <w:pPr>
+        <w:pStyle w:val="Normal"/>
+        <w:suppressLineNumbers w:val="0"/>
+        <w:bidi w:val="1"/>
+        <w:spacing w:before="0" w:beforeAutospacing="off" w:after="160" w:afterAutospacing="off" w:line="259" w:lineRule="auto"/>
+        <w:ind w:left="0" w:right="0"/>
+        <w:jc w:val="center"/>
+        <w:rPr>
+          <w:b w:val="1"/>
+          <w:bCs w:val="1"/>
+          <w:sz w:val="28"/>
+          <w:szCs w:val="28"/>
+          <w:lang w:val="en-US"/>
+        </w:rPr>
+      </w:pPr>
+    </w:p>
+    <w:p>
+      <w:pPr>
+        <w:pStyle w:val="Normal"/>
+        <w:suppressLineNumbers w:val="0"/>
+        <w:bidi w:val="1"/>
+        <w:spacing w:before="0" w:beforeAutospacing="off" w:after="160" w:afterAutospacing="off" w:line="259" w:lineRule="auto"/>
+        <w:ind w:left="0" w:right="0"/>
+        <w:jc w:val="center"/>
+        <w:rPr>
+          <w:b w:val="1"/>
+          <w:bCs w:val="1"/>
+          <w:sz w:val="28"/>
+          <w:szCs w:val="28"/>
+          <w:lang w:val="en-US"/>
+        </w:rPr>
+      </w:pPr>
+      <w:r>
+        <w:rPr>
+          <w:b w:val="1"/>
+          <w:bCs w:val="1"/>
+          <w:sz w:val="28"/>
+          <w:szCs w:val="28"/>
+          <w:rtl w:val="1"/>
+          <w:lang w:val="en-US"/>
+        </w:rPr>
+        <w:t>לסיכום</w:t>
+      </w:r>
+    </w:p>
+    <w:p>
+      <w:pPr>
+        <w:bidi w:val="0"/>
+        <w:spacing w:before="0" w:beforeAutospacing="off" w:after="240" w:afterAutospacing="off"/>
+        <w:jc w:val="center"/>
+      </w:pPr>
+      <w:r>
+        <w:rPr>
+          <w:rFonts w:ascii="Aptos" w:hAnsi="Aptos" w:eastAsia="Aptos" w:cs="Aptos"/>
+          <w:noProof w:val="0"/>
+          <w:sz w:val="22"/>
+          <w:szCs w:val="22"/>
+          <w:rtl w:val="1"/>
+          <w:lang w:val="en-US"/>
+        </w:rPr>
+        <w:t>מסמך</w:t>
+      </w:r>
+      <w:r>
+        <w:rPr>
+          <w:rFonts w:ascii="Aptos" w:hAnsi="Aptos" w:eastAsia="Aptos" w:cs="Aptos"/>
+          <w:noProof w:val="0"/>
+          <w:sz w:val="22"/>
+          <w:szCs w:val="22"/>
+          <w:rtl w:val="1"/>
+          <w:lang w:val="en-US"/>
+        </w:rPr>
+        <w:t xml:space="preserve"> </w:t>
+      </w:r>
+      <w:r>
+        <w:rPr>
+          <w:rFonts w:ascii="Aptos" w:hAnsi="Aptos" w:eastAsia="Aptos" w:cs="Aptos"/>
+          <w:noProof w:val="0"/>
+          <w:sz w:val="22"/>
+          <w:szCs w:val="22"/>
+          <w:rtl w:val="1"/>
+          <w:lang w:val="en-US"/>
+        </w:rPr>
+        <w:t>אפיון</w:t>
+      </w:r>
+      <w:r>
+        <w:rPr>
+          <w:rFonts w:ascii="Aptos" w:hAnsi="Aptos" w:eastAsia="Aptos" w:cs="Aptos"/>
+          <w:noProof w:val="0"/>
+          <w:sz w:val="22"/>
+          <w:szCs w:val="22"/>
+          <w:rtl w:val="1"/>
+          <w:lang w:val="en-US"/>
+        </w:rPr>
+        <w:t xml:space="preserve"> </w:t>
+      </w:r>
+      <w:r>
+        <w:rPr>
+          <w:rFonts w:ascii="Aptos" w:hAnsi="Aptos" w:eastAsia="Aptos" w:cs="Aptos"/>
+          <w:noProof w:val="0"/>
+          <w:sz w:val="22"/>
+          <w:szCs w:val="22"/>
+          <w:rtl w:val="1"/>
+          <w:lang w:val="en-US"/>
+        </w:rPr>
+        <w:t>זה</w:t>
+      </w:r>
+      <w:r>
+        <w:rPr>
+          <w:rFonts w:ascii="Aptos" w:hAnsi="Aptos" w:eastAsia="Aptos" w:cs="Aptos"/>
+          <w:noProof w:val="0"/>
+          <w:sz w:val="22"/>
+          <w:szCs w:val="22"/>
+          <w:rtl w:val="1"/>
+          <w:lang w:val="en-US"/>
+        </w:rPr>
+        <w:t xml:space="preserve"> </w:t>
+      </w:r>
+      <w:r>
+        <w:rPr>
+          <w:rFonts w:ascii="Aptos" w:hAnsi="Aptos" w:eastAsia="Aptos" w:cs="Aptos"/>
+          <w:noProof w:val="0"/>
+          <w:sz w:val="22"/>
+          <w:szCs w:val="22"/>
+          <w:rtl w:val="1"/>
+          <w:lang w:val="en-US"/>
+        </w:rPr>
+        <w:t>הציג</w:t>
+      </w:r>
+      <w:r>
+        <w:rPr>
+          <w:rFonts w:ascii="Aptos" w:hAnsi="Aptos" w:eastAsia="Aptos" w:cs="Aptos"/>
+          <w:noProof w:val="0"/>
+          <w:sz w:val="22"/>
+          <w:szCs w:val="22"/>
+          <w:rtl w:val="1"/>
+          <w:lang w:val="en-US"/>
+        </w:rPr>
+        <w:t xml:space="preserve"> </w:t>
+      </w:r>
+      <w:r>
+        <w:rPr>
+          <w:rFonts w:ascii="Aptos" w:hAnsi="Aptos" w:eastAsia="Aptos" w:cs="Aptos"/>
+          <w:noProof w:val="0"/>
+          <w:sz w:val="22"/>
+          <w:szCs w:val="22"/>
+          <w:rtl w:val="1"/>
+          <w:lang w:val="en-US"/>
+        </w:rPr>
+        <w:t>תכנון</w:t>
+      </w:r>
+      <w:r>
+        <w:rPr>
+          <w:rFonts w:ascii="Aptos" w:hAnsi="Aptos" w:eastAsia="Aptos" w:cs="Aptos"/>
+          <w:noProof w:val="0"/>
+          <w:sz w:val="22"/>
+          <w:szCs w:val="22"/>
+          <w:rtl w:val="1"/>
+          <w:lang w:val="en-US"/>
+        </w:rPr>
+        <w:t xml:space="preserve"> </w:t>
+      </w:r>
+      <w:r>
+        <w:rPr>
+          <w:rFonts w:ascii="Aptos" w:hAnsi="Aptos" w:eastAsia="Aptos" w:cs="Aptos"/>
+          <w:noProof w:val="0"/>
+          <w:sz w:val="22"/>
+          <w:szCs w:val="22"/>
+          <w:rtl w:val="1"/>
+          <w:lang w:val="en-US"/>
+        </w:rPr>
+        <w:t>מפורט</w:t>
+      </w:r>
+      <w:r>
+        <w:rPr>
+          <w:rFonts w:ascii="Aptos" w:hAnsi="Aptos" w:eastAsia="Aptos" w:cs="Aptos"/>
+          <w:noProof w:val="0"/>
+          <w:sz w:val="22"/>
+          <w:szCs w:val="22"/>
+          <w:rtl w:val="1"/>
+          <w:lang w:val="en-US"/>
+        </w:rPr>
+        <w:t xml:space="preserve"> </w:t>
+      </w:r>
+      <w:r>
+        <w:rPr>
+          <w:rFonts w:ascii="Aptos" w:hAnsi="Aptos" w:eastAsia="Aptos" w:cs="Aptos"/>
+          <w:noProof w:val="0"/>
+          <w:sz w:val="22"/>
+          <w:szCs w:val="22"/>
+          <w:rtl w:val="1"/>
+          <w:lang w:val="en-US"/>
+        </w:rPr>
+        <w:t>למערכת</w:t>
+      </w:r>
+      <w:r>
+        <w:rPr>
+          <w:rFonts w:ascii="Aptos" w:hAnsi="Aptos" w:eastAsia="Aptos" w:cs="Aptos"/>
+          <w:noProof w:val="0"/>
+          <w:sz w:val="22"/>
+          <w:szCs w:val="22"/>
+          <w:lang w:val="en-US"/>
+        </w:rPr>
+        <w:t xml:space="preserve"> </w:t>
+      </w:r>
+      <w:r>
+        <w:rPr>
+          <w:rFonts w:ascii="Aptos" w:hAnsi="Aptos" w:eastAsia="Aptos" w:cs="Aptos"/>
+          <w:b w:val="1"/>
+          <w:bCs w:val="1"/>
+          <w:noProof w:val="0"/>
+          <w:sz w:val="22"/>
+          <w:szCs w:val="22"/>
+          <w:lang w:val="en-US"/>
+        </w:rPr>
+        <w:t>IDS (Intrusion Detection System)</w:t>
+      </w:r>
+      <w:r>
+        <w:rPr>
+          <w:rFonts w:ascii="Aptos" w:hAnsi="Aptos" w:eastAsia="Aptos" w:cs="Aptos"/>
+          <w:noProof w:val="0"/>
+          <w:sz w:val="22"/>
+          <w:szCs w:val="22"/>
+          <w:lang w:val="en-US"/>
+        </w:rPr>
+        <w:t xml:space="preserve"> </w:t>
+      </w:r>
+      <w:r>
+        <w:rPr>
+          <w:rFonts w:ascii="Aptos" w:hAnsi="Aptos" w:eastAsia="Aptos" w:cs="Aptos"/>
+          <w:noProof w:val="0"/>
+          <w:sz w:val="22"/>
+          <w:szCs w:val="22"/>
+          <w:rtl w:val="1"/>
+          <w:lang w:val="en-US"/>
+        </w:rPr>
+        <w:t>המיועדת</w:t>
+      </w:r>
+      <w:r>
+        <w:rPr>
+          <w:rFonts w:ascii="Aptos" w:hAnsi="Aptos" w:eastAsia="Aptos" w:cs="Aptos"/>
+          <w:noProof w:val="0"/>
+          <w:sz w:val="22"/>
+          <w:szCs w:val="22"/>
+          <w:rtl w:val="1"/>
+          <w:lang w:val="en-US"/>
+        </w:rPr>
+        <w:t xml:space="preserve"> </w:t>
+      </w:r>
+      <w:r>
+        <w:rPr>
+          <w:rFonts w:ascii="Aptos" w:hAnsi="Aptos" w:eastAsia="Aptos" w:cs="Aptos"/>
+          <w:noProof w:val="0"/>
+          <w:sz w:val="22"/>
+          <w:szCs w:val="22"/>
+          <w:rtl w:val="1"/>
+          <w:lang w:val="en-US"/>
+        </w:rPr>
+        <w:t>לזיהוי</w:t>
+      </w:r>
+      <w:r>
+        <w:rPr>
+          <w:rFonts w:ascii="Aptos" w:hAnsi="Aptos" w:eastAsia="Aptos" w:cs="Aptos"/>
+          <w:noProof w:val="0"/>
+          <w:sz w:val="22"/>
+          <w:szCs w:val="22"/>
+          <w:rtl w:val="1"/>
+          <w:lang w:val="en-US"/>
+        </w:rPr>
+        <w:t xml:space="preserve"> </w:t>
+      </w:r>
+      <w:r>
+        <w:rPr>
+          <w:rFonts w:ascii="Aptos" w:hAnsi="Aptos" w:eastAsia="Aptos" w:cs="Aptos"/>
+          <w:noProof w:val="0"/>
+          <w:sz w:val="22"/>
+          <w:szCs w:val="22"/>
+          <w:rtl w:val="1"/>
+          <w:lang w:val="en-US"/>
+        </w:rPr>
+        <w:t>חדירות</w:t>
+      </w:r>
+      <w:r>
+        <w:rPr>
+          <w:rFonts w:ascii="Aptos" w:hAnsi="Aptos" w:eastAsia="Aptos" w:cs="Aptos"/>
+          <w:noProof w:val="0"/>
+          <w:sz w:val="22"/>
+          <w:szCs w:val="22"/>
+          <w:rtl w:val="1"/>
+          <w:lang w:val="en-US"/>
+        </w:rPr>
+        <w:t xml:space="preserve"> </w:t>
+      </w:r>
+      <w:r>
+        <w:rPr>
+          <w:rFonts w:ascii="Aptos" w:hAnsi="Aptos" w:eastAsia="Aptos" w:cs="Aptos"/>
+          <w:noProof w:val="0"/>
+          <w:sz w:val="22"/>
+          <w:szCs w:val="22"/>
+          <w:rtl w:val="1"/>
+          <w:lang w:val="en-US"/>
+        </w:rPr>
+        <w:t>ואיומי</w:t>
+      </w:r>
+      <w:r>
+        <w:rPr>
+          <w:rFonts w:ascii="Aptos" w:hAnsi="Aptos" w:eastAsia="Aptos" w:cs="Aptos"/>
+          <w:noProof w:val="0"/>
+          <w:sz w:val="22"/>
+          <w:szCs w:val="22"/>
+          <w:rtl w:val="1"/>
+          <w:lang w:val="en-US"/>
+        </w:rPr>
+        <w:t xml:space="preserve"> </w:t>
+      </w:r>
+      <w:r>
+        <w:rPr>
+          <w:rFonts w:ascii="Aptos" w:hAnsi="Aptos" w:eastAsia="Aptos" w:cs="Aptos"/>
+          <w:noProof w:val="0"/>
+          <w:sz w:val="22"/>
+          <w:szCs w:val="22"/>
+          <w:rtl w:val="1"/>
+          <w:lang w:val="en-US"/>
+        </w:rPr>
+        <w:t>סייבר</w:t>
+      </w:r>
+      <w:r>
+        <w:rPr>
+          <w:rFonts w:ascii="Aptos" w:hAnsi="Aptos" w:eastAsia="Aptos" w:cs="Aptos"/>
+          <w:noProof w:val="0"/>
+          <w:sz w:val="22"/>
+          <w:szCs w:val="22"/>
+          <w:rtl w:val="1"/>
+          <w:lang w:val="en-US"/>
+        </w:rPr>
+        <w:t xml:space="preserve"> </w:t>
+      </w:r>
+      <w:r>
+        <w:rPr>
+          <w:rFonts w:ascii="Aptos" w:hAnsi="Aptos" w:eastAsia="Aptos" w:cs="Aptos"/>
+          <w:noProof w:val="0"/>
+          <w:sz w:val="22"/>
+          <w:szCs w:val="22"/>
+          <w:rtl w:val="1"/>
+          <w:lang w:val="en-US"/>
+        </w:rPr>
+        <w:t>בזמן</w:t>
+      </w:r>
+      <w:r>
+        <w:rPr>
+          <w:rFonts w:ascii="Aptos" w:hAnsi="Aptos" w:eastAsia="Aptos" w:cs="Aptos"/>
+          <w:noProof w:val="0"/>
+          <w:sz w:val="22"/>
+          <w:szCs w:val="22"/>
+          <w:rtl w:val="1"/>
+          <w:lang w:val="en-US"/>
+        </w:rPr>
+        <w:t xml:space="preserve"> </w:t>
+      </w:r>
+      <w:r>
+        <w:rPr>
+          <w:rFonts w:ascii="Aptos" w:hAnsi="Aptos" w:eastAsia="Aptos" w:cs="Aptos"/>
+          <w:noProof w:val="0"/>
+          <w:sz w:val="22"/>
+          <w:szCs w:val="22"/>
+          <w:rtl w:val="1"/>
+          <w:lang w:val="en-US"/>
+        </w:rPr>
+        <w:t>אמת</w:t>
+      </w:r>
+      <w:r>
+        <w:rPr>
+          <w:rFonts w:ascii="Aptos" w:hAnsi="Aptos" w:eastAsia="Aptos" w:cs="Aptos"/>
+          <w:noProof w:val="0"/>
+          <w:sz w:val="22"/>
+          <w:szCs w:val="22"/>
+          <w:rtl w:val="1"/>
+          <w:lang w:val="en-US"/>
+        </w:rPr>
+        <w:t xml:space="preserve">. </w:t>
+      </w:r>
+      <w:r>
+        <w:rPr>
+          <w:rFonts w:ascii="Aptos" w:hAnsi="Aptos" w:eastAsia="Aptos" w:cs="Aptos"/>
+          <w:noProof w:val="0"/>
+          <w:sz w:val="22"/>
+          <w:szCs w:val="22"/>
+          <w:rtl w:val="1"/>
+          <w:lang w:val="en-US"/>
+        </w:rPr>
+        <w:t>לאורך</w:t>
+      </w:r>
+      <w:r>
+        <w:rPr>
+          <w:rFonts w:ascii="Aptos" w:hAnsi="Aptos" w:eastAsia="Aptos" w:cs="Aptos"/>
+          <w:noProof w:val="0"/>
+          <w:sz w:val="22"/>
+          <w:szCs w:val="22"/>
+          <w:rtl w:val="1"/>
+          <w:lang w:val="en-US"/>
+        </w:rPr>
+        <w:t xml:space="preserve"> </w:t>
+      </w:r>
+      <w:r>
+        <w:rPr>
+          <w:rFonts w:ascii="Aptos" w:hAnsi="Aptos" w:eastAsia="Aptos" w:cs="Aptos"/>
+          <w:noProof w:val="0"/>
+          <w:sz w:val="22"/>
+          <w:szCs w:val="22"/>
+          <w:rtl w:val="1"/>
+          <w:lang w:val="en-US"/>
+        </w:rPr>
+        <w:t>העבודה</w:t>
+      </w:r>
+      <w:r>
+        <w:rPr>
+          <w:rFonts w:ascii="Aptos" w:hAnsi="Aptos" w:eastAsia="Aptos" w:cs="Aptos"/>
+          <w:noProof w:val="0"/>
+          <w:sz w:val="22"/>
+          <w:szCs w:val="22"/>
+          <w:rtl w:val="1"/>
+          <w:lang w:val="en-US"/>
+        </w:rPr>
+        <w:t xml:space="preserve">, </w:t>
+      </w:r>
+      <w:r>
+        <w:rPr>
+          <w:rFonts w:ascii="Aptos" w:hAnsi="Aptos" w:eastAsia="Aptos" w:cs="Aptos"/>
+          <w:noProof w:val="0"/>
+          <w:sz w:val="22"/>
+          <w:szCs w:val="22"/>
+          <w:rtl w:val="1"/>
+          <w:lang w:val="en-US"/>
+        </w:rPr>
+        <w:t>נותחו</w:t>
+      </w:r>
+      <w:r>
+        <w:rPr>
+          <w:rFonts w:ascii="Aptos" w:hAnsi="Aptos" w:eastAsia="Aptos" w:cs="Aptos"/>
+          <w:noProof w:val="0"/>
+          <w:sz w:val="22"/>
+          <w:szCs w:val="22"/>
+          <w:rtl w:val="1"/>
+          <w:lang w:val="en-US"/>
+        </w:rPr>
+        <w:t xml:space="preserve"> </w:t>
+      </w:r>
+      <w:r>
+        <w:rPr>
+          <w:rFonts w:ascii="Aptos" w:hAnsi="Aptos" w:eastAsia="Aptos" w:cs="Aptos"/>
+          <w:noProof w:val="0"/>
+          <w:sz w:val="22"/>
+          <w:szCs w:val="22"/>
+          <w:rtl w:val="1"/>
+          <w:lang w:val="en-US"/>
+        </w:rPr>
+        <w:t>צרכי</w:t>
+      </w:r>
+      <w:r>
+        <w:rPr>
+          <w:rFonts w:ascii="Aptos" w:hAnsi="Aptos" w:eastAsia="Aptos" w:cs="Aptos"/>
+          <w:noProof w:val="0"/>
+          <w:sz w:val="22"/>
+          <w:szCs w:val="22"/>
+          <w:rtl w:val="1"/>
+          <w:lang w:val="en-US"/>
+        </w:rPr>
+        <w:t xml:space="preserve"> </w:t>
+      </w:r>
+      <w:r>
+        <w:rPr>
+          <w:rFonts w:ascii="Aptos" w:hAnsi="Aptos" w:eastAsia="Aptos" w:cs="Aptos"/>
+          <w:noProof w:val="0"/>
+          <w:sz w:val="22"/>
+          <w:szCs w:val="22"/>
+          <w:rtl w:val="1"/>
+          <w:lang w:val="en-US"/>
+        </w:rPr>
+        <w:t>הארגון</w:t>
+      </w:r>
+      <w:r>
+        <w:rPr>
+          <w:rFonts w:ascii="Aptos" w:hAnsi="Aptos" w:eastAsia="Aptos" w:cs="Aptos"/>
+          <w:noProof w:val="0"/>
+          <w:sz w:val="22"/>
+          <w:szCs w:val="22"/>
+          <w:rtl w:val="1"/>
+          <w:lang w:val="en-US"/>
+        </w:rPr>
+        <w:t xml:space="preserve"> </w:t>
+      </w:r>
+      <w:r>
+        <w:rPr>
+          <w:rFonts w:ascii="Aptos" w:hAnsi="Aptos" w:eastAsia="Aptos" w:cs="Aptos"/>
+          <w:noProof w:val="0"/>
+          <w:sz w:val="22"/>
+          <w:szCs w:val="22"/>
+          <w:rtl w:val="1"/>
+          <w:lang w:val="en-US"/>
+        </w:rPr>
+        <w:t>והפערים</w:t>
+      </w:r>
+      <w:r>
+        <w:rPr>
+          <w:rFonts w:ascii="Aptos" w:hAnsi="Aptos" w:eastAsia="Aptos" w:cs="Aptos"/>
+          <w:noProof w:val="0"/>
+          <w:sz w:val="22"/>
+          <w:szCs w:val="22"/>
+          <w:rtl w:val="1"/>
+          <w:lang w:val="en-US"/>
+        </w:rPr>
+        <w:t xml:space="preserve"> </w:t>
+      </w:r>
+      <w:r>
+        <w:rPr>
+          <w:rFonts w:ascii="Aptos" w:hAnsi="Aptos" w:eastAsia="Aptos" w:cs="Aptos"/>
+          <w:noProof w:val="0"/>
+          <w:sz w:val="22"/>
+          <w:szCs w:val="22"/>
+          <w:rtl w:val="1"/>
+          <w:lang w:val="en-US"/>
+        </w:rPr>
+        <w:t>הקיימים</w:t>
+      </w:r>
+      <w:r>
+        <w:rPr>
+          <w:rFonts w:ascii="Aptos" w:hAnsi="Aptos" w:eastAsia="Aptos" w:cs="Aptos"/>
+          <w:noProof w:val="0"/>
+          <w:sz w:val="22"/>
+          <w:szCs w:val="22"/>
+          <w:rtl w:val="1"/>
+          <w:lang w:val="en-US"/>
+        </w:rPr>
+        <w:t xml:space="preserve"> </w:t>
+      </w:r>
+      <w:r>
+        <w:rPr>
+          <w:rFonts w:ascii="Aptos" w:hAnsi="Aptos" w:eastAsia="Aptos" w:cs="Aptos"/>
+          <w:noProof w:val="0"/>
+          <w:sz w:val="22"/>
+          <w:szCs w:val="22"/>
+          <w:rtl w:val="1"/>
+          <w:lang w:val="en-US"/>
+        </w:rPr>
+        <w:t>במערכות</w:t>
+      </w:r>
+      <w:r>
+        <w:rPr>
+          <w:rFonts w:ascii="Aptos" w:hAnsi="Aptos" w:eastAsia="Aptos" w:cs="Aptos"/>
+          <w:noProof w:val="0"/>
+          <w:sz w:val="22"/>
+          <w:szCs w:val="22"/>
+          <w:rtl w:val="1"/>
+          <w:lang w:val="en-US"/>
+        </w:rPr>
+        <w:t xml:space="preserve"> </w:t>
+      </w:r>
+      <w:r>
+        <w:rPr>
+          <w:rFonts w:ascii="Aptos" w:hAnsi="Aptos" w:eastAsia="Aptos" w:cs="Aptos"/>
+          <w:noProof w:val="0"/>
+          <w:sz w:val="22"/>
+          <w:szCs w:val="22"/>
+          <w:rtl w:val="1"/>
+          <w:lang w:val="en-US"/>
+        </w:rPr>
+        <w:t>הניטור</w:t>
+      </w:r>
+      <w:r>
+        <w:rPr>
+          <w:rFonts w:ascii="Aptos" w:hAnsi="Aptos" w:eastAsia="Aptos" w:cs="Aptos"/>
+          <w:noProof w:val="0"/>
+          <w:sz w:val="22"/>
+          <w:szCs w:val="22"/>
+          <w:rtl w:val="1"/>
+          <w:lang w:val="en-US"/>
+        </w:rPr>
+        <w:t xml:space="preserve"> </w:t>
+      </w:r>
+      <w:r>
+        <w:rPr>
+          <w:rFonts w:ascii="Aptos" w:hAnsi="Aptos" w:eastAsia="Aptos" w:cs="Aptos"/>
+          <w:noProof w:val="0"/>
+          <w:sz w:val="22"/>
+          <w:szCs w:val="22"/>
+          <w:rtl w:val="1"/>
+          <w:lang w:val="en-US"/>
+        </w:rPr>
+        <w:t>הנוכחיות</w:t>
+      </w:r>
+      <w:r>
+        <w:rPr>
+          <w:rFonts w:ascii="Aptos" w:hAnsi="Aptos" w:eastAsia="Aptos" w:cs="Aptos"/>
+          <w:noProof w:val="0"/>
+          <w:sz w:val="22"/>
+          <w:szCs w:val="22"/>
+          <w:rtl w:val="1"/>
+          <w:lang w:val="en-US"/>
+        </w:rPr>
+        <w:t xml:space="preserve">, </w:t>
+      </w:r>
+      <w:r>
+        <w:rPr>
+          <w:rFonts w:ascii="Aptos" w:hAnsi="Aptos" w:eastAsia="Aptos" w:cs="Aptos"/>
+          <w:noProof w:val="0"/>
+          <w:sz w:val="22"/>
+          <w:szCs w:val="22"/>
+          <w:rtl w:val="1"/>
+          <w:lang w:val="en-US"/>
+        </w:rPr>
+        <w:t>אשר</w:t>
+      </w:r>
+      <w:r>
+        <w:rPr>
+          <w:rFonts w:ascii="Aptos" w:hAnsi="Aptos" w:eastAsia="Aptos" w:cs="Aptos"/>
+          <w:noProof w:val="0"/>
+          <w:sz w:val="22"/>
+          <w:szCs w:val="22"/>
+          <w:rtl w:val="1"/>
+          <w:lang w:val="en-US"/>
+        </w:rPr>
+        <w:t xml:space="preserve"> </w:t>
+      </w:r>
+      <w:r>
+        <w:rPr>
+          <w:rFonts w:ascii="Aptos" w:hAnsi="Aptos" w:eastAsia="Aptos" w:cs="Aptos"/>
+          <w:noProof w:val="0"/>
+          <w:sz w:val="22"/>
+          <w:szCs w:val="22"/>
+          <w:rtl w:val="1"/>
+          <w:lang w:val="en-US"/>
+        </w:rPr>
+        <w:t>הובילו</w:t>
+      </w:r>
+      <w:r>
+        <w:rPr>
+          <w:rFonts w:ascii="Aptos" w:hAnsi="Aptos" w:eastAsia="Aptos" w:cs="Aptos"/>
+          <w:noProof w:val="0"/>
+          <w:sz w:val="22"/>
+          <w:szCs w:val="22"/>
+          <w:rtl w:val="1"/>
+          <w:lang w:val="en-US"/>
+        </w:rPr>
+        <w:t xml:space="preserve"> </w:t>
+      </w:r>
+      <w:r>
+        <w:rPr>
+          <w:rFonts w:ascii="Aptos" w:hAnsi="Aptos" w:eastAsia="Aptos" w:cs="Aptos"/>
+          <w:noProof w:val="0"/>
+          <w:sz w:val="22"/>
+          <w:szCs w:val="22"/>
+          <w:rtl w:val="1"/>
+          <w:lang w:val="en-US"/>
+        </w:rPr>
+        <w:t>להגדרת</w:t>
+      </w:r>
+      <w:r>
+        <w:rPr>
+          <w:rFonts w:ascii="Aptos" w:hAnsi="Aptos" w:eastAsia="Aptos" w:cs="Aptos"/>
+          <w:noProof w:val="0"/>
+          <w:sz w:val="22"/>
+          <w:szCs w:val="22"/>
+          <w:rtl w:val="1"/>
+          <w:lang w:val="en-US"/>
+        </w:rPr>
+        <w:t xml:space="preserve"> </w:t>
+      </w:r>
+      <w:r>
+        <w:rPr>
+          <w:rFonts w:ascii="Aptos" w:hAnsi="Aptos" w:eastAsia="Aptos" w:cs="Aptos"/>
+          <w:noProof w:val="0"/>
+          <w:sz w:val="22"/>
+          <w:szCs w:val="22"/>
+          <w:rtl w:val="1"/>
+          <w:lang w:val="en-US"/>
+        </w:rPr>
+        <w:t>דרישות</w:t>
+      </w:r>
+      <w:r>
+        <w:rPr>
+          <w:rFonts w:ascii="Aptos" w:hAnsi="Aptos" w:eastAsia="Aptos" w:cs="Aptos"/>
+          <w:noProof w:val="0"/>
+          <w:sz w:val="22"/>
+          <w:szCs w:val="22"/>
+          <w:rtl w:val="1"/>
+          <w:lang w:val="en-US"/>
+        </w:rPr>
+        <w:t xml:space="preserve"> </w:t>
+      </w:r>
+      <w:r>
+        <w:rPr>
+          <w:rFonts w:ascii="Aptos" w:hAnsi="Aptos" w:eastAsia="Aptos" w:cs="Aptos"/>
+          <w:noProof w:val="0"/>
+          <w:sz w:val="22"/>
+          <w:szCs w:val="22"/>
+          <w:rtl w:val="1"/>
+          <w:lang w:val="en-US"/>
+        </w:rPr>
+        <w:t>פונקציונליות</w:t>
+      </w:r>
+      <w:r>
+        <w:rPr>
+          <w:rFonts w:ascii="Aptos" w:hAnsi="Aptos" w:eastAsia="Aptos" w:cs="Aptos"/>
+          <w:noProof w:val="0"/>
+          <w:sz w:val="22"/>
+          <w:szCs w:val="22"/>
+          <w:rtl w:val="1"/>
+          <w:lang w:val="en-US"/>
+        </w:rPr>
+        <w:t xml:space="preserve"> </w:t>
+      </w:r>
+      <w:r>
+        <w:rPr>
+          <w:rFonts w:ascii="Aptos" w:hAnsi="Aptos" w:eastAsia="Aptos" w:cs="Aptos"/>
+          <w:noProof w:val="0"/>
+          <w:sz w:val="22"/>
+          <w:szCs w:val="22"/>
+          <w:rtl w:val="1"/>
+          <w:lang w:val="en-US"/>
+        </w:rPr>
+        <w:t>ולא-פונקציונליות</w:t>
+      </w:r>
+      <w:r>
+        <w:rPr>
+          <w:rFonts w:ascii="Aptos" w:hAnsi="Aptos" w:eastAsia="Aptos" w:cs="Aptos"/>
+          <w:noProof w:val="0"/>
+          <w:sz w:val="22"/>
+          <w:szCs w:val="22"/>
+          <w:rtl w:val="1"/>
+          <w:lang w:val="en-US"/>
+        </w:rPr>
+        <w:t xml:space="preserve"> </w:t>
+      </w:r>
+      <w:r>
+        <w:rPr>
+          <w:rFonts w:ascii="Aptos" w:hAnsi="Aptos" w:eastAsia="Aptos" w:cs="Aptos"/>
+          <w:noProof w:val="0"/>
+          <w:sz w:val="22"/>
+          <w:szCs w:val="22"/>
+          <w:rtl w:val="1"/>
+          <w:lang w:val="en-US"/>
+        </w:rPr>
+        <w:t>קפדניות</w:t>
+      </w:r>
+      <w:r>
+        <w:rPr>
+          <w:rFonts w:ascii="Aptos" w:hAnsi="Aptos" w:eastAsia="Aptos" w:cs="Aptos"/>
+          <w:noProof w:val="0"/>
+          <w:sz w:val="22"/>
+          <w:szCs w:val="22"/>
+          <w:lang w:val="en-US"/>
+        </w:rPr>
+        <w:t xml:space="preserve"> .</w:t>
+      </w:r>
+    </w:p>
+    <w:p>
+      <w:pPr>
+        <w:bidi w:val="0"/>
+        <w:spacing w:before="0" w:beforeAutospacing="off" w:after="0" w:afterAutospacing="off"/>
+        <w:jc w:val="center"/>
+      </w:pPr>
+      <w:r>
+        <w:rPr>
+          <w:rFonts w:ascii="Aptos" w:hAnsi="Aptos" w:eastAsia="Aptos" w:cs="Aptos"/>
+          <w:noProof w:val="0"/>
+          <w:sz w:val="22"/>
+          <w:szCs w:val="22"/>
+          <w:lang w:val="en-US"/>
+        </w:rPr>
+        <w:t>+4</w:t>
+      </w:r>
+    </w:p>
+    <w:p>
+      <w:pPr>
+        <w:pStyle w:val="Heading3"/>
+        <w:bidi w:val="0"/>
+        <w:spacing w:before="281" w:beforeAutospacing="off" w:after="281" w:afterAutospacing="off"/>
+        <w:jc w:val="center"/>
+      </w:pPr>
+      <w:r>
+        <w:rPr>
+          <w:rFonts w:ascii="Aptos" w:hAnsi="Aptos" w:eastAsia="Aptos" w:cs="Aptos"/>
+          <w:noProof w:val="0"/>
+          <w:sz w:val="22"/>
+          <w:szCs w:val="22"/>
+          <w:rtl w:val="1"/>
+          <w:lang w:val="en-US"/>
+        </w:rPr>
+        <w:t>נקודות</w:t>
+      </w:r>
+      <w:r>
+        <w:rPr>
+          <w:rFonts w:ascii="Aptos" w:hAnsi="Aptos" w:eastAsia="Aptos" w:cs="Aptos"/>
+          <w:noProof w:val="0"/>
+          <w:sz w:val="22"/>
+          <w:szCs w:val="22"/>
+          <w:rtl w:val="1"/>
+          <w:lang w:val="en-US"/>
+        </w:rPr>
+        <w:t xml:space="preserve"> </w:t>
+      </w:r>
+      <w:r>
+        <w:rPr>
+          <w:rFonts w:ascii="Aptos" w:hAnsi="Aptos" w:eastAsia="Aptos" w:cs="Aptos"/>
+          <w:noProof w:val="0"/>
+          <w:sz w:val="22"/>
+          <w:szCs w:val="22"/>
+          <w:rtl w:val="1"/>
+          <w:lang w:val="en-US"/>
+        </w:rPr>
+        <w:t>מפתח</w:t>
+      </w:r>
+      <w:r>
+        <w:rPr>
+          <w:rFonts w:ascii="Aptos" w:hAnsi="Aptos" w:eastAsia="Aptos" w:cs="Aptos"/>
+          <w:noProof w:val="0"/>
+          <w:sz w:val="22"/>
+          <w:szCs w:val="22"/>
+          <w:rtl w:val="1"/>
+          <w:lang w:val="en-US"/>
+        </w:rPr>
+        <w:t xml:space="preserve"> </w:t>
+      </w:r>
+      <w:r>
+        <w:rPr>
+          <w:rFonts w:ascii="Aptos" w:hAnsi="Aptos" w:eastAsia="Aptos" w:cs="Aptos"/>
+          <w:noProof w:val="0"/>
+          <w:sz w:val="22"/>
+          <w:szCs w:val="22"/>
+          <w:rtl w:val="1"/>
+          <w:lang w:val="en-US"/>
+        </w:rPr>
+        <w:t>בתכנון</w:t>
+      </w:r>
+      <w:r>
+        <w:rPr>
+          <w:rFonts w:ascii="Aptos" w:hAnsi="Aptos" w:eastAsia="Aptos" w:cs="Aptos"/>
+          <w:noProof w:val="0"/>
+          <w:sz w:val="22"/>
+          <w:szCs w:val="22"/>
+          <w:rtl w:val="1"/>
+          <w:lang w:val="en-US"/>
+        </w:rPr>
+        <w:t xml:space="preserve"> </w:t>
+      </w:r>
+      <w:r>
+        <w:rPr>
+          <w:rFonts w:ascii="Aptos" w:hAnsi="Aptos" w:eastAsia="Aptos" w:cs="Aptos"/>
+          <w:noProof w:val="0"/>
+          <w:sz w:val="22"/>
+          <w:szCs w:val="22"/>
+          <w:rtl w:val="1"/>
+          <w:lang w:val="en-US"/>
+        </w:rPr>
+        <w:t>המערכת</w:t>
+      </w:r>
+      <w:r>
+        <w:rPr>
+          <w:rFonts w:ascii="Aptos" w:hAnsi="Aptos" w:eastAsia="Aptos" w:cs="Aptos"/>
+          <w:noProof w:val="0"/>
+          <w:sz w:val="22"/>
+          <w:szCs w:val="22"/>
+          <w:lang w:val="en-US"/>
+        </w:rPr>
+        <w:t>:</w:t>
+      </w:r>
+    </w:p>
+    <w:p>
+      <w:pPr>
+        <w:pStyle w:val="ListParagraph"/>
+        <w:numPr>
+          <w:ilvl w:val="0"/>
+          <w:numId w:val="11"/>
+        </w:numPr>
+        <w:bidi w:val="0"/>
+        <w:spacing w:before="240" w:beforeAutospacing="off" w:after="240" w:afterAutospacing="off"/>
+        <w:jc w:val="center"/>
+        <w:rPr>
+          <w:rFonts w:ascii="Aptos" w:hAnsi="Aptos" w:eastAsia="Aptos" w:cs="Aptos"/>
+          <w:noProof w:val="0"/>
+          <w:sz w:val="22"/>
+          <w:szCs w:val="22"/>
+          <w:lang w:val="en-US"/>
+        </w:rPr>
+      </w:pPr>
+      <w:r>
+        <w:rPr>
+          <w:rFonts w:ascii="Aptos" w:hAnsi="Aptos" w:eastAsia="Aptos" w:cs="Aptos"/>
+          <w:b w:val="1"/>
+          <w:bCs w:val="1"/>
+          <w:noProof w:val="0"/>
+          <w:sz w:val="22"/>
+          <w:szCs w:val="22"/>
+          <w:rtl w:val="1"/>
+          <w:lang w:val="en-US"/>
+        </w:rPr>
+        <w:t>ניטור</w:t>
+      </w:r>
+      <w:r>
+        <w:rPr>
+          <w:rFonts w:ascii="Aptos" w:hAnsi="Aptos" w:eastAsia="Aptos" w:cs="Aptos"/>
+          <w:b w:val="1"/>
+          <w:bCs w:val="1"/>
+          <w:noProof w:val="0"/>
+          <w:sz w:val="22"/>
+          <w:szCs w:val="22"/>
+          <w:rtl w:val="1"/>
+          <w:lang w:val="en-US"/>
+        </w:rPr>
+        <w:t xml:space="preserve"> </w:t>
+      </w:r>
+      <w:r>
+        <w:rPr>
+          <w:rFonts w:ascii="Aptos" w:hAnsi="Aptos" w:eastAsia="Aptos" w:cs="Aptos"/>
+          <w:b w:val="1"/>
+          <w:bCs w:val="1"/>
+          <w:noProof w:val="0"/>
+          <w:sz w:val="22"/>
+          <w:szCs w:val="22"/>
+          <w:rtl w:val="1"/>
+          <w:lang w:val="en-US"/>
+        </w:rPr>
+        <w:t>פרואקטיבי</w:t>
+      </w:r>
+      <w:r>
+        <w:rPr>
+          <w:rFonts w:ascii="Aptos" w:hAnsi="Aptos" w:eastAsia="Aptos" w:cs="Aptos"/>
+          <w:b w:val="1"/>
+          <w:bCs w:val="1"/>
+          <w:noProof w:val="0"/>
+          <w:sz w:val="22"/>
+          <w:szCs w:val="22"/>
+          <w:rtl w:val="1"/>
+          <w:lang w:val="en-US"/>
+        </w:rPr>
+        <w:t>:</w:t>
+      </w:r>
+      <w:r>
+        <w:rPr>
+          <w:rFonts w:ascii="Aptos" w:hAnsi="Aptos" w:eastAsia="Aptos" w:cs="Aptos"/>
+          <w:noProof w:val="0"/>
+          <w:sz w:val="22"/>
+          <w:szCs w:val="22"/>
+          <w:rtl w:val="1"/>
+          <w:lang w:val="en-US"/>
+        </w:rPr>
+        <w:t xml:space="preserve"> </w:t>
+      </w:r>
+      <w:r>
+        <w:rPr>
+          <w:rFonts w:ascii="Aptos" w:hAnsi="Aptos" w:eastAsia="Aptos" w:cs="Aptos"/>
+          <w:noProof w:val="0"/>
+          <w:sz w:val="22"/>
+          <w:szCs w:val="22"/>
+          <w:rtl w:val="1"/>
+          <w:lang w:val="en-US"/>
+        </w:rPr>
+        <w:t>המערכת</w:t>
+      </w:r>
+      <w:r>
+        <w:rPr>
+          <w:rFonts w:ascii="Aptos" w:hAnsi="Aptos" w:eastAsia="Aptos" w:cs="Aptos"/>
+          <w:noProof w:val="0"/>
+          <w:sz w:val="22"/>
+          <w:szCs w:val="22"/>
+          <w:rtl w:val="1"/>
+          <w:lang w:val="en-US"/>
+        </w:rPr>
+        <w:t xml:space="preserve"> </w:t>
+      </w:r>
+      <w:r>
+        <w:rPr>
+          <w:rFonts w:ascii="Aptos" w:hAnsi="Aptos" w:eastAsia="Aptos" w:cs="Aptos"/>
+          <w:noProof w:val="0"/>
+          <w:sz w:val="22"/>
+          <w:szCs w:val="22"/>
+          <w:rtl w:val="1"/>
+          <w:lang w:val="en-US"/>
+        </w:rPr>
+        <w:t>תוכננה</w:t>
+      </w:r>
+      <w:r>
+        <w:rPr>
+          <w:rFonts w:ascii="Aptos" w:hAnsi="Aptos" w:eastAsia="Aptos" w:cs="Aptos"/>
+          <w:noProof w:val="0"/>
+          <w:sz w:val="22"/>
+          <w:szCs w:val="22"/>
+          <w:rtl w:val="1"/>
+          <w:lang w:val="en-US"/>
+        </w:rPr>
+        <w:t xml:space="preserve"> </w:t>
+      </w:r>
+      <w:r>
+        <w:rPr>
+          <w:rFonts w:ascii="Aptos" w:hAnsi="Aptos" w:eastAsia="Aptos" w:cs="Aptos"/>
+          <w:noProof w:val="0"/>
+          <w:sz w:val="22"/>
+          <w:szCs w:val="22"/>
+          <w:rtl w:val="1"/>
+          <w:lang w:val="en-US"/>
+        </w:rPr>
+        <w:t>לבצע</w:t>
+      </w:r>
+      <w:r>
+        <w:rPr>
+          <w:rFonts w:ascii="Aptos" w:hAnsi="Aptos" w:eastAsia="Aptos" w:cs="Aptos"/>
+          <w:noProof w:val="0"/>
+          <w:sz w:val="22"/>
+          <w:szCs w:val="22"/>
+          <w:rtl w:val="1"/>
+          <w:lang w:val="en-US"/>
+        </w:rPr>
+        <w:t xml:space="preserve"> </w:t>
+      </w:r>
+      <w:r>
+        <w:rPr>
+          <w:rFonts w:ascii="Aptos" w:hAnsi="Aptos" w:eastAsia="Aptos" w:cs="Aptos"/>
+          <w:noProof w:val="0"/>
+          <w:sz w:val="22"/>
+          <w:szCs w:val="22"/>
+          <w:rtl w:val="1"/>
+          <w:lang w:val="en-US"/>
+        </w:rPr>
+        <w:t>האזנה</w:t>
+      </w:r>
+      <w:r>
+        <w:rPr>
+          <w:rFonts w:ascii="Aptos" w:hAnsi="Aptos" w:eastAsia="Aptos" w:cs="Aptos"/>
+          <w:noProof w:val="0"/>
+          <w:sz w:val="22"/>
+          <w:szCs w:val="22"/>
+          <w:rtl w:val="1"/>
+          <w:lang w:val="en-US"/>
+        </w:rPr>
+        <w:t xml:space="preserve"> </w:t>
+      </w:r>
+      <w:r>
+        <w:rPr>
+          <w:rFonts w:ascii="Aptos" w:hAnsi="Aptos" w:eastAsia="Aptos" w:cs="Aptos"/>
+          <w:noProof w:val="0"/>
+          <w:sz w:val="22"/>
+          <w:szCs w:val="22"/>
+          <w:rtl w:val="1"/>
+          <w:lang w:val="en-US"/>
+        </w:rPr>
+        <w:t>רציפה</w:t>
+      </w:r>
+      <w:r>
+        <w:rPr>
+          <w:rFonts w:ascii="Aptos" w:hAnsi="Aptos" w:eastAsia="Aptos" w:cs="Aptos"/>
+          <w:noProof w:val="0"/>
+          <w:sz w:val="22"/>
+          <w:szCs w:val="22"/>
+          <w:rtl w:val="1"/>
+          <w:lang w:val="en-US"/>
+        </w:rPr>
+        <w:t xml:space="preserve"> </w:t>
+      </w:r>
+      <w:r>
+        <w:rPr>
+          <w:rFonts w:ascii="Aptos" w:hAnsi="Aptos" w:eastAsia="Aptos" w:cs="Aptos"/>
+          <w:noProof w:val="0"/>
+          <w:sz w:val="22"/>
+          <w:szCs w:val="22"/>
+          <w:rtl w:val="1"/>
+          <w:lang w:val="en-US"/>
+        </w:rPr>
+        <w:t>לתעבורת</w:t>
+      </w:r>
+      <w:r>
+        <w:rPr>
+          <w:rFonts w:ascii="Aptos" w:hAnsi="Aptos" w:eastAsia="Aptos" w:cs="Aptos"/>
+          <w:noProof w:val="0"/>
+          <w:sz w:val="22"/>
+          <w:szCs w:val="22"/>
+          <w:rtl w:val="1"/>
+          <w:lang w:val="en-US"/>
+        </w:rPr>
+        <w:t xml:space="preserve"> </w:t>
+      </w:r>
+      <w:r>
+        <w:rPr>
+          <w:rFonts w:ascii="Aptos" w:hAnsi="Aptos" w:eastAsia="Aptos" w:cs="Aptos"/>
+          <w:noProof w:val="0"/>
+          <w:sz w:val="22"/>
+          <w:szCs w:val="22"/>
+          <w:rtl w:val="1"/>
+          <w:lang w:val="en-US"/>
+        </w:rPr>
+        <w:t>הרשת</w:t>
+      </w:r>
+      <w:r>
+        <w:rPr>
+          <w:rFonts w:ascii="Aptos" w:hAnsi="Aptos" w:eastAsia="Aptos" w:cs="Aptos"/>
+          <w:noProof w:val="0"/>
+          <w:sz w:val="22"/>
+          <w:szCs w:val="22"/>
+          <w:lang w:val="en-US"/>
+        </w:rPr>
+        <w:t xml:space="preserve"> (Promiscuous Mode) </w:t>
+      </w:r>
+      <w:r>
+        <w:rPr>
+          <w:rFonts w:ascii="Aptos" w:hAnsi="Aptos" w:eastAsia="Aptos" w:cs="Aptos"/>
+          <w:noProof w:val="0"/>
+          <w:sz w:val="22"/>
+          <w:szCs w:val="22"/>
+          <w:rtl w:val="1"/>
+          <w:lang w:val="en-US"/>
+        </w:rPr>
+        <w:t>ולחלץ</w:t>
+      </w:r>
+      <w:r>
+        <w:rPr>
+          <w:rFonts w:ascii="Aptos" w:hAnsi="Aptos" w:eastAsia="Aptos" w:cs="Aptos"/>
+          <w:noProof w:val="0"/>
+          <w:sz w:val="22"/>
+          <w:szCs w:val="22"/>
+          <w:rtl w:val="1"/>
+          <w:lang w:val="en-US"/>
+        </w:rPr>
+        <w:t xml:space="preserve"> </w:t>
+      </w:r>
+      <w:r>
+        <w:rPr>
+          <w:rFonts w:ascii="Aptos" w:hAnsi="Aptos" w:eastAsia="Aptos" w:cs="Aptos"/>
+          <w:noProof w:val="0"/>
+          <w:sz w:val="22"/>
+          <w:szCs w:val="22"/>
+          <w:rtl w:val="1"/>
+          <w:lang w:val="en-US"/>
+        </w:rPr>
+        <w:t>מידע</w:t>
+      </w:r>
+      <w:r>
+        <w:rPr>
+          <w:rFonts w:ascii="Aptos" w:hAnsi="Aptos" w:eastAsia="Aptos" w:cs="Aptos"/>
+          <w:noProof w:val="0"/>
+          <w:sz w:val="22"/>
+          <w:szCs w:val="22"/>
+          <w:rtl w:val="1"/>
+          <w:lang w:val="en-US"/>
+        </w:rPr>
+        <w:t xml:space="preserve"> </w:t>
+      </w:r>
+      <w:r>
+        <w:rPr>
+          <w:rFonts w:ascii="Aptos" w:hAnsi="Aptos" w:eastAsia="Aptos" w:cs="Aptos"/>
+          <w:noProof w:val="0"/>
+          <w:sz w:val="22"/>
+          <w:szCs w:val="22"/>
+          <w:rtl w:val="1"/>
+          <w:lang w:val="en-US"/>
+        </w:rPr>
+        <w:t>חיוני</w:t>
+      </w:r>
+      <w:r>
+        <w:rPr>
+          <w:rFonts w:ascii="Aptos" w:hAnsi="Aptos" w:eastAsia="Aptos" w:cs="Aptos"/>
+          <w:noProof w:val="0"/>
+          <w:sz w:val="22"/>
+          <w:szCs w:val="22"/>
+          <w:rtl w:val="1"/>
+          <w:lang w:val="en-US"/>
+        </w:rPr>
+        <w:t xml:space="preserve"> </w:t>
+      </w:r>
+      <w:r>
+        <w:rPr>
+          <w:rFonts w:ascii="Aptos" w:hAnsi="Aptos" w:eastAsia="Aptos" w:cs="Aptos"/>
+          <w:noProof w:val="0"/>
+          <w:sz w:val="22"/>
+          <w:szCs w:val="22"/>
+          <w:rtl w:val="1"/>
+          <w:lang w:val="en-US"/>
+        </w:rPr>
+        <w:t>מפרוטוקולי</w:t>
+      </w:r>
+      <w:r>
+        <w:rPr>
+          <w:rFonts w:ascii="Aptos" w:hAnsi="Aptos" w:eastAsia="Aptos" w:cs="Aptos"/>
+          <w:noProof w:val="0"/>
+          <w:sz w:val="22"/>
+          <w:szCs w:val="22"/>
+          <w:lang w:val="en-US"/>
+        </w:rPr>
+        <w:t xml:space="preserve"> IP </w:t>
+      </w:r>
+      <w:r>
+        <w:rPr>
+          <w:rFonts w:ascii="Aptos" w:hAnsi="Aptos" w:eastAsia="Aptos" w:cs="Aptos"/>
+          <w:noProof w:val="0"/>
+          <w:sz w:val="22"/>
+          <w:szCs w:val="22"/>
+          <w:rtl w:val="1"/>
+          <w:lang w:val="en-US"/>
+        </w:rPr>
+        <w:t>ו</w:t>
+      </w:r>
+      <w:r>
+        <w:rPr>
+          <w:rFonts w:ascii="Aptos" w:hAnsi="Aptos" w:eastAsia="Aptos" w:cs="Aptos"/>
+          <w:noProof w:val="0"/>
+          <w:sz w:val="22"/>
+          <w:szCs w:val="22"/>
+          <w:lang w:val="en-US"/>
+        </w:rPr>
+        <w:t xml:space="preserve">-TCP </w:t>
+      </w:r>
+      <w:r>
+        <w:rPr>
+          <w:rFonts w:ascii="Aptos" w:hAnsi="Aptos" w:eastAsia="Aptos" w:cs="Aptos"/>
+          <w:noProof w:val="0"/>
+          <w:sz w:val="22"/>
+          <w:szCs w:val="22"/>
+          <w:rtl w:val="1"/>
+          <w:lang w:val="en-US"/>
+        </w:rPr>
+        <w:t>בזמן</w:t>
+      </w:r>
+      <w:r>
+        <w:rPr>
+          <w:rFonts w:ascii="Aptos" w:hAnsi="Aptos" w:eastAsia="Aptos" w:cs="Aptos"/>
+          <w:noProof w:val="0"/>
+          <w:sz w:val="22"/>
+          <w:szCs w:val="22"/>
+          <w:rtl w:val="1"/>
+          <w:lang w:val="en-US"/>
+        </w:rPr>
+        <w:t xml:space="preserve"> </w:t>
+      </w:r>
+      <w:r>
+        <w:rPr>
+          <w:rFonts w:ascii="Aptos" w:hAnsi="Aptos" w:eastAsia="Aptos" w:cs="Aptos"/>
+          <w:noProof w:val="0"/>
+          <w:sz w:val="22"/>
+          <w:szCs w:val="22"/>
+          <w:rtl w:val="1"/>
+          <w:lang w:val="en-US"/>
+        </w:rPr>
+        <w:t>אמת</w:t>
+      </w:r>
+      <w:r>
+        <w:rPr>
+          <w:rFonts w:ascii="Aptos" w:hAnsi="Aptos" w:eastAsia="Aptos" w:cs="Aptos"/>
+          <w:noProof w:val="0"/>
+          <w:sz w:val="22"/>
+          <w:szCs w:val="22"/>
+          <w:lang w:val="en-US"/>
+        </w:rPr>
+        <w:t>.</w:t>
+      </w:r>
+    </w:p>
+    <w:p>
+      <w:pPr>
+        <w:bidi w:val="0"/>
+        <w:spacing w:before="0" w:beforeAutospacing="off" w:after="0" w:afterAutospacing="off"/>
+        <w:jc w:val="center"/>
+      </w:pPr>
+      <w:r>
+        <w:rPr>
+          <w:rFonts w:ascii="Aptos" w:hAnsi="Aptos" w:eastAsia="Aptos" w:cs="Aptos"/>
+          <w:noProof w:val="0"/>
+          <w:sz w:val="22"/>
+          <w:szCs w:val="22"/>
+          <w:lang w:val="en-US"/>
+        </w:rPr>
+        <w:t>+1</w:t>
+      </w:r>
+    </w:p>
+    <w:p>
+      <w:pPr>
+        <w:pStyle w:val="ListParagraph"/>
+        <w:numPr>
+          <w:ilvl w:val="0"/>
+          <w:numId w:val="11"/>
+        </w:numPr>
+        <w:bidi w:val="0"/>
+        <w:spacing w:before="240" w:beforeAutospacing="off" w:after="240" w:afterAutospacing="off"/>
+        <w:jc w:val="center"/>
+        <w:rPr>
+          <w:rFonts w:ascii="Aptos" w:hAnsi="Aptos" w:eastAsia="Aptos" w:cs="Aptos"/>
+          <w:noProof w:val="0"/>
+          <w:sz w:val="22"/>
+          <w:szCs w:val="22"/>
+          <w:lang w:val="en-US"/>
+        </w:rPr>
+      </w:pPr>
+      <w:r>
+        <w:rPr>
+          <w:rFonts w:ascii="Aptos" w:hAnsi="Aptos" w:eastAsia="Aptos" w:cs="Aptos"/>
+          <w:b w:val="1"/>
+          <w:bCs w:val="1"/>
+          <w:noProof w:val="0"/>
+          <w:sz w:val="22"/>
+          <w:szCs w:val="22"/>
+          <w:rtl w:val="1"/>
+          <w:lang w:val="en-US"/>
+        </w:rPr>
+        <w:t>זיהוי</w:t>
+      </w:r>
+      <w:r>
+        <w:rPr>
+          <w:rFonts w:ascii="Aptos" w:hAnsi="Aptos" w:eastAsia="Aptos" w:cs="Aptos"/>
+          <w:b w:val="1"/>
+          <w:bCs w:val="1"/>
+          <w:noProof w:val="0"/>
+          <w:sz w:val="22"/>
+          <w:szCs w:val="22"/>
+          <w:rtl w:val="1"/>
+          <w:lang w:val="en-US"/>
+        </w:rPr>
+        <w:t xml:space="preserve"> </w:t>
+      </w:r>
+      <w:r>
+        <w:rPr>
+          <w:rFonts w:ascii="Aptos" w:hAnsi="Aptos" w:eastAsia="Aptos" w:cs="Aptos"/>
+          <w:b w:val="1"/>
+          <w:bCs w:val="1"/>
+          <w:noProof w:val="0"/>
+          <w:sz w:val="22"/>
+          <w:szCs w:val="22"/>
+          <w:rtl w:val="1"/>
+          <w:lang w:val="en-US"/>
+        </w:rPr>
+        <w:t>חכם</w:t>
+      </w:r>
+      <w:r>
+        <w:rPr>
+          <w:rFonts w:ascii="Aptos" w:hAnsi="Aptos" w:eastAsia="Aptos" w:cs="Aptos"/>
+          <w:b w:val="1"/>
+          <w:bCs w:val="1"/>
+          <w:noProof w:val="0"/>
+          <w:sz w:val="22"/>
+          <w:szCs w:val="22"/>
+          <w:rtl w:val="1"/>
+          <w:lang w:val="en-US"/>
+        </w:rPr>
+        <w:t>:</w:t>
+      </w:r>
+      <w:r>
+        <w:rPr>
+          <w:rFonts w:ascii="Aptos" w:hAnsi="Aptos" w:eastAsia="Aptos" w:cs="Aptos"/>
+          <w:noProof w:val="0"/>
+          <w:sz w:val="22"/>
+          <w:szCs w:val="22"/>
+          <w:rtl w:val="1"/>
+          <w:lang w:val="en-US"/>
+        </w:rPr>
+        <w:t xml:space="preserve"> </w:t>
+      </w:r>
+      <w:r>
+        <w:rPr>
+          <w:rFonts w:ascii="Aptos" w:hAnsi="Aptos" w:eastAsia="Aptos" w:cs="Aptos"/>
+          <w:noProof w:val="0"/>
+          <w:sz w:val="22"/>
+          <w:szCs w:val="22"/>
+          <w:rtl w:val="1"/>
+          <w:lang w:val="en-US"/>
+        </w:rPr>
+        <w:t>שילוב</w:t>
+      </w:r>
+      <w:r>
+        <w:rPr>
+          <w:rFonts w:ascii="Aptos" w:hAnsi="Aptos" w:eastAsia="Aptos" w:cs="Aptos"/>
+          <w:noProof w:val="0"/>
+          <w:sz w:val="22"/>
+          <w:szCs w:val="22"/>
+          <w:rtl w:val="1"/>
+          <w:lang w:val="en-US"/>
+        </w:rPr>
+        <w:t xml:space="preserve"> </w:t>
+      </w:r>
+      <w:r>
+        <w:rPr>
+          <w:rFonts w:ascii="Aptos" w:hAnsi="Aptos" w:eastAsia="Aptos" w:cs="Aptos"/>
+          <w:noProof w:val="0"/>
+          <w:sz w:val="22"/>
+          <w:szCs w:val="22"/>
+          <w:rtl w:val="1"/>
+          <w:lang w:val="en-US"/>
+        </w:rPr>
+        <w:t>של</w:t>
+      </w:r>
+      <w:r>
+        <w:rPr>
+          <w:rFonts w:ascii="Aptos" w:hAnsi="Aptos" w:eastAsia="Aptos" w:cs="Aptos"/>
+          <w:noProof w:val="0"/>
+          <w:sz w:val="22"/>
+          <w:szCs w:val="22"/>
+          <w:rtl w:val="1"/>
+          <w:lang w:val="en-US"/>
+        </w:rPr>
+        <w:t xml:space="preserve"> </w:t>
+      </w:r>
+      <w:r>
+        <w:rPr>
+          <w:rFonts w:ascii="Aptos" w:hAnsi="Aptos" w:eastAsia="Aptos" w:cs="Aptos"/>
+          <w:noProof w:val="0"/>
+          <w:sz w:val="22"/>
+          <w:szCs w:val="22"/>
+          <w:rtl w:val="1"/>
+          <w:lang w:val="en-US"/>
+        </w:rPr>
+        <w:t>מנוע</w:t>
+      </w:r>
+      <w:r>
+        <w:rPr>
+          <w:rFonts w:ascii="Aptos" w:hAnsi="Aptos" w:eastAsia="Aptos" w:cs="Aptos"/>
+          <w:noProof w:val="0"/>
+          <w:sz w:val="22"/>
+          <w:szCs w:val="22"/>
+          <w:rtl w:val="1"/>
+          <w:lang w:val="en-US"/>
+        </w:rPr>
+        <w:t xml:space="preserve"> </w:t>
+      </w:r>
+      <w:r>
+        <w:rPr>
+          <w:rFonts w:ascii="Aptos" w:hAnsi="Aptos" w:eastAsia="Aptos" w:cs="Aptos"/>
+          <w:noProof w:val="0"/>
+          <w:sz w:val="22"/>
+          <w:szCs w:val="22"/>
+          <w:rtl w:val="1"/>
+          <w:lang w:val="en-US"/>
+        </w:rPr>
+        <w:t>חוקים</w:t>
+      </w:r>
+      <w:r>
+        <w:rPr>
+          <w:rFonts w:ascii="Aptos" w:hAnsi="Aptos" w:eastAsia="Aptos" w:cs="Aptos"/>
+          <w:noProof w:val="0"/>
+          <w:sz w:val="22"/>
+          <w:szCs w:val="22"/>
+          <w:rtl w:val="1"/>
+          <w:lang w:val="en-US"/>
+        </w:rPr>
+        <w:t xml:space="preserve"> </w:t>
+      </w:r>
+      <w:r>
+        <w:rPr>
+          <w:rFonts w:ascii="Aptos" w:hAnsi="Aptos" w:eastAsia="Aptos" w:cs="Aptos"/>
+          <w:noProof w:val="0"/>
+          <w:sz w:val="22"/>
+          <w:szCs w:val="22"/>
+          <w:rtl w:val="1"/>
+          <w:lang w:val="en-US"/>
+        </w:rPr>
+        <w:t>דטרמיניסטי</w:t>
+      </w:r>
+      <w:r>
+        <w:rPr>
+          <w:rFonts w:ascii="Aptos" w:hAnsi="Aptos" w:eastAsia="Aptos" w:cs="Aptos"/>
+          <w:noProof w:val="0"/>
+          <w:sz w:val="22"/>
+          <w:szCs w:val="22"/>
+          <w:rtl w:val="1"/>
+          <w:lang w:val="en-US"/>
+        </w:rPr>
+        <w:t xml:space="preserve"> </w:t>
+      </w:r>
+      <w:r>
+        <w:rPr>
+          <w:rFonts w:ascii="Aptos" w:hAnsi="Aptos" w:eastAsia="Aptos" w:cs="Aptos"/>
+          <w:noProof w:val="0"/>
+          <w:sz w:val="22"/>
+          <w:szCs w:val="22"/>
+          <w:rtl w:val="1"/>
+          <w:lang w:val="en-US"/>
+        </w:rPr>
+        <w:t>יחד</w:t>
+      </w:r>
+      <w:r>
+        <w:rPr>
+          <w:rFonts w:ascii="Aptos" w:hAnsi="Aptos" w:eastAsia="Aptos" w:cs="Aptos"/>
+          <w:noProof w:val="0"/>
+          <w:sz w:val="22"/>
+          <w:szCs w:val="22"/>
+          <w:rtl w:val="1"/>
+          <w:lang w:val="en-US"/>
+        </w:rPr>
+        <w:t xml:space="preserve"> </w:t>
+      </w:r>
+      <w:r>
+        <w:rPr>
+          <w:rFonts w:ascii="Aptos" w:hAnsi="Aptos" w:eastAsia="Aptos" w:cs="Aptos"/>
+          <w:noProof w:val="0"/>
+          <w:sz w:val="22"/>
+          <w:szCs w:val="22"/>
+          <w:rtl w:val="1"/>
+          <w:lang w:val="en-US"/>
+        </w:rPr>
+        <w:t>עם</w:t>
+      </w:r>
+      <w:r>
+        <w:rPr>
+          <w:rFonts w:ascii="Aptos" w:hAnsi="Aptos" w:eastAsia="Aptos" w:cs="Aptos"/>
+          <w:noProof w:val="0"/>
+          <w:sz w:val="22"/>
+          <w:szCs w:val="22"/>
+          <w:rtl w:val="1"/>
+          <w:lang w:val="en-US"/>
+        </w:rPr>
+        <w:t xml:space="preserve"> </w:t>
+      </w:r>
+      <w:r>
+        <w:rPr>
+          <w:rFonts w:ascii="Aptos" w:hAnsi="Aptos" w:eastAsia="Aptos" w:cs="Aptos"/>
+          <w:noProof w:val="0"/>
+          <w:sz w:val="22"/>
+          <w:szCs w:val="22"/>
+          <w:rtl w:val="1"/>
+          <w:lang w:val="en-US"/>
+        </w:rPr>
+        <w:t>מודל</w:t>
+      </w:r>
+      <w:r>
+        <w:rPr>
+          <w:rFonts w:ascii="Aptos" w:hAnsi="Aptos" w:eastAsia="Aptos" w:cs="Aptos"/>
+          <w:noProof w:val="0"/>
+          <w:sz w:val="22"/>
+          <w:szCs w:val="22"/>
+          <w:rtl w:val="1"/>
+          <w:lang w:val="en-US"/>
+        </w:rPr>
+        <w:t xml:space="preserve"> </w:t>
+      </w:r>
+      <w:r>
+        <w:rPr>
+          <w:rFonts w:ascii="Aptos" w:hAnsi="Aptos" w:eastAsia="Aptos" w:cs="Aptos"/>
+          <w:noProof w:val="0"/>
+          <w:sz w:val="22"/>
+          <w:szCs w:val="22"/>
+          <w:rtl w:val="1"/>
+          <w:lang w:val="en-US"/>
+        </w:rPr>
+        <w:t>למידת</w:t>
+      </w:r>
+      <w:r>
+        <w:rPr>
+          <w:rFonts w:ascii="Aptos" w:hAnsi="Aptos" w:eastAsia="Aptos" w:cs="Aptos"/>
+          <w:noProof w:val="0"/>
+          <w:sz w:val="22"/>
+          <w:szCs w:val="22"/>
+          <w:rtl w:val="1"/>
+          <w:lang w:val="en-US"/>
+        </w:rPr>
+        <w:t xml:space="preserve"> </w:t>
+      </w:r>
+      <w:r>
+        <w:rPr>
+          <w:rFonts w:ascii="Aptos" w:hAnsi="Aptos" w:eastAsia="Aptos" w:cs="Aptos"/>
+          <w:noProof w:val="0"/>
+          <w:sz w:val="22"/>
+          <w:szCs w:val="22"/>
+          <w:rtl w:val="1"/>
+          <w:lang w:val="en-US"/>
+        </w:rPr>
+        <w:t>מכונה</w:t>
+      </w:r>
+      <w:r>
+        <w:rPr>
+          <w:rFonts w:ascii="Aptos" w:hAnsi="Aptos" w:eastAsia="Aptos" w:cs="Aptos"/>
+          <w:noProof w:val="0"/>
+          <w:sz w:val="22"/>
+          <w:szCs w:val="22"/>
+          <w:lang w:val="en-US"/>
+        </w:rPr>
+        <w:t xml:space="preserve"> (</w:t>
+      </w:r>
+      <w:r>
+        <w:rPr>
+          <w:rFonts w:ascii="Aptos" w:hAnsi="Aptos" w:eastAsia="Aptos" w:cs="Aptos"/>
+          <w:b w:val="1"/>
+          <w:bCs w:val="1"/>
+          <w:noProof w:val="0"/>
+          <w:sz w:val="22"/>
+          <w:szCs w:val="22"/>
+          <w:lang w:val="en-US"/>
+        </w:rPr>
+        <w:t>Isolation Forest</w:t>
+      </w:r>
+      <w:r>
+        <w:rPr>
+          <w:rFonts w:ascii="Aptos" w:hAnsi="Aptos" w:eastAsia="Aptos" w:cs="Aptos"/>
+          <w:noProof w:val="0"/>
+          <w:sz w:val="22"/>
+          <w:szCs w:val="22"/>
+          <w:lang w:val="en-US"/>
+        </w:rPr>
+        <w:t xml:space="preserve">) </w:t>
+      </w:r>
+      <w:r>
+        <w:rPr>
+          <w:rFonts w:ascii="Aptos" w:hAnsi="Aptos" w:eastAsia="Aptos" w:cs="Aptos"/>
+          <w:noProof w:val="0"/>
+          <w:sz w:val="22"/>
+          <w:szCs w:val="22"/>
+          <w:rtl w:val="1"/>
+          <w:lang w:val="en-US"/>
+        </w:rPr>
+        <w:t>מאפשר</w:t>
+      </w:r>
+      <w:r>
+        <w:rPr>
+          <w:rFonts w:ascii="Aptos" w:hAnsi="Aptos" w:eastAsia="Aptos" w:cs="Aptos"/>
+          <w:noProof w:val="0"/>
+          <w:sz w:val="22"/>
+          <w:szCs w:val="22"/>
+          <w:rtl w:val="1"/>
+          <w:lang w:val="en-US"/>
+        </w:rPr>
+        <w:t xml:space="preserve"> </w:t>
+      </w:r>
+      <w:r>
+        <w:rPr>
+          <w:rFonts w:ascii="Aptos" w:hAnsi="Aptos" w:eastAsia="Aptos" w:cs="Aptos"/>
+          <w:noProof w:val="0"/>
+          <w:sz w:val="22"/>
+          <w:szCs w:val="22"/>
+          <w:rtl w:val="1"/>
+          <w:lang w:val="en-US"/>
+        </w:rPr>
+        <w:t>זיהוי</w:t>
+      </w:r>
+      <w:r>
+        <w:rPr>
+          <w:rFonts w:ascii="Aptos" w:hAnsi="Aptos" w:eastAsia="Aptos" w:cs="Aptos"/>
+          <w:noProof w:val="0"/>
+          <w:sz w:val="22"/>
+          <w:szCs w:val="22"/>
+          <w:rtl w:val="1"/>
+          <w:lang w:val="en-US"/>
+        </w:rPr>
+        <w:t xml:space="preserve"> </w:t>
+      </w:r>
+      <w:r>
+        <w:rPr>
+          <w:rFonts w:ascii="Aptos" w:hAnsi="Aptos" w:eastAsia="Aptos" w:cs="Aptos"/>
+          <w:noProof w:val="0"/>
+          <w:sz w:val="22"/>
+          <w:szCs w:val="22"/>
+          <w:rtl w:val="1"/>
+          <w:lang w:val="en-US"/>
+        </w:rPr>
+        <w:t>אנומליות</w:t>
+      </w:r>
+      <w:r>
+        <w:rPr>
+          <w:rFonts w:ascii="Aptos" w:hAnsi="Aptos" w:eastAsia="Aptos" w:cs="Aptos"/>
+          <w:noProof w:val="0"/>
+          <w:sz w:val="22"/>
+          <w:szCs w:val="22"/>
+          <w:rtl w:val="1"/>
+          <w:lang w:val="en-US"/>
+        </w:rPr>
+        <w:t xml:space="preserve"> </w:t>
+      </w:r>
+      <w:r>
+        <w:rPr>
+          <w:rFonts w:ascii="Aptos" w:hAnsi="Aptos" w:eastAsia="Aptos" w:cs="Aptos"/>
+          <w:noProof w:val="0"/>
+          <w:sz w:val="22"/>
+          <w:szCs w:val="22"/>
+          <w:rtl w:val="1"/>
+          <w:lang w:val="en-US"/>
+        </w:rPr>
+        <w:t>וסיכונים</w:t>
+      </w:r>
+      <w:r>
+        <w:rPr>
+          <w:rFonts w:ascii="Aptos" w:hAnsi="Aptos" w:eastAsia="Aptos" w:cs="Aptos"/>
+          <w:noProof w:val="0"/>
+          <w:sz w:val="22"/>
+          <w:szCs w:val="22"/>
+          <w:rtl w:val="1"/>
+          <w:lang w:val="en-US"/>
+        </w:rPr>
+        <w:t xml:space="preserve"> </w:t>
+      </w:r>
+      <w:r>
+        <w:rPr>
+          <w:rFonts w:ascii="Aptos" w:hAnsi="Aptos" w:eastAsia="Aptos" w:cs="Aptos"/>
+          <w:noProof w:val="0"/>
+          <w:sz w:val="22"/>
+          <w:szCs w:val="22"/>
+          <w:rtl w:val="1"/>
+          <w:lang w:val="en-US"/>
+        </w:rPr>
+        <w:t>שאינם</w:t>
+      </w:r>
+      <w:r>
+        <w:rPr>
+          <w:rFonts w:ascii="Aptos" w:hAnsi="Aptos" w:eastAsia="Aptos" w:cs="Aptos"/>
+          <w:noProof w:val="0"/>
+          <w:sz w:val="22"/>
+          <w:szCs w:val="22"/>
+          <w:rtl w:val="1"/>
+          <w:lang w:val="en-US"/>
+        </w:rPr>
+        <w:t xml:space="preserve"> </w:t>
+      </w:r>
+      <w:r>
+        <w:rPr>
+          <w:rFonts w:ascii="Aptos" w:hAnsi="Aptos" w:eastAsia="Aptos" w:cs="Aptos"/>
+          <w:noProof w:val="0"/>
+          <w:sz w:val="22"/>
+          <w:szCs w:val="22"/>
+          <w:rtl w:val="1"/>
+          <w:lang w:val="en-US"/>
+        </w:rPr>
+        <w:t>מוכרים</w:t>
+      </w:r>
+      <w:r>
+        <w:rPr>
+          <w:rFonts w:ascii="Aptos" w:hAnsi="Aptos" w:eastAsia="Aptos" w:cs="Aptos"/>
+          <w:noProof w:val="0"/>
+          <w:sz w:val="22"/>
+          <w:szCs w:val="22"/>
+          <w:rtl w:val="1"/>
+          <w:lang w:val="en-US"/>
+        </w:rPr>
+        <w:t xml:space="preserve"> </w:t>
+      </w:r>
+      <w:r>
+        <w:rPr>
+          <w:rFonts w:ascii="Aptos" w:hAnsi="Aptos" w:eastAsia="Aptos" w:cs="Aptos"/>
+          <w:noProof w:val="0"/>
+          <w:sz w:val="22"/>
+          <w:szCs w:val="22"/>
+          <w:rtl w:val="1"/>
+          <w:lang w:val="en-US"/>
+        </w:rPr>
+        <w:t>מראש</w:t>
+      </w:r>
+      <w:r>
+        <w:rPr>
+          <w:rFonts w:ascii="Aptos" w:hAnsi="Aptos" w:eastAsia="Aptos" w:cs="Aptos"/>
+          <w:noProof w:val="0"/>
+          <w:sz w:val="22"/>
+          <w:szCs w:val="22"/>
+          <w:lang w:val="en-US"/>
+        </w:rPr>
+        <w:t>.</w:t>
+      </w:r>
+    </w:p>
+    <w:p>
+      <w:pPr>
+        <w:bidi w:val="0"/>
+        <w:spacing w:before="0" w:beforeAutospacing="off" w:after="0" w:afterAutospacing="off"/>
+        <w:jc w:val="center"/>
+      </w:pPr>
+      <w:r>
+        <w:rPr>
+          <w:rFonts w:ascii="Aptos" w:hAnsi="Aptos" w:eastAsia="Aptos" w:cs="Aptos"/>
+          <w:noProof w:val="0"/>
+          <w:sz w:val="22"/>
+          <w:szCs w:val="22"/>
+          <w:lang w:val="en-US"/>
+        </w:rPr>
+        <w:t>+2</w:t>
+      </w:r>
+    </w:p>
+    <w:p>
+      <w:pPr>
+        <w:pStyle w:val="ListParagraph"/>
+        <w:numPr>
+          <w:ilvl w:val="0"/>
+          <w:numId w:val="11"/>
+        </w:numPr>
+        <w:bidi w:val="0"/>
+        <w:spacing w:before="240" w:beforeAutospacing="off" w:after="240" w:afterAutospacing="off"/>
+        <w:jc w:val="center"/>
+        <w:rPr>
+          <w:rFonts w:ascii="Aptos" w:hAnsi="Aptos" w:eastAsia="Aptos" w:cs="Aptos"/>
+          <w:noProof w:val="0"/>
+          <w:sz w:val="22"/>
+          <w:szCs w:val="22"/>
+          <w:lang w:val="en-US"/>
+        </w:rPr>
+      </w:pPr>
+      <w:r>
+        <w:rPr>
+          <w:rFonts w:ascii="Aptos" w:hAnsi="Aptos" w:eastAsia="Aptos" w:cs="Aptos"/>
+          <w:b w:val="1"/>
+          <w:bCs w:val="1"/>
+          <w:noProof w:val="0"/>
+          <w:sz w:val="22"/>
+          <w:szCs w:val="22"/>
+          <w:rtl w:val="1"/>
+          <w:lang w:val="en-US"/>
+        </w:rPr>
+        <w:t>ניהול</w:t>
+      </w:r>
+      <w:r>
+        <w:rPr>
+          <w:rFonts w:ascii="Aptos" w:hAnsi="Aptos" w:eastAsia="Aptos" w:cs="Aptos"/>
+          <w:b w:val="1"/>
+          <w:bCs w:val="1"/>
+          <w:noProof w:val="0"/>
+          <w:sz w:val="22"/>
+          <w:szCs w:val="22"/>
+          <w:rtl w:val="1"/>
+          <w:lang w:val="en-US"/>
+        </w:rPr>
+        <w:t xml:space="preserve"> </w:t>
+      </w:r>
+      <w:r>
+        <w:rPr>
+          <w:rFonts w:ascii="Aptos" w:hAnsi="Aptos" w:eastAsia="Aptos" w:cs="Aptos"/>
+          <w:b w:val="1"/>
+          <w:bCs w:val="1"/>
+          <w:noProof w:val="0"/>
+          <w:sz w:val="22"/>
+          <w:szCs w:val="22"/>
+          <w:rtl w:val="1"/>
+          <w:lang w:val="en-US"/>
+        </w:rPr>
+        <w:t>ושליטה</w:t>
+      </w:r>
+      <w:r>
+        <w:rPr>
+          <w:rFonts w:ascii="Aptos" w:hAnsi="Aptos" w:eastAsia="Aptos" w:cs="Aptos"/>
+          <w:b w:val="1"/>
+          <w:bCs w:val="1"/>
+          <w:noProof w:val="0"/>
+          <w:sz w:val="22"/>
+          <w:szCs w:val="22"/>
+          <w:rtl w:val="1"/>
+          <w:lang w:val="en-US"/>
+        </w:rPr>
+        <w:t>:</w:t>
+      </w:r>
+      <w:r>
+        <w:rPr>
+          <w:rFonts w:ascii="Aptos" w:hAnsi="Aptos" w:eastAsia="Aptos" w:cs="Aptos"/>
+          <w:noProof w:val="0"/>
+          <w:sz w:val="22"/>
+          <w:szCs w:val="22"/>
+          <w:rtl w:val="1"/>
+          <w:lang w:val="en-US"/>
+        </w:rPr>
+        <w:t xml:space="preserve"> </w:t>
+      </w:r>
+      <w:r>
+        <w:rPr>
+          <w:rFonts w:ascii="Aptos" w:hAnsi="Aptos" w:eastAsia="Aptos" w:cs="Aptos"/>
+          <w:noProof w:val="0"/>
+          <w:sz w:val="22"/>
+          <w:szCs w:val="22"/>
+          <w:rtl w:val="1"/>
+          <w:lang w:val="en-US"/>
+        </w:rPr>
+        <w:t>המערכת</w:t>
+      </w:r>
+      <w:r>
+        <w:rPr>
+          <w:rFonts w:ascii="Aptos" w:hAnsi="Aptos" w:eastAsia="Aptos" w:cs="Aptos"/>
+          <w:noProof w:val="0"/>
+          <w:sz w:val="22"/>
+          <w:szCs w:val="22"/>
+          <w:rtl w:val="1"/>
+          <w:lang w:val="en-US"/>
+        </w:rPr>
+        <w:t xml:space="preserve"> </w:t>
+      </w:r>
+      <w:r>
+        <w:rPr>
+          <w:rFonts w:ascii="Aptos" w:hAnsi="Aptos" w:eastAsia="Aptos" w:cs="Aptos"/>
+          <w:noProof w:val="0"/>
+          <w:sz w:val="22"/>
+          <w:szCs w:val="22"/>
+          <w:rtl w:val="1"/>
+          <w:lang w:val="en-US"/>
+        </w:rPr>
+        <w:t>מעניקה</w:t>
+      </w:r>
+      <w:r>
+        <w:rPr>
+          <w:rFonts w:ascii="Aptos" w:hAnsi="Aptos" w:eastAsia="Aptos" w:cs="Aptos"/>
+          <w:noProof w:val="0"/>
+          <w:sz w:val="22"/>
+          <w:szCs w:val="22"/>
+          <w:rtl w:val="1"/>
+          <w:lang w:val="en-US"/>
+        </w:rPr>
+        <w:t xml:space="preserve"> </w:t>
+      </w:r>
+      <w:r>
+        <w:rPr>
+          <w:rFonts w:ascii="Aptos" w:hAnsi="Aptos" w:eastAsia="Aptos" w:cs="Aptos"/>
+          <w:noProof w:val="0"/>
+          <w:sz w:val="22"/>
+          <w:szCs w:val="22"/>
+          <w:rtl w:val="1"/>
+          <w:lang w:val="en-US"/>
+        </w:rPr>
+        <w:t>למנהל</w:t>
+      </w:r>
+      <w:r>
+        <w:rPr>
+          <w:rFonts w:ascii="Aptos" w:hAnsi="Aptos" w:eastAsia="Aptos" w:cs="Aptos"/>
+          <w:noProof w:val="0"/>
+          <w:sz w:val="22"/>
+          <w:szCs w:val="22"/>
+          <w:rtl w:val="1"/>
+          <w:lang w:val="en-US"/>
+        </w:rPr>
+        <w:t xml:space="preserve"> </w:t>
+      </w:r>
+      <w:r>
+        <w:rPr>
+          <w:rFonts w:ascii="Aptos" w:hAnsi="Aptos" w:eastAsia="Aptos" w:cs="Aptos"/>
+          <w:noProof w:val="0"/>
+          <w:sz w:val="22"/>
+          <w:szCs w:val="22"/>
+          <w:rtl w:val="1"/>
+          <w:lang w:val="en-US"/>
+        </w:rPr>
+        <w:t>המערכת</w:t>
+      </w:r>
+      <w:r>
+        <w:rPr>
+          <w:rFonts w:ascii="Aptos" w:hAnsi="Aptos" w:eastAsia="Aptos" w:cs="Aptos"/>
+          <w:noProof w:val="0"/>
+          <w:sz w:val="22"/>
+          <w:szCs w:val="22"/>
+          <w:rtl w:val="1"/>
+          <w:lang w:val="en-US"/>
+        </w:rPr>
+        <w:t xml:space="preserve"> </w:t>
+      </w:r>
+      <w:r>
+        <w:rPr>
+          <w:rFonts w:ascii="Aptos" w:hAnsi="Aptos" w:eastAsia="Aptos" w:cs="Aptos"/>
+          <w:noProof w:val="0"/>
+          <w:sz w:val="22"/>
+          <w:szCs w:val="22"/>
+          <w:rtl w:val="1"/>
+          <w:lang w:val="en-US"/>
+        </w:rPr>
+        <w:t>שליטה</w:t>
+      </w:r>
+      <w:r>
+        <w:rPr>
+          <w:rFonts w:ascii="Aptos" w:hAnsi="Aptos" w:eastAsia="Aptos" w:cs="Aptos"/>
+          <w:noProof w:val="0"/>
+          <w:sz w:val="22"/>
+          <w:szCs w:val="22"/>
+          <w:rtl w:val="1"/>
+          <w:lang w:val="en-US"/>
+        </w:rPr>
+        <w:t xml:space="preserve"> </w:t>
+      </w:r>
+      <w:r>
+        <w:rPr>
+          <w:rFonts w:ascii="Aptos" w:hAnsi="Aptos" w:eastAsia="Aptos" w:cs="Aptos"/>
+          <w:noProof w:val="0"/>
+          <w:sz w:val="22"/>
+          <w:szCs w:val="22"/>
+          <w:rtl w:val="1"/>
+          <w:lang w:val="en-US"/>
+        </w:rPr>
+        <w:t>מלאה</w:t>
+      </w:r>
+      <w:r>
+        <w:rPr>
+          <w:rFonts w:ascii="Aptos" w:hAnsi="Aptos" w:eastAsia="Aptos" w:cs="Aptos"/>
+          <w:noProof w:val="0"/>
+          <w:sz w:val="22"/>
+          <w:szCs w:val="22"/>
+          <w:rtl w:val="1"/>
+          <w:lang w:val="en-US"/>
+        </w:rPr>
+        <w:t xml:space="preserve"> </w:t>
+      </w:r>
+      <w:r>
+        <w:rPr>
+          <w:rFonts w:ascii="Aptos" w:hAnsi="Aptos" w:eastAsia="Aptos" w:cs="Aptos"/>
+          <w:noProof w:val="0"/>
+          <w:sz w:val="22"/>
+          <w:szCs w:val="22"/>
+          <w:rtl w:val="1"/>
+          <w:lang w:val="en-US"/>
+        </w:rPr>
+        <w:t>על</w:t>
+      </w:r>
+      <w:r>
+        <w:rPr>
+          <w:rFonts w:ascii="Aptos" w:hAnsi="Aptos" w:eastAsia="Aptos" w:cs="Aptos"/>
+          <w:noProof w:val="0"/>
+          <w:sz w:val="22"/>
+          <w:szCs w:val="22"/>
+          <w:rtl w:val="1"/>
+          <w:lang w:val="en-US"/>
+        </w:rPr>
+        <w:t xml:space="preserve"> </w:t>
+      </w:r>
+      <w:r>
+        <w:rPr>
+          <w:rFonts w:ascii="Aptos" w:hAnsi="Aptos" w:eastAsia="Aptos" w:cs="Aptos"/>
+          <w:noProof w:val="0"/>
+          <w:sz w:val="22"/>
+          <w:szCs w:val="22"/>
+          <w:rtl w:val="1"/>
+          <w:lang w:val="en-US"/>
+        </w:rPr>
+        <w:t>מצבי</w:t>
+      </w:r>
+      <w:r>
+        <w:rPr>
+          <w:rFonts w:ascii="Aptos" w:hAnsi="Aptos" w:eastAsia="Aptos" w:cs="Aptos"/>
+          <w:noProof w:val="0"/>
+          <w:sz w:val="22"/>
+          <w:szCs w:val="22"/>
+          <w:rtl w:val="1"/>
+          <w:lang w:val="en-US"/>
+        </w:rPr>
+        <w:t xml:space="preserve"> </w:t>
+      </w:r>
+      <w:r>
+        <w:rPr>
+          <w:rFonts w:ascii="Aptos" w:hAnsi="Aptos" w:eastAsia="Aptos" w:cs="Aptos"/>
+          <w:noProof w:val="0"/>
+          <w:sz w:val="22"/>
+          <w:szCs w:val="22"/>
+          <w:rtl w:val="1"/>
+          <w:lang w:val="en-US"/>
+        </w:rPr>
+        <w:t>הניטור</w:t>
+      </w:r>
+      <w:r>
+        <w:rPr>
+          <w:rFonts w:ascii="Aptos" w:hAnsi="Aptos" w:eastAsia="Aptos" w:cs="Aptos"/>
+          <w:noProof w:val="0"/>
+          <w:sz w:val="22"/>
+          <w:szCs w:val="22"/>
+          <w:rtl w:val="1"/>
+          <w:lang w:val="en-US"/>
+        </w:rPr>
+        <w:t xml:space="preserve">, </w:t>
+      </w:r>
+      <w:r>
+        <w:rPr>
+          <w:rFonts w:ascii="Aptos" w:hAnsi="Aptos" w:eastAsia="Aptos" w:cs="Aptos"/>
+          <w:noProof w:val="0"/>
+          <w:sz w:val="22"/>
+          <w:szCs w:val="22"/>
+          <w:rtl w:val="1"/>
+          <w:lang w:val="en-US"/>
+        </w:rPr>
+        <w:t>ניהול</w:t>
+      </w:r>
+      <w:r>
+        <w:rPr>
+          <w:rFonts w:ascii="Aptos" w:hAnsi="Aptos" w:eastAsia="Aptos" w:cs="Aptos"/>
+          <w:noProof w:val="0"/>
+          <w:sz w:val="22"/>
+          <w:szCs w:val="22"/>
+          <w:rtl w:val="1"/>
+          <w:lang w:val="en-US"/>
+        </w:rPr>
+        <w:t xml:space="preserve"> </w:t>
+      </w:r>
+      <w:r>
+        <w:rPr>
+          <w:rFonts w:ascii="Aptos" w:hAnsi="Aptos" w:eastAsia="Aptos" w:cs="Aptos"/>
+          <w:noProof w:val="0"/>
+          <w:sz w:val="22"/>
+          <w:szCs w:val="22"/>
+          <w:rtl w:val="1"/>
+          <w:lang w:val="en-US"/>
+        </w:rPr>
+        <w:t>משתמשים</w:t>
+      </w:r>
+      <w:r>
+        <w:rPr>
+          <w:rFonts w:ascii="Aptos" w:hAnsi="Aptos" w:eastAsia="Aptos" w:cs="Aptos"/>
+          <w:noProof w:val="0"/>
+          <w:sz w:val="22"/>
+          <w:szCs w:val="22"/>
+          <w:rtl w:val="1"/>
+          <w:lang w:val="en-US"/>
+        </w:rPr>
+        <w:t xml:space="preserve"> </w:t>
+      </w:r>
+      <w:r>
+        <w:rPr>
+          <w:rFonts w:ascii="Aptos" w:hAnsi="Aptos" w:eastAsia="Aptos" w:cs="Aptos"/>
+          <w:noProof w:val="0"/>
+          <w:sz w:val="22"/>
+          <w:szCs w:val="22"/>
+          <w:rtl w:val="1"/>
+          <w:lang w:val="en-US"/>
+        </w:rPr>
+        <w:t>והגדרת</w:t>
+      </w:r>
+      <w:r>
+        <w:rPr>
+          <w:rFonts w:ascii="Aptos" w:hAnsi="Aptos" w:eastAsia="Aptos" w:cs="Aptos"/>
+          <w:noProof w:val="0"/>
+          <w:sz w:val="22"/>
+          <w:szCs w:val="22"/>
+          <w:rtl w:val="1"/>
+          <w:lang w:val="en-US"/>
+        </w:rPr>
+        <w:t xml:space="preserve"> "</w:t>
+      </w:r>
+      <w:r>
+        <w:rPr>
+          <w:rFonts w:ascii="Aptos" w:hAnsi="Aptos" w:eastAsia="Aptos" w:cs="Aptos"/>
+          <w:noProof w:val="0"/>
+          <w:sz w:val="22"/>
+          <w:szCs w:val="22"/>
+          <w:rtl w:val="1"/>
+          <w:lang w:val="en-US"/>
+        </w:rPr>
+        <w:t>רשימות</w:t>
+      </w:r>
+      <w:r>
+        <w:rPr>
+          <w:rFonts w:ascii="Aptos" w:hAnsi="Aptos" w:eastAsia="Aptos" w:cs="Aptos"/>
+          <w:noProof w:val="0"/>
+          <w:sz w:val="22"/>
+          <w:szCs w:val="22"/>
+          <w:rtl w:val="1"/>
+          <w:lang w:val="en-US"/>
+        </w:rPr>
+        <w:t xml:space="preserve"> </w:t>
+      </w:r>
+      <w:r>
+        <w:rPr>
+          <w:rFonts w:ascii="Aptos" w:hAnsi="Aptos" w:eastAsia="Aptos" w:cs="Aptos"/>
+          <w:noProof w:val="0"/>
+          <w:sz w:val="22"/>
+          <w:szCs w:val="22"/>
+          <w:rtl w:val="1"/>
+          <w:lang w:val="en-US"/>
+        </w:rPr>
+        <w:t>לבנות</w:t>
+      </w:r>
+      <w:r>
+        <w:rPr>
+          <w:rFonts w:ascii="Aptos" w:hAnsi="Aptos" w:eastAsia="Aptos" w:cs="Aptos"/>
+          <w:noProof w:val="0"/>
+          <w:sz w:val="22"/>
+          <w:szCs w:val="22"/>
+          <w:rtl w:val="1"/>
+          <w:lang w:val="en-US"/>
+        </w:rPr>
+        <w:t xml:space="preserve">" </w:t>
+      </w:r>
+      <w:r>
+        <w:rPr>
+          <w:rFonts w:ascii="Aptos" w:hAnsi="Aptos" w:eastAsia="Aptos" w:cs="Aptos"/>
+          <w:noProof w:val="0"/>
+          <w:sz w:val="22"/>
+          <w:szCs w:val="22"/>
+          <w:rtl w:val="1"/>
+          <w:lang w:val="en-US"/>
+        </w:rPr>
+        <w:t>לצמצום</w:t>
+      </w:r>
+      <w:r>
+        <w:rPr>
+          <w:rFonts w:ascii="Aptos" w:hAnsi="Aptos" w:eastAsia="Aptos" w:cs="Aptos"/>
+          <w:noProof w:val="0"/>
+          <w:sz w:val="22"/>
+          <w:szCs w:val="22"/>
+          <w:rtl w:val="1"/>
+          <w:lang w:val="en-US"/>
+        </w:rPr>
+        <w:t xml:space="preserve"> </w:t>
+      </w:r>
+      <w:r>
+        <w:rPr>
+          <w:rFonts w:ascii="Aptos" w:hAnsi="Aptos" w:eastAsia="Aptos" w:cs="Aptos"/>
+          <w:noProof w:val="0"/>
+          <w:sz w:val="22"/>
+          <w:szCs w:val="22"/>
+          <w:rtl w:val="1"/>
+          <w:lang w:val="en-US"/>
+        </w:rPr>
+        <w:t>התראות</w:t>
+      </w:r>
+      <w:r>
+        <w:rPr>
+          <w:rFonts w:ascii="Aptos" w:hAnsi="Aptos" w:eastAsia="Aptos" w:cs="Aptos"/>
+          <w:noProof w:val="0"/>
+          <w:sz w:val="22"/>
+          <w:szCs w:val="22"/>
+          <w:rtl w:val="1"/>
+          <w:lang w:val="en-US"/>
+        </w:rPr>
+        <w:t xml:space="preserve"> </w:t>
+      </w:r>
+      <w:r>
+        <w:rPr>
+          <w:rFonts w:ascii="Aptos" w:hAnsi="Aptos" w:eastAsia="Aptos" w:cs="Aptos"/>
+          <w:noProof w:val="0"/>
+          <w:sz w:val="22"/>
+          <w:szCs w:val="22"/>
+          <w:rtl w:val="1"/>
+          <w:lang w:val="en-US"/>
+        </w:rPr>
+        <w:t>שווא</w:t>
+      </w:r>
+      <w:r>
+        <w:rPr>
+          <w:rFonts w:ascii="Aptos" w:hAnsi="Aptos" w:eastAsia="Aptos" w:cs="Aptos"/>
+          <w:noProof w:val="0"/>
+          <w:sz w:val="22"/>
+          <w:szCs w:val="22"/>
+          <w:lang w:val="en-US"/>
+        </w:rPr>
+        <w:t>.</w:t>
+      </w:r>
+    </w:p>
+    <w:p>
+      <w:pPr>
+        <w:bidi w:val="0"/>
+        <w:spacing w:before="0" w:beforeAutospacing="off" w:after="0" w:afterAutospacing="off"/>
+        <w:jc w:val="center"/>
+      </w:pPr>
+      <w:r>
+        <w:rPr>
+          <w:rFonts w:ascii="Aptos" w:hAnsi="Aptos" w:eastAsia="Aptos" w:cs="Aptos"/>
+          <w:noProof w:val="0"/>
+          <w:sz w:val="22"/>
+          <w:szCs w:val="22"/>
+          <w:lang w:val="en-US"/>
+        </w:rPr>
+        <w:t>+2</w:t>
+      </w:r>
+    </w:p>
+    <w:p>
+      <w:pPr>
+        <w:pStyle w:val="ListParagraph"/>
+        <w:numPr>
+          <w:ilvl w:val="0"/>
+          <w:numId w:val="11"/>
+        </w:numPr>
+        <w:bidi w:val="0"/>
+        <w:spacing w:before="240" w:beforeAutospacing="off" w:after="240" w:afterAutospacing="off"/>
+        <w:jc w:val="center"/>
+        <w:rPr>
+          <w:rFonts w:ascii="Aptos" w:hAnsi="Aptos" w:eastAsia="Aptos" w:cs="Aptos"/>
+          <w:noProof w:val="0"/>
+          <w:sz w:val="22"/>
+          <w:szCs w:val="22"/>
+          <w:lang w:val="en-US"/>
+        </w:rPr>
+      </w:pPr>
+      <w:r>
+        <w:rPr>
+          <w:rFonts w:ascii="Aptos" w:hAnsi="Aptos" w:eastAsia="Aptos" w:cs="Aptos"/>
+          <w:b w:val="1"/>
+          <w:bCs w:val="1"/>
+          <w:noProof w:val="0"/>
+          <w:sz w:val="22"/>
+          <w:szCs w:val="22"/>
+          <w:rtl w:val="1"/>
+          <w:lang w:val="en-US"/>
+        </w:rPr>
+        <w:t>תצוגה</w:t>
+      </w:r>
+      <w:r>
+        <w:rPr>
+          <w:rFonts w:ascii="Aptos" w:hAnsi="Aptos" w:eastAsia="Aptos" w:cs="Aptos"/>
+          <w:b w:val="1"/>
+          <w:bCs w:val="1"/>
+          <w:noProof w:val="0"/>
+          <w:sz w:val="22"/>
+          <w:szCs w:val="22"/>
+          <w:rtl w:val="1"/>
+          <w:lang w:val="en-US"/>
+        </w:rPr>
+        <w:t xml:space="preserve"> </w:t>
+      </w:r>
+      <w:r>
+        <w:rPr>
+          <w:rFonts w:ascii="Aptos" w:hAnsi="Aptos" w:eastAsia="Aptos" w:cs="Aptos"/>
+          <w:b w:val="1"/>
+          <w:bCs w:val="1"/>
+          <w:noProof w:val="0"/>
+          <w:sz w:val="22"/>
+          <w:szCs w:val="22"/>
+          <w:rtl w:val="1"/>
+          <w:lang w:val="en-US"/>
+        </w:rPr>
+        <w:t>ודיווח</w:t>
+      </w:r>
+      <w:r>
+        <w:rPr>
+          <w:rFonts w:ascii="Aptos" w:hAnsi="Aptos" w:eastAsia="Aptos" w:cs="Aptos"/>
+          <w:b w:val="1"/>
+          <w:bCs w:val="1"/>
+          <w:noProof w:val="0"/>
+          <w:sz w:val="22"/>
+          <w:szCs w:val="22"/>
+          <w:rtl w:val="1"/>
+          <w:lang w:val="en-US"/>
+        </w:rPr>
+        <w:t>:</w:t>
+      </w:r>
+      <w:r>
+        <w:rPr>
+          <w:rFonts w:ascii="Aptos" w:hAnsi="Aptos" w:eastAsia="Aptos" w:cs="Aptos"/>
+          <w:noProof w:val="0"/>
+          <w:sz w:val="22"/>
+          <w:szCs w:val="22"/>
+          <w:rtl w:val="1"/>
+          <w:lang w:val="en-US"/>
+        </w:rPr>
+        <w:t xml:space="preserve"> </w:t>
+      </w:r>
+      <w:r>
+        <w:rPr>
+          <w:rFonts w:ascii="Aptos" w:hAnsi="Aptos" w:eastAsia="Aptos" w:cs="Aptos"/>
+          <w:noProof w:val="0"/>
+          <w:sz w:val="22"/>
+          <w:szCs w:val="22"/>
+          <w:rtl w:val="1"/>
+          <w:lang w:val="en-US"/>
+        </w:rPr>
+        <w:t>דגש</w:t>
+      </w:r>
+      <w:r>
+        <w:rPr>
+          <w:rFonts w:ascii="Aptos" w:hAnsi="Aptos" w:eastAsia="Aptos" w:cs="Aptos"/>
+          <w:noProof w:val="0"/>
+          <w:sz w:val="22"/>
+          <w:szCs w:val="22"/>
+          <w:rtl w:val="1"/>
+          <w:lang w:val="en-US"/>
+        </w:rPr>
+        <w:t xml:space="preserve"> </w:t>
+      </w:r>
+      <w:r>
+        <w:rPr>
+          <w:rFonts w:ascii="Aptos" w:hAnsi="Aptos" w:eastAsia="Aptos" w:cs="Aptos"/>
+          <w:noProof w:val="0"/>
+          <w:sz w:val="22"/>
+          <w:szCs w:val="22"/>
+          <w:rtl w:val="1"/>
+          <w:lang w:val="en-US"/>
+        </w:rPr>
+        <w:t>מיוחד</w:t>
+      </w:r>
+      <w:r>
+        <w:rPr>
+          <w:rFonts w:ascii="Aptos" w:hAnsi="Aptos" w:eastAsia="Aptos" w:cs="Aptos"/>
+          <w:noProof w:val="0"/>
+          <w:sz w:val="22"/>
+          <w:szCs w:val="22"/>
+          <w:rtl w:val="1"/>
+          <w:lang w:val="en-US"/>
+        </w:rPr>
+        <w:t xml:space="preserve"> </w:t>
+      </w:r>
+      <w:r>
+        <w:rPr>
+          <w:rFonts w:ascii="Aptos" w:hAnsi="Aptos" w:eastAsia="Aptos" w:cs="Aptos"/>
+          <w:noProof w:val="0"/>
+          <w:sz w:val="22"/>
+          <w:szCs w:val="22"/>
+          <w:rtl w:val="1"/>
+          <w:lang w:val="en-US"/>
+        </w:rPr>
+        <w:t>הושם</w:t>
+      </w:r>
+      <w:r>
+        <w:rPr>
+          <w:rFonts w:ascii="Aptos" w:hAnsi="Aptos" w:eastAsia="Aptos" w:cs="Aptos"/>
+          <w:noProof w:val="0"/>
+          <w:sz w:val="22"/>
+          <w:szCs w:val="22"/>
+          <w:rtl w:val="1"/>
+          <w:lang w:val="en-US"/>
+        </w:rPr>
+        <w:t xml:space="preserve"> </w:t>
+      </w:r>
+      <w:r>
+        <w:rPr>
+          <w:rFonts w:ascii="Aptos" w:hAnsi="Aptos" w:eastAsia="Aptos" w:cs="Aptos"/>
+          <w:noProof w:val="0"/>
+          <w:sz w:val="22"/>
+          <w:szCs w:val="22"/>
+          <w:rtl w:val="1"/>
+          <w:lang w:val="en-US"/>
+        </w:rPr>
+        <w:t>על</w:t>
+      </w:r>
+      <w:r>
+        <w:rPr>
+          <w:rFonts w:ascii="Aptos" w:hAnsi="Aptos" w:eastAsia="Aptos" w:cs="Aptos"/>
+          <w:noProof w:val="0"/>
+          <w:sz w:val="22"/>
+          <w:szCs w:val="22"/>
+          <w:rtl w:val="1"/>
+          <w:lang w:val="en-US"/>
+        </w:rPr>
+        <w:t xml:space="preserve"> </w:t>
+      </w:r>
+      <w:r>
+        <w:rPr>
+          <w:rFonts w:ascii="Aptos" w:hAnsi="Aptos" w:eastAsia="Aptos" w:cs="Aptos"/>
+          <w:noProof w:val="0"/>
+          <w:sz w:val="22"/>
+          <w:szCs w:val="22"/>
+          <w:rtl w:val="1"/>
+          <w:lang w:val="en-US"/>
+        </w:rPr>
+        <w:t>ממשק</w:t>
+      </w:r>
+      <w:r>
+        <w:rPr>
+          <w:rFonts w:ascii="Aptos" w:hAnsi="Aptos" w:eastAsia="Aptos" w:cs="Aptos"/>
+          <w:noProof w:val="0"/>
+          <w:sz w:val="22"/>
+          <w:szCs w:val="22"/>
+          <w:rtl w:val="1"/>
+          <w:lang w:val="en-US"/>
+        </w:rPr>
+        <w:t xml:space="preserve"> </w:t>
+      </w:r>
+      <w:r>
+        <w:rPr>
+          <w:rFonts w:ascii="Aptos" w:hAnsi="Aptos" w:eastAsia="Aptos" w:cs="Aptos"/>
+          <w:noProof w:val="0"/>
+          <w:sz w:val="22"/>
+          <w:szCs w:val="22"/>
+          <w:rtl w:val="1"/>
+          <w:lang w:val="en-US"/>
+        </w:rPr>
+        <w:t>משתמש</w:t>
+      </w:r>
+      <w:r>
+        <w:rPr>
+          <w:rFonts w:ascii="Aptos" w:hAnsi="Aptos" w:eastAsia="Aptos" w:cs="Aptos"/>
+          <w:noProof w:val="0"/>
+          <w:sz w:val="22"/>
+          <w:szCs w:val="22"/>
+          <w:rtl w:val="1"/>
+          <w:lang w:val="en-US"/>
+        </w:rPr>
+        <w:t xml:space="preserve"> </w:t>
+      </w:r>
+      <w:r>
+        <w:rPr>
+          <w:rFonts w:ascii="Aptos" w:hAnsi="Aptos" w:eastAsia="Aptos" w:cs="Aptos"/>
+          <w:noProof w:val="0"/>
+          <w:sz w:val="22"/>
+          <w:szCs w:val="22"/>
+          <w:rtl w:val="1"/>
+          <w:lang w:val="en-US"/>
+        </w:rPr>
+        <w:t>אינטואיטיבי</w:t>
+      </w:r>
+      <w:r>
+        <w:rPr>
+          <w:rFonts w:ascii="Aptos" w:hAnsi="Aptos" w:eastAsia="Aptos" w:cs="Aptos"/>
+          <w:noProof w:val="0"/>
+          <w:sz w:val="22"/>
+          <w:szCs w:val="22"/>
+          <w:rtl w:val="1"/>
+          <w:lang w:val="en-US"/>
+        </w:rPr>
+        <w:t xml:space="preserve"> </w:t>
+      </w:r>
+      <w:r>
+        <w:rPr>
+          <w:rFonts w:ascii="Aptos" w:hAnsi="Aptos" w:eastAsia="Aptos" w:cs="Aptos"/>
+          <w:noProof w:val="0"/>
+          <w:sz w:val="22"/>
+          <w:szCs w:val="22"/>
+          <w:rtl w:val="1"/>
+          <w:lang w:val="en-US"/>
+        </w:rPr>
+        <w:t>המציג</w:t>
+      </w:r>
+      <w:r>
+        <w:rPr>
+          <w:rFonts w:ascii="Aptos" w:hAnsi="Aptos" w:eastAsia="Aptos" w:cs="Aptos"/>
+          <w:noProof w:val="0"/>
+          <w:sz w:val="22"/>
+          <w:szCs w:val="22"/>
+          <w:rtl w:val="1"/>
+          <w:lang w:val="en-US"/>
+        </w:rPr>
+        <w:t xml:space="preserve"> </w:t>
+      </w:r>
+      <w:r>
+        <w:rPr>
+          <w:rFonts w:ascii="Aptos" w:hAnsi="Aptos" w:eastAsia="Aptos" w:cs="Aptos"/>
+          <w:noProof w:val="0"/>
+          <w:sz w:val="22"/>
+          <w:szCs w:val="22"/>
+          <w:rtl w:val="1"/>
+          <w:lang w:val="en-US"/>
+        </w:rPr>
+        <w:t>התראות</w:t>
+      </w:r>
+      <w:r>
+        <w:rPr>
+          <w:rFonts w:ascii="Aptos" w:hAnsi="Aptos" w:eastAsia="Aptos" w:cs="Aptos"/>
+          <w:noProof w:val="0"/>
+          <w:sz w:val="22"/>
+          <w:szCs w:val="22"/>
+          <w:rtl w:val="1"/>
+          <w:lang w:val="en-US"/>
+        </w:rPr>
+        <w:t xml:space="preserve"> </w:t>
+      </w:r>
+      <w:r>
+        <w:rPr>
+          <w:rFonts w:ascii="Aptos" w:hAnsi="Aptos" w:eastAsia="Aptos" w:cs="Aptos"/>
+          <w:noProof w:val="0"/>
+          <w:sz w:val="22"/>
+          <w:szCs w:val="22"/>
+          <w:rtl w:val="1"/>
+          <w:lang w:val="en-US"/>
+        </w:rPr>
+        <w:t>ויזואליות</w:t>
+      </w:r>
+      <w:r>
+        <w:rPr>
+          <w:rFonts w:ascii="Aptos" w:hAnsi="Aptos" w:eastAsia="Aptos" w:cs="Aptos"/>
+          <w:noProof w:val="0"/>
+          <w:sz w:val="22"/>
+          <w:szCs w:val="22"/>
+          <w:rtl w:val="1"/>
+          <w:lang w:val="en-US"/>
+        </w:rPr>
+        <w:t xml:space="preserve"> </w:t>
+      </w:r>
+      <w:r>
+        <w:rPr>
+          <w:rFonts w:ascii="Aptos" w:hAnsi="Aptos" w:eastAsia="Aptos" w:cs="Aptos"/>
+          <w:noProof w:val="0"/>
+          <w:sz w:val="22"/>
+          <w:szCs w:val="22"/>
+          <w:rtl w:val="1"/>
+          <w:lang w:val="en-US"/>
+        </w:rPr>
+        <w:t>תוך</w:t>
+      </w:r>
+      <w:r>
+        <w:rPr>
+          <w:rFonts w:ascii="Aptos" w:hAnsi="Aptos" w:eastAsia="Aptos" w:cs="Aptos"/>
+          <w:noProof w:val="0"/>
+          <w:sz w:val="22"/>
+          <w:szCs w:val="22"/>
+          <w:rtl w:val="1"/>
+          <w:lang w:val="en-US"/>
+        </w:rPr>
+        <w:t xml:space="preserve"> </w:t>
+      </w:r>
+      <w:r>
+        <w:rPr>
+          <w:rFonts w:ascii="Aptos" w:hAnsi="Aptos" w:eastAsia="Aptos" w:cs="Aptos"/>
+          <w:noProof w:val="0"/>
+          <w:sz w:val="22"/>
+          <w:szCs w:val="22"/>
+          <w:rtl w:val="1"/>
+          <w:lang w:val="en-US"/>
+        </w:rPr>
+        <w:t>פחות</w:t>
+      </w:r>
+      <w:r>
+        <w:rPr>
+          <w:rFonts w:ascii="Aptos" w:hAnsi="Aptos" w:eastAsia="Aptos" w:cs="Aptos"/>
+          <w:noProof w:val="0"/>
+          <w:sz w:val="22"/>
+          <w:szCs w:val="22"/>
+          <w:rtl w:val="1"/>
+          <w:lang w:val="en-US"/>
+        </w:rPr>
+        <w:t xml:space="preserve"> מ-2 </w:t>
+      </w:r>
+      <w:r>
+        <w:rPr>
+          <w:rFonts w:ascii="Aptos" w:hAnsi="Aptos" w:eastAsia="Aptos" w:cs="Aptos"/>
+          <w:noProof w:val="0"/>
+          <w:sz w:val="22"/>
+          <w:szCs w:val="22"/>
+          <w:rtl w:val="1"/>
+          <w:lang w:val="en-US"/>
+        </w:rPr>
+        <w:t>שניות</w:t>
+      </w:r>
+      <w:r>
+        <w:rPr>
+          <w:rFonts w:ascii="Aptos" w:hAnsi="Aptos" w:eastAsia="Aptos" w:cs="Aptos"/>
+          <w:noProof w:val="0"/>
+          <w:sz w:val="22"/>
+          <w:szCs w:val="22"/>
+          <w:rtl w:val="1"/>
+          <w:lang w:val="en-US"/>
+        </w:rPr>
+        <w:t xml:space="preserve"> </w:t>
+      </w:r>
+      <w:r>
+        <w:rPr>
+          <w:rFonts w:ascii="Aptos" w:hAnsi="Aptos" w:eastAsia="Aptos" w:cs="Aptos"/>
+          <w:noProof w:val="0"/>
+          <w:sz w:val="22"/>
+          <w:szCs w:val="22"/>
+          <w:rtl w:val="1"/>
+          <w:lang w:val="en-US"/>
+        </w:rPr>
+        <w:t>מרגע</w:t>
+      </w:r>
+      <w:r>
+        <w:rPr>
+          <w:rFonts w:ascii="Aptos" w:hAnsi="Aptos" w:eastAsia="Aptos" w:cs="Aptos"/>
+          <w:noProof w:val="0"/>
+          <w:sz w:val="22"/>
+          <w:szCs w:val="22"/>
+          <w:rtl w:val="1"/>
+          <w:lang w:val="en-US"/>
+        </w:rPr>
+        <w:t xml:space="preserve"> </w:t>
+      </w:r>
+      <w:r>
+        <w:rPr>
+          <w:rFonts w:ascii="Aptos" w:hAnsi="Aptos" w:eastAsia="Aptos" w:cs="Aptos"/>
+          <w:noProof w:val="0"/>
+          <w:sz w:val="22"/>
+          <w:szCs w:val="22"/>
+          <w:rtl w:val="1"/>
+          <w:lang w:val="en-US"/>
+        </w:rPr>
+        <w:t>הזיהוי</w:t>
+      </w:r>
+      <w:r>
+        <w:rPr>
+          <w:rFonts w:ascii="Aptos" w:hAnsi="Aptos" w:eastAsia="Aptos" w:cs="Aptos"/>
+          <w:noProof w:val="0"/>
+          <w:sz w:val="22"/>
+          <w:szCs w:val="22"/>
+          <w:rtl w:val="1"/>
+          <w:lang w:val="en-US"/>
+        </w:rPr>
+        <w:t xml:space="preserve">, </w:t>
+      </w:r>
+      <w:r>
+        <w:rPr>
+          <w:rFonts w:ascii="Aptos" w:hAnsi="Aptos" w:eastAsia="Aptos" w:cs="Aptos"/>
+          <w:noProof w:val="0"/>
+          <w:sz w:val="22"/>
+          <w:szCs w:val="22"/>
+          <w:rtl w:val="1"/>
+          <w:lang w:val="en-US"/>
+        </w:rPr>
+        <w:t>לצד</w:t>
+      </w:r>
+      <w:r>
+        <w:rPr>
+          <w:rFonts w:ascii="Aptos" w:hAnsi="Aptos" w:eastAsia="Aptos" w:cs="Aptos"/>
+          <w:noProof w:val="0"/>
+          <w:sz w:val="22"/>
+          <w:szCs w:val="22"/>
+          <w:rtl w:val="1"/>
+          <w:lang w:val="en-US"/>
+        </w:rPr>
+        <w:t xml:space="preserve"> </w:t>
+      </w:r>
+      <w:r>
+        <w:rPr>
+          <w:rFonts w:ascii="Aptos" w:hAnsi="Aptos" w:eastAsia="Aptos" w:cs="Aptos"/>
+          <w:noProof w:val="0"/>
+          <w:sz w:val="22"/>
+          <w:szCs w:val="22"/>
+          <w:rtl w:val="1"/>
+          <w:lang w:val="en-US"/>
+        </w:rPr>
+        <w:t>יכולת</w:t>
+      </w:r>
+      <w:r>
+        <w:rPr>
+          <w:rFonts w:ascii="Aptos" w:hAnsi="Aptos" w:eastAsia="Aptos" w:cs="Aptos"/>
+          <w:noProof w:val="0"/>
+          <w:sz w:val="22"/>
+          <w:szCs w:val="22"/>
+          <w:rtl w:val="1"/>
+          <w:lang w:val="en-US"/>
+        </w:rPr>
+        <w:t xml:space="preserve"> </w:t>
+      </w:r>
+      <w:r>
+        <w:rPr>
+          <w:rFonts w:ascii="Aptos" w:hAnsi="Aptos" w:eastAsia="Aptos" w:cs="Aptos"/>
+          <w:noProof w:val="0"/>
+          <w:sz w:val="22"/>
+          <w:szCs w:val="22"/>
+          <w:rtl w:val="1"/>
+          <w:lang w:val="en-US"/>
+        </w:rPr>
+        <w:t>הפקת</w:t>
+      </w:r>
+      <w:r>
+        <w:rPr>
+          <w:rFonts w:ascii="Aptos" w:hAnsi="Aptos" w:eastAsia="Aptos" w:cs="Aptos"/>
+          <w:noProof w:val="0"/>
+          <w:sz w:val="22"/>
+          <w:szCs w:val="22"/>
+          <w:rtl w:val="1"/>
+          <w:lang w:val="en-US"/>
+        </w:rPr>
+        <w:t xml:space="preserve"> </w:t>
+      </w:r>
+      <w:r>
+        <w:rPr>
+          <w:rFonts w:ascii="Aptos" w:hAnsi="Aptos" w:eastAsia="Aptos" w:cs="Aptos"/>
+          <w:noProof w:val="0"/>
+          <w:sz w:val="22"/>
+          <w:szCs w:val="22"/>
+          <w:rtl w:val="1"/>
+          <w:lang w:val="en-US"/>
+        </w:rPr>
+        <w:t>דוחות</w:t>
+      </w:r>
+      <w:r>
+        <w:rPr>
+          <w:rFonts w:ascii="Aptos" w:hAnsi="Aptos" w:eastAsia="Aptos" w:cs="Aptos"/>
+          <w:noProof w:val="0"/>
+          <w:sz w:val="22"/>
+          <w:szCs w:val="22"/>
+          <w:rtl w:val="1"/>
+          <w:lang w:val="en-US"/>
+        </w:rPr>
+        <w:t xml:space="preserve"> </w:t>
+      </w:r>
+      <w:r>
+        <w:rPr>
+          <w:rFonts w:ascii="Aptos" w:hAnsi="Aptos" w:eastAsia="Aptos" w:cs="Aptos"/>
+          <w:noProof w:val="0"/>
+          <w:sz w:val="22"/>
+          <w:szCs w:val="22"/>
+          <w:rtl w:val="1"/>
+          <w:lang w:val="en-US"/>
+        </w:rPr>
+        <w:t>סיכון</w:t>
+      </w:r>
+      <w:r>
+        <w:rPr>
+          <w:rFonts w:ascii="Aptos" w:hAnsi="Aptos" w:eastAsia="Aptos" w:cs="Aptos"/>
+          <w:noProof w:val="0"/>
+          <w:sz w:val="22"/>
+          <w:szCs w:val="22"/>
+          <w:rtl w:val="1"/>
+          <w:lang w:val="en-US"/>
+        </w:rPr>
+        <w:t xml:space="preserve"> </w:t>
+      </w:r>
+      <w:r>
+        <w:rPr>
+          <w:rFonts w:ascii="Aptos" w:hAnsi="Aptos" w:eastAsia="Aptos" w:cs="Aptos"/>
+          <w:noProof w:val="0"/>
+          <w:sz w:val="22"/>
+          <w:szCs w:val="22"/>
+          <w:rtl w:val="1"/>
+          <w:lang w:val="en-US"/>
+        </w:rPr>
+        <w:t>מרוכזים</w:t>
+      </w:r>
+      <w:r>
+        <w:rPr>
+          <w:rFonts w:ascii="Aptos" w:hAnsi="Aptos" w:eastAsia="Aptos" w:cs="Aptos"/>
+          <w:noProof w:val="0"/>
+          <w:sz w:val="22"/>
+          <w:szCs w:val="22"/>
+          <w:lang w:val="en-US"/>
+        </w:rPr>
+        <w:t>.</w:t>
+      </w:r>
+    </w:p>
+    <w:p>
+      <w:pPr>
+        <w:bidi w:val="0"/>
+        <w:spacing w:before="0" w:beforeAutospacing="off" w:after="0" w:afterAutospacing="off"/>
+        <w:jc w:val="center"/>
+      </w:pPr>
+      <w:r>
+        <w:rPr>
+          <w:rFonts w:ascii="Aptos" w:hAnsi="Aptos" w:eastAsia="Aptos" w:cs="Aptos"/>
+          <w:noProof w:val="0"/>
+          <w:sz w:val="22"/>
+          <w:szCs w:val="22"/>
+          <w:lang w:val="en-US"/>
+        </w:rPr>
+        <w:t>+2</w:t>
+      </w:r>
+    </w:p>
+    <w:p>
+      <w:pPr>
+        <w:pStyle w:val="Heading3"/>
+        <w:bidi w:val="0"/>
+        <w:spacing w:before="281" w:beforeAutospacing="off" w:after="281" w:afterAutospacing="off"/>
+        <w:jc w:val="center"/>
+      </w:pPr>
+      <w:r>
+        <w:rPr>
+          <w:rFonts w:ascii="Aptos" w:hAnsi="Aptos" w:eastAsia="Aptos" w:cs="Aptos"/>
+          <w:noProof w:val="0"/>
+          <w:sz w:val="22"/>
+          <w:szCs w:val="22"/>
+          <w:rtl w:val="1"/>
+          <w:lang w:val="en-US"/>
+        </w:rPr>
+        <w:t>תרומת</w:t>
+      </w:r>
+      <w:r>
+        <w:rPr>
+          <w:rFonts w:ascii="Aptos" w:hAnsi="Aptos" w:eastAsia="Aptos" w:cs="Aptos"/>
+          <w:noProof w:val="0"/>
+          <w:sz w:val="22"/>
+          <w:szCs w:val="22"/>
+          <w:rtl w:val="1"/>
+          <w:lang w:val="en-US"/>
+        </w:rPr>
+        <w:t xml:space="preserve"> </w:t>
+      </w:r>
+      <w:r>
+        <w:rPr>
+          <w:rFonts w:ascii="Aptos" w:hAnsi="Aptos" w:eastAsia="Aptos" w:cs="Aptos"/>
+          <w:noProof w:val="0"/>
+          <w:sz w:val="22"/>
+          <w:szCs w:val="22"/>
+          <w:rtl w:val="1"/>
+          <w:lang w:val="en-US"/>
+        </w:rPr>
+        <w:t>המערכת</w:t>
+      </w:r>
+      <w:r>
+        <w:rPr>
+          <w:rFonts w:ascii="Aptos" w:hAnsi="Aptos" w:eastAsia="Aptos" w:cs="Aptos"/>
+          <w:noProof w:val="0"/>
+          <w:sz w:val="22"/>
+          <w:szCs w:val="22"/>
+          <w:rtl w:val="1"/>
+          <w:lang w:val="en-US"/>
+        </w:rPr>
+        <w:t xml:space="preserve"> </w:t>
+      </w:r>
+      <w:r>
+        <w:rPr>
+          <w:rFonts w:ascii="Aptos" w:hAnsi="Aptos" w:eastAsia="Aptos" w:cs="Aptos"/>
+          <w:noProof w:val="0"/>
+          <w:sz w:val="22"/>
+          <w:szCs w:val="22"/>
+          <w:rtl w:val="1"/>
+          <w:lang w:val="en-US"/>
+        </w:rPr>
+        <w:t>לארגון</w:t>
+      </w:r>
+      <w:r>
+        <w:rPr>
+          <w:rFonts w:ascii="Aptos" w:hAnsi="Aptos" w:eastAsia="Aptos" w:cs="Aptos"/>
+          <w:noProof w:val="0"/>
+          <w:sz w:val="22"/>
+          <w:szCs w:val="22"/>
+          <w:lang w:val="en-US"/>
+        </w:rPr>
+        <w:t>:</w:t>
+      </w:r>
+    </w:p>
+    <w:p>
+      <w:pPr>
+        <w:bidi w:val="0"/>
+        <w:spacing w:before="240" w:beforeAutospacing="off" w:after="240" w:afterAutospacing="off"/>
+        <w:jc w:val="center"/>
+      </w:pPr>
+      <w:r>
+        <w:rPr>
+          <w:rFonts w:ascii="Aptos" w:hAnsi="Aptos" w:eastAsia="Aptos" w:cs="Aptos"/>
+          <w:noProof w:val="0"/>
+          <w:sz w:val="22"/>
+          <w:szCs w:val="22"/>
+          <w:rtl w:val="1"/>
+          <w:lang w:val="en-US"/>
+        </w:rPr>
+        <w:t>הטמעת</w:t>
+      </w:r>
+      <w:r>
+        <w:rPr>
+          <w:rFonts w:ascii="Aptos" w:hAnsi="Aptos" w:eastAsia="Aptos" w:cs="Aptos"/>
+          <w:noProof w:val="0"/>
+          <w:sz w:val="22"/>
+          <w:szCs w:val="22"/>
+          <w:rtl w:val="1"/>
+          <w:lang w:val="en-US"/>
+        </w:rPr>
+        <w:t xml:space="preserve"> </w:t>
+      </w:r>
+      <w:r>
+        <w:rPr>
+          <w:rFonts w:ascii="Aptos" w:hAnsi="Aptos" w:eastAsia="Aptos" w:cs="Aptos"/>
+          <w:noProof w:val="0"/>
+          <w:sz w:val="22"/>
+          <w:szCs w:val="22"/>
+          <w:rtl w:val="1"/>
+          <w:lang w:val="en-US"/>
+        </w:rPr>
+        <w:t>המערכת</w:t>
+      </w:r>
+      <w:r>
+        <w:rPr>
+          <w:rFonts w:ascii="Aptos" w:hAnsi="Aptos" w:eastAsia="Aptos" w:cs="Aptos"/>
+          <w:noProof w:val="0"/>
+          <w:sz w:val="22"/>
+          <w:szCs w:val="22"/>
+          <w:rtl w:val="1"/>
+          <w:lang w:val="en-US"/>
+        </w:rPr>
+        <w:t xml:space="preserve"> </w:t>
+      </w:r>
+      <w:r>
+        <w:rPr>
+          <w:rFonts w:ascii="Aptos" w:hAnsi="Aptos" w:eastAsia="Aptos" w:cs="Aptos"/>
+          <w:noProof w:val="0"/>
+          <w:sz w:val="22"/>
+          <w:szCs w:val="22"/>
+          <w:rtl w:val="1"/>
+          <w:lang w:val="en-US"/>
+        </w:rPr>
+        <w:t>צפויה</w:t>
+      </w:r>
+      <w:r>
+        <w:rPr>
+          <w:rFonts w:ascii="Aptos" w:hAnsi="Aptos" w:eastAsia="Aptos" w:cs="Aptos"/>
+          <w:noProof w:val="0"/>
+          <w:sz w:val="22"/>
+          <w:szCs w:val="22"/>
+          <w:rtl w:val="1"/>
+          <w:lang w:val="en-US"/>
+        </w:rPr>
+        <w:t xml:space="preserve"> </w:t>
+      </w:r>
+      <w:r>
+        <w:rPr>
+          <w:rFonts w:ascii="Aptos" w:hAnsi="Aptos" w:eastAsia="Aptos" w:cs="Aptos"/>
+          <w:noProof w:val="0"/>
+          <w:sz w:val="22"/>
+          <w:szCs w:val="22"/>
+          <w:rtl w:val="1"/>
+          <w:lang w:val="en-US"/>
+        </w:rPr>
+        <w:t>לשפר</w:t>
+      </w:r>
+      <w:r>
+        <w:rPr>
+          <w:rFonts w:ascii="Aptos" w:hAnsi="Aptos" w:eastAsia="Aptos" w:cs="Aptos"/>
+          <w:noProof w:val="0"/>
+          <w:sz w:val="22"/>
+          <w:szCs w:val="22"/>
+          <w:rtl w:val="1"/>
+          <w:lang w:val="en-US"/>
+        </w:rPr>
+        <w:t xml:space="preserve"> </w:t>
+      </w:r>
+      <w:r>
+        <w:rPr>
+          <w:rFonts w:ascii="Aptos" w:hAnsi="Aptos" w:eastAsia="Aptos" w:cs="Aptos"/>
+          <w:noProof w:val="0"/>
+          <w:sz w:val="22"/>
+          <w:szCs w:val="22"/>
+          <w:rtl w:val="1"/>
+          <w:lang w:val="en-US"/>
+        </w:rPr>
+        <w:t>משמעותית</w:t>
+      </w:r>
+      <w:r>
+        <w:rPr>
+          <w:rFonts w:ascii="Aptos" w:hAnsi="Aptos" w:eastAsia="Aptos" w:cs="Aptos"/>
+          <w:noProof w:val="0"/>
+          <w:sz w:val="22"/>
+          <w:szCs w:val="22"/>
+          <w:rtl w:val="1"/>
+          <w:lang w:val="en-US"/>
+        </w:rPr>
+        <w:t xml:space="preserve"> </w:t>
+      </w:r>
+      <w:r>
+        <w:rPr>
+          <w:rFonts w:ascii="Aptos" w:hAnsi="Aptos" w:eastAsia="Aptos" w:cs="Aptos"/>
+          <w:noProof w:val="0"/>
+          <w:sz w:val="22"/>
+          <w:szCs w:val="22"/>
+          <w:rtl w:val="1"/>
+          <w:lang w:val="en-US"/>
+        </w:rPr>
+        <w:t>את</w:t>
+      </w:r>
+      <w:r>
+        <w:rPr>
+          <w:rFonts w:ascii="Aptos" w:hAnsi="Aptos" w:eastAsia="Aptos" w:cs="Aptos"/>
+          <w:noProof w:val="0"/>
+          <w:sz w:val="22"/>
+          <w:szCs w:val="22"/>
+          <w:rtl w:val="1"/>
+          <w:lang w:val="en-US"/>
+        </w:rPr>
+        <w:t xml:space="preserve"> </w:t>
+      </w:r>
+      <w:r>
+        <w:rPr>
+          <w:rFonts w:ascii="Aptos" w:hAnsi="Aptos" w:eastAsia="Aptos" w:cs="Aptos"/>
+          <w:noProof w:val="0"/>
+          <w:sz w:val="22"/>
+          <w:szCs w:val="22"/>
+          <w:rtl w:val="1"/>
+          <w:lang w:val="en-US"/>
+        </w:rPr>
+        <w:t>רמת</w:t>
+      </w:r>
+      <w:r>
+        <w:rPr>
+          <w:rFonts w:ascii="Aptos" w:hAnsi="Aptos" w:eastAsia="Aptos" w:cs="Aptos"/>
+          <w:noProof w:val="0"/>
+          <w:sz w:val="22"/>
+          <w:szCs w:val="22"/>
+          <w:rtl w:val="1"/>
+          <w:lang w:val="en-US"/>
+        </w:rPr>
+        <w:t xml:space="preserve"> </w:t>
+      </w:r>
+      <w:r>
+        <w:rPr>
+          <w:rFonts w:ascii="Aptos" w:hAnsi="Aptos" w:eastAsia="Aptos" w:cs="Aptos"/>
+          <w:noProof w:val="0"/>
+          <w:sz w:val="22"/>
+          <w:szCs w:val="22"/>
+          <w:rtl w:val="1"/>
+          <w:lang w:val="en-US"/>
+        </w:rPr>
+        <w:t>האבטחה</w:t>
+      </w:r>
+      <w:r>
+        <w:rPr>
+          <w:rFonts w:ascii="Aptos" w:hAnsi="Aptos" w:eastAsia="Aptos" w:cs="Aptos"/>
+          <w:noProof w:val="0"/>
+          <w:sz w:val="22"/>
+          <w:szCs w:val="22"/>
+          <w:rtl w:val="1"/>
+          <w:lang w:val="en-US"/>
+        </w:rPr>
+        <w:t xml:space="preserve"> </w:t>
+      </w:r>
+      <w:r>
+        <w:rPr>
+          <w:rFonts w:ascii="Aptos" w:hAnsi="Aptos" w:eastAsia="Aptos" w:cs="Aptos"/>
+          <w:noProof w:val="0"/>
+          <w:sz w:val="22"/>
+          <w:szCs w:val="22"/>
+          <w:rtl w:val="1"/>
+          <w:lang w:val="en-US"/>
+        </w:rPr>
+        <w:t>הכוללת</w:t>
+      </w:r>
+      <w:r>
+        <w:rPr>
+          <w:rFonts w:ascii="Aptos" w:hAnsi="Aptos" w:eastAsia="Aptos" w:cs="Aptos"/>
+          <w:noProof w:val="0"/>
+          <w:sz w:val="22"/>
+          <w:szCs w:val="22"/>
+          <w:rtl w:val="1"/>
+          <w:lang w:val="en-US"/>
+        </w:rPr>
+        <w:t xml:space="preserve"> </w:t>
+      </w:r>
+      <w:r>
+        <w:rPr>
+          <w:rFonts w:ascii="Aptos" w:hAnsi="Aptos" w:eastAsia="Aptos" w:cs="Aptos"/>
+          <w:noProof w:val="0"/>
+          <w:sz w:val="22"/>
+          <w:szCs w:val="22"/>
+          <w:rtl w:val="1"/>
+          <w:lang w:val="en-US"/>
+        </w:rPr>
+        <w:t>בארגון</w:t>
+      </w:r>
+      <w:r>
+        <w:rPr>
+          <w:rFonts w:ascii="Aptos" w:hAnsi="Aptos" w:eastAsia="Aptos" w:cs="Aptos"/>
+          <w:noProof w:val="0"/>
+          <w:sz w:val="22"/>
+          <w:szCs w:val="22"/>
+          <w:rtl w:val="1"/>
+          <w:lang w:val="en-US"/>
+        </w:rPr>
+        <w:t xml:space="preserve">, </w:t>
+      </w:r>
+      <w:r>
+        <w:rPr>
+          <w:rFonts w:ascii="Aptos" w:hAnsi="Aptos" w:eastAsia="Aptos" w:cs="Aptos"/>
+          <w:noProof w:val="0"/>
+          <w:sz w:val="22"/>
+          <w:szCs w:val="22"/>
+          <w:rtl w:val="1"/>
+          <w:lang w:val="en-US"/>
+        </w:rPr>
+        <w:t>להקטין</w:t>
+      </w:r>
+      <w:r>
+        <w:rPr>
+          <w:rFonts w:ascii="Aptos" w:hAnsi="Aptos" w:eastAsia="Aptos" w:cs="Aptos"/>
+          <w:noProof w:val="0"/>
+          <w:sz w:val="22"/>
+          <w:szCs w:val="22"/>
+          <w:rtl w:val="1"/>
+          <w:lang w:val="en-US"/>
+        </w:rPr>
+        <w:t xml:space="preserve"> </w:t>
+      </w:r>
+      <w:r>
+        <w:rPr>
+          <w:rFonts w:ascii="Aptos" w:hAnsi="Aptos" w:eastAsia="Aptos" w:cs="Aptos"/>
+          <w:noProof w:val="0"/>
+          <w:sz w:val="22"/>
+          <w:szCs w:val="22"/>
+          <w:rtl w:val="1"/>
+          <w:lang w:val="en-US"/>
+        </w:rPr>
+        <w:t>את</w:t>
+      </w:r>
+      <w:r>
+        <w:rPr>
+          <w:rFonts w:ascii="Aptos" w:hAnsi="Aptos" w:eastAsia="Aptos" w:cs="Aptos"/>
+          <w:noProof w:val="0"/>
+          <w:sz w:val="22"/>
+          <w:szCs w:val="22"/>
+          <w:rtl w:val="1"/>
+          <w:lang w:val="en-US"/>
+        </w:rPr>
+        <w:t xml:space="preserve"> </w:t>
+      </w:r>
+      <w:r>
+        <w:rPr>
+          <w:rFonts w:ascii="Aptos" w:hAnsi="Aptos" w:eastAsia="Aptos" w:cs="Aptos"/>
+          <w:noProof w:val="0"/>
+          <w:sz w:val="22"/>
+          <w:szCs w:val="22"/>
+          <w:rtl w:val="1"/>
+          <w:lang w:val="en-US"/>
+        </w:rPr>
+        <w:t>זמן</w:t>
+      </w:r>
+      <w:r>
+        <w:rPr>
+          <w:rFonts w:ascii="Aptos" w:hAnsi="Aptos" w:eastAsia="Aptos" w:cs="Aptos"/>
+          <w:noProof w:val="0"/>
+          <w:sz w:val="22"/>
+          <w:szCs w:val="22"/>
+          <w:rtl w:val="1"/>
+          <w:lang w:val="en-US"/>
+        </w:rPr>
+        <w:t xml:space="preserve"> </w:t>
+      </w:r>
+      <w:r>
+        <w:rPr>
+          <w:rFonts w:ascii="Aptos" w:hAnsi="Aptos" w:eastAsia="Aptos" w:cs="Aptos"/>
+          <w:noProof w:val="0"/>
+          <w:sz w:val="22"/>
+          <w:szCs w:val="22"/>
+          <w:rtl w:val="1"/>
+          <w:lang w:val="en-US"/>
+        </w:rPr>
+        <w:t>התגובה</w:t>
+      </w:r>
+      <w:r>
+        <w:rPr>
+          <w:rFonts w:ascii="Aptos" w:hAnsi="Aptos" w:eastAsia="Aptos" w:cs="Aptos"/>
+          <w:noProof w:val="0"/>
+          <w:sz w:val="22"/>
+          <w:szCs w:val="22"/>
+          <w:rtl w:val="1"/>
+          <w:lang w:val="en-US"/>
+        </w:rPr>
+        <w:t xml:space="preserve"> </w:t>
+      </w:r>
+      <w:r>
+        <w:rPr>
+          <w:rFonts w:ascii="Aptos" w:hAnsi="Aptos" w:eastAsia="Aptos" w:cs="Aptos"/>
+          <w:noProof w:val="0"/>
+          <w:sz w:val="22"/>
+          <w:szCs w:val="22"/>
+          <w:rtl w:val="1"/>
+          <w:lang w:val="en-US"/>
+        </w:rPr>
+        <w:t>לאירועי</w:t>
+      </w:r>
+      <w:r>
+        <w:rPr>
+          <w:rFonts w:ascii="Aptos" w:hAnsi="Aptos" w:eastAsia="Aptos" w:cs="Aptos"/>
+          <w:noProof w:val="0"/>
+          <w:sz w:val="22"/>
+          <w:szCs w:val="22"/>
+          <w:rtl w:val="1"/>
+          <w:lang w:val="en-US"/>
+        </w:rPr>
+        <w:t xml:space="preserve"> </w:t>
+      </w:r>
+      <w:r>
+        <w:rPr>
+          <w:rFonts w:ascii="Aptos" w:hAnsi="Aptos" w:eastAsia="Aptos" w:cs="Aptos"/>
+          <w:noProof w:val="0"/>
+          <w:sz w:val="22"/>
+          <w:szCs w:val="22"/>
+          <w:rtl w:val="1"/>
+          <w:lang w:val="en-US"/>
+        </w:rPr>
+        <w:t>סייבר</w:t>
+      </w:r>
+      <w:r>
+        <w:rPr>
+          <w:rFonts w:ascii="Aptos" w:hAnsi="Aptos" w:eastAsia="Aptos" w:cs="Aptos"/>
+          <w:noProof w:val="0"/>
+          <w:sz w:val="22"/>
+          <w:szCs w:val="22"/>
+          <w:rtl w:val="1"/>
+          <w:lang w:val="en-US"/>
+        </w:rPr>
+        <w:t xml:space="preserve"> </w:t>
+      </w:r>
+      <w:r>
+        <w:rPr>
+          <w:rFonts w:ascii="Aptos" w:hAnsi="Aptos" w:eastAsia="Aptos" w:cs="Aptos"/>
+          <w:noProof w:val="0"/>
+          <w:sz w:val="22"/>
+          <w:szCs w:val="22"/>
+          <w:rtl w:val="1"/>
+          <w:lang w:val="en-US"/>
+        </w:rPr>
+        <w:t>ולספק</w:t>
+      </w:r>
+      <w:r>
+        <w:rPr>
+          <w:rFonts w:ascii="Aptos" w:hAnsi="Aptos" w:eastAsia="Aptos" w:cs="Aptos"/>
+          <w:noProof w:val="0"/>
+          <w:sz w:val="22"/>
+          <w:szCs w:val="22"/>
+          <w:rtl w:val="1"/>
+          <w:lang w:val="en-US"/>
+        </w:rPr>
+        <w:t xml:space="preserve"> </w:t>
+      </w:r>
+      <w:r>
+        <w:rPr>
+          <w:rFonts w:ascii="Aptos" w:hAnsi="Aptos" w:eastAsia="Aptos" w:cs="Aptos"/>
+          <w:noProof w:val="0"/>
+          <w:sz w:val="22"/>
+          <w:szCs w:val="22"/>
+          <w:rtl w:val="1"/>
+          <w:lang w:val="en-US"/>
+        </w:rPr>
+        <w:t>כלי</w:t>
+      </w:r>
+      <w:r>
+        <w:rPr>
+          <w:rFonts w:ascii="Aptos" w:hAnsi="Aptos" w:eastAsia="Aptos" w:cs="Aptos"/>
+          <w:noProof w:val="0"/>
+          <w:sz w:val="22"/>
+          <w:szCs w:val="22"/>
+          <w:rtl w:val="1"/>
+          <w:lang w:val="en-US"/>
+        </w:rPr>
+        <w:t xml:space="preserve"> </w:t>
+      </w:r>
+      <w:r>
+        <w:rPr>
+          <w:rFonts w:ascii="Aptos" w:hAnsi="Aptos" w:eastAsia="Aptos" w:cs="Aptos"/>
+          <w:noProof w:val="0"/>
+          <w:sz w:val="22"/>
+          <w:szCs w:val="22"/>
+          <w:rtl w:val="1"/>
+          <w:lang w:val="en-US"/>
+        </w:rPr>
+        <w:t>עבודה</w:t>
+      </w:r>
+      <w:r>
+        <w:rPr>
+          <w:rFonts w:ascii="Aptos" w:hAnsi="Aptos" w:eastAsia="Aptos" w:cs="Aptos"/>
+          <w:noProof w:val="0"/>
+          <w:sz w:val="22"/>
+          <w:szCs w:val="22"/>
+          <w:rtl w:val="1"/>
+          <w:lang w:val="en-US"/>
+        </w:rPr>
+        <w:t xml:space="preserve"> </w:t>
+      </w:r>
+      <w:r>
+        <w:rPr>
+          <w:rFonts w:ascii="Aptos" w:hAnsi="Aptos" w:eastAsia="Aptos" w:cs="Aptos"/>
+          <w:noProof w:val="0"/>
+          <w:sz w:val="22"/>
+          <w:szCs w:val="22"/>
+          <w:rtl w:val="1"/>
+          <w:lang w:val="en-US"/>
+        </w:rPr>
+        <w:t>חיוני</w:t>
+      </w:r>
+      <w:r>
+        <w:rPr>
+          <w:rFonts w:ascii="Aptos" w:hAnsi="Aptos" w:eastAsia="Aptos" w:cs="Aptos"/>
+          <w:noProof w:val="0"/>
+          <w:sz w:val="22"/>
+          <w:szCs w:val="22"/>
+          <w:rtl w:val="1"/>
+          <w:lang w:val="en-US"/>
+        </w:rPr>
+        <w:t xml:space="preserve"> </w:t>
+      </w:r>
+      <w:r>
+        <w:rPr>
+          <w:rFonts w:ascii="Aptos" w:hAnsi="Aptos" w:eastAsia="Aptos" w:cs="Aptos"/>
+          <w:noProof w:val="0"/>
+          <w:sz w:val="22"/>
+          <w:szCs w:val="22"/>
+          <w:rtl w:val="1"/>
+          <w:lang w:val="en-US"/>
+        </w:rPr>
+        <w:t>לצוות</w:t>
+      </w:r>
+      <w:r>
+        <w:rPr>
+          <w:rFonts w:ascii="Aptos" w:hAnsi="Aptos" w:eastAsia="Aptos" w:cs="Aptos"/>
+          <w:noProof w:val="0"/>
+          <w:sz w:val="22"/>
+          <w:szCs w:val="22"/>
+          <w:rtl w:val="1"/>
+          <w:lang w:val="en-US"/>
+        </w:rPr>
+        <w:t xml:space="preserve"> ה</w:t>
+      </w:r>
+      <w:r>
+        <w:rPr>
+          <w:rFonts w:ascii="Aptos" w:hAnsi="Aptos" w:eastAsia="Aptos" w:cs="Aptos"/>
+          <w:noProof w:val="0"/>
+          <w:sz w:val="22"/>
+          <w:szCs w:val="22"/>
+          <w:lang w:val="en-US"/>
+        </w:rPr>
+        <w:t xml:space="preserve">-IT </w:t>
+      </w:r>
+      <w:r>
+        <w:rPr>
+          <w:rFonts w:ascii="Aptos" w:hAnsi="Aptos" w:eastAsia="Aptos" w:cs="Aptos"/>
+          <w:noProof w:val="0"/>
+          <w:sz w:val="22"/>
+          <w:szCs w:val="22"/>
+          <w:rtl w:val="1"/>
+          <w:lang w:val="en-US"/>
+        </w:rPr>
+        <w:t>בקבלת</w:t>
+      </w:r>
+      <w:r>
+        <w:rPr>
+          <w:rFonts w:ascii="Aptos" w:hAnsi="Aptos" w:eastAsia="Aptos" w:cs="Aptos"/>
+          <w:noProof w:val="0"/>
+          <w:sz w:val="22"/>
+          <w:szCs w:val="22"/>
+          <w:rtl w:val="1"/>
+          <w:lang w:val="en-US"/>
+        </w:rPr>
+        <w:t xml:space="preserve"> </w:t>
+      </w:r>
+      <w:r>
+        <w:rPr>
+          <w:rFonts w:ascii="Aptos" w:hAnsi="Aptos" w:eastAsia="Aptos" w:cs="Aptos"/>
+          <w:noProof w:val="0"/>
+          <w:sz w:val="22"/>
+          <w:szCs w:val="22"/>
+          <w:rtl w:val="1"/>
+          <w:lang w:val="en-US"/>
+        </w:rPr>
+        <w:t>החלטות</w:t>
+      </w:r>
+      <w:r>
+        <w:rPr>
+          <w:rFonts w:ascii="Aptos" w:hAnsi="Aptos" w:eastAsia="Aptos" w:cs="Aptos"/>
+          <w:noProof w:val="0"/>
+          <w:sz w:val="22"/>
+          <w:szCs w:val="22"/>
+          <w:rtl w:val="1"/>
+          <w:lang w:val="en-US"/>
+        </w:rPr>
+        <w:t xml:space="preserve"> </w:t>
+      </w:r>
+      <w:r>
+        <w:rPr>
+          <w:rFonts w:ascii="Aptos" w:hAnsi="Aptos" w:eastAsia="Aptos" w:cs="Aptos"/>
+          <w:noProof w:val="0"/>
+          <w:sz w:val="22"/>
+          <w:szCs w:val="22"/>
+          <w:rtl w:val="1"/>
+          <w:lang w:val="en-US"/>
+        </w:rPr>
+        <w:t>מבוססות</w:t>
+      </w:r>
+      <w:r>
+        <w:rPr>
+          <w:rFonts w:ascii="Aptos" w:hAnsi="Aptos" w:eastAsia="Aptos" w:cs="Aptos"/>
+          <w:noProof w:val="0"/>
+          <w:sz w:val="22"/>
+          <w:szCs w:val="22"/>
+          <w:rtl w:val="1"/>
+          <w:lang w:val="en-US"/>
+        </w:rPr>
+        <w:t xml:space="preserve"> </w:t>
+      </w:r>
+      <w:r>
+        <w:rPr>
+          <w:rFonts w:ascii="Aptos" w:hAnsi="Aptos" w:eastAsia="Aptos" w:cs="Aptos"/>
+          <w:noProof w:val="0"/>
+          <w:sz w:val="22"/>
+          <w:szCs w:val="22"/>
+          <w:rtl w:val="1"/>
+          <w:lang w:val="en-US"/>
+        </w:rPr>
+        <w:t>נתונים</w:t>
+      </w:r>
+      <w:r>
+        <w:rPr>
+          <w:rFonts w:ascii="Aptos" w:hAnsi="Aptos" w:eastAsia="Aptos" w:cs="Aptos"/>
+          <w:noProof w:val="0"/>
+          <w:sz w:val="22"/>
+          <w:szCs w:val="22"/>
+          <w:rtl w:val="1"/>
+          <w:lang w:val="en-US"/>
+        </w:rPr>
+        <w:t xml:space="preserve">. </w:t>
+      </w:r>
+      <w:r>
+        <w:rPr>
+          <w:rFonts w:ascii="Aptos" w:hAnsi="Aptos" w:eastAsia="Aptos" w:cs="Aptos"/>
+          <w:noProof w:val="0"/>
+          <w:sz w:val="22"/>
+          <w:szCs w:val="22"/>
+          <w:rtl w:val="1"/>
+          <w:lang w:val="en-US"/>
+        </w:rPr>
+        <w:t>התשתית</w:t>
+      </w:r>
+      <w:r>
+        <w:rPr>
+          <w:rFonts w:ascii="Aptos" w:hAnsi="Aptos" w:eastAsia="Aptos" w:cs="Aptos"/>
+          <w:noProof w:val="0"/>
+          <w:sz w:val="22"/>
+          <w:szCs w:val="22"/>
+          <w:rtl w:val="1"/>
+          <w:lang w:val="en-US"/>
+        </w:rPr>
+        <w:t xml:space="preserve"> </w:t>
+      </w:r>
+      <w:r>
+        <w:rPr>
+          <w:rFonts w:ascii="Aptos" w:hAnsi="Aptos" w:eastAsia="Aptos" w:cs="Aptos"/>
+          <w:noProof w:val="0"/>
+          <w:sz w:val="22"/>
+          <w:szCs w:val="22"/>
+          <w:rtl w:val="1"/>
+          <w:lang w:val="en-US"/>
+        </w:rPr>
+        <w:t>שנבנתה</w:t>
+      </w:r>
+      <w:r>
+        <w:rPr>
+          <w:rFonts w:ascii="Aptos" w:hAnsi="Aptos" w:eastAsia="Aptos" w:cs="Aptos"/>
+          <w:noProof w:val="0"/>
+          <w:sz w:val="22"/>
+          <w:szCs w:val="22"/>
+          <w:rtl w:val="1"/>
+          <w:lang w:val="en-US"/>
+        </w:rPr>
+        <w:t xml:space="preserve"> </w:t>
+      </w:r>
+      <w:r>
+        <w:rPr>
+          <w:rFonts w:ascii="Aptos" w:hAnsi="Aptos" w:eastAsia="Aptos" w:cs="Aptos"/>
+          <w:noProof w:val="0"/>
+          <w:sz w:val="22"/>
+          <w:szCs w:val="22"/>
+          <w:rtl w:val="1"/>
+          <w:lang w:val="en-US"/>
+        </w:rPr>
+        <w:t>במסמך</w:t>
+      </w:r>
+      <w:r>
+        <w:rPr>
+          <w:rFonts w:ascii="Aptos" w:hAnsi="Aptos" w:eastAsia="Aptos" w:cs="Aptos"/>
+          <w:noProof w:val="0"/>
+          <w:sz w:val="22"/>
+          <w:szCs w:val="22"/>
+          <w:rtl w:val="1"/>
+          <w:lang w:val="en-US"/>
+        </w:rPr>
+        <w:t xml:space="preserve"> </w:t>
+      </w:r>
+      <w:r>
+        <w:rPr>
+          <w:rFonts w:ascii="Aptos" w:hAnsi="Aptos" w:eastAsia="Aptos" w:cs="Aptos"/>
+          <w:noProof w:val="0"/>
+          <w:sz w:val="22"/>
+          <w:szCs w:val="22"/>
+          <w:rtl w:val="1"/>
+          <w:lang w:val="en-US"/>
+        </w:rPr>
+        <w:t>זה</w:t>
+      </w:r>
+      <w:r>
+        <w:rPr>
+          <w:rFonts w:ascii="Aptos" w:hAnsi="Aptos" w:eastAsia="Aptos" w:cs="Aptos"/>
+          <w:noProof w:val="0"/>
+          <w:sz w:val="22"/>
+          <w:szCs w:val="22"/>
+          <w:rtl w:val="1"/>
+          <w:lang w:val="en-US"/>
+        </w:rPr>
+        <w:t xml:space="preserve">, </w:t>
+      </w:r>
+      <w:r>
+        <w:rPr>
+          <w:rFonts w:ascii="Aptos" w:hAnsi="Aptos" w:eastAsia="Aptos" w:cs="Aptos"/>
+          <w:noProof w:val="0"/>
+          <w:sz w:val="22"/>
+          <w:szCs w:val="22"/>
+          <w:rtl w:val="1"/>
+          <w:lang w:val="en-US"/>
+        </w:rPr>
+        <w:t>הכוללת</w:t>
+      </w:r>
+      <w:r>
+        <w:rPr>
+          <w:rFonts w:ascii="Aptos" w:hAnsi="Aptos" w:eastAsia="Aptos" w:cs="Aptos"/>
+          <w:noProof w:val="0"/>
+          <w:sz w:val="22"/>
+          <w:szCs w:val="22"/>
+          <w:rtl w:val="1"/>
+          <w:lang w:val="en-US"/>
+        </w:rPr>
+        <w:t xml:space="preserve"> </w:t>
+      </w:r>
+      <w:r>
+        <w:rPr>
+          <w:rFonts w:ascii="Aptos" w:hAnsi="Aptos" w:eastAsia="Aptos" w:cs="Aptos"/>
+          <w:noProof w:val="0"/>
+          <w:sz w:val="22"/>
+          <w:szCs w:val="22"/>
+          <w:rtl w:val="1"/>
+          <w:lang w:val="en-US"/>
+        </w:rPr>
+        <w:t>את</w:t>
+      </w:r>
+      <w:r>
+        <w:rPr>
+          <w:rFonts w:ascii="Aptos" w:hAnsi="Aptos" w:eastAsia="Aptos" w:cs="Aptos"/>
+          <w:noProof w:val="0"/>
+          <w:sz w:val="22"/>
+          <w:szCs w:val="22"/>
+          <w:rtl w:val="1"/>
+          <w:lang w:val="en-US"/>
+        </w:rPr>
+        <w:t xml:space="preserve"> </w:t>
+      </w:r>
+      <w:r>
+        <w:rPr>
+          <w:rFonts w:ascii="Aptos" w:hAnsi="Aptos" w:eastAsia="Aptos" w:cs="Aptos"/>
+          <w:noProof w:val="0"/>
+          <w:sz w:val="22"/>
+          <w:szCs w:val="22"/>
+          <w:rtl w:val="1"/>
+          <w:lang w:val="en-US"/>
+        </w:rPr>
+        <w:t>תרשימי</w:t>
+      </w:r>
+      <w:r>
+        <w:rPr>
+          <w:rFonts w:ascii="Aptos" w:hAnsi="Aptos" w:eastAsia="Aptos" w:cs="Aptos"/>
+          <w:noProof w:val="0"/>
+          <w:sz w:val="22"/>
+          <w:szCs w:val="22"/>
+          <w:rtl w:val="1"/>
+          <w:lang w:val="en-US"/>
+        </w:rPr>
+        <w:t xml:space="preserve"> ה</w:t>
+      </w:r>
+      <w:r>
+        <w:rPr>
+          <w:rFonts w:ascii="Aptos" w:hAnsi="Aptos" w:eastAsia="Aptos" w:cs="Aptos"/>
+          <w:noProof w:val="0"/>
+          <w:sz w:val="22"/>
+          <w:szCs w:val="22"/>
+          <w:lang w:val="en-US"/>
+        </w:rPr>
+        <w:t xml:space="preserve">-DFD </w:t>
+      </w:r>
+      <w:r>
+        <w:rPr>
+          <w:rFonts w:ascii="Aptos" w:hAnsi="Aptos" w:eastAsia="Aptos" w:cs="Aptos"/>
+          <w:noProof w:val="0"/>
+          <w:sz w:val="22"/>
+          <w:szCs w:val="22"/>
+          <w:rtl w:val="1"/>
+          <w:lang w:val="en-US"/>
+        </w:rPr>
+        <w:t>וה</w:t>
+      </w:r>
+      <w:r>
+        <w:rPr>
+          <w:rFonts w:ascii="Aptos" w:hAnsi="Aptos" w:eastAsia="Aptos" w:cs="Aptos"/>
+          <w:noProof w:val="0"/>
+          <w:sz w:val="22"/>
+          <w:szCs w:val="22"/>
+          <w:lang w:val="en-US"/>
+        </w:rPr>
+        <w:t xml:space="preserve">-UML, </w:t>
+      </w:r>
+      <w:r>
+        <w:rPr>
+          <w:rFonts w:ascii="Aptos" w:hAnsi="Aptos" w:eastAsia="Aptos" w:cs="Aptos"/>
+          <w:noProof w:val="0"/>
+          <w:sz w:val="22"/>
+          <w:szCs w:val="22"/>
+          <w:rtl w:val="1"/>
+          <w:lang w:val="en-US"/>
+        </w:rPr>
+        <w:t>מהווה</w:t>
+      </w:r>
+      <w:r>
+        <w:rPr>
+          <w:rFonts w:ascii="Aptos" w:hAnsi="Aptos" w:eastAsia="Aptos" w:cs="Aptos"/>
+          <w:noProof w:val="0"/>
+          <w:sz w:val="22"/>
+          <w:szCs w:val="22"/>
+          <w:rtl w:val="1"/>
+          <w:lang w:val="en-US"/>
+        </w:rPr>
+        <w:t xml:space="preserve"> </w:t>
+      </w:r>
+      <w:r>
+        <w:rPr>
+          <w:rFonts w:ascii="Aptos" w:hAnsi="Aptos" w:eastAsia="Aptos" w:cs="Aptos"/>
+          <w:noProof w:val="0"/>
+          <w:sz w:val="22"/>
+          <w:szCs w:val="22"/>
+          <w:rtl w:val="1"/>
+          <w:lang w:val="en-US"/>
+        </w:rPr>
+        <w:t>בסיס</w:t>
+      </w:r>
+      <w:r>
+        <w:rPr>
+          <w:rFonts w:ascii="Aptos" w:hAnsi="Aptos" w:eastAsia="Aptos" w:cs="Aptos"/>
+          <w:noProof w:val="0"/>
+          <w:sz w:val="22"/>
+          <w:szCs w:val="22"/>
+          <w:rtl w:val="1"/>
+          <w:lang w:val="en-US"/>
+        </w:rPr>
+        <w:t xml:space="preserve"> </w:t>
+      </w:r>
+      <w:r>
+        <w:rPr>
+          <w:rFonts w:ascii="Aptos" w:hAnsi="Aptos" w:eastAsia="Aptos" w:cs="Aptos"/>
+          <w:noProof w:val="0"/>
+          <w:sz w:val="22"/>
+          <w:szCs w:val="22"/>
+          <w:rtl w:val="1"/>
+          <w:lang w:val="en-US"/>
+        </w:rPr>
+        <w:t>איתן</w:t>
+      </w:r>
+      <w:r>
+        <w:rPr>
+          <w:rFonts w:ascii="Aptos" w:hAnsi="Aptos" w:eastAsia="Aptos" w:cs="Aptos"/>
+          <w:noProof w:val="0"/>
+          <w:sz w:val="22"/>
+          <w:szCs w:val="22"/>
+          <w:rtl w:val="1"/>
+          <w:lang w:val="en-US"/>
+        </w:rPr>
+        <w:t xml:space="preserve"> </w:t>
+      </w:r>
+      <w:r>
+        <w:rPr>
+          <w:rFonts w:ascii="Aptos" w:hAnsi="Aptos" w:eastAsia="Aptos" w:cs="Aptos"/>
+          <w:noProof w:val="0"/>
+          <w:sz w:val="22"/>
+          <w:szCs w:val="22"/>
+          <w:rtl w:val="1"/>
+          <w:lang w:val="en-US"/>
+        </w:rPr>
+        <w:t>לשלב</w:t>
+      </w:r>
+      <w:r>
+        <w:rPr>
+          <w:rFonts w:ascii="Aptos" w:hAnsi="Aptos" w:eastAsia="Aptos" w:cs="Aptos"/>
+          <w:noProof w:val="0"/>
+          <w:sz w:val="22"/>
+          <w:szCs w:val="22"/>
+          <w:rtl w:val="1"/>
+          <w:lang w:val="en-US"/>
+        </w:rPr>
+        <w:t xml:space="preserve"> </w:t>
+      </w:r>
+      <w:r>
+        <w:rPr>
+          <w:rFonts w:ascii="Aptos" w:hAnsi="Aptos" w:eastAsia="Aptos" w:cs="Aptos"/>
+          <w:noProof w:val="0"/>
+          <w:sz w:val="22"/>
+          <w:szCs w:val="22"/>
+          <w:rtl w:val="1"/>
+          <w:lang w:val="en-US"/>
+        </w:rPr>
+        <w:t>הפיתוח</w:t>
+      </w:r>
+      <w:r>
+        <w:rPr>
+          <w:rFonts w:ascii="Aptos" w:hAnsi="Aptos" w:eastAsia="Aptos" w:cs="Aptos"/>
+          <w:noProof w:val="0"/>
+          <w:sz w:val="22"/>
+          <w:szCs w:val="22"/>
+          <w:rtl w:val="1"/>
+          <w:lang w:val="en-US"/>
+        </w:rPr>
+        <w:t xml:space="preserve"> </w:t>
+      </w:r>
+      <w:r>
+        <w:rPr>
+          <w:rFonts w:ascii="Aptos" w:hAnsi="Aptos" w:eastAsia="Aptos" w:cs="Aptos"/>
+          <w:noProof w:val="0"/>
+          <w:sz w:val="22"/>
+          <w:szCs w:val="22"/>
+          <w:rtl w:val="1"/>
+          <w:lang w:val="en-US"/>
+        </w:rPr>
+        <w:t>והמימוש</w:t>
+      </w:r>
+      <w:r>
+        <w:rPr>
+          <w:rFonts w:ascii="Aptos" w:hAnsi="Aptos" w:eastAsia="Aptos" w:cs="Aptos"/>
+          <w:noProof w:val="0"/>
+          <w:sz w:val="22"/>
+          <w:szCs w:val="22"/>
+          <w:rtl w:val="1"/>
+          <w:lang w:val="en-US"/>
+        </w:rPr>
+        <w:t xml:space="preserve"> </w:t>
+      </w:r>
+      <w:r>
+        <w:rPr>
+          <w:rFonts w:ascii="Aptos" w:hAnsi="Aptos" w:eastAsia="Aptos" w:cs="Aptos"/>
+          <w:noProof w:val="0"/>
+          <w:sz w:val="22"/>
+          <w:szCs w:val="22"/>
+          <w:rtl w:val="1"/>
+          <w:lang w:val="en-US"/>
+        </w:rPr>
+        <w:t>של</w:t>
+      </w:r>
+      <w:r>
+        <w:rPr>
+          <w:rFonts w:ascii="Aptos" w:hAnsi="Aptos" w:eastAsia="Aptos" w:cs="Aptos"/>
+          <w:noProof w:val="0"/>
+          <w:sz w:val="22"/>
+          <w:szCs w:val="22"/>
+          <w:rtl w:val="1"/>
+          <w:lang w:val="en-US"/>
+        </w:rPr>
+        <w:t xml:space="preserve"> </w:t>
+      </w:r>
+      <w:r>
+        <w:rPr>
+          <w:rFonts w:ascii="Aptos" w:hAnsi="Aptos" w:eastAsia="Aptos" w:cs="Aptos"/>
+          <w:noProof w:val="0"/>
+          <w:sz w:val="22"/>
+          <w:szCs w:val="22"/>
+          <w:rtl w:val="1"/>
+          <w:lang w:val="en-US"/>
+        </w:rPr>
+        <w:t>הפרויקט</w:t>
+      </w:r>
+      <w:r>
+        <w:rPr>
+          <w:rFonts w:ascii="Aptos" w:hAnsi="Aptos" w:eastAsia="Aptos" w:cs="Aptos"/>
+          <w:noProof w:val="0"/>
+          <w:sz w:val="22"/>
+          <w:szCs w:val="22"/>
+          <w:lang w:val="en-US"/>
+        </w:rPr>
+        <w:t xml:space="preserve"> .</w:t>
+      </w:r>
+    </w:p>
+    <w:p>
+      <w:pPr>
+        <w:pStyle w:val="Normal"/>
+        <w:suppressLineNumbers w:val="0"/>
+        <w:bidi w:val="1"/>
+        <w:spacing w:before="0" w:beforeAutospacing="off" w:after="160" w:afterAutospacing="off" w:line="259" w:lineRule="auto"/>
+        <w:ind w:left="0" w:right="0"/>
+        <w:jc w:val="center"/>
+        <w:rPr>
+          <w:b w:val="0"/>
+          <w:bCs w:val="0"/>
+          <w:sz w:val="22"/>
+          <w:szCs w:val="22"/>
+          <w:lang w:val="en-US"/>
+        </w:rPr>
+      </w:pPr>
+    </w:p>
     <w:sectPr>
       <w:pgSz w:w="11906" w:h="16838" w:orient="portrait"/>
       <w:pgMar w:top="1440" w:right="1440" w:bottom="1440" w:left="1440" w:header="0" w:footer="0" w:gutter="0"/>
       <w:cols w:space="720"/>
       <w:formProt w:val="0"/>
       <w:docGrid w:linePitch="360" w:charSpace="4096"/>
-      <w:headerReference w:type="default" r:id="R55a0b6002f2c4daf"/>
-      <w:headerReference w:type="even" r:id="R0a8dec751cd14304"/>
-      <w:footerReference w:type="default" r:id="Rd8c691d4a6bc4e3e"/>
-      <w:footerReference w:type="even" r:id="Ra1f1fd49f8864da5"/>
+      <w:headerReference w:type="default" r:id="R42aa200cbe574a5c"/>
+      <w:headerReference w:type="even" r:id="R92c2171a584546a8"/>
+      <w:footerReference w:type="default" r:id="R9788f8c35ba04488"/>
+      <w:footerReference w:type="even" r:id="R04fef4be609b4416"/>
     </w:sectPr>
   </w:body>
 </w:document>
@@ -33771,6 +38297,118 @@
 
 <file path=word/numbering.xml><?xml version="1.0" encoding="utf-8"?>
 <w:numbering xmlns:wpc="http://schemas.microsoft.com/office/word/2010/wordprocessingCanvas" xmlns:cx="http://schemas.microsoft.com/office/drawing/2014/chartex" xmlns:cx1="http://schemas.microsoft.com/office/drawing/2015/9/8/chartex" xmlns:cx2="http://schemas.microsoft.com/office/drawing/2015/10/21/chartex" xmlns:cx3="http://schemas.microsoft.com/office/drawing/2016/5/9/chartex" xmlns:cx4="http://schemas.microsoft.com/office/drawing/2016/5/10/chartex" xmlns:cx5="http://schemas.microsoft.com/office/drawing/2016/5/11/chartex" xmlns:cx6="http://schemas.microsoft.com/office/drawing/2016/5/12/chartex" xmlns:cx7="http://schemas.microsoft.com/office/drawing/2016/5/13/chartex" xmlns:cx8="http://schemas.microsoft.com/office/drawing/2016/5/14/chartex" xmlns:mc="http://schemas.openxmlformats.org/markup-compatibility/2006" xmlns:aink="http://schemas.microsoft.com/office/drawing/2016/ink" xmlns:am3d="http://schemas.microsoft.com/office/drawing/2017/model3d" xmlns:o="urn:schemas-microsoft-com:office:office" xmlns:oel="http://schemas.microsoft.com/office/2019/extlst" xmlns:r="http://schemas.openxmlformats.org/officeDocument/2006/relationships" xmlns:m="http://schemas.openxmlformats.org/officeDocument/2006/math" xmlns:v="urn:schemas-microsoft-com:vml" xmlns:wp14="http://schemas.microsoft.com/office/word/2010/wordprocessingDrawing" xmlns:wp="http://schemas.openxmlformats.org/drawingml/2006/wordprocessingDrawing" xmlns:w10="urn:schemas-microsoft-com:office:word" xmlns:w="http://schemas.openxmlformats.org/wordprocessingml/2006/main" xmlns:w14="http://schemas.microsoft.com/office/word/2010/wordml" xmlns:w15="http://schemas.microsoft.com/office/word/2012/wordml" xmlns:w16cex="http://schemas.microsoft.com/office/word/2018/wordml/cex" xmlns:w16cid="http://schemas.microsoft.com/office/word/2016/wordml/cid" xmlns:w16="http://schemas.microsoft.com/office/word/2018/wordml" xmlns:w16du="http://schemas.microsoft.com/office/word/2023/wordml/word16du" xmlns:w16sdtdh="http://schemas.microsoft.com/office/word/2020/wordml/sdtdatahash" xmlns:w16sdtfl="http://schemas.microsoft.com/office/word/2024/wordml/sdtformatlock" xmlns:w16se="http://schemas.microsoft.com/office/word/2015/wordml/symex" xmlns:wpg="http://schemas.microsoft.com/office/word/2010/wordprocessingGroup" xmlns:wpi="http://schemas.microsoft.com/office/word/2010/wordprocessingInk" xmlns:wne="http://schemas.microsoft.com/office/word/2006/wordml" xmlns:wps="http://schemas.microsoft.com/office/word/2010/wordprocessingShape" mc:Ignorable="w14 w15 w16se w16cid w16 w16cex w16sdtdh w16sdtfl w16du wp14">
+  <w:abstractNum xmlns:w="http://schemas.openxmlformats.org/wordprocessingml/2006/main" w:abstractNumId="10">
+    <w:nsid w:val="224b3409"/>
+    <w:multiLevelType xmlns:w="http://schemas.openxmlformats.org/wordprocessingml/2006/main" w:val="hybridMultilevel"/>
+    <w:lvl xmlns:w="http://schemas.openxmlformats.org/wordprocessingml/2006/main" w:ilvl="0">
+      <w:start w:val="1"/>
+      <w:numFmt w:val="bullet"/>
+      <w:lvlText w:val=""/>
+      <w:lvlJc w:val="left"/>
+      <w:pPr>
+        <w:ind w:left="720" w:hanging="360"/>
+      </w:pPr>
+      <w:rPr>
+        <w:rFonts w:hint="default" w:ascii="Symbol" w:hAnsi="Symbol"/>
+      </w:rPr>
+    </w:lvl>
+    <w:lvl xmlns:w="http://schemas.openxmlformats.org/wordprocessingml/2006/main" w:ilvl="1">
+      <w:start w:val="1"/>
+      <w:numFmt w:val="bullet"/>
+      <w:lvlText w:val="o"/>
+      <w:lvlJc w:val="left"/>
+      <w:pPr>
+        <w:ind w:left="1440" w:hanging="360"/>
+      </w:pPr>
+      <w:rPr>
+        <w:rFonts w:hint="default" w:ascii="Courier New" w:hAnsi="Courier New"/>
+      </w:rPr>
+    </w:lvl>
+    <w:lvl xmlns:w="http://schemas.openxmlformats.org/wordprocessingml/2006/main" w:ilvl="2">
+      <w:start w:val="1"/>
+      <w:numFmt w:val="bullet"/>
+      <w:lvlText w:val=""/>
+      <w:lvlJc w:val="left"/>
+      <w:pPr>
+        <w:ind w:left="2160" w:hanging="360"/>
+      </w:pPr>
+      <w:rPr>
+        <w:rFonts w:hint="default" w:ascii="Wingdings" w:hAnsi="Wingdings"/>
+      </w:rPr>
+    </w:lvl>
+    <w:lvl xmlns:w="http://schemas.openxmlformats.org/wordprocessingml/2006/main" w:ilvl="3">
+      <w:start w:val="1"/>
+      <w:numFmt w:val="bullet"/>
+      <w:lvlText w:val=""/>
+      <w:lvlJc w:val="left"/>
+      <w:pPr>
+        <w:ind w:left="2880" w:hanging="360"/>
+      </w:pPr>
+      <w:rPr>
+        <w:rFonts w:hint="default" w:ascii="Symbol" w:hAnsi="Symbol"/>
+      </w:rPr>
+    </w:lvl>
+    <w:lvl xmlns:w="http://schemas.openxmlformats.org/wordprocessingml/2006/main" w:ilvl="4">
+      <w:start w:val="1"/>
+      <w:numFmt w:val="bullet"/>
+      <w:lvlText w:val="o"/>
+      <w:lvlJc w:val="left"/>
+      <w:pPr>
+        <w:ind w:left="3600" w:hanging="360"/>
+      </w:pPr>
+      <w:rPr>
+        <w:rFonts w:hint="default" w:ascii="Courier New" w:hAnsi="Courier New"/>
+      </w:rPr>
+    </w:lvl>
+    <w:lvl xmlns:w="http://schemas.openxmlformats.org/wordprocessingml/2006/main" w:ilvl="5">
+      <w:start w:val="1"/>
+      <w:numFmt w:val="bullet"/>
+      <w:lvlText w:val=""/>
+      <w:lvlJc w:val="left"/>
+      <w:pPr>
+        <w:ind w:left="4320" w:hanging="360"/>
+      </w:pPr>
+      <w:rPr>
+        <w:rFonts w:hint="default" w:ascii="Wingdings" w:hAnsi="Wingdings"/>
+      </w:rPr>
+    </w:lvl>
+    <w:lvl xmlns:w="http://schemas.openxmlformats.org/wordprocessingml/2006/main" w:ilvl="6">
+      <w:start w:val="1"/>
+      <w:numFmt w:val="bullet"/>
+      <w:lvlText w:val=""/>
+      <w:lvlJc w:val="left"/>
+      <w:pPr>
+        <w:ind w:left="5040" w:hanging="360"/>
+      </w:pPr>
+      <w:rPr>
+        <w:rFonts w:hint="default" w:ascii="Symbol" w:hAnsi="Symbol"/>
+      </w:rPr>
+    </w:lvl>
+    <w:lvl xmlns:w="http://schemas.openxmlformats.org/wordprocessingml/2006/main" w:ilvl="7">
+      <w:start w:val="1"/>
+      <w:numFmt w:val="bullet"/>
+      <w:lvlText w:val="o"/>
+      <w:lvlJc w:val="left"/>
+      <w:pPr>
+        <w:ind w:left="5760" w:hanging="360"/>
+      </w:pPr>
+      <w:rPr>
+        <w:rFonts w:hint="default" w:ascii="Courier New" w:hAnsi="Courier New"/>
+      </w:rPr>
+    </w:lvl>
+    <w:lvl xmlns:w="http://schemas.openxmlformats.org/wordprocessingml/2006/main" w:ilvl="8">
+      <w:start w:val="1"/>
+      <w:numFmt w:val="bullet"/>
+      <w:lvlText w:val=""/>
+      <w:lvlJc w:val="left"/>
+      <w:pPr>
+        <w:ind w:left="6480" w:hanging="360"/>
+      </w:pPr>
+      <w:rPr>
+        <w:rFonts w:hint="default" w:ascii="Wingdings" w:hAnsi="Wingdings"/>
+      </w:rPr>
+    </w:lvl>
+  </w:abstractNum>
   <w:abstractNum w:abstractNumId="0" w15:restartNumberingAfterBreak="0">
     <w:nsid w:val="20161C5C"/>
     <w:multiLevelType w:val="multilevel"/>
@@ -35134,6 +39772,9 @@
       </w:pPr>
     </w:lvl>
   </w:abstractNum>
+  <w:num w:numId="11">
+    <w:abstractNumId w:val="10"/>
+  </w:num>
   <w:num w:numId="1" w16cid:durableId="722292602">
     <w:abstractNumId w:val="6"/>
   </w:num>
@@ -36164,7 +40805,7 @@
     <w:name w:val="header"/>
     <w:basedOn w:val="Normal"/>
     <w:unhideWhenUsed/>
-    <w:rsid w:val="37833792"/>
+    <w:rsid w:val="25F37E4A"/>
     <w:pPr>
       <w:tabs>
         <w:tab w:val="center" w:leader="none" w:pos="4680"/>
@@ -36178,7 +40819,7 @@
     <w:name w:val="footer"/>
     <w:basedOn w:val="Normal"/>
     <w:unhideWhenUsed/>
-    <w:rsid w:val="37833792"/>
+    <w:rsid w:val="25F37E4A"/>
     <w:pPr>
       <w:tabs>
         <w:tab w:val="center" w:leader="none" w:pos="4680"/>

</xml_diff>

<commit_message>
Added docs for proj defense
</commit_message>
<xml_diff>
--- a/Nati_Goral_IDS_Documentation.docx
+++ b/Nati_Goral_IDS_Documentation.docx
@@ -22819,6 +22819,8 @@
           <w:bCs w:val="1"/>
           <w:sz w:val="32"/>
           <w:szCs w:val="32"/>
+          <w:rtl w:val="1"/>
+          <w:lang w:val="en-US"/>
         </w:rPr>
       </w:pPr>
       <w:r>
@@ -22827,6 +22829,7 @@
           <w:bCs w:val="1"/>
           <w:sz w:val="32"/>
           <w:szCs w:val="32"/>
+          <w:lang w:val="en-US"/>
         </w:rPr>
         <w:t>7</w:t>
       </w:r>
@@ -22837,6 +22840,7 @@
           <w:sz w:val="32"/>
           <w:szCs w:val="32"/>
           <w:rtl w:val="1"/>
+          <w:lang w:val="en-US"/>
         </w:rPr>
         <w:t xml:space="preserve"> </w:t>
       </w:r>
@@ -22847,28 +22851,102 @@
           <w:sz w:val="32"/>
           <w:szCs w:val="32"/>
           <w:rtl w:val="1"/>
-        </w:rPr>
-        <w:t>מבנה המחלקות</w:t>
-      </w:r>
-    </w:p>
-    <w:p>
-      <w:pPr>
-        <w:bidi w:val="1"/>
-        <w:jc w:val="center"/>
+          <w:lang w:val="en-US"/>
+        </w:rPr>
+        <w:t>תרשים</w:t>
+      </w:r>
+      <w:r>
         <w:rPr>
           <w:b w:val="1"/>
           <w:bCs w:val="1"/>
           <w:sz w:val="32"/>
           <w:szCs w:val="32"/>
           <w:rtl w:val="1"/>
-        </w:rPr>
+          <w:lang w:val="en-US"/>
+        </w:rPr>
+        <w:t xml:space="preserve"> </w:t>
+      </w:r>
+      <w:r>
+        <w:rPr>
+          <w:b w:val="1"/>
+          <w:bCs w:val="1"/>
+          <w:sz w:val="32"/>
+          <w:szCs w:val="32"/>
+          <w:rtl w:val="1"/>
+          <w:lang w:val="en-US"/>
+        </w:rPr>
+        <w:t>אובייקטים</w:t>
+      </w:r>
+    </w:p>
+    <w:p>
+      <w:pPr>
+        <w:bidi w:val="1"/>
+        <w:jc w:val="center"/>
+        <w:rPr>
+          <w:b w:val="0"/>
+          <w:bCs w:val="0"/>
+          <w:sz w:val="22"/>
+          <w:szCs w:val="22"/>
+          <w:rtl w:val="1"/>
+          <w:lang w:val="en-US"/>
+        </w:rPr>
+      </w:pPr>
+      <w:r>
+        <w:rPr>
+          <w:b w:val="0"/>
+          <w:bCs w:val="0"/>
+          <w:sz w:val="22"/>
+          <w:szCs w:val="22"/>
+          <w:rtl w:val="1"/>
+          <w:lang w:val="en-US" w:bidi="he-IL"/>
+        </w:rPr>
+        <w:t>היות והמערכת</w:t>
+      </w:r>
+      <w:r>
+        <w:rPr>
+          <w:b w:val="0"/>
+          <w:bCs w:val="0"/>
+          <w:sz w:val="22"/>
+          <w:szCs w:val="22"/>
+          <w:rtl w:val="1"/>
+          <w:lang w:val="en-US" w:bidi="he-IL"/>
+        </w:rPr>
+        <w:t xml:space="preserve"> משתמשת במסד לא </w:t>
+      </w:r>
+      <w:r>
+        <w:rPr>
+          <w:b w:val="0"/>
+          <w:bCs w:val="0"/>
+          <w:sz w:val="22"/>
+          <w:szCs w:val="22"/>
+          <w:rtl w:val="1"/>
+          <w:lang w:val="en-US" w:bidi="he-IL"/>
+        </w:rPr>
+        <w:t>רלציוני</w:t>
+      </w:r>
+      <w:r>
+        <w:rPr>
+          <w:b w:val="0"/>
+          <w:bCs w:val="0"/>
+          <w:sz w:val="22"/>
+          <w:szCs w:val="22"/>
+          <w:rtl w:val="1"/>
+          <w:lang w:val="en-US" w:bidi="he-IL"/>
+        </w:rPr>
+        <w:t xml:space="preserve"> ניהול נתונים מתבצע באמצעות מסמכים:</w:t>
+      </w:r>
+    </w:p>
+    <w:p>
+      <w:pPr>
+        <w:bidi w:val="1"/>
+        <w:jc w:val="center"/>
       </w:pPr>
       <w:r>
         <w:drawing>
-          <wp:inline wp14:editId="7009B223" wp14:anchorId="5A6629E8">
-            <wp:extent cx="5724525" cy="5314084"/>
+          <wp:inline wp14:editId="3390C498" wp14:anchorId="59038C48">
+            <wp:extent cx="6512177" cy="4828032"/>
             <wp:effectExtent l="0" t="0" r="0" b="0"/>
-            <wp:docPr id="1196433712" name="drawing"/>
+            <wp:docPr id="341228579" name="drawing"/>
             <wp:cNvGraphicFramePr>
               <a:graphicFrameLocks noChangeAspect="1"/>
             </wp:cNvGraphicFramePr>
@@ -22876,11 +22954,11 @@
               <a:graphicData xmlns:a="http://schemas.openxmlformats.org/drawingml/2006/main" uri="http://schemas.openxmlformats.org/drawingml/2006/picture">
                 <pic:pic xmlns:pic="http://schemas.openxmlformats.org/drawingml/2006/picture">
                   <pic:nvPicPr>
-                    <pic:cNvPr id="1196433712" name="Picture 1196433712"/>
+                    <pic:cNvPr id="341228579" name="Picture 341228579"/>
                     <pic:cNvPicPr/>
                   </pic:nvPicPr>
                   <pic:blipFill>
-                    <a:blip xmlns:r="http://schemas.openxmlformats.org/officeDocument/2006/relationships" r:embed="rId1088811479">
+                    <a:blip xmlns:r="http://schemas.openxmlformats.org/officeDocument/2006/relationships" r:embed="rId1001108485">
                       <a:extLst>
                         <a:ext uri="{28A0092B-C50C-407E-A947-70E740481C1C}">
                           <a14:useLocalDpi xmlns:a14="http://schemas.microsoft.com/office/drawing/2010/main"/>
@@ -22894,7 +22972,7 @@
                   <pic:spPr>
                     <a:xfrm rot="0">
                       <a:off x="0" y="0"/>
-                      <a:ext cx="5724525" cy="5314084"/>
+                      <a:ext cx="6512177" cy="4828032"/>
                     </a:xfrm>
                     <a:prstGeom prst="rect">
                       <a:avLst/>
@@ -33111,7 +33189,7 @@
           <w:rtl w:val="1"/>
           <w:lang w:val="en-US"/>
         </w:rPr>
-        <w:t>אובייקטים</w:t>
+        <w:t>מחלקות</w:t>
       </w:r>
     </w:p>
     <w:p>
@@ -33122,20 +33200,13 @@
         <w:spacing w:before="0" w:beforeAutospacing="off" w:after="160" w:afterAutospacing="off" w:line="259" w:lineRule="auto"/>
         <w:ind w:left="0" w:right="0"/>
         <w:jc w:val="center"/>
-        <w:rPr>
-          <w:b w:val="1"/>
-          <w:bCs w:val="1"/>
-          <w:sz w:val="28"/>
-          <w:szCs w:val="28"/>
-          <w:lang w:val="en-US"/>
-        </w:rPr>
       </w:pPr>
       <w:r>
         <w:drawing>
-          <wp:inline wp14:editId="5E9BD7C0" wp14:anchorId="06CDB435">
-            <wp:extent cx="6309360" cy="4566676"/>
+          <wp:inline wp14:editId="1257B57B" wp14:anchorId="3C6B5F26">
+            <wp:extent cx="5912313" cy="5577840"/>
             <wp:effectExtent l="0" t="0" r="0" b="0"/>
-            <wp:docPr id="302539347" name="drawing"/>
+            <wp:docPr id="186794238" name="drawing"/>
             <wp:cNvGraphicFramePr>
               <a:graphicFrameLocks noChangeAspect="1"/>
             </wp:cNvGraphicFramePr>
@@ -33143,11 +33214,11 @@
               <a:graphicData xmlns:a="http://schemas.openxmlformats.org/drawingml/2006/main" uri="http://schemas.openxmlformats.org/drawingml/2006/picture">
                 <pic:pic xmlns:pic="http://schemas.openxmlformats.org/drawingml/2006/picture">
                   <pic:nvPicPr>
-                    <pic:cNvPr id="302539347" name="Picture 302539347"/>
+                    <pic:cNvPr id="186794238" name="Picture 186794238"/>
                     <pic:cNvPicPr/>
                   </pic:nvPicPr>
                   <pic:blipFill>
-                    <a:blip xmlns:r="http://schemas.openxmlformats.org/officeDocument/2006/relationships" r:embed="rId417854496">
+                    <a:blip xmlns:r="http://schemas.openxmlformats.org/officeDocument/2006/relationships" r:embed="rId802467853">
                       <a:extLst>
                         <a:ext uri="{28A0092B-C50C-407E-A947-70E740481C1C}">
                           <a14:useLocalDpi xmlns:a14="http://schemas.microsoft.com/office/drawing/2010/main"/>
@@ -33161,7 +33232,7 @@
                   <pic:spPr>
                     <a:xfrm rot="0">
                       <a:off x="0" y="0"/>
-                      <a:ext cx="6309360" cy="4566676"/>
+                      <a:ext cx="5912313" cy="5577840"/>
                     </a:xfrm>
                     <a:prstGeom prst="rect">
                       <a:avLst/>
@@ -34222,7 +34293,7 @@
     </w:p>
     <w:p>
       <w:pPr>
-        <w:bidi w:val="0"/>
+        <w:bidi w:val="1"/>
         <w:spacing w:before="0" w:beforeAutospacing="off" w:after="240" w:afterAutospacing="off"/>
         <w:jc w:val="center"/>
       </w:pPr>
@@ -34235,829 +34306,14 @@
           <w:rtl w:val="1"/>
           <w:lang w:val="en-US"/>
         </w:rPr>
-        <w:t>מסמך</w:t>
-      </w:r>
-      <w:r>
-        <w:rPr>
-          <w:rFonts w:ascii="Aptos" w:hAnsi="Aptos" w:eastAsia="Aptos" w:cs="Aptos"/>
-          <w:noProof w:val="0"/>
-          <w:sz w:val="22"/>
-          <w:szCs w:val="22"/>
-          <w:rtl w:val="1"/>
-          <w:lang w:val="en-US"/>
-        </w:rPr>
-        <w:t xml:space="preserve"> </w:t>
-      </w:r>
-      <w:r>
-        <w:rPr>
-          <w:rFonts w:ascii="Aptos" w:hAnsi="Aptos" w:eastAsia="Aptos" w:cs="Aptos"/>
-          <w:noProof w:val="0"/>
-          <w:sz w:val="22"/>
-          <w:szCs w:val="22"/>
-          <w:rtl w:val="1"/>
-          <w:lang w:val="en-US"/>
-        </w:rPr>
-        <w:t>אפיון</w:t>
-      </w:r>
-      <w:r>
-        <w:rPr>
-          <w:rFonts w:ascii="Aptos" w:hAnsi="Aptos" w:eastAsia="Aptos" w:cs="Aptos"/>
-          <w:noProof w:val="0"/>
-          <w:sz w:val="22"/>
-          <w:szCs w:val="22"/>
-          <w:rtl w:val="1"/>
-          <w:lang w:val="en-US"/>
-        </w:rPr>
-        <w:t xml:space="preserve"> </w:t>
-      </w:r>
-      <w:r>
-        <w:rPr>
-          <w:rFonts w:ascii="Aptos" w:hAnsi="Aptos" w:eastAsia="Aptos" w:cs="Aptos"/>
-          <w:noProof w:val="0"/>
-          <w:sz w:val="22"/>
-          <w:szCs w:val="22"/>
-          <w:rtl w:val="1"/>
-          <w:lang w:val="en-US"/>
-        </w:rPr>
-        <w:t>זה</w:t>
-      </w:r>
-      <w:r>
-        <w:rPr>
-          <w:rFonts w:ascii="Aptos" w:hAnsi="Aptos" w:eastAsia="Aptos" w:cs="Aptos"/>
-          <w:noProof w:val="0"/>
-          <w:sz w:val="22"/>
-          <w:szCs w:val="22"/>
-          <w:rtl w:val="1"/>
-          <w:lang w:val="en-US"/>
-        </w:rPr>
-        <w:t xml:space="preserve"> </w:t>
-      </w:r>
-      <w:r>
-        <w:rPr>
-          <w:rFonts w:ascii="Aptos" w:hAnsi="Aptos" w:eastAsia="Aptos" w:cs="Aptos"/>
-          <w:noProof w:val="0"/>
-          <w:sz w:val="22"/>
-          <w:szCs w:val="22"/>
-          <w:rtl w:val="1"/>
-          <w:lang w:val="en-US"/>
-        </w:rPr>
-        <w:t>הציג</w:t>
-      </w:r>
-      <w:r>
-        <w:rPr>
-          <w:rFonts w:ascii="Aptos" w:hAnsi="Aptos" w:eastAsia="Aptos" w:cs="Aptos"/>
-          <w:noProof w:val="0"/>
-          <w:sz w:val="22"/>
-          <w:szCs w:val="22"/>
-          <w:rtl w:val="1"/>
-          <w:lang w:val="en-US"/>
-        </w:rPr>
-        <w:t xml:space="preserve"> </w:t>
-      </w:r>
-      <w:r>
-        <w:rPr>
-          <w:rFonts w:ascii="Aptos" w:hAnsi="Aptos" w:eastAsia="Aptos" w:cs="Aptos"/>
-          <w:noProof w:val="0"/>
-          <w:sz w:val="22"/>
-          <w:szCs w:val="22"/>
-          <w:rtl w:val="1"/>
-          <w:lang w:val="en-US"/>
-        </w:rPr>
-        <w:t>תכנון</w:t>
-      </w:r>
-      <w:r>
-        <w:rPr>
-          <w:rFonts w:ascii="Aptos" w:hAnsi="Aptos" w:eastAsia="Aptos" w:cs="Aptos"/>
-          <w:noProof w:val="0"/>
-          <w:sz w:val="22"/>
-          <w:szCs w:val="22"/>
-          <w:rtl w:val="1"/>
-          <w:lang w:val="en-US"/>
-        </w:rPr>
-        <w:t xml:space="preserve"> </w:t>
-      </w:r>
-      <w:r>
-        <w:rPr>
-          <w:rFonts w:ascii="Aptos" w:hAnsi="Aptos" w:eastAsia="Aptos" w:cs="Aptos"/>
-          <w:noProof w:val="0"/>
-          <w:sz w:val="22"/>
-          <w:szCs w:val="22"/>
-          <w:rtl w:val="1"/>
-          <w:lang w:val="en-US"/>
-        </w:rPr>
-        <w:t>מפורט</w:t>
-      </w:r>
-      <w:r>
-        <w:rPr>
-          <w:rFonts w:ascii="Aptos" w:hAnsi="Aptos" w:eastAsia="Aptos" w:cs="Aptos"/>
-          <w:noProof w:val="0"/>
-          <w:sz w:val="22"/>
-          <w:szCs w:val="22"/>
-          <w:rtl w:val="1"/>
-          <w:lang w:val="en-US"/>
-        </w:rPr>
-        <w:t xml:space="preserve"> </w:t>
-      </w:r>
-      <w:r>
-        <w:rPr>
-          <w:rFonts w:ascii="Aptos" w:hAnsi="Aptos" w:eastAsia="Aptos" w:cs="Aptos"/>
-          <w:noProof w:val="0"/>
-          <w:sz w:val="22"/>
-          <w:szCs w:val="22"/>
-          <w:rtl w:val="1"/>
-          <w:lang w:val="en-US"/>
-        </w:rPr>
-        <w:t>למערכת</w:t>
-      </w:r>
-      <w:r>
-        <w:rPr>
-          <w:rFonts w:ascii="Aptos" w:hAnsi="Aptos" w:eastAsia="Aptos" w:cs="Aptos"/>
-          <w:noProof w:val="0"/>
-          <w:sz w:val="22"/>
-          <w:szCs w:val="22"/>
-          <w:lang w:val="en-US"/>
-        </w:rPr>
-        <w:t xml:space="preserve"> </w:t>
-      </w:r>
-      <w:r>
-        <w:rPr>
-          <w:rFonts w:ascii="Aptos" w:hAnsi="Aptos" w:eastAsia="Aptos" w:cs="Aptos"/>
-          <w:b w:val="1"/>
-          <w:bCs w:val="1"/>
-          <w:noProof w:val="0"/>
-          <w:sz w:val="22"/>
-          <w:szCs w:val="22"/>
-          <w:lang w:val="en-US"/>
-        </w:rPr>
-        <w:t>IDS (Intrusion Detection System)</w:t>
-      </w:r>
-      <w:r>
-        <w:rPr>
-          <w:rFonts w:ascii="Aptos" w:hAnsi="Aptos" w:eastAsia="Aptos" w:cs="Aptos"/>
-          <w:noProof w:val="0"/>
-          <w:sz w:val="22"/>
-          <w:szCs w:val="22"/>
-          <w:lang w:val="en-US"/>
-        </w:rPr>
-        <w:t xml:space="preserve"> </w:t>
-      </w:r>
-      <w:r>
-        <w:rPr>
-          <w:rFonts w:ascii="Aptos" w:hAnsi="Aptos" w:eastAsia="Aptos" w:cs="Aptos"/>
-          <w:noProof w:val="0"/>
-          <w:sz w:val="22"/>
-          <w:szCs w:val="22"/>
-          <w:rtl w:val="1"/>
-          <w:lang w:val="en-US"/>
-        </w:rPr>
-        <w:t>המיועדת</w:t>
-      </w:r>
-      <w:r>
-        <w:rPr>
-          <w:rFonts w:ascii="Aptos" w:hAnsi="Aptos" w:eastAsia="Aptos" w:cs="Aptos"/>
-          <w:noProof w:val="0"/>
-          <w:sz w:val="22"/>
-          <w:szCs w:val="22"/>
-          <w:rtl w:val="1"/>
-          <w:lang w:val="en-US"/>
-        </w:rPr>
-        <w:t xml:space="preserve"> </w:t>
-      </w:r>
-      <w:r>
-        <w:rPr>
-          <w:rFonts w:ascii="Aptos" w:hAnsi="Aptos" w:eastAsia="Aptos" w:cs="Aptos"/>
-          <w:noProof w:val="0"/>
-          <w:sz w:val="22"/>
-          <w:szCs w:val="22"/>
-          <w:rtl w:val="1"/>
-          <w:lang w:val="en-US"/>
-        </w:rPr>
-        <w:t>לזיהוי</w:t>
-      </w:r>
-      <w:r>
-        <w:rPr>
-          <w:rFonts w:ascii="Aptos" w:hAnsi="Aptos" w:eastAsia="Aptos" w:cs="Aptos"/>
-          <w:noProof w:val="0"/>
-          <w:sz w:val="22"/>
-          <w:szCs w:val="22"/>
-          <w:rtl w:val="1"/>
-          <w:lang w:val="en-US"/>
-        </w:rPr>
-        <w:t xml:space="preserve"> </w:t>
-      </w:r>
-      <w:r>
-        <w:rPr>
-          <w:rFonts w:ascii="Aptos" w:hAnsi="Aptos" w:eastAsia="Aptos" w:cs="Aptos"/>
-          <w:noProof w:val="0"/>
-          <w:sz w:val="22"/>
-          <w:szCs w:val="22"/>
-          <w:rtl w:val="1"/>
-          <w:lang w:val="en-US"/>
-        </w:rPr>
-        <w:t>חדירות</w:t>
-      </w:r>
-      <w:r>
-        <w:rPr>
-          <w:rFonts w:ascii="Aptos" w:hAnsi="Aptos" w:eastAsia="Aptos" w:cs="Aptos"/>
-          <w:noProof w:val="0"/>
-          <w:sz w:val="22"/>
-          <w:szCs w:val="22"/>
-          <w:rtl w:val="1"/>
-          <w:lang w:val="en-US"/>
-        </w:rPr>
-        <w:t xml:space="preserve"> </w:t>
-      </w:r>
-      <w:r>
-        <w:rPr>
-          <w:rFonts w:ascii="Aptos" w:hAnsi="Aptos" w:eastAsia="Aptos" w:cs="Aptos"/>
-          <w:noProof w:val="0"/>
-          <w:sz w:val="22"/>
-          <w:szCs w:val="22"/>
-          <w:rtl w:val="1"/>
-          <w:lang w:val="en-US"/>
-        </w:rPr>
-        <w:t>ואיומי</w:t>
-      </w:r>
-      <w:r>
-        <w:rPr>
-          <w:rFonts w:ascii="Aptos" w:hAnsi="Aptos" w:eastAsia="Aptos" w:cs="Aptos"/>
-          <w:noProof w:val="0"/>
-          <w:sz w:val="22"/>
-          <w:szCs w:val="22"/>
-          <w:rtl w:val="1"/>
-          <w:lang w:val="en-US"/>
-        </w:rPr>
-        <w:t xml:space="preserve"> </w:t>
-      </w:r>
-      <w:r>
-        <w:rPr>
-          <w:rFonts w:ascii="Aptos" w:hAnsi="Aptos" w:eastAsia="Aptos" w:cs="Aptos"/>
-          <w:noProof w:val="0"/>
-          <w:sz w:val="22"/>
-          <w:szCs w:val="22"/>
-          <w:rtl w:val="1"/>
-          <w:lang w:val="en-US"/>
-        </w:rPr>
-        <w:t>סייבר</w:t>
-      </w:r>
-      <w:r>
-        <w:rPr>
-          <w:rFonts w:ascii="Aptos" w:hAnsi="Aptos" w:eastAsia="Aptos" w:cs="Aptos"/>
-          <w:noProof w:val="0"/>
-          <w:sz w:val="22"/>
-          <w:szCs w:val="22"/>
-          <w:rtl w:val="1"/>
-          <w:lang w:val="en-US"/>
-        </w:rPr>
-        <w:t xml:space="preserve"> </w:t>
-      </w:r>
-      <w:r>
-        <w:rPr>
-          <w:rFonts w:ascii="Aptos" w:hAnsi="Aptos" w:eastAsia="Aptos" w:cs="Aptos"/>
-          <w:noProof w:val="0"/>
-          <w:sz w:val="22"/>
-          <w:szCs w:val="22"/>
-          <w:rtl w:val="1"/>
-          <w:lang w:val="en-US"/>
-        </w:rPr>
-        <w:t>בזמן</w:t>
-      </w:r>
-      <w:r>
-        <w:rPr>
-          <w:rFonts w:ascii="Aptos" w:hAnsi="Aptos" w:eastAsia="Aptos" w:cs="Aptos"/>
-          <w:noProof w:val="0"/>
-          <w:sz w:val="22"/>
-          <w:szCs w:val="22"/>
-          <w:rtl w:val="1"/>
-          <w:lang w:val="en-US"/>
-        </w:rPr>
-        <w:t xml:space="preserve"> </w:t>
-      </w:r>
-      <w:r>
-        <w:rPr>
-          <w:rFonts w:ascii="Aptos" w:hAnsi="Aptos" w:eastAsia="Aptos" w:cs="Aptos"/>
-          <w:noProof w:val="0"/>
-          <w:sz w:val="22"/>
-          <w:szCs w:val="22"/>
-          <w:rtl w:val="1"/>
-          <w:lang w:val="en-US"/>
-        </w:rPr>
-        <w:t>אמת</w:t>
-      </w:r>
-      <w:r>
-        <w:rPr>
-          <w:rFonts w:ascii="Aptos" w:hAnsi="Aptos" w:eastAsia="Aptos" w:cs="Aptos"/>
-          <w:noProof w:val="0"/>
-          <w:sz w:val="22"/>
-          <w:szCs w:val="22"/>
-          <w:rtl w:val="1"/>
-          <w:lang w:val="en-US"/>
-        </w:rPr>
-        <w:t xml:space="preserve">. </w:t>
-      </w:r>
-      <w:r>
-        <w:rPr>
-          <w:rFonts w:ascii="Aptos" w:hAnsi="Aptos" w:eastAsia="Aptos" w:cs="Aptos"/>
-          <w:noProof w:val="0"/>
-          <w:sz w:val="22"/>
-          <w:szCs w:val="22"/>
-          <w:rtl w:val="1"/>
-          <w:lang w:val="en-US"/>
-        </w:rPr>
-        <w:t>לאורך</w:t>
-      </w:r>
-      <w:r>
-        <w:rPr>
-          <w:rFonts w:ascii="Aptos" w:hAnsi="Aptos" w:eastAsia="Aptos" w:cs="Aptos"/>
-          <w:noProof w:val="0"/>
-          <w:sz w:val="22"/>
-          <w:szCs w:val="22"/>
-          <w:rtl w:val="1"/>
-          <w:lang w:val="en-US"/>
-        </w:rPr>
-        <w:t xml:space="preserve"> </w:t>
-      </w:r>
-      <w:r>
-        <w:rPr>
-          <w:rFonts w:ascii="Aptos" w:hAnsi="Aptos" w:eastAsia="Aptos" w:cs="Aptos"/>
-          <w:noProof w:val="0"/>
-          <w:sz w:val="22"/>
-          <w:szCs w:val="22"/>
-          <w:rtl w:val="1"/>
-          <w:lang w:val="en-US"/>
-        </w:rPr>
-        <w:t>העבודה</w:t>
-      </w:r>
-      <w:r>
-        <w:rPr>
-          <w:rFonts w:ascii="Aptos" w:hAnsi="Aptos" w:eastAsia="Aptos" w:cs="Aptos"/>
-          <w:noProof w:val="0"/>
-          <w:sz w:val="22"/>
-          <w:szCs w:val="22"/>
-          <w:rtl w:val="1"/>
-          <w:lang w:val="en-US"/>
-        </w:rPr>
-        <w:t xml:space="preserve">, </w:t>
-      </w:r>
-      <w:r>
-        <w:rPr>
-          <w:rFonts w:ascii="Aptos" w:hAnsi="Aptos" w:eastAsia="Aptos" w:cs="Aptos"/>
-          <w:noProof w:val="0"/>
-          <w:sz w:val="22"/>
-          <w:szCs w:val="22"/>
-          <w:rtl w:val="1"/>
-          <w:lang w:val="en-US"/>
-        </w:rPr>
-        <w:t>נותחו</w:t>
-      </w:r>
-      <w:r>
-        <w:rPr>
-          <w:rFonts w:ascii="Aptos" w:hAnsi="Aptos" w:eastAsia="Aptos" w:cs="Aptos"/>
-          <w:noProof w:val="0"/>
-          <w:sz w:val="22"/>
-          <w:szCs w:val="22"/>
-          <w:rtl w:val="1"/>
-          <w:lang w:val="en-US"/>
-        </w:rPr>
-        <w:t xml:space="preserve"> </w:t>
-      </w:r>
-      <w:r>
-        <w:rPr>
-          <w:rFonts w:ascii="Aptos" w:hAnsi="Aptos" w:eastAsia="Aptos" w:cs="Aptos"/>
-          <w:noProof w:val="0"/>
-          <w:sz w:val="22"/>
-          <w:szCs w:val="22"/>
-          <w:rtl w:val="1"/>
-          <w:lang w:val="en-US"/>
-        </w:rPr>
-        <w:t>צרכי</w:t>
-      </w:r>
-      <w:r>
-        <w:rPr>
-          <w:rFonts w:ascii="Aptos" w:hAnsi="Aptos" w:eastAsia="Aptos" w:cs="Aptos"/>
-          <w:noProof w:val="0"/>
-          <w:sz w:val="22"/>
-          <w:szCs w:val="22"/>
-          <w:rtl w:val="1"/>
-          <w:lang w:val="en-US"/>
-        </w:rPr>
-        <w:t xml:space="preserve"> </w:t>
-      </w:r>
-      <w:r>
-        <w:rPr>
-          <w:rFonts w:ascii="Aptos" w:hAnsi="Aptos" w:eastAsia="Aptos" w:cs="Aptos"/>
-          <w:noProof w:val="0"/>
-          <w:sz w:val="22"/>
-          <w:szCs w:val="22"/>
-          <w:rtl w:val="1"/>
-          <w:lang w:val="en-US"/>
-        </w:rPr>
-        <w:t>הארגון</w:t>
-      </w:r>
-      <w:r>
-        <w:rPr>
-          <w:rFonts w:ascii="Aptos" w:hAnsi="Aptos" w:eastAsia="Aptos" w:cs="Aptos"/>
-          <w:noProof w:val="0"/>
-          <w:sz w:val="22"/>
-          <w:szCs w:val="22"/>
-          <w:rtl w:val="1"/>
-          <w:lang w:val="en-US"/>
-        </w:rPr>
-        <w:t xml:space="preserve"> </w:t>
-      </w:r>
-      <w:r>
-        <w:rPr>
-          <w:rFonts w:ascii="Aptos" w:hAnsi="Aptos" w:eastAsia="Aptos" w:cs="Aptos"/>
-          <w:noProof w:val="0"/>
-          <w:sz w:val="22"/>
-          <w:szCs w:val="22"/>
-          <w:rtl w:val="1"/>
-          <w:lang w:val="en-US"/>
-        </w:rPr>
-        <w:t>והפערים</w:t>
-      </w:r>
-      <w:r>
-        <w:rPr>
-          <w:rFonts w:ascii="Aptos" w:hAnsi="Aptos" w:eastAsia="Aptos" w:cs="Aptos"/>
-          <w:noProof w:val="0"/>
-          <w:sz w:val="22"/>
-          <w:szCs w:val="22"/>
-          <w:rtl w:val="1"/>
-          <w:lang w:val="en-US"/>
-        </w:rPr>
-        <w:t xml:space="preserve"> </w:t>
-      </w:r>
-      <w:r>
-        <w:rPr>
-          <w:rFonts w:ascii="Aptos" w:hAnsi="Aptos" w:eastAsia="Aptos" w:cs="Aptos"/>
-          <w:noProof w:val="0"/>
-          <w:sz w:val="22"/>
-          <w:szCs w:val="22"/>
-          <w:rtl w:val="1"/>
-          <w:lang w:val="en-US"/>
-        </w:rPr>
-        <w:t>הקיימים</w:t>
-      </w:r>
-      <w:r>
-        <w:rPr>
-          <w:rFonts w:ascii="Aptos" w:hAnsi="Aptos" w:eastAsia="Aptos" w:cs="Aptos"/>
-          <w:noProof w:val="0"/>
-          <w:sz w:val="22"/>
-          <w:szCs w:val="22"/>
-          <w:rtl w:val="1"/>
-          <w:lang w:val="en-US"/>
-        </w:rPr>
-        <w:t xml:space="preserve"> </w:t>
-      </w:r>
-      <w:r>
-        <w:rPr>
-          <w:rFonts w:ascii="Aptos" w:hAnsi="Aptos" w:eastAsia="Aptos" w:cs="Aptos"/>
-          <w:noProof w:val="0"/>
-          <w:sz w:val="22"/>
-          <w:szCs w:val="22"/>
-          <w:rtl w:val="1"/>
-          <w:lang w:val="en-US"/>
-        </w:rPr>
-        <w:t>במערכות</w:t>
-      </w:r>
-      <w:r>
-        <w:rPr>
-          <w:rFonts w:ascii="Aptos" w:hAnsi="Aptos" w:eastAsia="Aptos" w:cs="Aptos"/>
-          <w:noProof w:val="0"/>
-          <w:sz w:val="22"/>
-          <w:szCs w:val="22"/>
-          <w:rtl w:val="1"/>
-          <w:lang w:val="en-US"/>
-        </w:rPr>
-        <w:t xml:space="preserve"> </w:t>
-      </w:r>
-      <w:r>
-        <w:rPr>
-          <w:rFonts w:ascii="Aptos" w:hAnsi="Aptos" w:eastAsia="Aptos" w:cs="Aptos"/>
-          <w:noProof w:val="0"/>
-          <w:sz w:val="22"/>
-          <w:szCs w:val="22"/>
-          <w:rtl w:val="1"/>
-          <w:lang w:val="en-US"/>
-        </w:rPr>
-        <w:t>הניטור</w:t>
-      </w:r>
-      <w:r>
-        <w:rPr>
-          <w:rFonts w:ascii="Aptos" w:hAnsi="Aptos" w:eastAsia="Aptos" w:cs="Aptos"/>
-          <w:noProof w:val="0"/>
-          <w:sz w:val="22"/>
-          <w:szCs w:val="22"/>
-          <w:rtl w:val="1"/>
-          <w:lang w:val="en-US"/>
-        </w:rPr>
-        <w:t xml:space="preserve"> </w:t>
-      </w:r>
-      <w:r>
-        <w:rPr>
-          <w:rFonts w:ascii="Aptos" w:hAnsi="Aptos" w:eastAsia="Aptos" w:cs="Aptos"/>
-          <w:noProof w:val="0"/>
-          <w:sz w:val="22"/>
-          <w:szCs w:val="22"/>
-          <w:rtl w:val="1"/>
-          <w:lang w:val="en-US"/>
-        </w:rPr>
-        <w:t>הנוכחיות</w:t>
-      </w:r>
-      <w:r>
-        <w:rPr>
-          <w:rFonts w:ascii="Aptos" w:hAnsi="Aptos" w:eastAsia="Aptos" w:cs="Aptos"/>
-          <w:noProof w:val="0"/>
-          <w:sz w:val="22"/>
-          <w:szCs w:val="22"/>
-          <w:rtl w:val="1"/>
-          <w:lang w:val="en-US"/>
-        </w:rPr>
-        <w:t xml:space="preserve">, </w:t>
-      </w:r>
-      <w:r>
-        <w:rPr>
-          <w:rFonts w:ascii="Aptos" w:hAnsi="Aptos" w:eastAsia="Aptos" w:cs="Aptos"/>
-          <w:noProof w:val="0"/>
-          <w:sz w:val="22"/>
-          <w:szCs w:val="22"/>
-          <w:rtl w:val="1"/>
-          <w:lang w:val="en-US"/>
-        </w:rPr>
-        <w:t>אשר</w:t>
-      </w:r>
-      <w:r>
-        <w:rPr>
-          <w:rFonts w:ascii="Aptos" w:hAnsi="Aptos" w:eastAsia="Aptos" w:cs="Aptos"/>
-          <w:noProof w:val="0"/>
-          <w:sz w:val="22"/>
-          <w:szCs w:val="22"/>
-          <w:rtl w:val="1"/>
-          <w:lang w:val="en-US"/>
-        </w:rPr>
-        <w:t xml:space="preserve"> </w:t>
-      </w:r>
-      <w:r>
-        <w:rPr>
-          <w:rFonts w:ascii="Aptos" w:hAnsi="Aptos" w:eastAsia="Aptos" w:cs="Aptos"/>
-          <w:noProof w:val="0"/>
-          <w:sz w:val="22"/>
-          <w:szCs w:val="22"/>
-          <w:rtl w:val="1"/>
-          <w:lang w:val="en-US"/>
-        </w:rPr>
-        <w:t>הובילו</w:t>
-      </w:r>
-      <w:r>
-        <w:rPr>
-          <w:rFonts w:ascii="Aptos" w:hAnsi="Aptos" w:eastAsia="Aptos" w:cs="Aptos"/>
-          <w:noProof w:val="0"/>
-          <w:sz w:val="22"/>
-          <w:szCs w:val="22"/>
-          <w:rtl w:val="1"/>
-          <w:lang w:val="en-US"/>
-        </w:rPr>
-        <w:t xml:space="preserve"> </w:t>
-      </w:r>
-      <w:r>
-        <w:rPr>
-          <w:rFonts w:ascii="Aptos" w:hAnsi="Aptos" w:eastAsia="Aptos" w:cs="Aptos"/>
-          <w:noProof w:val="0"/>
-          <w:sz w:val="22"/>
-          <w:szCs w:val="22"/>
-          <w:rtl w:val="1"/>
-          <w:lang w:val="en-US"/>
-        </w:rPr>
-        <w:t>להגדרת</w:t>
-      </w:r>
-      <w:r>
-        <w:rPr>
-          <w:rFonts w:ascii="Aptos" w:hAnsi="Aptos" w:eastAsia="Aptos" w:cs="Aptos"/>
-          <w:noProof w:val="0"/>
-          <w:sz w:val="22"/>
-          <w:szCs w:val="22"/>
-          <w:rtl w:val="1"/>
-          <w:lang w:val="en-US"/>
-        </w:rPr>
-        <w:t xml:space="preserve"> </w:t>
-      </w:r>
-      <w:r>
-        <w:rPr>
-          <w:rFonts w:ascii="Aptos" w:hAnsi="Aptos" w:eastAsia="Aptos" w:cs="Aptos"/>
-          <w:noProof w:val="0"/>
-          <w:sz w:val="22"/>
-          <w:szCs w:val="22"/>
-          <w:rtl w:val="1"/>
-          <w:lang w:val="en-US"/>
-        </w:rPr>
-        <w:t>דרישות</w:t>
-      </w:r>
-      <w:r>
-        <w:rPr>
-          <w:rFonts w:ascii="Aptos" w:hAnsi="Aptos" w:eastAsia="Aptos" w:cs="Aptos"/>
-          <w:noProof w:val="0"/>
-          <w:sz w:val="22"/>
-          <w:szCs w:val="22"/>
-          <w:rtl w:val="1"/>
-          <w:lang w:val="en-US"/>
-        </w:rPr>
-        <w:t xml:space="preserve"> </w:t>
-      </w:r>
-      <w:r>
-        <w:rPr>
-          <w:rFonts w:ascii="Aptos" w:hAnsi="Aptos" w:eastAsia="Aptos" w:cs="Aptos"/>
-          <w:noProof w:val="0"/>
-          <w:sz w:val="22"/>
-          <w:szCs w:val="22"/>
-          <w:rtl w:val="1"/>
-          <w:lang w:val="en-US"/>
-        </w:rPr>
-        <w:t>פונקציונליות</w:t>
-      </w:r>
-      <w:r>
-        <w:rPr>
-          <w:rFonts w:ascii="Aptos" w:hAnsi="Aptos" w:eastAsia="Aptos" w:cs="Aptos"/>
-          <w:noProof w:val="0"/>
-          <w:sz w:val="22"/>
-          <w:szCs w:val="22"/>
-          <w:rtl w:val="1"/>
-          <w:lang w:val="en-US"/>
-        </w:rPr>
-        <w:t xml:space="preserve"> </w:t>
-      </w:r>
-      <w:r>
-        <w:rPr>
-          <w:rFonts w:ascii="Aptos" w:hAnsi="Aptos" w:eastAsia="Aptos" w:cs="Aptos"/>
-          <w:noProof w:val="0"/>
-          <w:sz w:val="22"/>
-          <w:szCs w:val="22"/>
-          <w:rtl w:val="1"/>
-          <w:lang w:val="en-US"/>
-        </w:rPr>
-        <w:t>ולא-פונקציונליות</w:t>
-      </w:r>
-      <w:r>
-        <w:rPr>
-          <w:rFonts w:ascii="Aptos" w:hAnsi="Aptos" w:eastAsia="Aptos" w:cs="Aptos"/>
-          <w:noProof w:val="0"/>
-          <w:sz w:val="22"/>
-          <w:szCs w:val="22"/>
-          <w:rtl w:val="1"/>
-          <w:lang w:val="en-US"/>
-        </w:rPr>
-        <w:t xml:space="preserve"> </w:t>
-      </w:r>
-      <w:r>
-        <w:rPr>
-          <w:rFonts w:ascii="Aptos" w:hAnsi="Aptos" w:eastAsia="Aptos" w:cs="Aptos"/>
-          <w:noProof w:val="0"/>
-          <w:sz w:val="22"/>
-          <w:szCs w:val="22"/>
-          <w:rtl w:val="1"/>
-          <w:lang w:val="en-US"/>
-        </w:rPr>
-        <w:t>קפדניות</w:t>
-      </w:r>
-      <w:r>
-        <w:rPr>
-          <w:rFonts w:ascii="Aptos" w:hAnsi="Aptos" w:eastAsia="Aptos" w:cs="Aptos"/>
-          <w:noProof w:val="0"/>
-          <w:sz w:val="22"/>
-          <w:szCs w:val="22"/>
-          <w:lang w:val="en-US"/>
-        </w:rPr>
-        <w:t xml:space="preserve"> .</w:t>
-      </w:r>
-    </w:p>
-    <w:p>
-      <w:pPr>
-        <w:bidi w:val="0"/>
-        <w:spacing w:before="0" w:beforeAutospacing="off" w:after="0" w:afterAutospacing="off"/>
-        <w:jc w:val="center"/>
-      </w:pPr>
-      <w:r>
-        <w:rPr>
-          <w:rFonts w:ascii="Aptos" w:hAnsi="Aptos" w:eastAsia="Aptos" w:cs="Aptos"/>
-          <w:noProof w:val="0"/>
-          <w:sz w:val="22"/>
-          <w:szCs w:val="22"/>
-          <w:lang w:val="en-US"/>
-        </w:rPr>
-        <w:t>+4</w:t>
-      </w:r>
-    </w:p>
-    <w:p>
-      <w:pPr>
-        <w:pStyle w:val="Heading3"/>
-        <w:bidi w:val="0"/>
-        <w:spacing w:before="281" w:beforeAutospacing="off" w:after="281" w:afterAutospacing="off"/>
-        <w:jc w:val="center"/>
-      </w:pPr>
-      <w:r>
-        <w:rPr>
-          <w:rFonts w:ascii="Aptos" w:hAnsi="Aptos" w:eastAsia="Aptos" w:cs="Aptos"/>
-          <w:noProof w:val="0"/>
-          <w:sz w:val="22"/>
-          <w:szCs w:val="22"/>
-          <w:rtl w:val="1"/>
-          <w:lang w:val="en-US"/>
-        </w:rPr>
-        <w:t>נקודות</w:t>
-      </w:r>
-      <w:r>
-        <w:rPr>
-          <w:rFonts w:ascii="Aptos" w:hAnsi="Aptos" w:eastAsia="Aptos" w:cs="Aptos"/>
-          <w:noProof w:val="0"/>
-          <w:sz w:val="22"/>
-          <w:szCs w:val="22"/>
-          <w:rtl w:val="1"/>
-          <w:lang w:val="en-US"/>
-        </w:rPr>
-        <w:t xml:space="preserve"> </w:t>
-      </w:r>
-      <w:r>
-        <w:rPr>
-          <w:rFonts w:ascii="Aptos" w:hAnsi="Aptos" w:eastAsia="Aptos" w:cs="Aptos"/>
-          <w:noProof w:val="0"/>
-          <w:sz w:val="22"/>
-          <w:szCs w:val="22"/>
-          <w:rtl w:val="1"/>
-          <w:lang w:val="en-US"/>
-        </w:rPr>
-        <w:t>מפתח</w:t>
-      </w:r>
-      <w:r>
-        <w:rPr>
-          <w:rFonts w:ascii="Aptos" w:hAnsi="Aptos" w:eastAsia="Aptos" w:cs="Aptos"/>
-          <w:noProof w:val="0"/>
-          <w:sz w:val="22"/>
-          <w:szCs w:val="22"/>
-          <w:rtl w:val="1"/>
-          <w:lang w:val="en-US"/>
-        </w:rPr>
-        <w:t xml:space="preserve"> </w:t>
-      </w:r>
-      <w:r>
-        <w:rPr>
-          <w:rFonts w:ascii="Aptos" w:hAnsi="Aptos" w:eastAsia="Aptos" w:cs="Aptos"/>
-          <w:noProof w:val="0"/>
-          <w:sz w:val="22"/>
-          <w:szCs w:val="22"/>
-          <w:rtl w:val="1"/>
-          <w:lang w:val="en-US"/>
-        </w:rPr>
-        <w:t>בתכנון</w:t>
-      </w:r>
-      <w:r>
-        <w:rPr>
-          <w:rFonts w:ascii="Aptos" w:hAnsi="Aptos" w:eastAsia="Aptos" w:cs="Aptos"/>
-          <w:noProof w:val="0"/>
-          <w:sz w:val="22"/>
-          <w:szCs w:val="22"/>
-          <w:rtl w:val="1"/>
-          <w:lang w:val="en-US"/>
-        </w:rPr>
-        <w:t xml:space="preserve"> </w:t>
-      </w:r>
-      <w:r>
-        <w:rPr>
-          <w:rFonts w:ascii="Aptos" w:hAnsi="Aptos" w:eastAsia="Aptos" w:cs="Aptos"/>
-          <w:noProof w:val="0"/>
-          <w:sz w:val="22"/>
-          <w:szCs w:val="22"/>
-          <w:rtl w:val="1"/>
-          <w:lang w:val="en-US"/>
-        </w:rPr>
-        <w:t>המערכת</w:t>
-      </w:r>
-      <w:r>
-        <w:rPr>
-          <w:rFonts w:ascii="Aptos" w:hAnsi="Aptos" w:eastAsia="Aptos" w:cs="Aptos"/>
-          <w:noProof w:val="0"/>
-          <w:sz w:val="22"/>
-          <w:szCs w:val="22"/>
-          <w:lang w:val="en-US"/>
-        </w:rPr>
-        <w:t>:</w:t>
-      </w:r>
-    </w:p>
-    <w:p>
-      <w:pPr>
-        <w:pStyle w:val="ListParagraph"/>
-        <w:numPr>
-          <w:ilvl w:val="0"/>
-          <w:numId w:val="11"/>
-        </w:numPr>
-        <w:bidi w:val="0"/>
+        <w:t>מסמך אפיון זה מסכם את שלב התכנון של המערכת לגילוי חדירות, אשר נועדה לספק מענה לאתגרי אבטחת המידע בארגון. נקודת המוצא לפרויקט הייתה ההבנה כי כלי הניטור הקיימים אינם מספקים תמונה מלאה בזמן אמת, ולכן נדרש פתרון שיאפשר זיהוי יזום של איומים לפני שנגרם נזק.</w:t>
+      </w:r>
+    </w:p>
+    <w:p>
+      <w:pPr>
+        <w:bidi w:val="1"/>
         <w:spacing w:before="240" w:beforeAutospacing="off" w:after="240" w:afterAutospacing="off"/>
         <w:jc w:val="center"/>
-        <w:rPr>
-          <w:rFonts w:ascii="Aptos" w:hAnsi="Aptos" w:eastAsia="Aptos" w:cs="Aptos"/>
-          <w:noProof w:val="0"/>
-          <w:sz w:val="22"/>
-          <w:szCs w:val="22"/>
-          <w:lang w:val="en-US"/>
-        </w:rPr>
       </w:pPr>
       <w:r>
         <w:rPr>
@@ -35070,8 +34326,27 @@
           <w:rtl w:val="1"/>
           <w:lang w:val="en-US"/>
         </w:rPr>
-        <w:t>ניטור</w:t>
-      </w:r>
+        <w:t>עיקרי הפתרון הטכנולוגי:</w:t>
+      </w:r>
+    </w:p>
+    <w:p>
+      <w:pPr>
+        <w:pStyle w:val="ListParagraph"/>
+        <w:numPr>
+          <w:ilvl w:val="0"/>
+          <w:numId w:val="14"/>
+        </w:numPr>
+        <w:bidi w:val="1"/>
+        <w:spacing w:before="240" w:beforeAutospacing="off" w:after="240" w:afterAutospacing="off"/>
+        <w:jc w:val="center"/>
+        <w:rPr>
+          <w:rFonts w:ascii="Aptos" w:hAnsi="Aptos" w:eastAsia="Aptos" w:cs="Aptos"/>
+          <w:noProof w:val="0"/>
+          <w:sz w:val="22"/>
+          <w:szCs w:val="22"/>
+          <w:lang w:val="en-US"/>
+        </w:rPr>
+      </w:pPr>
       <w:r>
         <w:rPr>
           <w:rFonts w:ascii="Aptos" w:hAnsi="Aptos" w:eastAsia="Aptos" w:cs="Aptos"/>
@@ -35083,8 +34358,38 @@
           <w:rtl w:val="1"/>
           <w:lang w:val="en-US"/>
         </w:rPr>
-        <w:t xml:space="preserve"> </w:t>
-      </w:r>
+        <w:t>ניטור שקוף ורציף:</w:t>
+      </w:r>
+      <w:r>
+        <w:rPr>
+          <w:rFonts w:ascii="Aptos" w:hAnsi="Aptos" w:eastAsia="Aptos" w:cs="Aptos"/>
+          <w:noProof w:val="0"/>
+          <w:sz w:val="22"/>
+          <w:szCs w:val="22"/>
+          <w:rtl w:val="1"/>
+          <w:lang w:val="en-US"/>
+        </w:rPr>
+        <w:t xml:space="preserve"> המערכת תוכננה להאזין לתעבורת הרשת ברקע, ולבצע ניתוח עמוק של חבילות המידע מבלי להעמיס על משאבי הארגון או להפריע למשתמשי הקצה.</w:t>
+      </w:r>
+    </w:p>
+    <w:p>
+      <w:pPr>
+        <w:pStyle w:val="ListParagraph"/>
+        <w:numPr>
+          <w:ilvl w:val="0"/>
+          <w:numId w:val="14"/>
+        </w:numPr>
+        <w:bidi w:val="1"/>
+        <w:spacing w:before="240" w:beforeAutospacing="off" w:after="240" w:afterAutospacing="off"/>
+        <w:jc w:val="center"/>
+        <w:rPr>
+          <w:rFonts w:ascii="Aptos" w:hAnsi="Aptos" w:eastAsia="Aptos" w:cs="Aptos"/>
+          <w:noProof w:val="0"/>
+          <w:sz w:val="22"/>
+          <w:szCs w:val="22"/>
+          <w:lang w:val="en-US"/>
+        </w:rPr>
+      </w:pPr>
       <w:r>
         <w:rPr>
           <w:rFonts w:ascii="Aptos" w:hAnsi="Aptos" w:eastAsia="Aptos" w:cs="Aptos"/>
@@ -35096,8 +34401,38 @@
           <w:rtl w:val="1"/>
           <w:lang w:val="en-US"/>
         </w:rPr>
-        <w:t>פרואקטיבי</w:t>
-      </w:r>
+        <w:t>מנוע זיהוי משולב:</w:t>
+      </w:r>
+      <w:r>
+        <w:rPr>
+          <w:rFonts w:ascii="Aptos" w:hAnsi="Aptos" w:eastAsia="Aptos" w:cs="Aptos"/>
+          <w:noProof w:val="0"/>
+          <w:sz w:val="22"/>
+          <w:szCs w:val="22"/>
+          <w:rtl w:val="1"/>
+          <w:lang w:val="en-US"/>
+        </w:rPr>
+        <w:t xml:space="preserve"> במקום להסתמך רק על חוקים יבשים, האפיון משלב מודל לומד שיודע לזהות התנהגות חריגה ברשת. גישה זו מאפשרת לגלות גם מתקפות חדשות שלא נצפו בעבר.</w:t>
+      </w:r>
+    </w:p>
+    <w:p>
+      <w:pPr>
+        <w:pStyle w:val="ListParagraph"/>
+        <w:numPr>
+          <w:ilvl w:val="0"/>
+          <w:numId w:val="14"/>
+        </w:numPr>
+        <w:bidi w:val="1"/>
+        <w:spacing w:before="240" w:beforeAutospacing="off" w:after="240" w:afterAutospacing="off"/>
+        <w:jc w:val="center"/>
+        <w:rPr>
+          <w:rFonts w:ascii="Aptos" w:hAnsi="Aptos" w:eastAsia="Aptos" w:cs="Aptos"/>
+          <w:noProof w:val="0"/>
+          <w:sz w:val="22"/>
+          <w:szCs w:val="22"/>
+          <w:lang w:val="en-US"/>
+        </w:rPr>
+      </w:pPr>
       <w:r>
         <w:rPr>
           <w:rFonts w:ascii="Aptos" w:hAnsi="Aptos" w:eastAsia="Aptos" w:cs="Aptos"/>
@@ -35109,7 +34444,7 @@
           <w:rtl w:val="1"/>
           <w:lang w:val="en-US"/>
         </w:rPr>
-        <w:t>:</w:t>
+        <w:t>כלי עבודה למנהל:</w:t>
       </w:r>
       <w:r>
         <w:rPr>
@@ -35120,347 +34455,14 @@
           <w:rtl w:val="1"/>
           <w:lang w:val="en-US"/>
         </w:rPr>
-        <w:t xml:space="preserve"> </w:t>
-      </w:r>
-      <w:r>
-        <w:rPr>
-          <w:rFonts w:ascii="Aptos" w:hAnsi="Aptos" w:eastAsia="Aptos" w:cs="Aptos"/>
-          <w:noProof w:val="0"/>
-          <w:sz w:val="22"/>
-          <w:szCs w:val="22"/>
-          <w:rtl w:val="1"/>
-          <w:lang w:val="en-US"/>
-        </w:rPr>
-        <w:t>המערכת</w:t>
-      </w:r>
-      <w:r>
-        <w:rPr>
-          <w:rFonts w:ascii="Aptos" w:hAnsi="Aptos" w:eastAsia="Aptos" w:cs="Aptos"/>
-          <w:noProof w:val="0"/>
-          <w:sz w:val="22"/>
-          <w:szCs w:val="22"/>
-          <w:rtl w:val="1"/>
-          <w:lang w:val="en-US"/>
-        </w:rPr>
-        <w:t xml:space="preserve"> </w:t>
-      </w:r>
-      <w:r>
-        <w:rPr>
-          <w:rFonts w:ascii="Aptos" w:hAnsi="Aptos" w:eastAsia="Aptos" w:cs="Aptos"/>
-          <w:noProof w:val="0"/>
-          <w:sz w:val="22"/>
-          <w:szCs w:val="22"/>
-          <w:rtl w:val="1"/>
-          <w:lang w:val="en-US"/>
-        </w:rPr>
-        <w:t>תוכננה</w:t>
-      </w:r>
-      <w:r>
-        <w:rPr>
-          <w:rFonts w:ascii="Aptos" w:hAnsi="Aptos" w:eastAsia="Aptos" w:cs="Aptos"/>
-          <w:noProof w:val="0"/>
-          <w:sz w:val="22"/>
-          <w:szCs w:val="22"/>
-          <w:rtl w:val="1"/>
-          <w:lang w:val="en-US"/>
-        </w:rPr>
-        <w:t xml:space="preserve"> </w:t>
-      </w:r>
-      <w:r>
-        <w:rPr>
-          <w:rFonts w:ascii="Aptos" w:hAnsi="Aptos" w:eastAsia="Aptos" w:cs="Aptos"/>
-          <w:noProof w:val="0"/>
-          <w:sz w:val="22"/>
-          <w:szCs w:val="22"/>
-          <w:rtl w:val="1"/>
-          <w:lang w:val="en-US"/>
-        </w:rPr>
-        <w:t>לבצע</w:t>
-      </w:r>
-      <w:r>
-        <w:rPr>
-          <w:rFonts w:ascii="Aptos" w:hAnsi="Aptos" w:eastAsia="Aptos" w:cs="Aptos"/>
-          <w:noProof w:val="0"/>
-          <w:sz w:val="22"/>
-          <w:szCs w:val="22"/>
-          <w:rtl w:val="1"/>
-          <w:lang w:val="en-US"/>
-        </w:rPr>
-        <w:t xml:space="preserve"> </w:t>
-      </w:r>
-      <w:r>
-        <w:rPr>
-          <w:rFonts w:ascii="Aptos" w:hAnsi="Aptos" w:eastAsia="Aptos" w:cs="Aptos"/>
-          <w:noProof w:val="0"/>
-          <w:sz w:val="22"/>
-          <w:szCs w:val="22"/>
-          <w:rtl w:val="1"/>
-          <w:lang w:val="en-US"/>
-        </w:rPr>
-        <w:t>האזנה</w:t>
-      </w:r>
-      <w:r>
-        <w:rPr>
-          <w:rFonts w:ascii="Aptos" w:hAnsi="Aptos" w:eastAsia="Aptos" w:cs="Aptos"/>
-          <w:noProof w:val="0"/>
-          <w:sz w:val="22"/>
-          <w:szCs w:val="22"/>
-          <w:rtl w:val="1"/>
-          <w:lang w:val="en-US"/>
-        </w:rPr>
-        <w:t xml:space="preserve"> </w:t>
-      </w:r>
-      <w:r>
-        <w:rPr>
-          <w:rFonts w:ascii="Aptos" w:hAnsi="Aptos" w:eastAsia="Aptos" w:cs="Aptos"/>
-          <w:noProof w:val="0"/>
-          <w:sz w:val="22"/>
-          <w:szCs w:val="22"/>
-          <w:rtl w:val="1"/>
-          <w:lang w:val="en-US"/>
-        </w:rPr>
-        <w:t>רציפה</w:t>
-      </w:r>
-      <w:r>
-        <w:rPr>
-          <w:rFonts w:ascii="Aptos" w:hAnsi="Aptos" w:eastAsia="Aptos" w:cs="Aptos"/>
-          <w:noProof w:val="0"/>
-          <w:sz w:val="22"/>
-          <w:szCs w:val="22"/>
-          <w:rtl w:val="1"/>
-          <w:lang w:val="en-US"/>
-        </w:rPr>
-        <w:t xml:space="preserve"> </w:t>
-      </w:r>
-      <w:r>
-        <w:rPr>
-          <w:rFonts w:ascii="Aptos" w:hAnsi="Aptos" w:eastAsia="Aptos" w:cs="Aptos"/>
-          <w:noProof w:val="0"/>
-          <w:sz w:val="22"/>
-          <w:szCs w:val="22"/>
-          <w:rtl w:val="1"/>
-          <w:lang w:val="en-US"/>
-        </w:rPr>
-        <w:t>לתעבורת</w:t>
-      </w:r>
-      <w:r>
-        <w:rPr>
-          <w:rFonts w:ascii="Aptos" w:hAnsi="Aptos" w:eastAsia="Aptos" w:cs="Aptos"/>
-          <w:noProof w:val="0"/>
-          <w:sz w:val="22"/>
-          <w:szCs w:val="22"/>
-          <w:rtl w:val="1"/>
-          <w:lang w:val="en-US"/>
-        </w:rPr>
-        <w:t xml:space="preserve"> </w:t>
-      </w:r>
-      <w:r>
-        <w:rPr>
-          <w:rFonts w:ascii="Aptos" w:hAnsi="Aptos" w:eastAsia="Aptos" w:cs="Aptos"/>
-          <w:noProof w:val="0"/>
-          <w:sz w:val="22"/>
-          <w:szCs w:val="22"/>
-          <w:rtl w:val="1"/>
-          <w:lang w:val="en-US"/>
-        </w:rPr>
-        <w:t>הרשת</w:t>
-      </w:r>
-      <w:r>
-        <w:rPr>
-          <w:rFonts w:ascii="Aptos" w:hAnsi="Aptos" w:eastAsia="Aptos" w:cs="Aptos"/>
-          <w:noProof w:val="0"/>
-          <w:sz w:val="22"/>
-          <w:szCs w:val="22"/>
-          <w:lang w:val="en-US"/>
-        </w:rPr>
-        <w:t xml:space="preserve"> (Promiscuous Mode) </w:t>
-      </w:r>
-      <w:r>
-        <w:rPr>
-          <w:rFonts w:ascii="Aptos" w:hAnsi="Aptos" w:eastAsia="Aptos" w:cs="Aptos"/>
-          <w:noProof w:val="0"/>
-          <w:sz w:val="22"/>
-          <w:szCs w:val="22"/>
-          <w:rtl w:val="1"/>
-          <w:lang w:val="en-US"/>
-        </w:rPr>
-        <w:t>ולחלץ</w:t>
-      </w:r>
-      <w:r>
-        <w:rPr>
-          <w:rFonts w:ascii="Aptos" w:hAnsi="Aptos" w:eastAsia="Aptos" w:cs="Aptos"/>
-          <w:noProof w:val="0"/>
-          <w:sz w:val="22"/>
-          <w:szCs w:val="22"/>
-          <w:rtl w:val="1"/>
-          <w:lang w:val="en-US"/>
-        </w:rPr>
-        <w:t xml:space="preserve"> </w:t>
-      </w:r>
-      <w:r>
-        <w:rPr>
-          <w:rFonts w:ascii="Aptos" w:hAnsi="Aptos" w:eastAsia="Aptos" w:cs="Aptos"/>
-          <w:noProof w:val="0"/>
-          <w:sz w:val="22"/>
-          <w:szCs w:val="22"/>
-          <w:rtl w:val="1"/>
-          <w:lang w:val="en-US"/>
-        </w:rPr>
-        <w:t>מידע</w:t>
-      </w:r>
-      <w:r>
-        <w:rPr>
-          <w:rFonts w:ascii="Aptos" w:hAnsi="Aptos" w:eastAsia="Aptos" w:cs="Aptos"/>
-          <w:noProof w:val="0"/>
-          <w:sz w:val="22"/>
-          <w:szCs w:val="22"/>
-          <w:rtl w:val="1"/>
-          <w:lang w:val="en-US"/>
-        </w:rPr>
-        <w:t xml:space="preserve"> </w:t>
-      </w:r>
-      <w:r>
-        <w:rPr>
-          <w:rFonts w:ascii="Aptos" w:hAnsi="Aptos" w:eastAsia="Aptos" w:cs="Aptos"/>
-          <w:noProof w:val="0"/>
-          <w:sz w:val="22"/>
-          <w:szCs w:val="22"/>
-          <w:rtl w:val="1"/>
-          <w:lang w:val="en-US"/>
-        </w:rPr>
-        <w:t>חיוני</w:t>
-      </w:r>
-      <w:r>
-        <w:rPr>
-          <w:rFonts w:ascii="Aptos" w:hAnsi="Aptos" w:eastAsia="Aptos" w:cs="Aptos"/>
-          <w:noProof w:val="0"/>
-          <w:sz w:val="22"/>
-          <w:szCs w:val="22"/>
-          <w:rtl w:val="1"/>
-          <w:lang w:val="en-US"/>
-        </w:rPr>
-        <w:t xml:space="preserve"> </w:t>
-      </w:r>
-      <w:r>
-        <w:rPr>
-          <w:rFonts w:ascii="Aptos" w:hAnsi="Aptos" w:eastAsia="Aptos" w:cs="Aptos"/>
-          <w:noProof w:val="0"/>
-          <w:sz w:val="22"/>
-          <w:szCs w:val="22"/>
-          <w:rtl w:val="1"/>
-          <w:lang w:val="en-US"/>
-        </w:rPr>
-        <w:t>מפרוטוקולי</w:t>
-      </w:r>
-      <w:r>
-        <w:rPr>
-          <w:rFonts w:ascii="Aptos" w:hAnsi="Aptos" w:eastAsia="Aptos" w:cs="Aptos"/>
-          <w:noProof w:val="0"/>
-          <w:sz w:val="22"/>
-          <w:szCs w:val="22"/>
-          <w:lang w:val="en-US"/>
-        </w:rPr>
-        <w:t xml:space="preserve"> IP </w:t>
-      </w:r>
-      <w:r>
-        <w:rPr>
-          <w:rFonts w:ascii="Aptos" w:hAnsi="Aptos" w:eastAsia="Aptos" w:cs="Aptos"/>
-          <w:noProof w:val="0"/>
-          <w:sz w:val="22"/>
-          <w:szCs w:val="22"/>
-          <w:rtl w:val="1"/>
-          <w:lang w:val="en-US"/>
-        </w:rPr>
-        <w:t>ו</w:t>
-      </w:r>
-      <w:r>
-        <w:rPr>
-          <w:rFonts w:ascii="Aptos" w:hAnsi="Aptos" w:eastAsia="Aptos" w:cs="Aptos"/>
-          <w:noProof w:val="0"/>
-          <w:sz w:val="22"/>
-          <w:szCs w:val="22"/>
-          <w:lang w:val="en-US"/>
-        </w:rPr>
-        <w:t xml:space="preserve">-TCP </w:t>
-      </w:r>
-      <w:r>
-        <w:rPr>
-          <w:rFonts w:ascii="Aptos" w:hAnsi="Aptos" w:eastAsia="Aptos" w:cs="Aptos"/>
-          <w:noProof w:val="0"/>
-          <w:sz w:val="22"/>
-          <w:szCs w:val="22"/>
-          <w:rtl w:val="1"/>
-          <w:lang w:val="en-US"/>
-        </w:rPr>
-        <w:t>בזמן</w:t>
-      </w:r>
-      <w:r>
-        <w:rPr>
-          <w:rFonts w:ascii="Aptos" w:hAnsi="Aptos" w:eastAsia="Aptos" w:cs="Aptos"/>
-          <w:noProof w:val="0"/>
-          <w:sz w:val="22"/>
-          <w:szCs w:val="22"/>
-          <w:rtl w:val="1"/>
-          <w:lang w:val="en-US"/>
-        </w:rPr>
-        <w:t xml:space="preserve"> </w:t>
-      </w:r>
-      <w:r>
-        <w:rPr>
-          <w:rFonts w:ascii="Aptos" w:hAnsi="Aptos" w:eastAsia="Aptos" w:cs="Aptos"/>
-          <w:noProof w:val="0"/>
-          <w:sz w:val="22"/>
-          <w:szCs w:val="22"/>
-          <w:rtl w:val="1"/>
-          <w:lang w:val="en-US"/>
-        </w:rPr>
-        <w:t>אמת</w:t>
-      </w:r>
-      <w:r>
-        <w:rPr>
-          <w:rFonts w:ascii="Aptos" w:hAnsi="Aptos" w:eastAsia="Aptos" w:cs="Aptos"/>
-          <w:noProof w:val="0"/>
-          <w:sz w:val="22"/>
-          <w:szCs w:val="22"/>
-          <w:lang w:val="en-US"/>
-        </w:rPr>
-        <w:t>.</w:t>
-      </w:r>
-    </w:p>
-    <w:p>
-      <w:pPr>
-        <w:bidi w:val="0"/>
-        <w:spacing w:before="0" w:beforeAutospacing="off" w:after="0" w:afterAutospacing="off"/>
-        <w:jc w:val="center"/>
-      </w:pPr>
-      <w:r>
-        <w:rPr>
-          <w:rFonts w:ascii="Aptos" w:hAnsi="Aptos" w:eastAsia="Aptos" w:cs="Aptos"/>
-          <w:noProof w:val="0"/>
-          <w:sz w:val="22"/>
-          <w:szCs w:val="22"/>
-          <w:lang w:val="en-US"/>
-        </w:rPr>
-        <w:t>+1</w:t>
-      </w:r>
-    </w:p>
-    <w:p>
-      <w:pPr>
-        <w:pStyle w:val="ListParagraph"/>
-        <w:numPr>
-          <w:ilvl w:val="0"/>
-          <w:numId w:val="11"/>
-        </w:numPr>
-        <w:bidi w:val="0"/>
+        <w:t xml:space="preserve"> הדגש בתכנון היה על יצירת ממשק יעיל למנהל הרשת, המאפשר ניהול משתמשים פשוט, הגדרת רשימות מורשים וקבלת התראות ויזואליות תוך שניות בודדות.</w:t>
+      </w:r>
+    </w:p>
+    <w:p>
+      <w:pPr>
+        <w:bidi w:val="1"/>
         <w:spacing w:before="240" w:beforeAutospacing="off" w:after="240" w:afterAutospacing="off"/>
         <w:jc w:val="center"/>
-        <w:rPr>
-          <w:rFonts w:ascii="Aptos" w:hAnsi="Aptos" w:eastAsia="Aptos" w:cs="Aptos"/>
-          <w:noProof w:val="0"/>
-          <w:sz w:val="22"/>
-          <w:szCs w:val="22"/>
-          <w:lang w:val="en-US"/>
-        </w:rPr>
       </w:pPr>
       <w:r>
         <w:rPr>
@@ -35473,47 +34475,15 @@
           <w:rtl w:val="1"/>
           <w:lang w:val="en-US"/>
         </w:rPr>
-        <w:t>זיהוי</w:t>
-      </w:r>
-      <w:r>
-        <w:rPr>
-          <w:rFonts w:ascii="Aptos" w:hAnsi="Aptos" w:eastAsia="Aptos" w:cs="Aptos"/>
-          <w:b w:val="1"/>
-          <w:bCs w:val="1"/>
-          <w:noProof w:val="0"/>
-          <w:sz w:val="22"/>
-          <w:szCs w:val="22"/>
-          <w:rtl w:val="1"/>
-          <w:lang w:val="en-US"/>
-        </w:rPr>
-        <w:t xml:space="preserve"> </w:t>
-      </w:r>
-      <w:r>
-        <w:rPr>
-          <w:rFonts w:ascii="Aptos" w:hAnsi="Aptos" w:eastAsia="Aptos" w:cs="Aptos"/>
-          <w:b w:val="1"/>
-          <w:bCs w:val="1"/>
-          <w:noProof w:val="0"/>
-          <w:sz w:val="22"/>
-          <w:szCs w:val="22"/>
-          <w:rtl w:val="1"/>
-          <w:lang w:val="en-US"/>
-        </w:rPr>
-        <w:t>חכם</w:t>
-      </w:r>
-      <w:r>
-        <w:rPr>
-          <w:rFonts w:ascii="Aptos" w:hAnsi="Aptos" w:eastAsia="Aptos" w:cs="Aptos"/>
-          <w:b w:val="1"/>
-          <w:bCs w:val="1"/>
-          <w:noProof w:val="0"/>
-          <w:sz w:val="22"/>
-          <w:szCs w:val="22"/>
-          <w:rtl w:val="1"/>
-          <w:lang w:val="en-US"/>
-        </w:rPr>
-        <w:t>:</w:t>
-      </w:r>
+        <w:t>סיכום ומבט להמשך:</w:t>
+      </w:r>
+    </w:p>
+    <w:p>
+      <w:pPr>
+        <w:bidi w:val="1"/>
+        <w:spacing w:before="240" w:beforeAutospacing="off" w:after="240" w:afterAutospacing="off"/>
+        <w:jc w:val="center"/>
+      </w:pPr>
       <w:r>
         <w:rPr>
           <w:rFonts w:ascii="Aptos" w:hAnsi="Aptos" w:eastAsia="Aptos" w:cs="Aptos"/>
@@ -35523,2450 +34493,7 @@
           <w:rtl w:val="1"/>
           <w:lang w:val="en-US"/>
         </w:rPr>
-        <w:t xml:space="preserve"> </w:t>
-      </w:r>
-      <w:r>
-        <w:rPr>
-          <w:rFonts w:ascii="Aptos" w:hAnsi="Aptos" w:eastAsia="Aptos" w:cs="Aptos"/>
-          <w:noProof w:val="0"/>
-          <w:sz w:val="22"/>
-          <w:szCs w:val="22"/>
-          <w:rtl w:val="1"/>
-          <w:lang w:val="en-US"/>
-        </w:rPr>
-        <w:t>שילוב</w:t>
-      </w:r>
-      <w:r>
-        <w:rPr>
-          <w:rFonts w:ascii="Aptos" w:hAnsi="Aptos" w:eastAsia="Aptos" w:cs="Aptos"/>
-          <w:noProof w:val="0"/>
-          <w:sz w:val="22"/>
-          <w:szCs w:val="22"/>
-          <w:rtl w:val="1"/>
-          <w:lang w:val="en-US"/>
-        </w:rPr>
-        <w:t xml:space="preserve"> </w:t>
-      </w:r>
-      <w:r>
-        <w:rPr>
-          <w:rFonts w:ascii="Aptos" w:hAnsi="Aptos" w:eastAsia="Aptos" w:cs="Aptos"/>
-          <w:noProof w:val="0"/>
-          <w:sz w:val="22"/>
-          <w:szCs w:val="22"/>
-          <w:rtl w:val="1"/>
-          <w:lang w:val="en-US"/>
-        </w:rPr>
-        <w:t>של</w:t>
-      </w:r>
-      <w:r>
-        <w:rPr>
-          <w:rFonts w:ascii="Aptos" w:hAnsi="Aptos" w:eastAsia="Aptos" w:cs="Aptos"/>
-          <w:noProof w:val="0"/>
-          <w:sz w:val="22"/>
-          <w:szCs w:val="22"/>
-          <w:rtl w:val="1"/>
-          <w:lang w:val="en-US"/>
-        </w:rPr>
-        <w:t xml:space="preserve"> </w:t>
-      </w:r>
-      <w:r>
-        <w:rPr>
-          <w:rFonts w:ascii="Aptos" w:hAnsi="Aptos" w:eastAsia="Aptos" w:cs="Aptos"/>
-          <w:noProof w:val="0"/>
-          <w:sz w:val="22"/>
-          <w:szCs w:val="22"/>
-          <w:rtl w:val="1"/>
-          <w:lang w:val="en-US"/>
-        </w:rPr>
-        <w:t>מנוע</w:t>
-      </w:r>
-      <w:r>
-        <w:rPr>
-          <w:rFonts w:ascii="Aptos" w:hAnsi="Aptos" w:eastAsia="Aptos" w:cs="Aptos"/>
-          <w:noProof w:val="0"/>
-          <w:sz w:val="22"/>
-          <w:szCs w:val="22"/>
-          <w:rtl w:val="1"/>
-          <w:lang w:val="en-US"/>
-        </w:rPr>
-        <w:t xml:space="preserve"> </w:t>
-      </w:r>
-      <w:r>
-        <w:rPr>
-          <w:rFonts w:ascii="Aptos" w:hAnsi="Aptos" w:eastAsia="Aptos" w:cs="Aptos"/>
-          <w:noProof w:val="0"/>
-          <w:sz w:val="22"/>
-          <w:szCs w:val="22"/>
-          <w:rtl w:val="1"/>
-          <w:lang w:val="en-US"/>
-        </w:rPr>
-        <w:t>חוקים</w:t>
-      </w:r>
-      <w:r>
-        <w:rPr>
-          <w:rFonts w:ascii="Aptos" w:hAnsi="Aptos" w:eastAsia="Aptos" w:cs="Aptos"/>
-          <w:noProof w:val="0"/>
-          <w:sz w:val="22"/>
-          <w:szCs w:val="22"/>
-          <w:rtl w:val="1"/>
-          <w:lang w:val="en-US"/>
-        </w:rPr>
-        <w:t xml:space="preserve"> </w:t>
-      </w:r>
-      <w:r>
-        <w:rPr>
-          <w:rFonts w:ascii="Aptos" w:hAnsi="Aptos" w:eastAsia="Aptos" w:cs="Aptos"/>
-          <w:noProof w:val="0"/>
-          <w:sz w:val="22"/>
-          <w:szCs w:val="22"/>
-          <w:rtl w:val="1"/>
-          <w:lang w:val="en-US"/>
-        </w:rPr>
-        <w:t>דטרמיניסטי</w:t>
-      </w:r>
-      <w:r>
-        <w:rPr>
-          <w:rFonts w:ascii="Aptos" w:hAnsi="Aptos" w:eastAsia="Aptos" w:cs="Aptos"/>
-          <w:noProof w:val="0"/>
-          <w:sz w:val="22"/>
-          <w:szCs w:val="22"/>
-          <w:rtl w:val="1"/>
-          <w:lang w:val="en-US"/>
-        </w:rPr>
-        <w:t xml:space="preserve"> </w:t>
-      </w:r>
-      <w:r>
-        <w:rPr>
-          <w:rFonts w:ascii="Aptos" w:hAnsi="Aptos" w:eastAsia="Aptos" w:cs="Aptos"/>
-          <w:noProof w:val="0"/>
-          <w:sz w:val="22"/>
-          <w:szCs w:val="22"/>
-          <w:rtl w:val="1"/>
-          <w:lang w:val="en-US"/>
-        </w:rPr>
-        <w:t>יחד</w:t>
-      </w:r>
-      <w:r>
-        <w:rPr>
-          <w:rFonts w:ascii="Aptos" w:hAnsi="Aptos" w:eastAsia="Aptos" w:cs="Aptos"/>
-          <w:noProof w:val="0"/>
-          <w:sz w:val="22"/>
-          <w:szCs w:val="22"/>
-          <w:rtl w:val="1"/>
-          <w:lang w:val="en-US"/>
-        </w:rPr>
-        <w:t xml:space="preserve"> </w:t>
-      </w:r>
-      <w:r>
-        <w:rPr>
-          <w:rFonts w:ascii="Aptos" w:hAnsi="Aptos" w:eastAsia="Aptos" w:cs="Aptos"/>
-          <w:noProof w:val="0"/>
-          <w:sz w:val="22"/>
-          <w:szCs w:val="22"/>
-          <w:rtl w:val="1"/>
-          <w:lang w:val="en-US"/>
-        </w:rPr>
-        <w:t>עם</w:t>
-      </w:r>
-      <w:r>
-        <w:rPr>
-          <w:rFonts w:ascii="Aptos" w:hAnsi="Aptos" w:eastAsia="Aptos" w:cs="Aptos"/>
-          <w:noProof w:val="0"/>
-          <w:sz w:val="22"/>
-          <w:szCs w:val="22"/>
-          <w:rtl w:val="1"/>
-          <w:lang w:val="en-US"/>
-        </w:rPr>
-        <w:t xml:space="preserve"> </w:t>
-      </w:r>
-      <w:r>
-        <w:rPr>
-          <w:rFonts w:ascii="Aptos" w:hAnsi="Aptos" w:eastAsia="Aptos" w:cs="Aptos"/>
-          <w:noProof w:val="0"/>
-          <w:sz w:val="22"/>
-          <w:szCs w:val="22"/>
-          <w:rtl w:val="1"/>
-          <w:lang w:val="en-US"/>
-        </w:rPr>
-        <w:t>מודל</w:t>
-      </w:r>
-      <w:r>
-        <w:rPr>
-          <w:rFonts w:ascii="Aptos" w:hAnsi="Aptos" w:eastAsia="Aptos" w:cs="Aptos"/>
-          <w:noProof w:val="0"/>
-          <w:sz w:val="22"/>
-          <w:szCs w:val="22"/>
-          <w:rtl w:val="1"/>
-          <w:lang w:val="en-US"/>
-        </w:rPr>
-        <w:t xml:space="preserve"> </w:t>
-      </w:r>
-      <w:r>
-        <w:rPr>
-          <w:rFonts w:ascii="Aptos" w:hAnsi="Aptos" w:eastAsia="Aptos" w:cs="Aptos"/>
-          <w:noProof w:val="0"/>
-          <w:sz w:val="22"/>
-          <w:szCs w:val="22"/>
-          <w:rtl w:val="1"/>
-          <w:lang w:val="en-US"/>
-        </w:rPr>
-        <w:t>למידת</w:t>
-      </w:r>
-      <w:r>
-        <w:rPr>
-          <w:rFonts w:ascii="Aptos" w:hAnsi="Aptos" w:eastAsia="Aptos" w:cs="Aptos"/>
-          <w:noProof w:val="0"/>
-          <w:sz w:val="22"/>
-          <w:szCs w:val="22"/>
-          <w:rtl w:val="1"/>
-          <w:lang w:val="en-US"/>
-        </w:rPr>
-        <w:t xml:space="preserve"> </w:t>
-      </w:r>
-      <w:r>
-        <w:rPr>
-          <w:rFonts w:ascii="Aptos" w:hAnsi="Aptos" w:eastAsia="Aptos" w:cs="Aptos"/>
-          <w:noProof w:val="0"/>
-          <w:sz w:val="22"/>
-          <w:szCs w:val="22"/>
-          <w:rtl w:val="1"/>
-          <w:lang w:val="en-US"/>
-        </w:rPr>
-        <w:t>מכונה</w:t>
-      </w:r>
-      <w:r>
-        <w:rPr>
-          <w:rFonts w:ascii="Aptos" w:hAnsi="Aptos" w:eastAsia="Aptos" w:cs="Aptos"/>
-          <w:noProof w:val="0"/>
-          <w:sz w:val="22"/>
-          <w:szCs w:val="22"/>
-          <w:lang w:val="en-US"/>
-        </w:rPr>
-        <w:t xml:space="preserve"> (</w:t>
-      </w:r>
-      <w:r>
-        <w:rPr>
-          <w:rFonts w:ascii="Aptos" w:hAnsi="Aptos" w:eastAsia="Aptos" w:cs="Aptos"/>
-          <w:b w:val="1"/>
-          <w:bCs w:val="1"/>
-          <w:noProof w:val="0"/>
-          <w:sz w:val="22"/>
-          <w:szCs w:val="22"/>
-          <w:lang w:val="en-US"/>
-        </w:rPr>
-        <w:t>Isolation Forest</w:t>
-      </w:r>
-      <w:r>
-        <w:rPr>
-          <w:rFonts w:ascii="Aptos" w:hAnsi="Aptos" w:eastAsia="Aptos" w:cs="Aptos"/>
-          <w:noProof w:val="0"/>
-          <w:sz w:val="22"/>
-          <w:szCs w:val="22"/>
-          <w:lang w:val="en-US"/>
-        </w:rPr>
-        <w:t xml:space="preserve">) </w:t>
-      </w:r>
-      <w:r>
-        <w:rPr>
-          <w:rFonts w:ascii="Aptos" w:hAnsi="Aptos" w:eastAsia="Aptos" w:cs="Aptos"/>
-          <w:noProof w:val="0"/>
-          <w:sz w:val="22"/>
-          <w:szCs w:val="22"/>
-          <w:rtl w:val="1"/>
-          <w:lang w:val="en-US"/>
-        </w:rPr>
-        <w:t>מאפשר</w:t>
-      </w:r>
-      <w:r>
-        <w:rPr>
-          <w:rFonts w:ascii="Aptos" w:hAnsi="Aptos" w:eastAsia="Aptos" w:cs="Aptos"/>
-          <w:noProof w:val="0"/>
-          <w:sz w:val="22"/>
-          <w:szCs w:val="22"/>
-          <w:rtl w:val="1"/>
-          <w:lang w:val="en-US"/>
-        </w:rPr>
-        <w:t xml:space="preserve"> </w:t>
-      </w:r>
-      <w:r>
-        <w:rPr>
-          <w:rFonts w:ascii="Aptos" w:hAnsi="Aptos" w:eastAsia="Aptos" w:cs="Aptos"/>
-          <w:noProof w:val="0"/>
-          <w:sz w:val="22"/>
-          <w:szCs w:val="22"/>
-          <w:rtl w:val="1"/>
-          <w:lang w:val="en-US"/>
-        </w:rPr>
-        <w:t>זיהוי</w:t>
-      </w:r>
-      <w:r>
-        <w:rPr>
-          <w:rFonts w:ascii="Aptos" w:hAnsi="Aptos" w:eastAsia="Aptos" w:cs="Aptos"/>
-          <w:noProof w:val="0"/>
-          <w:sz w:val="22"/>
-          <w:szCs w:val="22"/>
-          <w:rtl w:val="1"/>
-          <w:lang w:val="en-US"/>
-        </w:rPr>
-        <w:t xml:space="preserve"> </w:t>
-      </w:r>
-      <w:r>
-        <w:rPr>
-          <w:rFonts w:ascii="Aptos" w:hAnsi="Aptos" w:eastAsia="Aptos" w:cs="Aptos"/>
-          <w:noProof w:val="0"/>
-          <w:sz w:val="22"/>
-          <w:szCs w:val="22"/>
-          <w:rtl w:val="1"/>
-          <w:lang w:val="en-US"/>
-        </w:rPr>
-        <w:t>אנומליות</w:t>
-      </w:r>
-      <w:r>
-        <w:rPr>
-          <w:rFonts w:ascii="Aptos" w:hAnsi="Aptos" w:eastAsia="Aptos" w:cs="Aptos"/>
-          <w:noProof w:val="0"/>
-          <w:sz w:val="22"/>
-          <w:szCs w:val="22"/>
-          <w:rtl w:val="1"/>
-          <w:lang w:val="en-US"/>
-        </w:rPr>
-        <w:t xml:space="preserve"> </w:t>
-      </w:r>
-      <w:r>
-        <w:rPr>
-          <w:rFonts w:ascii="Aptos" w:hAnsi="Aptos" w:eastAsia="Aptos" w:cs="Aptos"/>
-          <w:noProof w:val="0"/>
-          <w:sz w:val="22"/>
-          <w:szCs w:val="22"/>
-          <w:rtl w:val="1"/>
-          <w:lang w:val="en-US"/>
-        </w:rPr>
-        <w:t>וסיכונים</w:t>
-      </w:r>
-      <w:r>
-        <w:rPr>
-          <w:rFonts w:ascii="Aptos" w:hAnsi="Aptos" w:eastAsia="Aptos" w:cs="Aptos"/>
-          <w:noProof w:val="0"/>
-          <w:sz w:val="22"/>
-          <w:szCs w:val="22"/>
-          <w:rtl w:val="1"/>
-          <w:lang w:val="en-US"/>
-        </w:rPr>
-        <w:t xml:space="preserve"> </w:t>
-      </w:r>
-      <w:r>
-        <w:rPr>
-          <w:rFonts w:ascii="Aptos" w:hAnsi="Aptos" w:eastAsia="Aptos" w:cs="Aptos"/>
-          <w:noProof w:val="0"/>
-          <w:sz w:val="22"/>
-          <w:szCs w:val="22"/>
-          <w:rtl w:val="1"/>
-          <w:lang w:val="en-US"/>
-        </w:rPr>
-        <w:t>שאינם</w:t>
-      </w:r>
-      <w:r>
-        <w:rPr>
-          <w:rFonts w:ascii="Aptos" w:hAnsi="Aptos" w:eastAsia="Aptos" w:cs="Aptos"/>
-          <w:noProof w:val="0"/>
-          <w:sz w:val="22"/>
-          <w:szCs w:val="22"/>
-          <w:rtl w:val="1"/>
-          <w:lang w:val="en-US"/>
-        </w:rPr>
-        <w:t xml:space="preserve"> </w:t>
-      </w:r>
-      <w:r>
-        <w:rPr>
-          <w:rFonts w:ascii="Aptos" w:hAnsi="Aptos" w:eastAsia="Aptos" w:cs="Aptos"/>
-          <w:noProof w:val="0"/>
-          <w:sz w:val="22"/>
-          <w:szCs w:val="22"/>
-          <w:rtl w:val="1"/>
-          <w:lang w:val="en-US"/>
-        </w:rPr>
-        <w:t>מוכרים</w:t>
-      </w:r>
-      <w:r>
-        <w:rPr>
-          <w:rFonts w:ascii="Aptos" w:hAnsi="Aptos" w:eastAsia="Aptos" w:cs="Aptos"/>
-          <w:noProof w:val="0"/>
-          <w:sz w:val="22"/>
-          <w:szCs w:val="22"/>
-          <w:rtl w:val="1"/>
-          <w:lang w:val="en-US"/>
-        </w:rPr>
-        <w:t xml:space="preserve"> </w:t>
-      </w:r>
-      <w:r>
-        <w:rPr>
-          <w:rFonts w:ascii="Aptos" w:hAnsi="Aptos" w:eastAsia="Aptos" w:cs="Aptos"/>
-          <w:noProof w:val="0"/>
-          <w:sz w:val="22"/>
-          <w:szCs w:val="22"/>
-          <w:rtl w:val="1"/>
-          <w:lang w:val="en-US"/>
-        </w:rPr>
-        <w:t>מראש</w:t>
-      </w:r>
-      <w:r>
-        <w:rPr>
-          <w:rFonts w:ascii="Aptos" w:hAnsi="Aptos" w:eastAsia="Aptos" w:cs="Aptos"/>
-          <w:noProof w:val="0"/>
-          <w:sz w:val="22"/>
-          <w:szCs w:val="22"/>
-          <w:lang w:val="en-US"/>
-        </w:rPr>
-        <w:t>.</w:t>
-      </w:r>
-    </w:p>
-    <w:p>
-      <w:pPr>
-        <w:bidi w:val="0"/>
-        <w:spacing w:before="0" w:beforeAutospacing="off" w:after="0" w:afterAutospacing="off"/>
-        <w:jc w:val="center"/>
-      </w:pPr>
-      <w:r>
-        <w:rPr>
-          <w:rFonts w:ascii="Aptos" w:hAnsi="Aptos" w:eastAsia="Aptos" w:cs="Aptos"/>
-          <w:noProof w:val="0"/>
-          <w:sz w:val="22"/>
-          <w:szCs w:val="22"/>
-          <w:lang w:val="en-US"/>
-        </w:rPr>
-        <w:t>+2</w:t>
-      </w:r>
-    </w:p>
-    <w:p>
-      <w:pPr>
-        <w:pStyle w:val="ListParagraph"/>
-        <w:numPr>
-          <w:ilvl w:val="0"/>
-          <w:numId w:val="11"/>
-        </w:numPr>
-        <w:bidi w:val="0"/>
-        <w:spacing w:before="240" w:beforeAutospacing="off" w:after="240" w:afterAutospacing="off"/>
-        <w:jc w:val="center"/>
-        <w:rPr>
-          <w:rFonts w:ascii="Aptos" w:hAnsi="Aptos" w:eastAsia="Aptos" w:cs="Aptos"/>
-          <w:noProof w:val="0"/>
-          <w:sz w:val="22"/>
-          <w:szCs w:val="22"/>
-          <w:lang w:val="en-US"/>
-        </w:rPr>
-      </w:pPr>
-      <w:r>
-        <w:rPr>
-          <w:rFonts w:ascii="Aptos" w:hAnsi="Aptos" w:eastAsia="Aptos" w:cs="Aptos"/>
-          <w:b w:val="1"/>
-          <w:bCs w:val="1"/>
-          <w:noProof w:val="0"/>
-          <w:sz w:val="22"/>
-          <w:szCs w:val="22"/>
-          <w:rtl w:val="1"/>
-          <w:lang w:val="en-US"/>
-        </w:rPr>
-        <w:t>ניהול</w:t>
-      </w:r>
-      <w:r>
-        <w:rPr>
-          <w:rFonts w:ascii="Aptos" w:hAnsi="Aptos" w:eastAsia="Aptos" w:cs="Aptos"/>
-          <w:b w:val="1"/>
-          <w:bCs w:val="1"/>
-          <w:noProof w:val="0"/>
-          <w:sz w:val="22"/>
-          <w:szCs w:val="22"/>
-          <w:rtl w:val="1"/>
-          <w:lang w:val="en-US"/>
-        </w:rPr>
-        <w:t xml:space="preserve"> </w:t>
-      </w:r>
-      <w:r>
-        <w:rPr>
-          <w:rFonts w:ascii="Aptos" w:hAnsi="Aptos" w:eastAsia="Aptos" w:cs="Aptos"/>
-          <w:b w:val="1"/>
-          <w:bCs w:val="1"/>
-          <w:noProof w:val="0"/>
-          <w:sz w:val="22"/>
-          <w:szCs w:val="22"/>
-          <w:rtl w:val="1"/>
-          <w:lang w:val="en-US"/>
-        </w:rPr>
-        <w:t>ושליטה</w:t>
-      </w:r>
-      <w:r>
-        <w:rPr>
-          <w:rFonts w:ascii="Aptos" w:hAnsi="Aptos" w:eastAsia="Aptos" w:cs="Aptos"/>
-          <w:b w:val="1"/>
-          <w:bCs w:val="1"/>
-          <w:noProof w:val="0"/>
-          <w:sz w:val="22"/>
-          <w:szCs w:val="22"/>
-          <w:rtl w:val="1"/>
-          <w:lang w:val="en-US"/>
-        </w:rPr>
-        <w:t>:</w:t>
-      </w:r>
-      <w:r>
-        <w:rPr>
-          <w:rFonts w:ascii="Aptos" w:hAnsi="Aptos" w:eastAsia="Aptos" w:cs="Aptos"/>
-          <w:noProof w:val="0"/>
-          <w:sz w:val="22"/>
-          <w:szCs w:val="22"/>
-          <w:rtl w:val="1"/>
-          <w:lang w:val="en-US"/>
-        </w:rPr>
-        <w:t xml:space="preserve"> </w:t>
-      </w:r>
-      <w:r>
-        <w:rPr>
-          <w:rFonts w:ascii="Aptos" w:hAnsi="Aptos" w:eastAsia="Aptos" w:cs="Aptos"/>
-          <w:noProof w:val="0"/>
-          <w:sz w:val="22"/>
-          <w:szCs w:val="22"/>
-          <w:rtl w:val="1"/>
-          <w:lang w:val="en-US"/>
-        </w:rPr>
-        <w:t>המערכת</w:t>
-      </w:r>
-      <w:r>
-        <w:rPr>
-          <w:rFonts w:ascii="Aptos" w:hAnsi="Aptos" w:eastAsia="Aptos" w:cs="Aptos"/>
-          <w:noProof w:val="0"/>
-          <w:sz w:val="22"/>
-          <w:szCs w:val="22"/>
-          <w:rtl w:val="1"/>
-          <w:lang w:val="en-US"/>
-        </w:rPr>
-        <w:t xml:space="preserve"> </w:t>
-      </w:r>
-      <w:r>
-        <w:rPr>
-          <w:rFonts w:ascii="Aptos" w:hAnsi="Aptos" w:eastAsia="Aptos" w:cs="Aptos"/>
-          <w:noProof w:val="0"/>
-          <w:sz w:val="22"/>
-          <w:szCs w:val="22"/>
-          <w:rtl w:val="1"/>
-          <w:lang w:val="en-US"/>
-        </w:rPr>
-        <w:t>מעניקה</w:t>
-      </w:r>
-      <w:r>
-        <w:rPr>
-          <w:rFonts w:ascii="Aptos" w:hAnsi="Aptos" w:eastAsia="Aptos" w:cs="Aptos"/>
-          <w:noProof w:val="0"/>
-          <w:sz w:val="22"/>
-          <w:szCs w:val="22"/>
-          <w:rtl w:val="1"/>
-          <w:lang w:val="en-US"/>
-        </w:rPr>
-        <w:t xml:space="preserve"> </w:t>
-      </w:r>
-      <w:r>
-        <w:rPr>
-          <w:rFonts w:ascii="Aptos" w:hAnsi="Aptos" w:eastAsia="Aptos" w:cs="Aptos"/>
-          <w:noProof w:val="0"/>
-          <w:sz w:val="22"/>
-          <w:szCs w:val="22"/>
-          <w:rtl w:val="1"/>
-          <w:lang w:val="en-US"/>
-        </w:rPr>
-        <w:t>למנהל</w:t>
-      </w:r>
-      <w:r>
-        <w:rPr>
-          <w:rFonts w:ascii="Aptos" w:hAnsi="Aptos" w:eastAsia="Aptos" w:cs="Aptos"/>
-          <w:noProof w:val="0"/>
-          <w:sz w:val="22"/>
-          <w:szCs w:val="22"/>
-          <w:rtl w:val="1"/>
-          <w:lang w:val="en-US"/>
-        </w:rPr>
-        <w:t xml:space="preserve"> </w:t>
-      </w:r>
-      <w:r>
-        <w:rPr>
-          <w:rFonts w:ascii="Aptos" w:hAnsi="Aptos" w:eastAsia="Aptos" w:cs="Aptos"/>
-          <w:noProof w:val="0"/>
-          <w:sz w:val="22"/>
-          <w:szCs w:val="22"/>
-          <w:rtl w:val="1"/>
-          <w:lang w:val="en-US"/>
-        </w:rPr>
-        <w:t>המערכת</w:t>
-      </w:r>
-      <w:r>
-        <w:rPr>
-          <w:rFonts w:ascii="Aptos" w:hAnsi="Aptos" w:eastAsia="Aptos" w:cs="Aptos"/>
-          <w:noProof w:val="0"/>
-          <w:sz w:val="22"/>
-          <w:szCs w:val="22"/>
-          <w:rtl w:val="1"/>
-          <w:lang w:val="en-US"/>
-        </w:rPr>
-        <w:t xml:space="preserve"> </w:t>
-      </w:r>
-      <w:r>
-        <w:rPr>
-          <w:rFonts w:ascii="Aptos" w:hAnsi="Aptos" w:eastAsia="Aptos" w:cs="Aptos"/>
-          <w:noProof w:val="0"/>
-          <w:sz w:val="22"/>
-          <w:szCs w:val="22"/>
-          <w:rtl w:val="1"/>
-          <w:lang w:val="en-US"/>
-        </w:rPr>
-        <w:t>שליטה</w:t>
-      </w:r>
-      <w:r>
-        <w:rPr>
-          <w:rFonts w:ascii="Aptos" w:hAnsi="Aptos" w:eastAsia="Aptos" w:cs="Aptos"/>
-          <w:noProof w:val="0"/>
-          <w:sz w:val="22"/>
-          <w:szCs w:val="22"/>
-          <w:rtl w:val="1"/>
-          <w:lang w:val="en-US"/>
-        </w:rPr>
-        <w:t xml:space="preserve"> </w:t>
-      </w:r>
-      <w:r>
-        <w:rPr>
-          <w:rFonts w:ascii="Aptos" w:hAnsi="Aptos" w:eastAsia="Aptos" w:cs="Aptos"/>
-          <w:noProof w:val="0"/>
-          <w:sz w:val="22"/>
-          <w:szCs w:val="22"/>
-          <w:rtl w:val="1"/>
-          <w:lang w:val="en-US"/>
-        </w:rPr>
-        <w:t>מלאה</w:t>
-      </w:r>
-      <w:r>
-        <w:rPr>
-          <w:rFonts w:ascii="Aptos" w:hAnsi="Aptos" w:eastAsia="Aptos" w:cs="Aptos"/>
-          <w:noProof w:val="0"/>
-          <w:sz w:val="22"/>
-          <w:szCs w:val="22"/>
-          <w:rtl w:val="1"/>
-          <w:lang w:val="en-US"/>
-        </w:rPr>
-        <w:t xml:space="preserve"> </w:t>
-      </w:r>
-      <w:r>
-        <w:rPr>
-          <w:rFonts w:ascii="Aptos" w:hAnsi="Aptos" w:eastAsia="Aptos" w:cs="Aptos"/>
-          <w:noProof w:val="0"/>
-          <w:sz w:val="22"/>
-          <w:szCs w:val="22"/>
-          <w:rtl w:val="1"/>
-          <w:lang w:val="en-US"/>
-        </w:rPr>
-        <w:t>על</w:t>
-      </w:r>
-      <w:r>
-        <w:rPr>
-          <w:rFonts w:ascii="Aptos" w:hAnsi="Aptos" w:eastAsia="Aptos" w:cs="Aptos"/>
-          <w:noProof w:val="0"/>
-          <w:sz w:val="22"/>
-          <w:szCs w:val="22"/>
-          <w:rtl w:val="1"/>
-          <w:lang w:val="en-US"/>
-        </w:rPr>
-        <w:t xml:space="preserve"> </w:t>
-      </w:r>
-      <w:r>
-        <w:rPr>
-          <w:rFonts w:ascii="Aptos" w:hAnsi="Aptos" w:eastAsia="Aptos" w:cs="Aptos"/>
-          <w:noProof w:val="0"/>
-          <w:sz w:val="22"/>
-          <w:szCs w:val="22"/>
-          <w:rtl w:val="1"/>
-          <w:lang w:val="en-US"/>
-        </w:rPr>
-        <w:t>מצבי</w:t>
-      </w:r>
-      <w:r>
-        <w:rPr>
-          <w:rFonts w:ascii="Aptos" w:hAnsi="Aptos" w:eastAsia="Aptos" w:cs="Aptos"/>
-          <w:noProof w:val="0"/>
-          <w:sz w:val="22"/>
-          <w:szCs w:val="22"/>
-          <w:rtl w:val="1"/>
-          <w:lang w:val="en-US"/>
-        </w:rPr>
-        <w:t xml:space="preserve"> </w:t>
-      </w:r>
-      <w:r>
-        <w:rPr>
-          <w:rFonts w:ascii="Aptos" w:hAnsi="Aptos" w:eastAsia="Aptos" w:cs="Aptos"/>
-          <w:noProof w:val="0"/>
-          <w:sz w:val="22"/>
-          <w:szCs w:val="22"/>
-          <w:rtl w:val="1"/>
-          <w:lang w:val="en-US"/>
-        </w:rPr>
-        <w:t>הניטור</w:t>
-      </w:r>
-      <w:r>
-        <w:rPr>
-          <w:rFonts w:ascii="Aptos" w:hAnsi="Aptos" w:eastAsia="Aptos" w:cs="Aptos"/>
-          <w:noProof w:val="0"/>
-          <w:sz w:val="22"/>
-          <w:szCs w:val="22"/>
-          <w:rtl w:val="1"/>
-          <w:lang w:val="en-US"/>
-        </w:rPr>
-        <w:t xml:space="preserve">, </w:t>
-      </w:r>
-      <w:r>
-        <w:rPr>
-          <w:rFonts w:ascii="Aptos" w:hAnsi="Aptos" w:eastAsia="Aptos" w:cs="Aptos"/>
-          <w:noProof w:val="0"/>
-          <w:sz w:val="22"/>
-          <w:szCs w:val="22"/>
-          <w:rtl w:val="1"/>
-          <w:lang w:val="en-US"/>
-        </w:rPr>
-        <w:t>ניהול</w:t>
-      </w:r>
-      <w:r>
-        <w:rPr>
-          <w:rFonts w:ascii="Aptos" w:hAnsi="Aptos" w:eastAsia="Aptos" w:cs="Aptos"/>
-          <w:noProof w:val="0"/>
-          <w:sz w:val="22"/>
-          <w:szCs w:val="22"/>
-          <w:rtl w:val="1"/>
-          <w:lang w:val="en-US"/>
-        </w:rPr>
-        <w:t xml:space="preserve"> </w:t>
-      </w:r>
-      <w:r>
-        <w:rPr>
-          <w:rFonts w:ascii="Aptos" w:hAnsi="Aptos" w:eastAsia="Aptos" w:cs="Aptos"/>
-          <w:noProof w:val="0"/>
-          <w:sz w:val="22"/>
-          <w:szCs w:val="22"/>
-          <w:rtl w:val="1"/>
-          <w:lang w:val="en-US"/>
-        </w:rPr>
-        <w:t>משתמשים</w:t>
-      </w:r>
-      <w:r>
-        <w:rPr>
-          <w:rFonts w:ascii="Aptos" w:hAnsi="Aptos" w:eastAsia="Aptos" w:cs="Aptos"/>
-          <w:noProof w:val="0"/>
-          <w:sz w:val="22"/>
-          <w:szCs w:val="22"/>
-          <w:rtl w:val="1"/>
-          <w:lang w:val="en-US"/>
-        </w:rPr>
-        <w:t xml:space="preserve"> </w:t>
-      </w:r>
-      <w:r>
-        <w:rPr>
-          <w:rFonts w:ascii="Aptos" w:hAnsi="Aptos" w:eastAsia="Aptos" w:cs="Aptos"/>
-          <w:noProof w:val="0"/>
-          <w:sz w:val="22"/>
-          <w:szCs w:val="22"/>
-          <w:rtl w:val="1"/>
-          <w:lang w:val="en-US"/>
-        </w:rPr>
-        <w:t>והגדרת</w:t>
-      </w:r>
-      <w:r>
-        <w:rPr>
-          <w:rFonts w:ascii="Aptos" w:hAnsi="Aptos" w:eastAsia="Aptos" w:cs="Aptos"/>
-          <w:noProof w:val="0"/>
-          <w:sz w:val="22"/>
-          <w:szCs w:val="22"/>
-          <w:rtl w:val="1"/>
-          <w:lang w:val="en-US"/>
-        </w:rPr>
-        <w:t xml:space="preserve"> "</w:t>
-      </w:r>
-      <w:r>
-        <w:rPr>
-          <w:rFonts w:ascii="Aptos" w:hAnsi="Aptos" w:eastAsia="Aptos" w:cs="Aptos"/>
-          <w:noProof w:val="0"/>
-          <w:sz w:val="22"/>
-          <w:szCs w:val="22"/>
-          <w:rtl w:val="1"/>
-          <w:lang w:val="en-US"/>
-        </w:rPr>
-        <w:t>רשימות</w:t>
-      </w:r>
-      <w:r>
-        <w:rPr>
-          <w:rFonts w:ascii="Aptos" w:hAnsi="Aptos" w:eastAsia="Aptos" w:cs="Aptos"/>
-          <w:noProof w:val="0"/>
-          <w:sz w:val="22"/>
-          <w:szCs w:val="22"/>
-          <w:rtl w:val="1"/>
-          <w:lang w:val="en-US"/>
-        </w:rPr>
-        <w:t xml:space="preserve"> </w:t>
-      </w:r>
-      <w:r>
-        <w:rPr>
-          <w:rFonts w:ascii="Aptos" w:hAnsi="Aptos" w:eastAsia="Aptos" w:cs="Aptos"/>
-          <w:noProof w:val="0"/>
-          <w:sz w:val="22"/>
-          <w:szCs w:val="22"/>
-          <w:rtl w:val="1"/>
-          <w:lang w:val="en-US"/>
-        </w:rPr>
-        <w:t>לבנות</w:t>
-      </w:r>
-      <w:r>
-        <w:rPr>
-          <w:rFonts w:ascii="Aptos" w:hAnsi="Aptos" w:eastAsia="Aptos" w:cs="Aptos"/>
-          <w:noProof w:val="0"/>
-          <w:sz w:val="22"/>
-          <w:szCs w:val="22"/>
-          <w:rtl w:val="1"/>
-          <w:lang w:val="en-US"/>
-        </w:rPr>
-        <w:t xml:space="preserve">" </w:t>
-      </w:r>
-      <w:r>
-        <w:rPr>
-          <w:rFonts w:ascii="Aptos" w:hAnsi="Aptos" w:eastAsia="Aptos" w:cs="Aptos"/>
-          <w:noProof w:val="0"/>
-          <w:sz w:val="22"/>
-          <w:szCs w:val="22"/>
-          <w:rtl w:val="1"/>
-          <w:lang w:val="en-US"/>
-        </w:rPr>
-        <w:t>לצמצום</w:t>
-      </w:r>
-      <w:r>
-        <w:rPr>
-          <w:rFonts w:ascii="Aptos" w:hAnsi="Aptos" w:eastAsia="Aptos" w:cs="Aptos"/>
-          <w:noProof w:val="0"/>
-          <w:sz w:val="22"/>
-          <w:szCs w:val="22"/>
-          <w:rtl w:val="1"/>
-          <w:lang w:val="en-US"/>
-        </w:rPr>
-        <w:t xml:space="preserve"> </w:t>
-      </w:r>
-      <w:r>
-        <w:rPr>
-          <w:rFonts w:ascii="Aptos" w:hAnsi="Aptos" w:eastAsia="Aptos" w:cs="Aptos"/>
-          <w:noProof w:val="0"/>
-          <w:sz w:val="22"/>
-          <w:szCs w:val="22"/>
-          <w:rtl w:val="1"/>
-          <w:lang w:val="en-US"/>
-        </w:rPr>
-        <w:t>התראות</w:t>
-      </w:r>
-      <w:r>
-        <w:rPr>
-          <w:rFonts w:ascii="Aptos" w:hAnsi="Aptos" w:eastAsia="Aptos" w:cs="Aptos"/>
-          <w:noProof w:val="0"/>
-          <w:sz w:val="22"/>
-          <w:szCs w:val="22"/>
-          <w:rtl w:val="1"/>
-          <w:lang w:val="en-US"/>
-        </w:rPr>
-        <w:t xml:space="preserve"> </w:t>
-      </w:r>
-      <w:r>
-        <w:rPr>
-          <w:rFonts w:ascii="Aptos" w:hAnsi="Aptos" w:eastAsia="Aptos" w:cs="Aptos"/>
-          <w:noProof w:val="0"/>
-          <w:sz w:val="22"/>
-          <w:szCs w:val="22"/>
-          <w:rtl w:val="1"/>
-          <w:lang w:val="en-US"/>
-        </w:rPr>
-        <w:t>שווא</w:t>
-      </w:r>
-      <w:r>
-        <w:rPr>
-          <w:rFonts w:ascii="Aptos" w:hAnsi="Aptos" w:eastAsia="Aptos" w:cs="Aptos"/>
-          <w:noProof w:val="0"/>
-          <w:sz w:val="22"/>
-          <w:szCs w:val="22"/>
-          <w:lang w:val="en-US"/>
-        </w:rPr>
-        <w:t>.</w:t>
-      </w:r>
-    </w:p>
-    <w:p>
-      <w:pPr>
-        <w:bidi w:val="0"/>
-        <w:spacing w:before="0" w:beforeAutospacing="off" w:after="0" w:afterAutospacing="off"/>
-        <w:jc w:val="center"/>
-      </w:pPr>
-      <w:r>
-        <w:rPr>
-          <w:rFonts w:ascii="Aptos" w:hAnsi="Aptos" w:eastAsia="Aptos" w:cs="Aptos"/>
-          <w:noProof w:val="0"/>
-          <w:sz w:val="22"/>
-          <w:szCs w:val="22"/>
-          <w:lang w:val="en-US"/>
-        </w:rPr>
-        <w:t>+2</w:t>
-      </w:r>
-    </w:p>
-    <w:p>
-      <w:pPr>
-        <w:pStyle w:val="ListParagraph"/>
-        <w:numPr>
-          <w:ilvl w:val="0"/>
-          <w:numId w:val="11"/>
-        </w:numPr>
-        <w:bidi w:val="0"/>
-        <w:spacing w:before="240" w:beforeAutospacing="off" w:after="240" w:afterAutospacing="off"/>
-        <w:jc w:val="center"/>
-        <w:rPr>
-          <w:rFonts w:ascii="Aptos" w:hAnsi="Aptos" w:eastAsia="Aptos" w:cs="Aptos"/>
-          <w:noProof w:val="0"/>
-          <w:sz w:val="22"/>
-          <w:szCs w:val="22"/>
-          <w:lang w:val="en-US"/>
-        </w:rPr>
-      </w:pPr>
-      <w:r>
-        <w:rPr>
-          <w:rFonts w:ascii="Aptos" w:hAnsi="Aptos" w:eastAsia="Aptos" w:cs="Aptos"/>
-          <w:b w:val="1"/>
-          <w:bCs w:val="1"/>
-          <w:noProof w:val="0"/>
-          <w:sz w:val="22"/>
-          <w:szCs w:val="22"/>
-          <w:rtl w:val="1"/>
-          <w:lang w:val="en-US"/>
-        </w:rPr>
-        <w:t>תצוגה</w:t>
-      </w:r>
-      <w:r>
-        <w:rPr>
-          <w:rFonts w:ascii="Aptos" w:hAnsi="Aptos" w:eastAsia="Aptos" w:cs="Aptos"/>
-          <w:b w:val="1"/>
-          <w:bCs w:val="1"/>
-          <w:noProof w:val="0"/>
-          <w:sz w:val="22"/>
-          <w:szCs w:val="22"/>
-          <w:rtl w:val="1"/>
-          <w:lang w:val="en-US"/>
-        </w:rPr>
-        <w:t xml:space="preserve"> </w:t>
-      </w:r>
-      <w:r>
-        <w:rPr>
-          <w:rFonts w:ascii="Aptos" w:hAnsi="Aptos" w:eastAsia="Aptos" w:cs="Aptos"/>
-          <w:b w:val="1"/>
-          <w:bCs w:val="1"/>
-          <w:noProof w:val="0"/>
-          <w:sz w:val="22"/>
-          <w:szCs w:val="22"/>
-          <w:rtl w:val="1"/>
-          <w:lang w:val="en-US"/>
-        </w:rPr>
-        <w:t>ודיווח</w:t>
-      </w:r>
-      <w:r>
-        <w:rPr>
-          <w:rFonts w:ascii="Aptos" w:hAnsi="Aptos" w:eastAsia="Aptos" w:cs="Aptos"/>
-          <w:b w:val="1"/>
-          <w:bCs w:val="1"/>
-          <w:noProof w:val="0"/>
-          <w:sz w:val="22"/>
-          <w:szCs w:val="22"/>
-          <w:rtl w:val="1"/>
-          <w:lang w:val="en-US"/>
-        </w:rPr>
-        <w:t>:</w:t>
-      </w:r>
-      <w:r>
-        <w:rPr>
-          <w:rFonts w:ascii="Aptos" w:hAnsi="Aptos" w:eastAsia="Aptos" w:cs="Aptos"/>
-          <w:noProof w:val="0"/>
-          <w:sz w:val="22"/>
-          <w:szCs w:val="22"/>
-          <w:rtl w:val="1"/>
-          <w:lang w:val="en-US"/>
-        </w:rPr>
-        <w:t xml:space="preserve"> </w:t>
-      </w:r>
-      <w:r>
-        <w:rPr>
-          <w:rFonts w:ascii="Aptos" w:hAnsi="Aptos" w:eastAsia="Aptos" w:cs="Aptos"/>
-          <w:noProof w:val="0"/>
-          <w:sz w:val="22"/>
-          <w:szCs w:val="22"/>
-          <w:rtl w:val="1"/>
-          <w:lang w:val="en-US"/>
-        </w:rPr>
-        <w:t>דגש</w:t>
-      </w:r>
-      <w:r>
-        <w:rPr>
-          <w:rFonts w:ascii="Aptos" w:hAnsi="Aptos" w:eastAsia="Aptos" w:cs="Aptos"/>
-          <w:noProof w:val="0"/>
-          <w:sz w:val="22"/>
-          <w:szCs w:val="22"/>
-          <w:rtl w:val="1"/>
-          <w:lang w:val="en-US"/>
-        </w:rPr>
-        <w:t xml:space="preserve"> </w:t>
-      </w:r>
-      <w:r>
-        <w:rPr>
-          <w:rFonts w:ascii="Aptos" w:hAnsi="Aptos" w:eastAsia="Aptos" w:cs="Aptos"/>
-          <w:noProof w:val="0"/>
-          <w:sz w:val="22"/>
-          <w:szCs w:val="22"/>
-          <w:rtl w:val="1"/>
-          <w:lang w:val="en-US"/>
-        </w:rPr>
-        <w:t>מיוחד</w:t>
-      </w:r>
-      <w:r>
-        <w:rPr>
-          <w:rFonts w:ascii="Aptos" w:hAnsi="Aptos" w:eastAsia="Aptos" w:cs="Aptos"/>
-          <w:noProof w:val="0"/>
-          <w:sz w:val="22"/>
-          <w:szCs w:val="22"/>
-          <w:rtl w:val="1"/>
-          <w:lang w:val="en-US"/>
-        </w:rPr>
-        <w:t xml:space="preserve"> </w:t>
-      </w:r>
-      <w:r>
-        <w:rPr>
-          <w:rFonts w:ascii="Aptos" w:hAnsi="Aptos" w:eastAsia="Aptos" w:cs="Aptos"/>
-          <w:noProof w:val="0"/>
-          <w:sz w:val="22"/>
-          <w:szCs w:val="22"/>
-          <w:rtl w:val="1"/>
-          <w:lang w:val="en-US"/>
-        </w:rPr>
-        <w:t>הושם</w:t>
-      </w:r>
-      <w:r>
-        <w:rPr>
-          <w:rFonts w:ascii="Aptos" w:hAnsi="Aptos" w:eastAsia="Aptos" w:cs="Aptos"/>
-          <w:noProof w:val="0"/>
-          <w:sz w:val="22"/>
-          <w:szCs w:val="22"/>
-          <w:rtl w:val="1"/>
-          <w:lang w:val="en-US"/>
-        </w:rPr>
-        <w:t xml:space="preserve"> </w:t>
-      </w:r>
-      <w:r>
-        <w:rPr>
-          <w:rFonts w:ascii="Aptos" w:hAnsi="Aptos" w:eastAsia="Aptos" w:cs="Aptos"/>
-          <w:noProof w:val="0"/>
-          <w:sz w:val="22"/>
-          <w:szCs w:val="22"/>
-          <w:rtl w:val="1"/>
-          <w:lang w:val="en-US"/>
-        </w:rPr>
-        <w:t>על</w:t>
-      </w:r>
-      <w:r>
-        <w:rPr>
-          <w:rFonts w:ascii="Aptos" w:hAnsi="Aptos" w:eastAsia="Aptos" w:cs="Aptos"/>
-          <w:noProof w:val="0"/>
-          <w:sz w:val="22"/>
-          <w:szCs w:val="22"/>
-          <w:rtl w:val="1"/>
-          <w:lang w:val="en-US"/>
-        </w:rPr>
-        <w:t xml:space="preserve"> </w:t>
-      </w:r>
-      <w:r>
-        <w:rPr>
-          <w:rFonts w:ascii="Aptos" w:hAnsi="Aptos" w:eastAsia="Aptos" w:cs="Aptos"/>
-          <w:noProof w:val="0"/>
-          <w:sz w:val="22"/>
-          <w:szCs w:val="22"/>
-          <w:rtl w:val="1"/>
-          <w:lang w:val="en-US"/>
-        </w:rPr>
-        <w:t>ממשק</w:t>
-      </w:r>
-      <w:r>
-        <w:rPr>
-          <w:rFonts w:ascii="Aptos" w:hAnsi="Aptos" w:eastAsia="Aptos" w:cs="Aptos"/>
-          <w:noProof w:val="0"/>
-          <w:sz w:val="22"/>
-          <w:szCs w:val="22"/>
-          <w:rtl w:val="1"/>
-          <w:lang w:val="en-US"/>
-        </w:rPr>
-        <w:t xml:space="preserve"> </w:t>
-      </w:r>
-      <w:r>
-        <w:rPr>
-          <w:rFonts w:ascii="Aptos" w:hAnsi="Aptos" w:eastAsia="Aptos" w:cs="Aptos"/>
-          <w:noProof w:val="0"/>
-          <w:sz w:val="22"/>
-          <w:szCs w:val="22"/>
-          <w:rtl w:val="1"/>
-          <w:lang w:val="en-US"/>
-        </w:rPr>
-        <w:t>משתמש</w:t>
-      </w:r>
-      <w:r>
-        <w:rPr>
-          <w:rFonts w:ascii="Aptos" w:hAnsi="Aptos" w:eastAsia="Aptos" w:cs="Aptos"/>
-          <w:noProof w:val="0"/>
-          <w:sz w:val="22"/>
-          <w:szCs w:val="22"/>
-          <w:rtl w:val="1"/>
-          <w:lang w:val="en-US"/>
-        </w:rPr>
-        <w:t xml:space="preserve"> </w:t>
-      </w:r>
-      <w:r>
-        <w:rPr>
-          <w:rFonts w:ascii="Aptos" w:hAnsi="Aptos" w:eastAsia="Aptos" w:cs="Aptos"/>
-          <w:noProof w:val="0"/>
-          <w:sz w:val="22"/>
-          <w:szCs w:val="22"/>
-          <w:rtl w:val="1"/>
-          <w:lang w:val="en-US"/>
-        </w:rPr>
-        <w:t>אינטואיטיבי</w:t>
-      </w:r>
-      <w:r>
-        <w:rPr>
-          <w:rFonts w:ascii="Aptos" w:hAnsi="Aptos" w:eastAsia="Aptos" w:cs="Aptos"/>
-          <w:noProof w:val="0"/>
-          <w:sz w:val="22"/>
-          <w:szCs w:val="22"/>
-          <w:rtl w:val="1"/>
-          <w:lang w:val="en-US"/>
-        </w:rPr>
-        <w:t xml:space="preserve"> </w:t>
-      </w:r>
-      <w:r>
-        <w:rPr>
-          <w:rFonts w:ascii="Aptos" w:hAnsi="Aptos" w:eastAsia="Aptos" w:cs="Aptos"/>
-          <w:noProof w:val="0"/>
-          <w:sz w:val="22"/>
-          <w:szCs w:val="22"/>
-          <w:rtl w:val="1"/>
-          <w:lang w:val="en-US"/>
-        </w:rPr>
-        <w:t>המציג</w:t>
-      </w:r>
-      <w:r>
-        <w:rPr>
-          <w:rFonts w:ascii="Aptos" w:hAnsi="Aptos" w:eastAsia="Aptos" w:cs="Aptos"/>
-          <w:noProof w:val="0"/>
-          <w:sz w:val="22"/>
-          <w:szCs w:val="22"/>
-          <w:rtl w:val="1"/>
-          <w:lang w:val="en-US"/>
-        </w:rPr>
-        <w:t xml:space="preserve"> </w:t>
-      </w:r>
-      <w:r>
-        <w:rPr>
-          <w:rFonts w:ascii="Aptos" w:hAnsi="Aptos" w:eastAsia="Aptos" w:cs="Aptos"/>
-          <w:noProof w:val="0"/>
-          <w:sz w:val="22"/>
-          <w:szCs w:val="22"/>
-          <w:rtl w:val="1"/>
-          <w:lang w:val="en-US"/>
-        </w:rPr>
-        <w:t>התראות</w:t>
-      </w:r>
-      <w:r>
-        <w:rPr>
-          <w:rFonts w:ascii="Aptos" w:hAnsi="Aptos" w:eastAsia="Aptos" w:cs="Aptos"/>
-          <w:noProof w:val="0"/>
-          <w:sz w:val="22"/>
-          <w:szCs w:val="22"/>
-          <w:rtl w:val="1"/>
-          <w:lang w:val="en-US"/>
-        </w:rPr>
-        <w:t xml:space="preserve"> </w:t>
-      </w:r>
-      <w:r>
-        <w:rPr>
-          <w:rFonts w:ascii="Aptos" w:hAnsi="Aptos" w:eastAsia="Aptos" w:cs="Aptos"/>
-          <w:noProof w:val="0"/>
-          <w:sz w:val="22"/>
-          <w:szCs w:val="22"/>
-          <w:rtl w:val="1"/>
-          <w:lang w:val="en-US"/>
-        </w:rPr>
-        <w:t>ויזואליות</w:t>
-      </w:r>
-      <w:r>
-        <w:rPr>
-          <w:rFonts w:ascii="Aptos" w:hAnsi="Aptos" w:eastAsia="Aptos" w:cs="Aptos"/>
-          <w:noProof w:val="0"/>
-          <w:sz w:val="22"/>
-          <w:szCs w:val="22"/>
-          <w:rtl w:val="1"/>
-          <w:lang w:val="en-US"/>
-        </w:rPr>
-        <w:t xml:space="preserve"> </w:t>
-      </w:r>
-      <w:r>
-        <w:rPr>
-          <w:rFonts w:ascii="Aptos" w:hAnsi="Aptos" w:eastAsia="Aptos" w:cs="Aptos"/>
-          <w:noProof w:val="0"/>
-          <w:sz w:val="22"/>
-          <w:szCs w:val="22"/>
-          <w:rtl w:val="1"/>
-          <w:lang w:val="en-US"/>
-        </w:rPr>
-        <w:t>תוך</w:t>
-      </w:r>
-      <w:r>
-        <w:rPr>
-          <w:rFonts w:ascii="Aptos" w:hAnsi="Aptos" w:eastAsia="Aptos" w:cs="Aptos"/>
-          <w:noProof w:val="0"/>
-          <w:sz w:val="22"/>
-          <w:szCs w:val="22"/>
-          <w:rtl w:val="1"/>
-          <w:lang w:val="en-US"/>
-        </w:rPr>
-        <w:t xml:space="preserve"> </w:t>
-      </w:r>
-      <w:r>
-        <w:rPr>
-          <w:rFonts w:ascii="Aptos" w:hAnsi="Aptos" w:eastAsia="Aptos" w:cs="Aptos"/>
-          <w:noProof w:val="0"/>
-          <w:sz w:val="22"/>
-          <w:szCs w:val="22"/>
-          <w:rtl w:val="1"/>
-          <w:lang w:val="en-US"/>
-        </w:rPr>
-        <w:t>פחות</w:t>
-      </w:r>
-      <w:r>
-        <w:rPr>
-          <w:rFonts w:ascii="Aptos" w:hAnsi="Aptos" w:eastAsia="Aptos" w:cs="Aptos"/>
-          <w:noProof w:val="0"/>
-          <w:sz w:val="22"/>
-          <w:szCs w:val="22"/>
-          <w:rtl w:val="1"/>
-          <w:lang w:val="en-US"/>
-        </w:rPr>
-        <w:t xml:space="preserve"> מ-2 </w:t>
-      </w:r>
-      <w:r>
-        <w:rPr>
-          <w:rFonts w:ascii="Aptos" w:hAnsi="Aptos" w:eastAsia="Aptos" w:cs="Aptos"/>
-          <w:noProof w:val="0"/>
-          <w:sz w:val="22"/>
-          <w:szCs w:val="22"/>
-          <w:rtl w:val="1"/>
-          <w:lang w:val="en-US"/>
-        </w:rPr>
-        <w:t>שניות</w:t>
-      </w:r>
-      <w:r>
-        <w:rPr>
-          <w:rFonts w:ascii="Aptos" w:hAnsi="Aptos" w:eastAsia="Aptos" w:cs="Aptos"/>
-          <w:noProof w:val="0"/>
-          <w:sz w:val="22"/>
-          <w:szCs w:val="22"/>
-          <w:rtl w:val="1"/>
-          <w:lang w:val="en-US"/>
-        </w:rPr>
-        <w:t xml:space="preserve"> </w:t>
-      </w:r>
-      <w:r>
-        <w:rPr>
-          <w:rFonts w:ascii="Aptos" w:hAnsi="Aptos" w:eastAsia="Aptos" w:cs="Aptos"/>
-          <w:noProof w:val="0"/>
-          <w:sz w:val="22"/>
-          <w:szCs w:val="22"/>
-          <w:rtl w:val="1"/>
-          <w:lang w:val="en-US"/>
-        </w:rPr>
-        <w:t>מרגע</w:t>
-      </w:r>
-      <w:r>
-        <w:rPr>
-          <w:rFonts w:ascii="Aptos" w:hAnsi="Aptos" w:eastAsia="Aptos" w:cs="Aptos"/>
-          <w:noProof w:val="0"/>
-          <w:sz w:val="22"/>
-          <w:szCs w:val="22"/>
-          <w:rtl w:val="1"/>
-          <w:lang w:val="en-US"/>
-        </w:rPr>
-        <w:t xml:space="preserve"> </w:t>
-      </w:r>
-      <w:r>
-        <w:rPr>
-          <w:rFonts w:ascii="Aptos" w:hAnsi="Aptos" w:eastAsia="Aptos" w:cs="Aptos"/>
-          <w:noProof w:val="0"/>
-          <w:sz w:val="22"/>
-          <w:szCs w:val="22"/>
-          <w:rtl w:val="1"/>
-          <w:lang w:val="en-US"/>
-        </w:rPr>
-        <w:t>הזיהוי</w:t>
-      </w:r>
-      <w:r>
-        <w:rPr>
-          <w:rFonts w:ascii="Aptos" w:hAnsi="Aptos" w:eastAsia="Aptos" w:cs="Aptos"/>
-          <w:noProof w:val="0"/>
-          <w:sz w:val="22"/>
-          <w:szCs w:val="22"/>
-          <w:rtl w:val="1"/>
-          <w:lang w:val="en-US"/>
-        </w:rPr>
-        <w:t xml:space="preserve">, </w:t>
-      </w:r>
-      <w:r>
-        <w:rPr>
-          <w:rFonts w:ascii="Aptos" w:hAnsi="Aptos" w:eastAsia="Aptos" w:cs="Aptos"/>
-          <w:noProof w:val="0"/>
-          <w:sz w:val="22"/>
-          <w:szCs w:val="22"/>
-          <w:rtl w:val="1"/>
-          <w:lang w:val="en-US"/>
-        </w:rPr>
-        <w:t>לצד</w:t>
-      </w:r>
-      <w:r>
-        <w:rPr>
-          <w:rFonts w:ascii="Aptos" w:hAnsi="Aptos" w:eastAsia="Aptos" w:cs="Aptos"/>
-          <w:noProof w:val="0"/>
-          <w:sz w:val="22"/>
-          <w:szCs w:val="22"/>
-          <w:rtl w:val="1"/>
-          <w:lang w:val="en-US"/>
-        </w:rPr>
-        <w:t xml:space="preserve"> </w:t>
-      </w:r>
-      <w:r>
-        <w:rPr>
-          <w:rFonts w:ascii="Aptos" w:hAnsi="Aptos" w:eastAsia="Aptos" w:cs="Aptos"/>
-          <w:noProof w:val="0"/>
-          <w:sz w:val="22"/>
-          <w:szCs w:val="22"/>
-          <w:rtl w:val="1"/>
-          <w:lang w:val="en-US"/>
-        </w:rPr>
-        <w:t>יכולת</w:t>
-      </w:r>
-      <w:r>
-        <w:rPr>
-          <w:rFonts w:ascii="Aptos" w:hAnsi="Aptos" w:eastAsia="Aptos" w:cs="Aptos"/>
-          <w:noProof w:val="0"/>
-          <w:sz w:val="22"/>
-          <w:szCs w:val="22"/>
-          <w:rtl w:val="1"/>
-          <w:lang w:val="en-US"/>
-        </w:rPr>
-        <w:t xml:space="preserve"> </w:t>
-      </w:r>
-      <w:r>
-        <w:rPr>
-          <w:rFonts w:ascii="Aptos" w:hAnsi="Aptos" w:eastAsia="Aptos" w:cs="Aptos"/>
-          <w:noProof w:val="0"/>
-          <w:sz w:val="22"/>
-          <w:szCs w:val="22"/>
-          <w:rtl w:val="1"/>
-          <w:lang w:val="en-US"/>
-        </w:rPr>
-        <w:t>הפקת</w:t>
-      </w:r>
-      <w:r>
-        <w:rPr>
-          <w:rFonts w:ascii="Aptos" w:hAnsi="Aptos" w:eastAsia="Aptos" w:cs="Aptos"/>
-          <w:noProof w:val="0"/>
-          <w:sz w:val="22"/>
-          <w:szCs w:val="22"/>
-          <w:rtl w:val="1"/>
-          <w:lang w:val="en-US"/>
-        </w:rPr>
-        <w:t xml:space="preserve"> </w:t>
-      </w:r>
-      <w:r>
-        <w:rPr>
-          <w:rFonts w:ascii="Aptos" w:hAnsi="Aptos" w:eastAsia="Aptos" w:cs="Aptos"/>
-          <w:noProof w:val="0"/>
-          <w:sz w:val="22"/>
-          <w:szCs w:val="22"/>
-          <w:rtl w:val="1"/>
-          <w:lang w:val="en-US"/>
-        </w:rPr>
-        <w:t>דוחות</w:t>
-      </w:r>
-      <w:r>
-        <w:rPr>
-          <w:rFonts w:ascii="Aptos" w:hAnsi="Aptos" w:eastAsia="Aptos" w:cs="Aptos"/>
-          <w:noProof w:val="0"/>
-          <w:sz w:val="22"/>
-          <w:szCs w:val="22"/>
-          <w:rtl w:val="1"/>
-          <w:lang w:val="en-US"/>
-        </w:rPr>
-        <w:t xml:space="preserve"> </w:t>
-      </w:r>
-      <w:r>
-        <w:rPr>
-          <w:rFonts w:ascii="Aptos" w:hAnsi="Aptos" w:eastAsia="Aptos" w:cs="Aptos"/>
-          <w:noProof w:val="0"/>
-          <w:sz w:val="22"/>
-          <w:szCs w:val="22"/>
-          <w:rtl w:val="1"/>
-          <w:lang w:val="en-US"/>
-        </w:rPr>
-        <w:t>סיכון</w:t>
-      </w:r>
-      <w:r>
-        <w:rPr>
-          <w:rFonts w:ascii="Aptos" w:hAnsi="Aptos" w:eastAsia="Aptos" w:cs="Aptos"/>
-          <w:noProof w:val="0"/>
-          <w:sz w:val="22"/>
-          <w:szCs w:val="22"/>
-          <w:rtl w:val="1"/>
-          <w:lang w:val="en-US"/>
-        </w:rPr>
-        <w:t xml:space="preserve"> </w:t>
-      </w:r>
-      <w:r>
-        <w:rPr>
-          <w:rFonts w:ascii="Aptos" w:hAnsi="Aptos" w:eastAsia="Aptos" w:cs="Aptos"/>
-          <w:noProof w:val="0"/>
-          <w:sz w:val="22"/>
-          <w:szCs w:val="22"/>
-          <w:rtl w:val="1"/>
-          <w:lang w:val="en-US"/>
-        </w:rPr>
-        <w:t>מרוכזים</w:t>
-      </w:r>
-      <w:r>
-        <w:rPr>
-          <w:rFonts w:ascii="Aptos" w:hAnsi="Aptos" w:eastAsia="Aptos" w:cs="Aptos"/>
-          <w:noProof w:val="0"/>
-          <w:sz w:val="22"/>
-          <w:szCs w:val="22"/>
-          <w:lang w:val="en-US"/>
-        </w:rPr>
-        <w:t>.</w:t>
-      </w:r>
-    </w:p>
-    <w:p>
-      <w:pPr>
-        <w:bidi w:val="0"/>
-        <w:spacing w:before="0" w:beforeAutospacing="off" w:after="0" w:afterAutospacing="off"/>
-        <w:jc w:val="center"/>
-      </w:pPr>
-      <w:r>
-        <w:rPr>
-          <w:rFonts w:ascii="Aptos" w:hAnsi="Aptos" w:eastAsia="Aptos" w:cs="Aptos"/>
-          <w:noProof w:val="0"/>
-          <w:sz w:val="22"/>
-          <w:szCs w:val="22"/>
-          <w:lang w:val="en-US"/>
-        </w:rPr>
-        <w:t>+2</w:t>
-      </w:r>
-    </w:p>
-    <w:p>
-      <w:pPr>
-        <w:pStyle w:val="Heading3"/>
-        <w:bidi w:val="0"/>
-        <w:spacing w:before="281" w:beforeAutospacing="off" w:after="281" w:afterAutospacing="off"/>
-        <w:jc w:val="center"/>
-      </w:pPr>
-      <w:r>
-        <w:rPr>
-          <w:rFonts w:ascii="Aptos" w:hAnsi="Aptos" w:eastAsia="Aptos" w:cs="Aptos"/>
-          <w:noProof w:val="0"/>
-          <w:sz w:val="22"/>
-          <w:szCs w:val="22"/>
-          <w:rtl w:val="1"/>
-          <w:lang w:val="en-US"/>
-        </w:rPr>
-        <w:t>תרומת</w:t>
-      </w:r>
-      <w:r>
-        <w:rPr>
-          <w:rFonts w:ascii="Aptos" w:hAnsi="Aptos" w:eastAsia="Aptos" w:cs="Aptos"/>
-          <w:noProof w:val="0"/>
-          <w:sz w:val="22"/>
-          <w:szCs w:val="22"/>
-          <w:rtl w:val="1"/>
-          <w:lang w:val="en-US"/>
-        </w:rPr>
-        <w:t xml:space="preserve"> </w:t>
-      </w:r>
-      <w:r>
-        <w:rPr>
-          <w:rFonts w:ascii="Aptos" w:hAnsi="Aptos" w:eastAsia="Aptos" w:cs="Aptos"/>
-          <w:noProof w:val="0"/>
-          <w:sz w:val="22"/>
-          <w:szCs w:val="22"/>
-          <w:rtl w:val="1"/>
-          <w:lang w:val="en-US"/>
-        </w:rPr>
-        <w:t>המערכת</w:t>
-      </w:r>
-      <w:r>
-        <w:rPr>
-          <w:rFonts w:ascii="Aptos" w:hAnsi="Aptos" w:eastAsia="Aptos" w:cs="Aptos"/>
-          <w:noProof w:val="0"/>
-          <w:sz w:val="22"/>
-          <w:szCs w:val="22"/>
-          <w:rtl w:val="1"/>
-          <w:lang w:val="en-US"/>
-        </w:rPr>
-        <w:t xml:space="preserve"> </w:t>
-      </w:r>
-      <w:r>
-        <w:rPr>
-          <w:rFonts w:ascii="Aptos" w:hAnsi="Aptos" w:eastAsia="Aptos" w:cs="Aptos"/>
-          <w:noProof w:val="0"/>
-          <w:sz w:val="22"/>
-          <w:szCs w:val="22"/>
-          <w:rtl w:val="1"/>
-          <w:lang w:val="en-US"/>
-        </w:rPr>
-        <w:t>לארגון</w:t>
-      </w:r>
-      <w:r>
-        <w:rPr>
-          <w:rFonts w:ascii="Aptos" w:hAnsi="Aptos" w:eastAsia="Aptos" w:cs="Aptos"/>
-          <w:noProof w:val="0"/>
-          <w:sz w:val="22"/>
-          <w:szCs w:val="22"/>
-          <w:lang w:val="en-US"/>
-        </w:rPr>
-        <w:t>:</w:t>
-      </w:r>
-    </w:p>
-    <w:p>
-      <w:pPr>
-        <w:bidi w:val="0"/>
-        <w:spacing w:before="240" w:beforeAutospacing="off" w:after="240" w:afterAutospacing="off"/>
-        <w:jc w:val="center"/>
-      </w:pPr>
-      <w:r>
-        <w:rPr>
-          <w:rFonts w:ascii="Aptos" w:hAnsi="Aptos" w:eastAsia="Aptos" w:cs="Aptos"/>
-          <w:noProof w:val="0"/>
-          <w:sz w:val="22"/>
-          <w:szCs w:val="22"/>
-          <w:rtl w:val="1"/>
-          <w:lang w:val="en-US"/>
-        </w:rPr>
-        <w:t>הטמעת</w:t>
-      </w:r>
-      <w:r>
-        <w:rPr>
-          <w:rFonts w:ascii="Aptos" w:hAnsi="Aptos" w:eastAsia="Aptos" w:cs="Aptos"/>
-          <w:noProof w:val="0"/>
-          <w:sz w:val="22"/>
-          <w:szCs w:val="22"/>
-          <w:rtl w:val="1"/>
-          <w:lang w:val="en-US"/>
-        </w:rPr>
-        <w:t xml:space="preserve"> </w:t>
-      </w:r>
-      <w:r>
-        <w:rPr>
-          <w:rFonts w:ascii="Aptos" w:hAnsi="Aptos" w:eastAsia="Aptos" w:cs="Aptos"/>
-          <w:noProof w:val="0"/>
-          <w:sz w:val="22"/>
-          <w:szCs w:val="22"/>
-          <w:rtl w:val="1"/>
-          <w:lang w:val="en-US"/>
-        </w:rPr>
-        <w:t>המערכת</w:t>
-      </w:r>
-      <w:r>
-        <w:rPr>
-          <w:rFonts w:ascii="Aptos" w:hAnsi="Aptos" w:eastAsia="Aptos" w:cs="Aptos"/>
-          <w:noProof w:val="0"/>
-          <w:sz w:val="22"/>
-          <w:szCs w:val="22"/>
-          <w:rtl w:val="1"/>
-          <w:lang w:val="en-US"/>
-        </w:rPr>
-        <w:t xml:space="preserve"> </w:t>
-      </w:r>
-      <w:r>
-        <w:rPr>
-          <w:rFonts w:ascii="Aptos" w:hAnsi="Aptos" w:eastAsia="Aptos" w:cs="Aptos"/>
-          <w:noProof w:val="0"/>
-          <w:sz w:val="22"/>
-          <w:szCs w:val="22"/>
-          <w:rtl w:val="1"/>
-          <w:lang w:val="en-US"/>
-        </w:rPr>
-        <w:t>צפויה</w:t>
-      </w:r>
-      <w:r>
-        <w:rPr>
-          <w:rFonts w:ascii="Aptos" w:hAnsi="Aptos" w:eastAsia="Aptos" w:cs="Aptos"/>
-          <w:noProof w:val="0"/>
-          <w:sz w:val="22"/>
-          <w:szCs w:val="22"/>
-          <w:rtl w:val="1"/>
-          <w:lang w:val="en-US"/>
-        </w:rPr>
-        <w:t xml:space="preserve"> </w:t>
-      </w:r>
-      <w:r>
-        <w:rPr>
-          <w:rFonts w:ascii="Aptos" w:hAnsi="Aptos" w:eastAsia="Aptos" w:cs="Aptos"/>
-          <w:noProof w:val="0"/>
-          <w:sz w:val="22"/>
-          <w:szCs w:val="22"/>
-          <w:rtl w:val="1"/>
-          <w:lang w:val="en-US"/>
-        </w:rPr>
-        <w:t>לשפר</w:t>
-      </w:r>
-      <w:r>
-        <w:rPr>
-          <w:rFonts w:ascii="Aptos" w:hAnsi="Aptos" w:eastAsia="Aptos" w:cs="Aptos"/>
-          <w:noProof w:val="0"/>
-          <w:sz w:val="22"/>
-          <w:szCs w:val="22"/>
-          <w:rtl w:val="1"/>
-          <w:lang w:val="en-US"/>
-        </w:rPr>
-        <w:t xml:space="preserve"> </w:t>
-      </w:r>
-      <w:r>
-        <w:rPr>
-          <w:rFonts w:ascii="Aptos" w:hAnsi="Aptos" w:eastAsia="Aptos" w:cs="Aptos"/>
-          <w:noProof w:val="0"/>
-          <w:sz w:val="22"/>
-          <w:szCs w:val="22"/>
-          <w:rtl w:val="1"/>
-          <w:lang w:val="en-US"/>
-        </w:rPr>
-        <w:t>משמעותית</w:t>
-      </w:r>
-      <w:r>
-        <w:rPr>
-          <w:rFonts w:ascii="Aptos" w:hAnsi="Aptos" w:eastAsia="Aptos" w:cs="Aptos"/>
-          <w:noProof w:val="0"/>
-          <w:sz w:val="22"/>
-          <w:szCs w:val="22"/>
-          <w:rtl w:val="1"/>
-          <w:lang w:val="en-US"/>
-        </w:rPr>
-        <w:t xml:space="preserve"> </w:t>
-      </w:r>
-      <w:r>
-        <w:rPr>
-          <w:rFonts w:ascii="Aptos" w:hAnsi="Aptos" w:eastAsia="Aptos" w:cs="Aptos"/>
-          <w:noProof w:val="0"/>
-          <w:sz w:val="22"/>
-          <w:szCs w:val="22"/>
-          <w:rtl w:val="1"/>
-          <w:lang w:val="en-US"/>
-        </w:rPr>
-        <w:t>את</w:t>
-      </w:r>
-      <w:r>
-        <w:rPr>
-          <w:rFonts w:ascii="Aptos" w:hAnsi="Aptos" w:eastAsia="Aptos" w:cs="Aptos"/>
-          <w:noProof w:val="0"/>
-          <w:sz w:val="22"/>
-          <w:szCs w:val="22"/>
-          <w:rtl w:val="1"/>
-          <w:lang w:val="en-US"/>
-        </w:rPr>
-        <w:t xml:space="preserve"> </w:t>
-      </w:r>
-      <w:r>
-        <w:rPr>
-          <w:rFonts w:ascii="Aptos" w:hAnsi="Aptos" w:eastAsia="Aptos" w:cs="Aptos"/>
-          <w:noProof w:val="0"/>
-          <w:sz w:val="22"/>
-          <w:szCs w:val="22"/>
-          <w:rtl w:val="1"/>
-          <w:lang w:val="en-US"/>
-        </w:rPr>
-        <w:t>רמת</w:t>
-      </w:r>
-      <w:r>
-        <w:rPr>
-          <w:rFonts w:ascii="Aptos" w:hAnsi="Aptos" w:eastAsia="Aptos" w:cs="Aptos"/>
-          <w:noProof w:val="0"/>
-          <w:sz w:val="22"/>
-          <w:szCs w:val="22"/>
-          <w:rtl w:val="1"/>
-          <w:lang w:val="en-US"/>
-        </w:rPr>
-        <w:t xml:space="preserve"> </w:t>
-      </w:r>
-      <w:r>
-        <w:rPr>
-          <w:rFonts w:ascii="Aptos" w:hAnsi="Aptos" w:eastAsia="Aptos" w:cs="Aptos"/>
-          <w:noProof w:val="0"/>
-          <w:sz w:val="22"/>
-          <w:szCs w:val="22"/>
-          <w:rtl w:val="1"/>
-          <w:lang w:val="en-US"/>
-        </w:rPr>
-        <w:t>האבטחה</w:t>
-      </w:r>
-      <w:r>
-        <w:rPr>
-          <w:rFonts w:ascii="Aptos" w:hAnsi="Aptos" w:eastAsia="Aptos" w:cs="Aptos"/>
-          <w:noProof w:val="0"/>
-          <w:sz w:val="22"/>
-          <w:szCs w:val="22"/>
-          <w:rtl w:val="1"/>
-          <w:lang w:val="en-US"/>
-        </w:rPr>
-        <w:t xml:space="preserve"> </w:t>
-      </w:r>
-      <w:r>
-        <w:rPr>
-          <w:rFonts w:ascii="Aptos" w:hAnsi="Aptos" w:eastAsia="Aptos" w:cs="Aptos"/>
-          <w:noProof w:val="0"/>
-          <w:sz w:val="22"/>
-          <w:szCs w:val="22"/>
-          <w:rtl w:val="1"/>
-          <w:lang w:val="en-US"/>
-        </w:rPr>
-        <w:t>הכוללת</w:t>
-      </w:r>
-      <w:r>
-        <w:rPr>
-          <w:rFonts w:ascii="Aptos" w:hAnsi="Aptos" w:eastAsia="Aptos" w:cs="Aptos"/>
-          <w:noProof w:val="0"/>
-          <w:sz w:val="22"/>
-          <w:szCs w:val="22"/>
-          <w:rtl w:val="1"/>
-          <w:lang w:val="en-US"/>
-        </w:rPr>
-        <w:t xml:space="preserve"> </w:t>
-      </w:r>
-      <w:r>
-        <w:rPr>
-          <w:rFonts w:ascii="Aptos" w:hAnsi="Aptos" w:eastAsia="Aptos" w:cs="Aptos"/>
-          <w:noProof w:val="0"/>
-          <w:sz w:val="22"/>
-          <w:szCs w:val="22"/>
-          <w:rtl w:val="1"/>
-          <w:lang w:val="en-US"/>
-        </w:rPr>
-        <w:t>בארגון</w:t>
-      </w:r>
-      <w:r>
-        <w:rPr>
-          <w:rFonts w:ascii="Aptos" w:hAnsi="Aptos" w:eastAsia="Aptos" w:cs="Aptos"/>
-          <w:noProof w:val="0"/>
-          <w:sz w:val="22"/>
-          <w:szCs w:val="22"/>
-          <w:rtl w:val="1"/>
-          <w:lang w:val="en-US"/>
-        </w:rPr>
-        <w:t xml:space="preserve">, </w:t>
-      </w:r>
-      <w:r>
-        <w:rPr>
-          <w:rFonts w:ascii="Aptos" w:hAnsi="Aptos" w:eastAsia="Aptos" w:cs="Aptos"/>
-          <w:noProof w:val="0"/>
-          <w:sz w:val="22"/>
-          <w:szCs w:val="22"/>
-          <w:rtl w:val="1"/>
-          <w:lang w:val="en-US"/>
-        </w:rPr>
-        <w:t>להקטין</w:t>
-      </w:r>
-      <w:r>
-        <w:rPr>
-          <w:rFonts w:ascii="Aptos" w:hAnsi="Aptos" w:eastAsia="Aptos" w:cs="Aptos"/>
-          <w:noProof w:val="0"/>
-          <w:sz w:val="22"/>
-          <w:szCs w:val="22"/>
-          <w:rtl w:val="1"/>
-          <w:lang w:val="en-US"/>
-        </w:rPr>
-        <w:t xml:space="preserve"> </w:t>
-      </w:r>
-      <w:r>
-        <w:rPr>
-          <w:rFonts w:ascii="Aptos" w:hAnsi="Aptos" w:eastAsia="Aptos" w:cs="Aptos"/>
-          <w:noProof w:val="0"/>
-          <w:sz w:val="22"/>
-          <w:szCs w:val="22"/>
-          <w:rtl w:val="1"/>
-          <w:lang w:val="en-US"/>
-        </w:rPr>
-        <w:t>את</w:t>
-      </w:r>
-      <w:r>
-        <w:rPr>
-          <w:rFonts w:ascii="Aptos" w:hAnsi="Aptos" w:eastAsia="Aptos" w:cs="Aptos"/>
-          <w:noProof w:val="0"/>
-          <w:sz w:val="22"/>
-          <w:szCs w:val="22"/>
-          <w:rtl w:val="1"/>
-          <w:lang w:val="en-US"/>
-        </w:rPr>
-        <w:t xml:space="preserve"> </w:t>
-      </w:r>
-      <w:r>
-        <w:rPr>
-          <w:rFonts w:ascii="Aptos" w:hAnsi="Aptos" w:eastAsia="Aptos" w:cs="Aptos"/>
-          <w:noProof w:val="0"/>
-          <w:sz w:val="22"/>
-          <w:szCs w:val="22"/>
-          <w:rtl w:val="1"/>
-          <w:lang w:val="en-US"/>
-        </w:rPr>
-        <w:t>זמן</w:t>
-      </w:r>
-      <w:r>
-        <w:rPr>
-          <w:rFonts w:ascii="Aptos" w:hAnsi="Aptos" w:eastAsia="Aptos" w:cs="Aptos"/>
-          <w:noProof w:val="0"/>
-          <w:sz w:val="22"/>
-          <w:szCs w:val="22"/>
-          <w:rtl w:val="1"/>
-          <w:lang w:val="en-US"/>
-        </w:rPr>
-        <w:t xml:space="preserve"> </w:t>
-      </w:r>
-      <w:r>
-        <w:rPr>
-          <w:rFonts w:ascii="Aptos" w:hAnsi="Aptos" w:eastAsia="Aptos" w:cs="Aptos"/>
-          <w:noProof w:val="0"/>
-          <w:sz w:val="22"/>
-          <w:szCs w:val="22"/>
-          <w:rtl w:val="1"/>
-          <w:lang w:val="en-US"/>
-        </w:rPr>
-        <w:t>התגובה</w:t>
-      </w:r>
-      <w:r>
-        <w:rPr>
-          <w:rFonts w:ascii="Aptos" w:hAnsi="Aptos" w:eastAsia="Aptos" w:cs="Aptos"/>
-          <w:noProof w:val="0"/>
-          <w:sz w:val="22"/>
-          <w:szCs w:val="22"/>
-          <w:rtl w:val="1"/>
-          <w:lang w:val="en-US"/>
-        </w:rPr>
-        <w:t xml:space="preserve"> </w:t>
-      </w:r>
-      <w:r>
-        <w:rPr>
-          <w:rFonts w:ascii="Aptos" w:hAnsi="Aptos" w:eastAsia="Aptos" w:cs="Aptos"/>
-          <w:noProof w:val="0"/>
-          <w:sz w:val="22"/>
-          <w:szCs w:val="22"/>
-          <w:rtl w:val="1"/>
-          <w:lang w:val="en-US"/>
-        </w:rPr>
-        <w:t>לאירועי</w:t>
-      </w:r>
-      <w:r>
-        <w:rPr>
-          <w:rFonts w:ascii="Aptos" w:hAnsi="Aptos" w:eastAsia="Aptos" w:cs="Aptos"/>
-          <w:noProof w:val="0"/>
-          <w:sz w:val="22"/>
-          <w:szCs w:val="22"/>
-          <w:rtl w:val="1"/>
-          <w:lang w:val="en-US"/>
-        </w:rPr>
-        <w:t xml:space="preserve"> </w:t>
-      </w:r>
-      <w:r>
-        <w:rPr>
-          <w:rFonts w:ascii="Aptos" w:hAnsi="Aptos" w:eastAsia="Aptos" w:cs="Aptos"/>
-          <w:noProof w:val="0"/>
-          <w:sz w:val="22"/>
-          <w:szCs w:val="22"/>
-          <w:rtl w:val="1"/>
-          <w:lang w:val="en-US"/>
-        </w:rPr>
-        <w:t>סייבר</w:t>
-      </w:r>
-      <w:r>
-        <w:rPr>
-          <w:rFonts w:ascii="Aptos" w:hAnsi="Aptos" w:eastAsia="Aptos" w:cs="Aptos"/>
-          <w:noProof w:val="0"/>
-          <w:sz w:val="22"/>
-          <w:szCs w:val="22"/>
-          <w:rtl w:val="1"/>
-          <w:lang w:val="en-US"/>
-        </w:rPr>
-        <w:t xml:space="preserve"> </w:t>
-      </w:r>
-      <w:r>
-        <w:rPr>
-          <w:rFonts w:ascii="Aptos" w:hAnsi="Aptos" w:eastAsia="Aptos" w:cs="Aptos"/>
-          <w:noProof w:val="0"/>
-          <w:sz w:val="22"/>
-          <w:szCs w:val="22"/>
-          <w:rtl w:val="1"/>
-          <w:lang w:val="en-US"/>
-        </w:rPr>
-        <w:t>ולספק</w:t>
-      </w:r>
-      <w:r>
-        <w:rPr>
-          <w:rFonts w:ascii="Aptos" w:hAnsi="Aptos" w:eastAsia="Aptos" w:cs="Aptos"/>
-          <w:noProof w:val="0"/>
-          <w:sz w:val="22"/>
-          <w:szCs w:val="22"/>
-          <w:rtl w:val="1"/>
-          <w:lang w:val="en-US"/>
-        </w:rPr>
-        <w:t xml:space="preserve"> </w:t>
-      </w:r>
-      <w:r>
-        <w:rPr>
-          <w:rFonts w:ascii="Aptos" w:hAnsi="Aptos" w:eastAsia="Aptos" w:cs="Aptos"/>
-          <w:noProof w:val="0"/>
-          <w:sz w:val="22"/>
-          <w:szCs w:val="22"/>
-          <w:rtl w:val="1"/>
-          <w:lang w:val="en-US"/>
-        </w:rPr>
-        <w:t>כלי</w:t>
-      </w:r>
-      <w:r>
-        <w:rPr>
-          <w:rFonts w:ascii="Aptos" w:hAnsi="Aptos" w:eastAsia="Aptos" w:cs="Aptos"/>
-          <w:noProof w:val="0"/>
-          <w:sz w:val="22"/>
-          <w:szCs w:val="22"/>
-          <w:rtl w:val="1"/>
-          <w:lang w:val="en-US"/>
-        </w:rPr>
-        <w:t xml:space="preserve"> </w:t>
-      </w:r>
-      <w:r>
-        <w:rPr>
-          <w:rFonts w:ascii="Aptos" w:hAnsi="Aptos" w:eastAsia="Aptos" w:cs="Aptos"/>
-          <w:noProof w:val="0"/>
-          <w:sz w:val="22"/>
-          <w:szCs w:val="22"/>
-          <w:rtl w:val="1"/>
-          <w:lang w:val="en-US"/>
-        </w:rPr>
-        <w:t>עבודה</w:t>
-      </w:r>
-      <w:r>
-        <w:rPr>
-          <w:rFonts w:ascii="Aptos" w:hAnsi="Aptos" w:eastAsia="Aptos" w:cs="Aptos"/>
-          <w:noProof w:val="0"/>
-          <w:sz w:val="22"/>
-          <w:szCs w:val="22"/>
-          <w:rtl w:val="1"/>
-          <w:lang w:val="en-US"/>
-        </w:rPr>
-        <w:t xml:space="preserve"> </w:t>
-      </w:r>
-      <w:r>
-        <w:rPr>
-          <w:rFonts w:ascii="Aptos" w:hAnsi="Aptos" w:eastAsia="Aptos" w:cs="Aptos"/>
-          <w:noProof w:val="0"/>
-          <w:sz w:val="22"/>
-          <w:szCs w:val="22"/>
-          <w:rtl w:val="1"/>
-          <w:lang w:val="en-US"/>
-        </w:rPr>
-        <w:t>חיוני</w:t>
-      </w:r>
-      <w:r>
-        <w:rPr>
-          <w:rFonts w:ascii="Aptos" w:hAnsi="Aptos" w:eastAsia="Aptos" w:cs="Aptos"/>
-          <w:noProof w:val="0"/>
-          <w:sz w:val="22"/>
-          <w:szCs w:val="22"/>
-          <w:rtl w:val="1"/>
-          <w:lang w:val="en-US"/>
-        </w:rPr>
-        <w:t xml:space="preserve"> </w:t>
-      </w:r>
-      <w:r>
-        <w:rPr>
-          <w:rFonts w:ascii="Aptos" w:hAnsi="Aptos" w:eastAsia="Aptos" w:cs="Aptos"/>
-          <w:noProof w:val="0"/>
-          <w:sz w:val="22"/>
-          <w:szCs w:val="22"/>
-          <w:rtl w:val="1"/>
-          <w:lang w:val="en-US"/>
-        </w:rPr>
-        <w:t>לצוות</w:t>
-      </w:r>
-      <w:r>
-        <w:rPr>
-          <w:rFonts w:ascii="Aptos" w:hAnsi="Aptos" w:eastAsia="Aptos" w:cs="Aptos"/>
-          <w:noProof w:val="0"/>
-          <w:sz w:val="22"/>
-          <w:szCs w:val="22"/>
-          <w:rtl w:val="1"/>
-          <w:lang w:val="en-US"/>
-        </w:rPr>
-        <w:t xml:space="preserve"> ה</w:t>
-      </w:r>
-      <w:r>
-        <w:rPr>
-          <w:rFonts w:ascii="Aptos" w:hAnsi="Aptos" w:eastAsia="Aptos" w:cs="Aptos"/>
-          <w:noProof w:val="0"/>
-          <w:sz w:val="22"/>
-          <w:szCs w:val="22"/>
-          <w:lang w:val="en-US"/>
-        </w:rPr>
-        <w:t xml:space="preserve">-IT </w:t>
-      </w:r>
-      <w:r>
-        <w:rPr>
-          <w:rFonts w:ascii="Aptos" w:hAnsi="Aptos" w:eastAsia="Aptos" w:cs="Aptos"/>
-          <w:noProof w:val="0"/>
-          <w:sz w:val="22"/>
-          <w:szCs w:val="22"/>
-          <w:rtl w:val="1"/>
-          <w:lang w:val="en-US"/>
-        </w:rPr>
-        <w:t>בקבלת</w:t>
-      </w:r>
-      <w:r>
-        <w:rPr>
-          <w:rFonts w:ascii="Aptos" w:hAnsi="Aptos" w:eastAsia="Aptos" w:cs="Aptos"/>
-          <w:noProof w:val="0"/>
-          <w:sz w:val="22"/>
-          <w:szCs w:val="22"/>
-          <w:rtl w:val="1"/>
-          <w:lang w:val="en-US"/>
-        </w:rPr>
-        <w:t xml:space="preserve"> </w:t>
-      </w:r>
-      <w:r>
-        <w:rPr>
-          <w:rFonts w:ascii="Aptos" w:hAnsi="Aptos" w:eastAsia="Aptos" w:cs="Aptos"/>
-          <w:noProof w:val="0"/>
-          <w:sz w:val="22"/>
-          <w:szCs w:val="22"/>
-          <w:rtl w:val="1"/>
-          <w:lang w:val="en-US"/>
-        </w:rPr>
-        <w:t>החלטות</w:t>
-      </w:r>
-      <w:r>
-        <w:rPr>
-          <w:rFonts w:ascii="Aptos" w:hAnsi="Aptos" w:eastAsia="Aptos" w:cs="Aptos"/>
-          <w:noProof w:val="0"/>
-          <w:sz w:val="22"/>
-          <w:szCs w:val="22"/>
-          <w:rtl w:val="1"/>
-          <w:lang w:val="en-US"/>
-        </w:rPr>
-        <w:t xml:space="preserve"> </w:t>
-      </w:r>
-      <w:r>
-        <w:rPr>
-          <w:rFonts w:ascii="Aptos" w:hAnsi="Aptos" w:eastAsia="Aptos" w:cs="Aptos"/>
-          <w:noProof w:val="0"/>
-          <w:sz w:val="22"/>
-          <w:szCs w:val="22"/>
-          <w:rtl w:val="1"/>
-          <w:lang w:val="en-US"/>
-        </w:rPr>
-        <w:t>מבוססות</w:t>
-      </w:r>
-      <w:r>
-        <w:rPr>
-          <w:rFonts w:ascii="Aptos" w:hAnsi="Aptos" w:eastAsia="Aptos" w:cs="Aptos"/>
-          <w:noProof w:val="0"/>
-          <w:sz w:val="22"/>
-          <w:szCs w:val="22"/>
-          <w:rtl w:val="1"/>
-          <w:lang w:val="en-US"/>
-        </w:rPr>
-        <w:t xml:space="preserve"> </w:t>
-      </w:r>
-      <w:r>
-        <w:rPr>
-          <w:rFonts w:ascii="Aptos" w:hAnsi="Aptos" w:eastAsia="Aptos" w:cs="Aptos"/>
-          <w:noProof w:val="0"/>
-          <w:sz w:val="22"/>
-          <w:szCs w:val="22"/>
-          <w:rtl w:val="1"/>
-          <w:lang w:val="en-US"/>
-        </w:rPr>
-        <w:t>נתונים</w:t>
-      </w:r>
-      <w:r>
-        <w:rPr>
-          <w:rFonts w:ascii="Aptos" w:hAnsi="Aptos" w:eastAsia="Aptos" w:cs="Aptos"/>
-          <w:noProof w:val="0"/>
-          <w:sz w:val="22"/>
-          <w:szCs w:val="22"/>
-          <w:rtl w:val="1"/>
-          <w:lang w:val="en-US"/>
-        </w:rPr>
-        <w:t xml:space="preserve">. </w:t>
-      </w:r>
-      <w:r>
-        <w:rPr>
-          <w:rFonts w:ascii="Aptos" w:hAnsi="Aptos" w:eastAsia="Aptos" w:cs="Aptos"/>
-          <w:noProof w:val="0"/>
-          <w:sz w:val="22"/>
-          <w:szCs w:val="22"/>
-          <w:rtl w:val="1"/>
-          <w:lang w:val="en-US"/>
-        </w:rPr>
-        <w:t>התשתית</w:t>
-      </w:r>
-      <w:r>
-        <w:rPr>
-          <w:rFonts w:ascii="Aptos" w:hAnsi="Aptos" w:eastAsia="Aptos" w:cs="Aptos"/>
-          <w:noProof w:val="0"/>
-          <w:sz w:val="22"/>
-          <w:szCs w:val="22"/>
-          <w:rtl w:val="1"/>
-          <w:lang w:val="en-US"/>
-        </w:rPr>
-        <w:t xml:space="preserve"> </w:t>
-      </w:r>
-      <w:r>
-        <w:rPr>
-          <w:rFonts w:ascii="Aptos" w:hAnsi="Aptos" w:eastAsia="Aptos" w:cs="Aptos"/>
-          <w:noProof w:val="0"/>
-          <w:sz w:val="22"/>
-          <w:szCs w:val="22"/>
-          <w:rtl w:val="1"/>
-          <w:lang w:val="en-US"/>
-        </w:rPr>
-        <w:t>שנבנתה</w:t>
-      </w:r>
-      <w:r>
-        <w:rPr>
-          <w:rFonts w:ascii="Aptos" w:hAnsi="Aptos" w:eastAsia="Aptos" w:cs="Aptos"/>
-          <w:noProof w:val="0"/>
-          <w:sz w:val="22"/>
-          <w:szCs w:val="22"/>
-          <w:rtl w:val="1"/>
-          <w:lang w:val="en-US"/>
-        </w:rPr>
-        <w:t xml:space="preserve"> </w:t>
-      </w:r>
-      <w:r>
-        <w:rPr>
-          <w:rFonts w:ascii="Aptos" w:hAnsi="Aptos" w:eastAsia="Aptos" w:cs="Aptos"/>
-          <w:noProof w:val="0"/>
-          <w:sz w:val="22"/>
-          <w:szCs w:val="22"/>
-          <w:rtl w:val="1"/>
-          <w:lang w:val="en-US"/>
-        </w:rPr>
-        <w:t>במסמך</w:t>
-      </w:r>
-      <w:r>
-        <w:rPr>
-          <w:rFonts w:ascii="Aptos" w:hAnsi="Aptos" w:eastAsia="Aptos" w:cs="Aptos"/>
-          <w:noProof w:val="0"/>
-          <w:sz w:val="22"/>
-          <w:szCs w:val="22"/>
-          <w:rtl w:val="1"/>
-          <w:lang w:val="en-US"/>
-        </w:rPr>
-        <w:t xml:space="preserve"> </w:t>
-      </w:r>
-      <w:r>
-        <w:rPr>
-          <w:rFonts w:ascii="Aptos" w:hAnsi="Aptos" w:eastAsia="Aptos" w:cs="Aptos"/>
-          <w:noProof w:val="0"/>
-          <w:sz w:val="22"/>
-          <w:szCs w:val="22"/>
-          <w:rtl w:val="1"/>
-          <w:lang w:val="en-US"/>
-        </w:rPr>
-        <w:t>זה</w:t>
-      </w:r>
-      <w:r>
-        <w:rPr>
-          <w:rFonts w:ascii="Aptos" w:hAnsi="Aptos" w:eastAsia="Aptos" w:cs="Aptos"/>
-          <w:noProof w:val="0"/>
-          <w:sz w:val="22"/>
-          <w:szCs w:val="22"/>
-          <w:rtl w:val="1"/>
-          <w:lang w:val="en-US"/>
-        </w:rPr>
-        <w:t xml:space="preserve">, </w:t>
-      </w:r>
-      <w:r>
-        <w:rPr>
-          <w:rFonts w:ascii="Aptos" w:hAnsi="Aptos" w:eastAsia="Aptos" w:cs="Aptos"/>
-          <w:noProof w:val="0"/>
-          <w:sz w:val="22"/>
-          <w:szCs w:val="22"/>
-          <w:rtl w:val="1"/>
-          <w:lang w:val="en-US"/>
-        </w:rPr>
-        <w:t>הכוללת</w:t>
-      </w:r>
-      <w:r>
-        <w:rPr>
-          <w:rFonts w:ascii="Aptos" w:hAnsi="Aptos" w:eastAsia="Aptos" w:cs="Aptos"/>
-          <w:noProof w:val="0"/>
-          <w:sz w:val="22"/>
-          <w:szCs w:val="22"/>
-          <w:rtl w:val="1"/>
-          <w:lang w:val="en-US"/>
-        </w:rPr>
-        <w:t xml:space="preserve"> </w:t>
-      </w:r>
-      <w:r>
-        <w:rPr>
-          <w:rFonts w:ascii="Aptos" w:hAnsi="Aptos" w:eastAsia="Aptos" w:cs="Aptos"/>
-          <w:noProof w:val="0"/>
-          <w:sz w:val="22"/>
-          <w:szCs w:val="22"/>
-          <w:rtl w:val="1"/>
-          <w:lang w:val="en-US"/>
-        </w:rPr>
-        <w:t>את</w:t>
-      </w:r>
-      <w:r>
-        <w:rPr>
-          <w:rFonts w:ascii="Aptos" w:hAnsi="Aptos" w:eastAsia="Aptos" w:cs="Aptos"/>
-          <w:noProof w:val="0"/>
-          <w:sz w:val="22"/>
-          <w:szCs w:val="22"/>
-          <w:rtl w:val="1"/>
-          <w:lang w:val="en-US"/>
-        </w:rPr>
-        <w:t xml:space="preserve"> </w:t>
-      </w:r>
-      <w:r>
-        <w:rPr>
-          <w:rFonts w:ascii="Aptos" w:hAnsi="Aptos" w:eastAsia="Aptos" w:cs="Aptos"/>
-          <w:noProof w:val="0"/>
-          <w:sz w:val="22"/>
-          <w:szCs w:val="22"/>
-          <w:rtl w:val="1"/>
-          <w:lang w:val="en-US"/>
-        </w:rPr>
-        <w:t>תרשימי</w:t>
-      </w:r>
-      <w:r>
-        <w:rPr>
-          <w:rFonts w:ascii="Aptos" w:hAnsi="Aptos" w:eastAsia="Aptos" w:cs="Aptos"/>
-          <w:noProof w:val="0"/>
-          <w:sz w:val="22"/>
-          <w:szCs w:val="22"/>
-          <w:rtl w:val="1"/>
-          <w:lang w:val="en-US"/>
-        </w:rPr>
-        <w:t xml:space="preserve"> ה</w:t>
-      </w:r>
-      <w:r>
-        <w:rPr>
-          <w:rFonts w:ascii="Aptos" w:hAnsi="Aptos" w:eastAsia="Aptos" w:cs="Aptos"/>
-          <w:noProof w:val="0"/>
-          <w:sz w:val="22"/>
-          <w:szCs w:val="22"/>
-          <w:lang w:val="en-US"/>
-        </w:rPr>
-        <w:t xml:space="preserve">-DFD </w:t>
-      </w:r>
-      <w:r>
-        <w:rPr>
-          <w:rFonts w:ascii="Aptos" w:hAnsi="Aptos" w:eastAsia="Aptos" w:cs="Aptos"/>
-          <w:noProof w:val="0"/>
-          <w:sz w:val="22"/>
-          <w:szCs w:val="22"/>
-          <w:rtl w:val="1"/>
-          <w:lang w:val="en-US"/>
-        </w:rPr>
-        <w:t>וה</w:t>
-      </w:r>
-      <w:r>
-        <w:rPr>
-          <w:rFonts w:ascii="Aptos" w:hAnsi="Aptos" w:eastAsia="Aptos" w:cs="Aptos"/>
-          <w:noProof w:val="0"/>
-          <w:sz w:val="22"/>
-          <w:szCs w:val="22"/>
-          <w:lang w:val="en-US"/>
-        </w:rPr>
-        <w:t xml:space="preserve">-UML, </w:t>
-      </w:r>
-      <w:r>
-        <w:rPr>
-          <w:rFonts w:ascii="Aptos" w:hAnsi="Aptos" w:eastAsia="Aptos" w:cs="Aptos"/>
-          <w:noProof w:val="0"/>
-          <w:sz w:val="22"/>
-          <w:szCs w:val="22"/>
-          <w:rtl w:val="1"/>
-          <w:lang w:val="en-US"/>
-        </w:rPr>
-        <w:t>מהווה</w:t>
-      </w:r>
-      <w:r>
-        <w:rPr>
-          <w:rFonts w:ascii="Aptos" w:hAnsi="Aptos" w:eastAsia="Aptos" w:cs="Aptos"/>
-          <w:noProof w:val="0"/>
-          <w:sz w:val="22"/>
-          <w:szCs w:val="22"/>
-          <w:rtl w:val="1"/>
-          <w:lang w:val="en-US"/>
-        </w:rPr>
-        <w:t xml:space="preserve"> </w:t>
-      </w:r>
-      <w:r>
-        <w:rPr>
-          <w:rFonts w:ascii="Aptos" w:hAnsi="Aptos" w:eastAsia="Aptos" w:cs="Aptos"/>
-          <w:noProof w:val="0"/>
-          <w:sz w:val="22"/>
-          <w:szCs w:val="22"/>
-          <w:rtl w:val="1"/>
-          <w:lang w:val="en-US"/>
-        </w:rPr>
-        <w:t>בסיס</w:t>
-      </w:r>
-      <w:r>
-        <w:rPr>
-          <w:rFonts w:ascii="Aptos" w:hAnsi="Aptos" w:eastAsia="Aptos" w:cs="Aptos"/>
-          <w:noProof w:val="0"/>
-          <w:sz w:val="22"/>
-          <w:szCs w:val="22"/>
-          <w:rtl w:val="1"/>
-          <w:lang w:val="en-US"/>
-        </w:rPr>
-        <w:t xml:space="preserve"> </w:t>
-      </w:r>
-      <w:r>
-        <w:rPr>
-          <w:rFonts w:ascii="Aptos" w:hAnsi="Aptos" w:eastAsia="Aptos" w:cs="Aptos"/>
-          <w:noProof w:val="0"/>
-          <w:sz w:val="22"/>
-          <w:szCs w:val="22"/>
-          <w:rtl w:val="1"/>
-          <w:lang w:val="en-US"/>
-        </w:rPr>
-        <w:t>איתן</w:t>
-      </w:r>
-      <w:r>
-        <w:rPr>
-          <w:rFonts w:ascii="Aptos" w:hAnsi="Aptos" w:eastAsia="Aptos" w:cs="Aptos"/>
-          <w:noProof w:val="0"/>
-          <w:sz w:val="22"/>
-          <w:szCs w:val="22"/>
-          <w:rtl w:val="1"/>
-          <w:lang w:val="en-US"/>
-        </w:rPr>
-        <w:t xml:space="preserve"> </w:t>
-      </w:r>
-      <w:r>
-        <w:rPr>
-          <w:rFonts w:ascii="Aptos" w:hAnsi="Aptos" w:eastAsia="Aptos" w:cs="Aptos"/>
-          <w:noProof w:val="0"/>
-          <w:sz w:val="22"/>
-          <w:szCs w:val="22"/>
-          <w:rtl w:val="1"/>
-          <w:lang w:val="en-US"/>
-        </w:rPr>
-        <w:t>לשלב</w:t>
-      </w:r>
-      <w:r>
-        <w:rPr>
-          <w:rFonts w:ascii="Aptos" w:hAnsi="Aptos" w:eastAsia="Aptos" w:cs="Aptos"/>
-          <w:noProof w:val="0"/>
-          <w:sz w:val="22"/>
-          <w:szCs w:val="22"/>
-          <w:rtl w:val="1"/>
-          <w:lang w:val="en-US"/>
-        </w:rPr>
-        <w:t xml:space="preserve"> </w:t>
-      </w:r>
-      <w:r>
-        <w:rPr>
-          <w:rFonts w:ascii="Aptos" w:hAnsi="Aptos" w:eastAsia="Aptos" w:cs="Aptos"/>
-          <w:noProof w:val="0"/>
-          <w:sz w:val="22"/>
-          <w:szCs w:val="22"/>
-          <w:rtl w:val="1"/>
-          <w:lang w:val="en-US"/>
-        </w:rPr>
-        <w:t>הפיתוח</w:t>
-      </w:r>
-      <w:r>
-        <w:rPr>
-          <w:rFonts w:ascii="Aptos" w:hAnsi="Aptos" w:eastAsia="Aptos" w:cs="Aptos"/>
-          <w:noProof w:val="0"/>
-          <w:sz w:val="22"/>
-          <w:szCs w:val="22"/>
-          <w:rtl w:val="1"/>
-          <w:lang w:val="en-US"/>
-        </w:rPr>
-        <w:t xml:space="preserve"> </w:t>
-      </w:r>
-      <w:r>
-        <w:rPr>
-          <w:rFonts w:ascii="Aptos" w:hAnsi="Aptos" w:eastAsia="Aptos" w:cs="Aptos"/>
-          <w:noProof w:val="0"/>
-          <w:sz w:val="22"/>
-          <w:szCs w:val="22"/>
-          <w:rtl w:val="1"/>
-          <w:lang w:val="en-US"/>
-        </w:rPr>
-        <w:t>והמימוש</w:t>
-      </w:r>
-      <w:r>
-        <w:rPr>
-          <w:rFonts w:ascii="Aptos" w:hAnsi="Aptos" w:eastAsia="Aptos" w:cs="Aptos"/>
-          <w:noProof w:val="0"/>
-          <w:sz w:val="22"/>
-          <w:szCs w:val="22"/>
-          <w:rtl w:val="1"/>
-          <w:lang w:val="en-US"/>
-        </w:rPr>
-        <w:t xml:space="preserve"> </w:t>
-      </w:r>
-      <w:r>
-        <w:rPr>
-          <w:rFonts w:ascii="Aptos" w:hAnsi="Aptos" w:eastAsia="Aptos" w:cs="Aptos"/>
-          <w:noProof w:val="0"/>
-          <w:sz w:val="22"/>
-          <w:szCs w:val="22"/>
-          <w:rtl w:val="1"/>
-          <w:lang w:val="en-US"/>
-        </w:rPr>
-        <w:t>של</w:t>
-      </w:r>
-      <w:r>
-        <w:rPr>
-          <w:rFonts w:ascii="Aptos" w:hAnsi="Aptos" w:eastAsia="Aptos" w:cs="Aptos"/>
-          <w:noProof w:val="0"/>
-          <w:sz w:val="22"/>
-          <w:szCs w:val="22"/>
-          <w:rtl w:val="1"/>
-          <w:lang w:val="en-US"/>
-        </w:rPr>
-        <w:t xml:space="preserve"> </w:t>
-      </w:r>
-      <w:r>
-        <w:rPr>
-          <w:rFonts w:ascii="Aptos" w:hAnsi="Aptos" w:eastAsia="Aptos" w:cs="Aptos"/>
-          <w:noProof w:val="0"/>
-          <w:sz w:val="22"/>
-          <w:szCs w:val="22"/>
-          <w:rtl w:val="1"/>
-          <w:lang w:val="en-US"/>
-        </w:rPr>
-        <w:t>הפרויקט</w:t>
-      </w:r>
-      <w:r>
-        <w:rPr>
-          <w:rFonts w:ascii="Aptos" w:hAnsi="Aptos" w:eastAsia="Aptos" w:cs="Aptos"/>
-          <w:noProof w:val="0"/>
-          <w:sz w:val="22"/>
-          <w:szCs w:val="22"/>
-          <w:lang w:val="en-US"/>
-        </w:rPr>
-        <w:t xml:space="preserve"> .</w:t>
+        <w:t>המסמך הנוכחי פורס את כלל הדרישות, תהליכי הזרימה ומבנה הנתונים הדרושים להקמת המערכת. יישום האפיון יקנה לארגון יכולת שליטה ובקרה גבוהה יותר על המתרחש ברשת הפנימית. התשתית שהוגדרה בפרקים הקודמים, ובפרט תרשימי המידול השונים, משמשת כמפרט טכני מוכן למעבר לשלב הפיתוח וכתיבת הקוד.</w:t>
       </w:r>
     </w:p>
     <w:p>
@@ -38297,6 +34824,342 @@
 
 <file path=word/numbering.xml><?xml version="1.0" encoding="utf-8"?>
 <w:numbering xmlns:wpc="http://schemas.microsoft.com/office/word/2010/wordprocessingCanvas" xmlns:cx="http://schemas.microsoft.com/office/drawing/2014/chartex" xmlns:cx1="http://schemas.microsoft.com/office/drawing/2015/9/8/chartex" xmlns:cx2="http://schemas.microsoft.com/office/drawing/2015/10/21/chartex" xmlns:cx3="http://schemas.microsoft.com/office/drawing/2016/5/9/chartex" xmlns:cx4="http://schemas.microsoft.com/office/drawing/2016/5/10/chartex" xmlns:cx5="http://schemas.microsoft.com/office/drawing/2016/5/11/chartex" xmlns:cx6="http://schemas.microsoft.com/office/drawing/2016/5/12/chartex" xmlns:cx7="http://schemas.microsoft.com/office/drawing/2016/5/13/chartex" xmlns:cx8="http://schemas.microsoft.com/office/drawing/2016/5/14/chartex" xmlns:mc="http://schemas.openxmlformats.org/markup-compatibility/2006" xmlns:aink="http://schemas.microsoft.com/office/drawing/2016/ink" xmlns:am3d="http://schemas.microsoft.com/office/drawing/2017/model3d" xmlns:o="urn:schemas-microsoft-com:office:office" xmlns:oel="http://schemas.microsoft.com/office/2019/extlst" xmlns:r="http://schemas.openxmlformats.org/officeDocument/2006/relationships" xmlns:m="http://schemas.openxmlformats.org/officeDocument/2006/math" xmlns:v="urn:schemas-microsoft-com:vml" xmlns:wp14="http://schemas.microsoft.com/office/word/2010/wordprocessingDrawing" xmlns:wp="http://schemas.openxmlformats.org/drawingml/2006/wordprocessingDrawing" xmlns:w10="urn:schemas-microsoft-com:office:word" xmlns:w="http://schemas.openxmlformats.org/wordprocessingml/2006/main" xmlns:w14="http://schemas.microsoft.com/office/word/2010/wordml" xmlns:w15="http://schemas.microsoft.com/office/word/2012/wordml" xmlns:w16cex="http://schemas.microsoft.com/office/word/2018/wordml/cex" xmlns:w16cid="http://schemas.microsoft.com/office/word/2016/wordml/cid" xmlns:w16="http://schemas.microsoft.com/office/word/2018/wordml" xmlns:w16du="http://schemas.microsoft.com/office/word/2023/wordml/word16du" xmlns:w16sdtdh="http://schemas.microsoft.com/office/word/2020/wordml/sdtdatahash" xmlns:w16sdtfl="http://schemas.microsoft.com/office/word/2024/wordml/sdtformatlock" xmlns:w16se="http://schemas.microsoft.com/office/word/2015/wordml/symex" xmlns:wpg="http://schemas.microsoft.com/office/word/2010/wordprocessingGroup" xmlns:wpi="http://schemas.microsoft.com/office/word/2010/wordprocessingInk" xmlns:wne="http://schemas.microsoft.com/office/word/2006/wordml" xmlns:wps="http://schemas.microsoft.com/office/word/2010/wordprocessingShape" mc:Ignorable="w14 w15 w16se w16cid w16 w16cex w16sdtdh w16sdtfl w16du wp14">
+  <w:abstractNum xmlns:w="http://schemas.openxmlformats.org/wordprocessingml/2006/main" w:abstractNumId="13">
+    <w:nsid w:val="482c338d"/>
+    <w:multiLevelType xmlns:w="http://schemas.openxmlformats.org/wordprocessingml/2006/main" w:val="hybridMultilevel"/>
+    <w:lvl xmlns:w="http://schemas.openxmlformats.org/wordprocessingml/2006/main" w:ilvl="0">
+      <w:start w:val="1"/>
+      <w:numFmt w:val="bullet"/>
+      <w:lvlText w:val=""/>
+      <w:lvlJc w:val="left"/>
+      <w:pPr>
+        <w:ind w:left="720" w:hanging="360"/>
+      </w:pPr>
+      <w:rPr>
+        <w:rFonts w:hint="default" w:ascii="Symbol" w:hAnsi="Symbol"/>
+      </w:rPr>
+    </w:lvl>
+    <w:lvl xmlns:w="http://schemas.openxmlformats.org/wordprocessingml/2006/main" w:ilvl="1">
+      <w:start w:val="1"/>
+      <w:numFmt w:val="bullet"/>
+      <w:lvlText w:val="o"/>
+      <w:lvlJc w:val="left"/>
+      <w:pPr>
+        <w:ind w:left="1440" w:hanging="360"/>
+      </w:pPr>
+      <w:rPr>
+        <w:rFonts w:hint="default" w:ascii="Courier New" w:hAnsi="Courier New"/>
+      </w:rPr>
+    </w:lvl>
+    <w:lvl xmlns:w="http://schemas.openxmlformats.org/wordprocessingml/2006/main" w:ilvl="2">
+      <w:start w:val="1"/>
+      <w:numFmt w:val="bullet"/>
+      <w:lvlText w:val=""/>
+      <w:lvlJc w:val="left"/>
+      <w:pPr>
+        <w:ind w:left="2160" w:hanging="360"/>
+      </w:pPr>
+      <w:rPr>
+        <w:rFonts w:hint="default" w:ascii="Wingdings" w:hAnsi="Wingdings"/>
+      </w:rPr>
+    </w:lvl>
+    <w:lvl xmlns:w="http://schemas.openxmlformats.org/wordprocessingml/2006/main" w:ilvl="3">
+      <w:start w:val="1"/>
+      <w:numFmt w:val="bullet"/>
+      <w:lvlText w:val=""/>
+      <w:lvlJc w:val="left"/>
+      <w:pPr>
+        <w:ind w:left="2880" w:hanging="360"/>
+      </w:pPr>
+      <w:rPr>
+        <w:rFonts w:hint="default" w:ascii="Symbol" w:hAnsi="Symbol"/>
+      </w:rPr>
+    </w:lvl>
+    <w:lvl xmlns:w="http://schemas.openxmlformats.org/wordprocessingml/2006/main" w:ilvl="4">
+      <w:start w:val="1"/>
+      <w:numFmt w:val="bullet"/>
+      <w:lvlText w:val="o"/>
+      <w:lvlJc w:val="left"/>
+      <w:pPr>
+        <w:ind w:left="3600" w:hanging="360"/>
+      </w:pPr>
+      <w:rPr>
+        <w:rFonts w:hint="default" w:ascii="Courier New" w:hAnsi="Courier New"/>
+      </w:rPr>
+    </w:lvl>
+    <w:lvl xmlns:w="http://schemas.openxmlformats.org/wordprocessingml/2006/main" w:ilvl="5">
+      <w:start w:val="1"/>
+      <w:numFmt w:val="bullet"/>
+      <w:lvlText w:val=""/>
+      <w:lvlJc w:val="left"/>
+      <w:pPr>
+        <w:ind w:left="4320" w:hanging="360"/>
+      </w:pPr>
+      <w:rPr>
+        <w:rFonts w:hint="default" w:ascii="Wingdings" w:hAnsi="Wingdings"/>
+      </w:rPr>
+    </w:lvl>
+    <w:lvl xmlns:w="http://schemas.openxmlformats.org/wordprocessingml/2006/main" w:ilvl="6">
+      <w:start w:val="1"/>
+      <w:numFmt w:val="bullet"/>
+      <w:lvlText w:val=""/>
+      <w:lvlJc w:val="left"/>
+      <w:pPr>
+        <w:ind w:left="5040" w:hanging="360"/>
+      </w:pPr>
+      <w:rPr>
+        <w:rFonts w:hint="default" w:ascii="Symbol" w:hAnsi="Symbol"/>
+      </w:rPr>
+    </w:lvl>
+    <w:lvl xmlns:w="http://schemas.openxmlformats.org/wordprocessingml/2006/main" w:ilvl="7">
+      <w:start w:val="1"/>
+      <w:numFmt w:val="bullet"/>
+      <w:lvlText w:val="o"/>
+      <w:lvlJc w:val="left"/>
+      <w:pPr>
+        <w:ind w:left="5760" w:hanging="360"/>
+      </w:pPr>
+      <w:rPr>
+        <w:rFonts w:hint="default" w:ascii="Courier New" w:hAnsi="Courier New"/>
+      </w:rPr>
+    </w:lvl>
+    <w:lvl xmlns:w="http://schemas.openxmlformats.org/wordprocessingml/2006/main" w:ilvl="8">
+      <w:start w:val="1"/>
+      <w:numFmt w:val="bullet"/>
+      <w:lvlText w:val=""/>
+      <w:lvlJc w:val="left"/>
+      <w:pPr>
+        <w:ind w:left="6480" w:hanging="360"/>
+      </w:pPr>
+      <w:rPr>
+        <w:rFonts w:hint="default" w:ascii="Wingdings" w:hAnsi="Wingdings"/>
+      </w:rPr>
+    </w:lvl>
+  </w:abstractNum>
+  <w:abstractNum xmlns:w="http://schemas.openxmlformats.org/wordprocessingml/2006/main" w:abstractNumId="12">
+    <w:nsid w:val="3f63ed43"/>
+    <w:multiLevelType xmlns:w="http://schemas.openxmlformats.org/wordprocessingml/2006/main" w:val="hybridMultilevel"/>
+    <w:lvl xmlns:w="http://schemas.openxmlformats.org/wordprocessingml/2006/main" w:ilvl="0">
+      <w:start w:val="1"/>
+      <w:numFmt w:val="bullet"/>
+      <w:lvlText w:val=""/>
+      <w:lvlJc w:val="left"/>
+      <w:pPr>
+        <w:ind w:left="720" w:hanging="360"/>
+      </w:pPr>
+      <w:rPr>
+        <w:rFonts w:hint="default" w:ascii="Symbol" w:hAnsi="Symbol"/>
+      </w:rPr>
+    </w:lvl>
+    <w:lvl xmlns:w="http://schemas.openxmlformats.org/wordprocessingml/2006/main" w:ilvl="1">
+      <w:start w:val="1"/>
+      <w:numFmt w:val="bullet"/>
+      <w:lvlText w:val="o"/>
+      <w:lvlJc w:val="left"/>
+      <w:pPr>
+        <w:ind w:left="1440" w:hanging="360"/>
+      </w:pPr>
+      <w:rPr>
+        <w:rFonts w:hint="default" w:ascii="Courier New" w:hAnsi="Courier New"/>
+      </w:rPr>
+    </w:lvl>
+    <w:lvl xmlns:w="http://schemas.openxmlformats.org/wordprocessingml/2006/main" w:ilvl="2">
+      <w:start w:val="1"/>
+      <w:numFmt w:val="bullet"/>
+      <w:lvlText w:val=""/>
+      <w:lvlJc w:val="left"/>
+      <w:pPr>
+        <w:ind w:left="2160" w:hanging="360"/>
+      </w:pPr>
+      <w:rPr>
+        <w:rFonts w:hint="default" w:ascii="Wingdings" w:hAnsi="Wingdings"/>
+      </w:rPr>
+    </w:lvl>
+    <w:lvl xmlns:w="http://schemas.openxmlformats.org/wordprocessingml/2006/main" w:ilvl="3">
+      <w:start w:val="1"/>
+      <w:numFmt w:val="bullet"/>
+      <w:lvlText w:val=""/>
+      <w:lvlJc w:val="left"/>
+      <w:pPr>
+        <w:ind w:left="2880" w:hanging="360"/>
+      </w:pPr>
+      <w:rPr>
+        <w:rFonts w:hint="default" w:ascii="Symbol" w:hAnsi="Symbol"/>
+      </w:rPr>
+    </w:lvl>
+    <w:lvl xmlns:w="http://schemas.openxmlformats.org/wordprocessingml/2006/main" w:ilvl="4">
+      <w:start w:val="1"/>
+      <w:numFmt w:val="bullet"/>
+      <w:lvlText w:val="o"/>
+      <w:lvlJc w:val="left"/>
+      <w:pPr>
+        <w:ind w:left="3600" w:hanging="360"/>
+      </w:pPr>
+      <w:rPr>
+        <w:rFonts w:hint="default" w:ascii="Courier New" w:hAnsi="Courier New"/>
+      </w:rPr>
+    </w:lvl>
+    <w:lvl xmlns:w="http://schemas.openxmlformats.org/wordprocessingml/2006/main" w:ilvl="5">
+      <w:start w:val="1"/>
+      <w:numFmt w:val="bullet"/>
+      <w:lvlText w:val=""/>
+      <w:lvlJc w:val="left"/>
+      <w:pPr>
+        <w:ind w:left="4320" w:hanging="360"/>
+      </w:pPr>
+      <w:rPr>
+        <w:rFonts w:hint="default" w:ascii="Wingdings" w:hAnsi="Wingdings"/>
+      </w:rPr>
+    </w:lvl>
+    <w:lvl xmlns:w="http://schemas.openxmlformats.org/wordprocessingml/2006/main" w:ilvl="6">
+      <w:start w:val="1"/>
+      <w:numFmt w:val="bullet"/>
+      <w:lvlText w:val=""/>
+      <w:lvlJc w:val="left"/>
+      <w:pPr>
+        <w:ind w:left="5040" w:hanging="360"/>
+      </w:pPr>
+      <w:rPr>
+        <w:rFonts w:hint="default" w:ascii="Symbol" w:hAnsi="Symbol"/>
+      </w:rPr>
+    </w:lvl>
+    <w:lvl xmlns:w="http://schemas.openxmlformats.org/wordprocessingml/2006/main" w:ilvl="7">
+      <w:start w:val="1"/>
+      <w:numFmt w:val="bullet"/>
+      <w:lvlText w:val="o"/>
+      <w:lvlJc w:val="left"/>
+      <w:pPr>
+        <w:ind w:left="5760" w:hanging="360"/>
+      </w:pPr>
+      <w:rPr>
+        <w:rFonts w:hint="default" w:ascii="Courier New" w:hAnsi="Courier New"/>
+      </w:rPr>
+    </w:lvl>
+    <w:lvl xmlns:w="http://schemas.openxmlformats.org/wordprocessingml/2006/main" w:ilvl="8">
+      <w:start w:val="1"/>
+      <w:numFmt w:val="bullet"/>
+      <w:lvlText w:val=""/>
+      <w:lvlJc w:val="left"/>
+      <w:pPr>
+        <w:ind w:left="6480" w:hanging="360"/>
+      </w:pPr>
+      <w:rPr>
+        <w:rFonts w:hint="default" w:ascii="Wingdings" w:hAnsi="Wingdings"/>
+      </w:rPr>
+    </w:lvl>
+  </w:abstractNum>
+  <w:abstractNum xmlns:w="http://schemas.openxmlformats.org/wordprocessingml/2006/main" w:abstractNumId="11">
+    <w:nsid w:val="6e647a56"/>
+    <w:multiLevelType xmlns:w="http://schemas.openxmlformats.org/wordprocessingml/2006/main" w:val="hybridMultilevel"/>
+    <w:lvl xmlns:w="http://schemas.openxmlformats.org/wordprocessingml/2006/main" w:ilvl="0">
+      <w:start w:val="1"/>
+      <w:numFmt w:val="bullet"/>
+      <w:lvlText w:val=""/>
+      <w:lvlJc w:val="left"/>
+      <w:pPr>
+        <w:ind w:left="720" w:hanging="360"/>
+      </w:pPr>
+      <w:rPr>
+        <w:rFonts w:hint="default" w:ascii="Symbol" w:hAnsi="Symbol"/>
+      </w:rPr>
+    </w:lvl>
+    <w:lvl xmlns:w="http://schemas.openxmlformats.org/wordprocessingml/2006/main" w:ilvl="1">
+      <w:start w:val="1"/>
+      <w:numFmt w:val="bullet"/>
+      <w:lvlText w:val="o"/>
+      <w:lvlJc w:val="left"/>
+      <w:pPr>
+        <w:ind w:left="1440" w:hanging="360"/>
+      </w:pPr>
+      <w:rPr>
+        <w:rFonts w:hint="default" w:ascii="Courier New" w:hAnsi="Courier New"/>
+      </w:rPr>
+    </w:lvl>
+    <w:lvl xmlns:w="http://schemas.openxmlformats.org/wordprocessingml/2006/main" w:ilvl="2">
+      <w:start w:val="1"/>
+      <w:numFmt w:val="bullet"/>
+      <w:lvlText w:val=""/>
+      <w:lvlJc w:val="left"/>
+      <w:pPr>
+        <w:ind w:left="2160" w:hanging="360"/>
+      </w:pPr>
+      <w:rPr>
+        <w:rFonts w:hint="default" w:ascii="Wingdings" w:hAnsi="Wingdings"/>
+      </w:rPr>
+    </w:lvl>
+    <w:lvl xmlns:w="http://schemas.openxmlformats.org/wordprocessingml/2006/main" w:ilvl="3">
+      <w:start w:val="1"/>
+      <w:numFmt w:val="bullet"/>
+      <w:lvlText w:val=""/>
+      <w:lvlJc w:val="left"/>
+      <w:pPr>
+        <w:ind w:left="2880" w:hanging="360"/>
+      </w:pPr>
+      <w:rPr>
+        <w:rFonts w:hint="default" w:ascii="Symbol" w:hAnsi="Symbol"/>
+      </w:rPr>
+    </w:lvl>
+    <w:lvl xmlns:w="http://schemas.openxmlformats.org/wordprocessingml/2006/main" w:ilvl="4">
+      <w:start w:val="1"/>
+      <w:numFmt w:val="bullet"/>
+      <w:lvlText w:val="o"/>
+      <w:lvlJc w:val="left"/>
+      <w:pPr>
+        <w:ind w:left="3600" w:hanging="360"/>
+      </w:pPr>
+      <w:rPr>
+        <w:rFonts w:hint="default" w:ascii="Courier New" w:hAnsi="Courier New"/>
+      </w:rPr>
+    </w:lvl>
+    <w:lvl xmlns:w="http://schemas.openxmlformats.org/wordprocessingml/2006/main" w:ilvl="5">
+      <w:start w:val="1"/>
+      <w:numFmt w:val="bullet"/>
+      <w:lvlText w:val=""/>
+      <w:lvlJc w:val="left"/>
+      <w:pPr>
+        <w:ind w:left="4320" w:hanging="360"/>
+      </w:pPr>
+      <w:rPr>
+        <w:rFonts w:hint="default" w:ascii="Wingdings" w:hAnsi="Wingdings"/>
+      </w:rPr>
+    </w:lvl>
+    <w:lvl xmlns:w="http://schemas.openxmlformats.org/wordprocessingml/2006/main" w:ilvl="6">
+      <w:start w:val="1"/>
+      <w:numFmt w:val="bullet"/>
+      <w:lvlText w:val=""/>
+      <w:lvlJc w:val="left"/>
+      <w:pPr>
+        <w:ind w:left="5040" w:hanging="360"/>
+      </w:pPr>
+      <w:rPr>
+        <w:rFonts w:hint="default" w:ascii="Symbol" w:hAnsi="Symbol"/>
+      </w:rPr>
+    </w:lvl>
+    <w:lvl xmlns:w="http://schemas.openxmlformats.org/wordprocessingml/2006/main" w:ilvl="7">
+      <w:start w:val="1"/>
+      <w:numFmt w:val="bullet"/>
+      <w:lvlText w:val="o"/>
+      <w:lvlJc w:val="left"/>
+      <w:pPr>
+        <w:ind w:left="5760" w:hanging="360"/>
+      </w:pPr>
+      <w:rPr>
+        <w:rFonts w:hint="default" w:ascii="Courier New" w:hAnsi="Courier New"/>
+      </w:rPr>
+    </w:lvl>
+    <w:lvl xmlns:w="http://schemas.openxmlformats.org/wordprocessingml/2006/main" w:ilvl="8">
+      <w:start w:val="1"/>
+      <w:numFmt w:val="bullet"/>
+      <w:lvlText w:val=""/>
+      <w:lvlJc w:val="left"/>
+      <w:pPr>
+        <w:ind w:left="6480" w:hanging="360"/>
+      </w:pPr>
+      <w:rPr>
+        <w:rFonts w:hint="default" w:ascii="Wingdings" w:hAnsi="Wingdings"/>
+      </w:rPr>
+    </w:lvl>
+  </w:abstractNum>
   <w:abstractNum xmlns:w="http://schemas.openxmlformats.org/wordprocessingml/2006/main" w:abstractNumId="10">
     <w:nsid w:val="224b3409"/>
     <w:multiLevelType xmlns:w="http://schemas.openxmlformats.org/wordprocessingml/2006/main" w:val="hybridMultilevel"/>
@@ -39772,6 +36635,15 @@
       </w:pPr>
     </w:lvl>
   </w:abstractNum>
+  <w:num w:numId="14">
+    <w:abstractNumId w:val="13"/>
+  </w:num>
+  <w:num w:numId="13">
+    <w:abstractNumId w:val="12"/>
+  </w:num>
+  <w:num w:numId="12">
+    <w:abstractNumId w:val="11"/>
+  </w:num>
   <w:num w:numId="11">
     <w:abstractNumId w:val="10"/>
   </w:num>

</xml_diff>